<commit_message>
Add Alison Diploma in Environmental Management (Credential ID: 1917-10374639)
</commit_message>
<xml_diff>
--- a/I Gede Mahendra Wijaya_Master CV.docx
+++ b/I Gede Mahendra Wijaya_Master CV.docx
@@ -4214,7 +4214,7 @@
           <w:sz w:val="24"/>
           <w:szCs w:val="24"/>
         </w:rPr>
-        <w:t xml:space="preserve">PROFESSIONAL CERTIFICATIONS &amp; SPECIALIZED TRAINING (TOTAL: 62)</w:t>
+        <w:t xml:space="preserve">PROFESSIONAL CERTIFICATIONS &amp; SPECIALIZED TRAINING (TOTAL: 63)</w:t>
       </w:r>
     </w:p>
     <w:p>
@@ -6013,7 +6013,7 @@
           <w:sz w:val="21"/>
           <w:szCs w:val="21"/>
         </w:rPr>
-        <w:t xml:space="preserve">4. Occupational Health, Safety, EHS &amp; Quality Assurance (OHSE, ISO Auditing, APDI Drone) (6 Programs)</w:t>
+        <w:t xml:space="preserve">4. Occupational Health, Safety, EHS &amp; Quality Assurance (OHSE, ISO Auditing, APDI Drone) (7 Programs)</w:t>
       </w:r>
     </w:p>
     <w:p>
@@ -6085,6 +6085,77 @@
           <w:szCs w:val="18"/>
         </w:rPr>
         <w:t xml:space="preserve">Comprehensive diploma program in Occupational Health, Safety, and Environment (OHSE) from Alison, covering hazard identification, workplace risk assessments, incident prevention &amp; root cause analysis, environmental protection protocols, emergency response planning, and international HSE management standards.</w:t>
+      </w:r>
+    </w:p>
+    <w:p>
+      <w:pPr>
+        <w:pStyle w:val="ListParagraph"/>
+        <w:numPr>
+          <w:ilvl w:val="0"/>
+          <w:numId w:val="1"/>
+        </w:numPr>
+        <w:spacing w:after="20" w:before="20"/>
+      </w:pPr>
+      <w:r>
+        <w:rPr>
+          <w:rFonts w:ascii="Arial" w:cs="Arial" w:eastAsia="Arial" w:hAnsi="Arial"/>
+          <w:b/>
+          <w:bCs/>
+          <w:color w:val="1E293B"/>
+          <w:sz w:val="19"/>
+          <w:szCs w:val="19"/>
+        </w:rPr>
+        <w:t xml:space="preserve">Diploma in Environmental Management</w:t>
+      </w:r>
+      <w:r>
+        <w:rPr>
+          <w:rFonts w:ascii="Arial" w:cs="Arial" w:eastAsia="Arial" w:hAnsi="Arial"/>
+          <w:color w:val="64748B"/>
+          <w:sz w:val="18"/>
+          <w:szCs w:val="18"/>
+        </w:rPr>
+        <w:t xml:space="preserve"> — Alison (Sep 2026)</w:t>
+      </w:r>
+    </w:p>
+    <w:p>
+      <w:pPr>
+        <w:spacing w:after="20" w:before="0"/>
+        <w:ind w:left="400"/>
+      </w:pPr>
+      <w:r>
+        <w:rPr>
+          <w:rFonts w:ascii="Arial" w:cs="Arial" w:eastAsia="Arial" w:hAnsi="Arial"/>
+          <w:b/>
+          <w:bCs/>
+          <w:color w:val="0D9488"/>
+          <w:sz w:val="18"/>
+          <w:szCs w:val="18"/>
+        </w:rPr>
+        <w:t xml:space="preserve">Competencies: </w:t>
+      </w:r>
+      <w:r>
+        <w:rPr>
+          <w:rFonts w:ascii="Arial" w:cs="Arial" w:eastAsia="Arial" w:hAnsi="Arial"/>
+          <w:color w:val="1E293B"/>
+          <w:sz w:val="18"/>
+          <w:szCs w:val="18"/>
+        </w:rPr>
+        <w:t xml:space="preserve">Environmental Management Systems (EMS / ISO 14001), Environmental Impact Assessment (EIA / ESIA), Environmental Auditing &amp; Compliance, Pollution Prevention &amp; Control, Ecological Sustainability &amp; Resource Efficiency</w:t>
+      </w:r>
+    </w:p>
+    <w:p>
+      <w:pPr>
+        <w:spacing w:after="40" w:before="0"/>
+        <w:ind w:left="400"/>
+      </w:pPr>
+      <w:r>
+        <w:rPr>
+          <w:rFonts w:ascii="Arial" w:cs="Arial" w:eastAsia="Arial" w:hAnsi="Arial"/>
+          <w:color w:val="64748B"/>
+          <w:sz w:val="18"/>
+          <w:szCs w:val="18"/>
+        </w:rPr>
+        <w:t xml:space="preserve">Comprehensive professional diploma in Environmental Management accredited by Alison (Credential ID: 1917-10374639), covering environmental management systems (ISO 14001), EIA/ESIA screening and scoping, environmental auditing and compliance standards, waste and water resource governance, pollution abatement protocols, and strategic ecological sustainability.</w:t>
       </w:r>
     </w:p>
     <w:p>

</xml_diff>

<commit_message>
Align Alison Diplomas alongside GHGMI Diploma in Education section across data.js, Markdown, Word DOCX, and website
</commit_message>
<xml_diff>
--- a/I Gede Mahendra Wijaya_Master CV.docx
+++ b/I Gede Mahendra Wijaya_Master CV.docx
@@ -307,27 +307,16 @@
     </w:p>
     <w:p>
       <w:pPr>
-        <w:spacing w:after="120" w:before="0"/>
-      </w:pPr>
-      <w:r>
-        <w:rPr>
-          <w:rFonts w:ascii="Arial" w:cs="Arial" w:eastAsia="Arial" w:hAnsi="Arial"/>
-          <w:b/>
-          <w:bCs/>
-          <w:color w:val="1E293B"/>
-          <w:sz w:val="19"/>
-          <w:szCs w:val="19"/>
-        </w:rPr>
-        <w:t xml:space="preserve">Concentration: </w:t>
-      </w:r>
-      <w:r>
-        <w:rPr>
-          <w:rFonts w:ascii="Arial" w:cs="Arial" w:eastAsia="Arial" w:hAnsi="Arial"/>
-          <w:color w:val="1E293B"/>
-          <w:sz w:val="19"/>
-          <w:szCs w:val="19"/>
-        </w:rPr>
-        <w:t xml:space="preserve">Marine Acoustic and Remote Sensing Technology | GPA: 3.04</w:t>
+        <w:spacing w:after="100" w:before="0"/>
+      </w:pPr>
+      <w:r>
+        <w:rPr>
+          <w:rFonts w:ascii="Arial" w:cs="Arial" w:eastAsia="Arial" w:hAnsi="Arial"/>
+          <w:color w:val="1E293B"/>
+          <w:sz w:val="19"/>
+          <w:szCs w:val="19"/>
+        </w:rPr>
+        <w:t xml:space="preserve">Concentration in Marine Acoustic and Remote Sensing Technology | GPA: 3.04</w:t>
       </w:r>
     </w:p>
     <w:p>
@@ -352,12 +341,12 @@
           <w:sz w:val="19"/>
           <w:szCs w:val="19"/>
         </w:rPr>
-        <w:t xml:space="preserve">  |  Online Professional Program (Ongoing)</w:t>
-      </w:r>
-    </w:p>
-    <w:p>
-      <w:pPr>
-        <w:spacing w:after="120" w:before="0"/>
+        <w:t xml:space="preserve">  |  2023 – Present (Ongoing)</w:t>
+      </w:r>
+    </w:p>
+    <w:p>
+      <w:pPr>
+        <w:spacing w:after="20" w:before="0"/>
       </w:pPr>
       <w:r>
         <w:rPr>
@@ -377,7 +366,149 @@
           <w:sz w:val="19"/>
           <w:szCs w:val="19"/>
         </w:rPr>
-        <w:t xml:space="preserve"> — Specialized curriculum in GHG accounting, carbon project development, and MRV frameworks.</w:t>
+        <w:t xml:space="preserve"> — Online Professional Program</w:t>
+      </w:r>
+    </w:p>
+    <w:p>
+      <w:pPr>
+        <w:spacing w:after="100" w:before="0"/>
+      </w:pPr>
+      <w:r>
+        <w:rPr>
+          <w:rFonts w:ascii="Arial" w:cs="Arial" w:eastAsia="Arial" w:hAnsi="Arial"/>
+          <w:color w:val="1E293B"/>
+          <w:sz w:val="19"/>
+          <w:szCs w:val="19"/>
+        </w:rPr>
+        <w:t xml:space="preserve">Specialized curriculum in GHG accounting, carbon project management, baseline determination, and MRV frameworks.</w:t>
+      </w:r>
+    </w:p>
+    <w:p>
+      <w:pPr>
+        <w:spacing w:after="20" w:before="40"/>
+      </w:pPr>
+      <w:r>
+        <w:rPr>
+          <w:rFonts w:ascii="Arial" w:cs="Arial" w:eastAsia="Arial" w:hAnsi="Arial"/>
+          <w:b/>
+          <w:bCs/>
+          <w:color w:val="0F3A5D"/>
+          <w:sz w:val="21"/>
+          <w:szCs w:val="21"/>
+        </w:rPr>
+        <w:t xml:space="preserve">Diploma in Environmental Management</w:t>
+      </w:r>
+      <w:r>
+        <w:rPr>
+          <w:rFonts w:ascii="Arial" w:cs="Arial" w:eastAsia="Arial" w:hAnsi="Arial"/>
+          <w:color w:val="64748B"/>
+          <w:sz w:val="19"/>
+          <w:szCs w:val="19"/>
+        </w:rPr>
+        <w:t xml:space="preserve">  |  September 2026</w:t>
+      </w:r>
+    </w:p>
+    <w:p>
+      <w:pPr>
+        <w:spacing w:after="20" w:before="0"/>
+      </w:pPr>
+      <w:r>
+        <w:rPr>
+          <w:rFonts w:ascii="Arial" w:cs="Arial" w:eastAsia="Arial" w:hAnsi="Arial"/>
+          <w:b/>
+          <w:bCs/>
+          <w:color w:val="1E293B"/>
+          <w:sz w:val="19"/>
+          <w:szCs w:val="19"/>
+        </w:rPr>
+        <w:t xml:space="preserve">Alison</w:t>
+      </w:r>
+      <w:r>
+        <w:rPr>
+          <w:rFonts w:ascii="Arial" w:cs="Arial" w:eastAsia="Arial" w:hAnsi="Arial"/>
+          <w:color w:val="64748B"/>
+          <w:sz w:val="19"/>
+          <w:szCs w:val="19"/>
+        </w:rPr>
+        <w:t xml:space="preserve"> — Professional Diploma Program</w:t>
+      </w:r>
+    </w:p>
+    <w:p>
+      <w:pPr>
+        <w:spacing w:after="100" w:before="0"/>
+      </w:pPr>
+      <w:r>
+        <w:rPr>
+          <w:rFonts w:ascii="Arial" w:cs="Arial" w:eastAsia="Arial" w:hAnsi="Arial"/>
+          <w:color w:val="1E293B"/>
+          <w:sz w:val="19"/>
+          <w:szCs w:val="19"/>
+        </w:rPr>
+        <w:t xml:space="preserve">Comprehensive curriculum in Environmental Management Systems (ISO 14001), EIA/ESIA, Environmental Auditing &amp; Compliance, and Pollution Abatement. (Credential ID: 1917-10374639)</w:t>
+      </w:r>
+    </w:p>
+    <w:p>
+      <w:pPr>
+        <w:spacing w:after="20" w:before="40"/>
+      </w:pPr>
+      <w:r>
+        <w:rPr>
+          <w:rFonts w:ascii="Arial" w:cs="Arial" w:eastAsia="Arial" w:hAnsi="Arial"/>
+          <w:b/>
+          <w:bCs/>
+          <w:color w:val="0F3A5D"/>
+          <w:sz w:val="21"/>
+          <w:szCs w:val="21"/>
+        </w:rPr>
+        <w:t xml:space="preserve">Diploma in Occupational Health, Safety and Environment (OHSE)</w:t>
+      </w:r>
+      <w:r>
+        <w:rPr>
+          <w:rFonts w:ascii="Arial" w:cs="Arial" w:eastAsia="Arial" w:hAnsi="Arial"/>
+          <w:color w:val="64748B"/>
+          <w:sz w:val="19"/>
+          <w:szCs w:val="19"/>
+        </w:rPr>
+        <w:t xml:space="preserve">  |  September 2026</w:t>
+      </w:r>
+    </w:p>
+    <w:p>
+      <w:pPr>
+        <w:spacing w:after="20" w:before="0"/>
+      </w:pPr>
+      <w:r>
+        <w:rPr>
+          <w:rFonts w:ascii="Arial" w:cs="Arial" w:eastAsia="Arial" w:hAnsi="Arial"/>
+          <w:b/>
+          <w:bCs/>
+          <w:color w:val="1E293B"/>
+          <w:sz w:val="19"/>
+          <w:szCs w:val="19"/>
+        </w:rPr>
+        <w:t xml:space="preserve">Alison</w:t>
+      </w:r>
+      <w:r>
+        <w:rPr>
+          <w:rFonts w:ascii="Arial" w:cs="Arial" w:eastAsia="Arial" w:hAnsi="Arial"/>
+          <w:color w:val="64748B"/>
+          <w:sz w:val="19"/>
+          <w:szCs w:val="19"/>
+        </w:rPr>
+        <w:t xml:space="preserve"> — Professional Diploma Program</w:t>
+      </w:r>
+    </w:p>
+    <w:p>
+      <w:pPr>
+        <w:spacing w:after="100" w:before="0"/>
+      </w:pPr>
+      <w:r>
+        <w:rPr>
+          <w:rFonts w:ascii="Arial" w:cs="Arial" w:eastAsia="Arial" w:hAnsi="Arial"/>
+          <w:color w:val="1E293B"/>
+          <w:sz w:val="19"/>
+          <w:szCs w:val="19"/>
+        </w:rPr>
+        <w:t xml:space="preserve">Specialized curriculum in Occupational Health &amp; Safety (OHS), Environmental Management Systems (EMS), Workplace Hazard &amp; Risk Assessment, Emergency Preparedness, and HSE Compliance.</w:t>
       </w:r>
     </w:p>
     <w:p>

</xml_diff>

<commit_message>
Add IPB Scientific Repository undergraduate thesis (Radon Transform 2D seismic) to publications, education, Master CV docs, and website
</commit_message>
<xml_diff>
--- a/I Gede Mahendra Wijaya_Master CV.docx
+++ b/I Gede Mahendra Wijaya_Master CV.docx
@@ -316,7 +316,7 @@
           <w:sz w:val="19"/>
           <w:szCs w:val="19"/>
         </w:rPr>
-        <w:t xml:space="preserve">Concentration in Marine Acoustic and Remote Sensing Technology | GPA: 3.04</w:t>
+        <w:t xml:space="preserve">Concentration in Marine Acoustic and Remote Sensing Technology | GPA: 3.04. Undergraduate Thesis: "Penerapan Metode Radon Transform untuk Reduksi Gelombang Multiple Seismik 2D di Perairan Barat Sumatra" (Advisor: Dr. Henry M. Manik | IPB Scientific Repository).</w:t>
       </w:r>
     </w:p>
     <w:p>
@@ -6662,7 +6662,7 @@
           <w:sz w:val="24"/>
           <w:szCs w:val="24"/>
         </w:rPr>
-        <w:t xml:space="preserve">PEER-REVIEWED PUBLICATIONS &amp; RESEARCH REPORTS (TOTAL: 4)</w:t>
+        <w:t xml:space="preserve">PEER-REVIEWED PUBLICATIONS &amp; RESEARCH REPORTS (TOTAL: 5)</w:t>
       </w:r>
     </w:p>
     <w:p>
@@ -6683,25 +6683,39 @@
     </w:p>
     <w:p>
       <w:pPr>
+        <w:spacing w:after="20" w:before="0"/>
+      </w:pPr>
+      <w:r>
+        <w:rPr>
+          <w:rFonts w:ascii="Arial" w:cs="Arial" w:eastAsia="Arial" w:hAnsi="Arial"/>
+          <w:color w:val="64748B"/>
+          <w:sz w:val="18"/>
+          <w:szCs w:val="18"/>
+        </w:rPr>
+        <w:t xml:space="preserve">Year: 2019  |  Publisher: International Seminar on Natural Resources and Environmental Management</w:t>
+      </w:r>
+      <w:r>
+        <w:rPr>
+          <w:rFonts w:ascii="Arial" w:cs="Arial" w:eastAsia="Arial" w:hAnsi="Arial"/>
+          <w:color w:val="0D9488"/>
+          <w:sz w:val="18"/>
+          <w:szCs w:val="18"/>
+        </w:rPr>
+        <w:t xml:space="preserve">  |  Link: https://doi.org/10.1088/1755-1315/399/1/012128</w:t>
+      </w:r>
+    </w:p>
+    <w:p>
+      <w:pPr>
         <w:spacing w:after="40" w:before="0"/>
       </w:pPr>
       <w:r>
         <w:rPr>
           <w:rFonts w:ascii="Arial" w:cs="Arial" w:eastAsia="Arial" w:hAnsi="Arial"/>
-          <w:color w:val="64748B"/>
-          <w:sz w:val="18"/>
-          <w:szCs w:val="18"/>
-        </w:rPr>
-        <w:t xml:space="preserve">Year: 2019  |  Publisher: International Seminar on Natural Resources and Environmental Management</w:t>
-      </w:r>
-      <w:r>
-        <w:rPr>
-          <w:rFonts w:ascii="Arial" w:cs="Arial" w:eastAsia="Arial" w:hAnsi="Arial"/>
-          <w:color w:val="0D9488"/>
-          <w:sz w:val="18"/>
-          <w:szCs w:val="18"/>
-        </w:rPr>
-        <w:t xml:space="preserve">  |  Link: https://doi.org/10.1088/1755-1315/399/1/012128</w:t>
+          <w:color w:val="1E293B"/>
+          <w:sz w:val="18"/>
+          <w:szCs w:val="18"/>
+        </w:rPr>
+        <w:t xml:space="preserve">Summary: Research paper assessing spatial interactions and mitigation strategies between marine mammal populations and industrial tuna longline fisheries across Indonesian fishing zones.</w:t>
       </w:r>
     </w:p>
     <w:p>
@@ -6722,25 +6736,39 @@
     </w:p>
     <w:p>
       <w:pPr>
+        <w:spacing w:after="20" w:before="0"/>
+      </w:pPr>
+      <w:r>
+        <w:rPr>
+          <w:rFonts w:ascii="Arial" w:cs="Arial" w:eastAsia="Arial" w:hAnsi="Arial"/>
+          <w:color w:val="64748B"/>
+          <w:sz w:val="18"/>
+          <w:szCs w:val="18"/>
+        </w:rPr>
+        <w:t xml:space="preserve">Year: 2016  |  Publisher: Current Status and Conservation, Part 2, Vol 73, AMB, UK: Academic Press, pp. 219–271</w:t>
+      </w:r>
+      <w:r>
+        <w:rPr>
+          <w:rFonts w:ascii="Arial" w:cs="Arial" w:eastAsia="Arial" w:hAnsi="Arial"/>
+          <w:color w:val="0D9488"/>
+          <w:sz w:val="18"/>
+          <w:szCs w:val="18"/>
+        </w:rPr>
+        <w:t xml:space="preserve">  |  Link: https://doi.org/10.1016/bs.amb.2015.08.003</w:t>
+      </w:r>
+    </w:p>
+    <w:p>
+      <w:pPr>
         <w:spacing w:after="40" w:before="0"/>
       </w:pPr>
       <w:r>
         <w:rPr>
           <w:rFonts w:ascii="Arial" w:cs="Arial" w:eastAsia="Arial" w:hAnsi="Arial"/>
-          <w:color w:val="64748B"/>
-          <w:sz w:val="18"/>
-          <w:szCs w:val="18"/>
-        </w:rPr>
-        <w:t xml:space="preserve">Year: 2016  |  Publisher: Current Status and Conservation, Part 2, Vol 73, AMB, UK: Academic Press, pp. 219–271</w:t>
-      </w:r>
-      <w:r>
-        <w:rPr>
-          <w:rFonts w:ascii="Arial" w:cs="Arial" w:eastAsia="Arial" w:hAnsi="Arial"/>
-          <w:color w:val="0D9488"/>
-          <w:sz w:val="18"/>
-          <w:szCs w:val="18"/>
-        </w:rPr>
-        <w:t xml:space="preserve">  |  Link: https://doi.org/10.1016/bs.amb.2015.08.003</w:t>
+          <w:color w:val="1E293B"/>
+          <w:sz w:val="18"/>
+          <w:szCs w:val="18"/>
+        </w:rPr>
+        <w:t xml:space="preserve">Summary: Comprehensive peer-reviewed book chapter and field study documenting the distribution, ecology, and conservation status of Australian humpback dolphins in the Pacific and New Guinea.</w:t>
       </w:r>
     </w:p>
     <w:p>
@@ -6756,7 +6784,30 @@
           <w:sz w:val="20"/>
           <w:szCs w:val="20"/>
         </w:rPr>
-        <w:t xml:space="preserve">3. Sound of Fish Affects Fish Productivity</w:t>
+        <w:t xml:space="preserve">3. Penerapan Metode Radon Transform untuk Reduksi Gelombang Multiple Seismik 2D di Perairan Barat Sumatra (Application of Radon Transform for 2D Seismic Multiple Wave Reduction)</w:t>
+      </w:r>
+    </w:p>
+    <w:p>
+      <w:pPr>
+        <w:spacing w:after="20" w:before="0"/>
+      </w:pPr>
+      <w:r>
+        <w:rPr>
+          <w:rFonts w:ascii="Arial" w:cs="Arial" w:eastAsia="Arial" w:hAnsi="Arial"/>
+          <w:color w:val="64748B"/>
+          <w:sz w:val="18"/>
+          <w:szCs w:val="18"/>
+        </w:rPr>
+        <w:t xml:space="preserve">Year: 2013  |  Publisher: IPB University Scientific Repository — Undergraduate Thesis (Advisor: Dr. Henry M. Manik)</w:t>
+      </w:r>
+      <w:r>
+        <w:rPr>
+          <w:rFonts w:ascii="Arial" w:cs="Arial" w:eastAsia="Arial" w:hAnsi="Arial"/>
+          <w:color w:val="0D9488"/>
+          <w:sz w:val="18"/>
+          <w:szCs w:val="18"/>
+        </w:rPr>
+        <w:t xml:space="preserve">  |  Link: https://repository.ipb.ac.id/handle/123456789/63281</w:t>
       </w:r>
     </w:p>
     <w:p>
@@ -6766,20 +6817,11 @@
       <w:r>
         <w:rPr>
           <w:rFonts w:ascii="Arial" w:cs="Arial" w:eastAsia="Arial" w:hAnsi="Arial"/>
-          <w:color w:val="64748B"/>
-          <w:sz w:val="18"/>
-          <w:szCs w:val="18"/>
-        </w:rPr>
-        <w:t xml:space="preserve">Year: 2012  |  Publisher: Research Innovation Award — Business Innovation Center (BIC), Indonesia</w:t>
-      </w:r>
-      <w:r>
-        <w:rPr>
-          <w:rFonts w:ascii="Arial" w:cs="Arial" w:eastAsia="Arial" w:hAnsi="Arial"/>
-          <w:color w:val="0D9488"/>
-          <w:sz w:val="18"/>
-          <w:szCs w:val="18"/>
-        </w:rPr>
-        <w:t xml:space="preserve">  |  Link: https://www.antaranews.com/berita/342159/mahasiswa-ipb-temukan-cara-deteksi-produktivitas-ikan</w:t>
+          <w:color w:val="1E293B"/>
+          <w:sz w:val="18"/>
+          <w:szCs w:val="18"/>
+        </w:rPr>
+        <w:t xml:space="preserve">Summary: Undergraduate research in marine geophysics and seismic data processing applying Radon Transform (Tau-P Analysis) to attenuate surface multiples on 2D marine seismic line SUME23.31 in West Sumatra waters.</w:t>
       </w:r>
     </w:p>
     <w:p>
@@ -6795,7 +6837,30 @@
           <w:sz w:val="20"/>
           <w:szCs w:val="20"/>
         </w:rPr>
-        <w:t xml:space="preserve">4. Investigation on Salinity, Turbidity, and Total Suspended Solid (TSS) in Cimandiri River and Its Impact on Marine Environment</w:t>
+        <w:t xml:space="preserve">4. Sound of Fish Affects Fish Productivity</w:t>
+      </w:r>
+    </w:p>
+    <w:p>
+      <w:pPr>
+        <w:spacing w:after="20" w:before="0"/>
+      </w:pPr>
+      <w:r>
+        <w:rPr>
+          <w:rFonts w:ascii="Arial" w:cs="Arial" w:eastAsia="Arial" w:hAnsi="Arial"/>
+          <w:color w:val="64748B"/>
+          <w:sz w:val="18"/>
+          <w:szCs w:val="18"/>
+        </w:rPr>
+        <w:t xml:space="preserve">Year: 2012  |  Publisher: Research Innovation Award — Business Innovation Center (BIC), Indonesia</w:t>
+      </w:r>
+      <w:r>
+        <w:rPr>
+          <w:rFonts w:ascii="Arial" w:cs="Arial" w:eastAsia="Arial" w:hAnsi="Arial"/>
+          <w:color w:val="0D9488"/>
+          <w:sz w:val="18"/>
+          <w:szCs w:val="18"/>
+        </w:rPr>
+        <w:t xml:space="preserve">  |  Link: https://www.antaranews.com/berita/342159/mahasiswa-ipb-temukan-cara-deteksi-produktivitas-ikan</w:t>
       </w:r>
     </w:p>
     <w:p>
@@ -6805,6 +6870,36 @@
       <w:r>
         <w:rPr>
           <w:rFonts w:ascii="Arial" w:cs="Arial" w:eastAsia="Arial" w:hAnsi="Arial"/>
+          <w:color w:val="1E293B"/>
+          <w:sz w:val="18"/>
+          <w:szCs w:val="18"/>
+        </w:rPr>
+        <w:t xml:space="preserve">Summary: National award-winning research innovation on passive acoustic detection and bioacoustic monitoring for fish productivity.</w:t>
+      </w:r>
+    </w:p>
+    <w:p>
+      <w:pPr>
+        <w:spacing w:after="20" w:before="80"/>
+      </w:pPr>
+      <w:r>
+        <w:rPr>
+          <w:rFonts w:ascii="Arial" w:cs="Arial" w:eastAsia="Arial" w:hAnsi="Arial"/>
+          <w:b/>
+          <w:bCs/>
+          <w:color w:val="0F3A5D"/>
+          <w:sz w:val="20"/>
+          <w:szCs w:val="20"/>
+        </w:rPr>
+        <w:t xml:space="preserve">5. Investigation on Salinity, Turbidity, and Total Suspended Solid (TSS) in Cimandiri River and Its Impact on Marine Environment</w:t>
+      </w:r>
+    </w:p>
+    <w:p>
+      <w:pPr>
+        <w:spacing w:after="20" w:before="0"/>
+      </w:pPr>
+      <w:r>
+        <w:rPr>
+          <w:rFonts w:ascii="Arial" w:cs="Arial" w:eastAsia="Arial" w:hAnsi="Arial"/>
           <w:color w:val="64748B"/>
           <w:sz w:val="18"/>
           <w:szCs w:val="18"/>
@@ -6819,6 +6914,20 @@
           <w:szCs w:val="18"/>
         </w:rPr>
         <w:t xml:space="preserve">  |  Link: https://repository.ipb.ac.id</w:t>
+      </w:r>
+    </w:p>
+    <w:p>
+      <w:pPr>
+        <w:spacing w:after="40" w:before="0"/>
+      </w:pPr>
+      <w:r>
+        <w:rPr>
+          <w:rFonts w:ascii="Arial" w:cs="Arial" w:eastAsia="Arial" w:hAnsi="Arial"/>
+          <w:color w:val="1E293B"/>
+          <w:sz w:val="18"/>
+          <w:szCs w:val="18"/>
+        </w:rPr>
+        <w:t xml:space="preserve">Summary: Estuarine and coastal water quality assessment analyzing terrestrial sediment runoff, salinity gradients, and environmental impacts on coastal ecosystems.</w:t>
       </w:r>
     </w:p>
     <w:p>

</xml_diff>

<commit_message>
Add ICAT Training on the Use of the IPCC Inventory Software to certifications, Master CV docs, and portfolio website
</commit_message>
<xml_diff>
--- a/I Gede Mahendra Wijaya_Master CV.docx
+++ b/I Gede Mahendra Wijaya_Master CV.docx
@@ -4345,7 +4345,7 @@
           <w:sz w:val="24"/>
           <w:szCs w:val="24"/>
         </w:rPr>
-        <w:t xml:space="preserve">PROFESSIONAL CERTIFICATIONS &amp; SPECIALIZED TRAINING (TOTAL: 63)</w:t>
+        <w:t xml:space="preserve">PROFESSIONAL CERTIFICATIONS &amp; SPECIALIZED TRAINING (TOTAL: 64)</w:t>
       </w:r>
     </w:p>
     <w:p>
@@ -4361,7 +4361,78 @@
           <w:sz w:val="21"/>
           <w:szCs w:val="21"/>
         </w:rPr>
-        <w:t xml:space="preserve">1. Carbon, Climate &amp; Ecosystem Services (Blue Carbon, Forest Carbon &amp; Climate Finance) (15 Programs)</w:t>
+        <w:t xml:space="preserve">1. Carbon, Climate &amp; Ecosystem Services (Blue Carbon, Forest Carbon &amp; Climate Finance) (16 Programs)</w:t>
+      </w:r>
+    </w:p>
+    <w:p>
+      <w:pPr>
+        <w:pStyle w:val="ListParagraph"/>
+        <w:numPr>
+          <w:ilvl w:val="0"/>
+          <w:numId w:val="1"/>
+        </w:numPr>
+        <w:spacing w:after="20" w:before="20"/>
+      </w:pPr>
+      <w:r>
+        <w:rPr>
+          <w:rFonts w:ascii="Arial" w:cs="Arial" w:eastAsia="Arial" w:hAnsi="Arial"/>
+          <w:b/>
+          <w:bCs/>
+          <w:color w:val="1E293B"/>
+          <w:sz w:val="19"/>
+          <w:szCs w:val="19"/>
+        </w:rPr>
+        <w:t xml:space="preserve">ICAT Training on the Use of the IPCC Inventory Software</w:t>
+      </w:r>
+      <w:r>
+        <w:rPr>
+          <w:rFonts w:ascii="Arial" w:cs="Arial" w:eastAsia="Arial" w:hAnsi="Arial"/>
+          <w:color w:val="64748B"/>
+          <w:sz w:val="18"/>
+          <w:szCs w:val="18"/>
+        </w:rPr>
+        <w:t xml:space="preserve"> — Initiative for Climate Action Transparency (ICAT), IPCC TSU &amp; UNDP Learning for Nature (Sep 2026)</w:t>
+      </w:r>
+    </w:p>
+    <w:p>
+      <w:pPr>
+        <w:spacing w:after="20" w:before="0"/>
+        <w:ind w:left="400"/>
+      </w:pPr>
+      <w:r>
+        <w:rPr>
+          <w:rFonts w:ascii="Arial" w:cs="Arial" w:eastAsia="Arial" w:hAnsi="Arial"/>
+          <w:b/>
+          <w:bCs/>
+          <w:color w:val="0D9488"/>
+          <w:sz w:val="18"/>
+          <w:szCs w:val="18"/>
+        </w:rPr>
+        <w:t xml:space="preserve">Competencies: </w:t>
+      </w:r>
+      <w:r>
+        <w:rPr>
+          <w:rFonts w:ascii="Arial" w:cs="Arial" w:eastAsia="Arial" w:hAnsi="Arial"/>
+          <w:color w:val="1E293B"/>
+          <w:sz w:val="18"/>
+          <w:szCs w:val="18"/>
+        </w:rPr>
+        <w:t xml:space="preserve">IPCC Inventory Software, 2006 IPCC Guidelines for National GHG Inventories, Enhanced Transparency Framework (ETF), LULUCF &amp; AFOLU Emission Estimation, UNFCCC ETF Reporting Tool Interoperability, Activity Data &amp; Emission Factor Management</w:t>
+      </w:r>
+    </w:p>
+    <w:p>
+      <w:pPr>
+        <w:spacing w:after="40" w:before="0"/>
+        <w:ind w:left="400"/>
+      </w:pPr>
+      <w:r>
+        <w:rPr>
+          <w:rFonts w:ascii="Arial" w:cs="Arial" w:eastAsia="Arial" w:hAnsi="Arial"/>
+          <w:color w:val="64748B"/>
+          <w:sz w:val="18"/>
+          <w:szCs w:val="18"/>
+        </w:rPr>
+        <w:t xml:space="preserve">Specialized technical training program developed by the Initiative for Climate Action Transparency (ICAT) and the IPCC Task Force on National Greenhouse Gas Inventories Technical Support Unit (IPCC TSU) on UNDP Learning for Nature. Comprehensive operational training covering all IPCC sectors (Energy, IPPU, Agriculture, LULUCF/Forestry, and Waste) to calculate national GHG emissions and removals, apply 2006 IPCC Guidelines, and ensure interoperability with the UNFCCC ETF reporting tool under the Paris Agreement.</w:t>
       </w:r>
     </w:p>
     <w:p>

</xml_diff>

<commit_message>
Add UNDP BIOFIN Biodiversity Finance certificate to MASTER_MAPPINGS, data.js, Master CV docs, and website
</commit_message>
<xml_diff>
--- a/I Gede Mahendra Wijaya_Master CV.docx
+++ b/I Gede Mahendra Wijaya_Master CV.docx
@@ -4345,7 +4345,7 @@
           <w:sz w:val="24"/>
           <w:szCs w:val="24"/>
         </w:rPr>
-        <w:t xml:space="preserve">PROFESSIONAL CERTIFICATIONS &amp; SPECIALIZED TRAINING (TOTAL: 64)</w:t>
+        <w:t xml:space="preserve">PROFESSIONAL CERTIFICATIONS &amp; SPECIALIZED TRAINING (TOTAL: 65)</w:t>
       </w:r>
     </w:p>
     <w:p>
@@ -4361,7 +4361,78 @@
           <w:sz w:val="21"/>
           <w:szCs w:val="21"/>
         </w:rPr>
-        <w:t xml:space="preserve">1. Carbon, Climate &amp; Ecosystem Services (Blue Carbon, Forest Carbon &amp; Climate Finance) (16 Programs)</w:t>
+        <w:t xml:space="preserve">1. Carbon, Climate &amp; Ecosystem Services (Blue Carbon, Forest Carbon &amp; Climate Finance) (17 Programs)</w:t>
+      </w:r>
+    </w:p>
+    <w:p>
+      <w:pPr>
+        <w:pStyle w:val="ListParagraph"/>
+        <w:numPr>
+          <w:ilvl w:val="0"/>
+          <w:numId w:val="1"/>
+        </w:numPr>
+        <w:spacing w:after="20" w:before="20"/>
+      </w:pPr>
+      <w:r>
+        <w:rPr>
+          <w:rFonts w:ascii="Arial" w:cs="Arial" w:eastAsia="Arial" w:hAnsi="Arial"/>
+          <w:b/>
+          <w:bCs/>
+          <w:color w:val="1E293B"/>
+          <w:sz w:val="19"/>
+          <w:szCs w:val="19"/>
+        </w:rPr>
+        <w:t xml:space="preserve">Biodiversity Finance: Designing and Implementing Finance Plans for Nature</w:t>
+      </w:r>
+      <w:r>
+        <w:rPr>
+          <w:rFonts w:ascii="Arial" w:cs="Arial" w:eastAsia="Arial" w:hAnsi="Arial"/>
+          <w:color w:val="64748B"/>
+          <w:sz w:val="18"/>
+          <w:szCs w:val="18"/>
+        </w:rPr>
+        <w:t xml:space="preserve"> — UNDP Biodiversity Finance Initiative (BIOFIN) &amp; Learning for Nature (Sep 2026)</w:t>
+      </w:r>
+    </w:p>
+    <w:p>
+      <w:pPr>
+        <w:spacing w:after="20" w:before="0"/>
+        <w:ind w:left="400"/>
+      </w:pPr>
+      <w:r>
+        <w:rPr>
+          <w:rFonts w:ascii="Arial" w:cs="Arial" w:eastAsia="Arial" w:hAnsi="Arial"/>
+          <w:b/>
+          <w:bCs/>
+          <w:color w:val="0D9488"/>
+          <w:sz w:val="18"/>
+          <w:szCs w:val="18"/>
+        </w:rPr>
+        <w:t xml:space="preserve">Competencies: </w:t>
+      </w:r>
+      <w:r>
+        <w:rPr>
+          <w:rFonts w:ascii="Arial" w:cs="Arial" w:eastAsia="Arial" w:hAnsi="Arial"/>
+          <w:color w:val="1E293B"/>
+          <w:sz w:val="18"/>
+          <w:szCs w:val="18"/>
+        </w:rPr>
+        <w:t xml:space="preserve">BIOFIN Methodology, Biodiversity Expenditure Review (BER), Financial Needs Assessment (FNA), Biodiversity Finance Plan (BFP), Nature-Positive Finance Mechanisms, Sustainable Blended Finance &amp; Impact Investment</w:t>
+      </w:r>
+    </w:p>
+    <w:p>
+      <w:pPr>
+        <w:spacing w:after="40" w:before="0"/>
+        <w:ind w:left="400"/>
+      </w:pPr>
+      <w:r>
+        <w:rPr>
+          <w:rFonts w:ascii="Arial" w:cs="Arial" w:eastAsia="Arial" w:hAnsi="Arial"/>
+          <w:color w:val="64748B"/>
+          <w:sz w:val="18"/>
+          <w:szCs w:val="18"/>
+        </w:rPr>
+        <w:t xml:space="preserve">Comprehensive 12-hour specialized professional course developed by the UNDP Biodiversity Finance Initiative (BIOFIN) on Learning for Nature, based on the BIOFIN Workbook 2024. Covers the complete BIOFIN national methodology: Policy and Institutional Review (PIR), Biodiversity Expenditure Review (BER), Financial Needs Assessment (FNA), and designing and mobilizing high-impact national Biodiversity Finance Plans (BFP) to close global biodiversity financing gaps.</w:t>
       </w:r>
     </w:p>
     <w:p>

</xml_diff>

<commit_message>
Map and sync new certificates: GHGMI 201 GHG Accounting & BCA Introduction to Biodiversity Credits
</commit_message>
<xml_diff>
--- a/I Gede Mahendra Wijaya_Master CV.docx
+++ b/I Gede Mahendra Wijaya_Master CV.docx
@@ -4345,7 +4345,7 @@
           <w:sz w:val="24"/>
           <w:szCs w:val="24"/>
         </w:rPr>
-        <w:t xml:space="preserve">PROFESSIONAL CERTIFICATIONS &amp; SPECIALIZED TRAINING (TOTAL: 65)</w:t>
+        <w:t xml:space="preserve">PROFESSIONAL CERTIFICATIONS &amp; SPECIALIZED TRAINING (TOTAL: 67)</w:t>
       </w:r>
     </w:p>
     <w:p>
@@ -4361,7 +4361,7 @@
           <w:sz w:val="21"/>
           <w:szCs w:val="21"/>
         </w:rPr>
-        <w:t xml:space="preserve">1. Carbon, Climate &amp; Ecosystem Services (Blue Carbon, Forest Carbon &amp; Climate Finance) (17 Programs)</w:t>
+        <w:t xml:space="preserve">1. Carbon, Climate &amp; Ecosystem Services (Blue Carbon, Forest Carbon &amp; Climate Finance) (19 Programs)</w:t>
       </w:r>
     </w:p>
     <w:p>
@@ -4382,16 +4382,16 @@
           <w:sz w:val="19"/>
           <w:szCs w:val="19"/>
         </w:rPr>
-        <w:t xml:space="preserve">Biodiversity Finance: Designing and Implementing Finance Plans for Nature</w:t>
-      </w:r>
-      <w:r>
-        <w:rPr>
-          <w:rFonts w:ascii="Arial" w:cs="Arial" w:eastAsia="Arial" w:hAnsi="Arial"/>
-          <w:color w:val="64748B"/>
-          <w:sz w:val="18"/>
-          <w:szCs w:val="18"/>
-        </w:rPr>
-        <w:t xml:space="preserve"> — UNDP Biodiversity Finance Initiative (BIOFIN) &amp; Learning for Nature (Sep 2026)</w:t>
+        <w:t xml:space="preserve">Introduction to Biodiversity Credits (Learning Journey)</w:t>
+      </w:r>
+      <w:r>
+        <w:rPr>
+          <w:rFonts w:ascii="Arial" w:cs="Arial" w:eastAsia="Arial" w:hAnsi="Arial"/>
+          <w:color w:val="64748B"/>
+          <w:sz w:val="18"/>
+          <w:szCs w:val="18"/>
+        </w:rPr>
+        <w:t xml:space="preserve"> — Biodiversity Credit Alliance (BCA), Nature for Life Hub &amp; University of Nottingham (Sep 2026)</w:t>
       </w:r>
     </w:p>
     <w:p>
@@ -4417,7 +4417,7 @@
           <w:sz w:val="18"/>
           <w:szCs w:val="18"/>
         </w:rPr>
-        <w:t xml:space="preserve">BIOFIN Methodology, Biodiversity Expenditure Review (BER), Financial Needs Assessment (FNA), Biodiversity Finance Plan (BFP), Nature-Positive Finance Mechanisms, Sustainable Blended Finance &amp; Impact Investment</w:t>
+        <w:t xml:space="preserve">Biodiversity Credits Framework, High-Integrity Nature Credits, Biodiversity Credit Alliance (BCA) Principles, Nature-Positive Market Mechanisms, Indigenous &amp; Community Rights (IPLC Safeguards), Biodiversity Metrics &amp; Monitoring</w:t>
       </w:r>
     </w:p>
     <w:p>
@@ -4432,7 +4432,7 @@
           <w:sz w:val="18"/>
           <w:szCs w:val="18"/>
         </w:rPr>
-        <w:t xml:space="preserve">Comprehensive 12-hour specialized professional course developed by the UNDP Biodiversity Finance Initiative (BIOFIN) on Learning for Nature, based on the BIOFIN Workbook 2024. Covers the complete BIOFIN national methodology: Policy and Institutional Review (PIR), Biodiversity Expenditure Review (BER), Financial Needs Assessment (FNA), and designing and mobilizing high-impact national Biodiversity Finance Plans (BFP) to close global biodiversity financing gaps.</w:t>
+        <w:t xml:space="preserve">Specialized learning journey certification on biodiversity credits awarded by the Biodiversity Credit Alliance (BCA) and Nature for Life Hub in collaboration with the University of Nottingham. Comprehensive training on high-integrity biodiversity credit markets, nature-positive crediting mechanisms, biodiversity metrics, integrity governance, and community benefit-sharing models.</w:t>
       </w:r>
     </w:p>
     <w:p>
@@ -4453,16 +4453,16 @@
           <w:sz w:val="19"/>
           <w:szCs w:val="19"/>
         </w:rPr>
-        <w:t xml:space="preserve">ICAT Training on the Use of the IPCC Inventory Software</w:t>
-      </w:r>
-      <w:r>
-        <w:rPr>
-          <w:rFonts w:ascii="Arial" w:cs="Arial" w:eastAsia="Arial" w:hAnsi="Arial"/>
-          <w:color w:val="64748B"/>
-          <w:sz w:val="18"/>
-          <w:szCs w:val="18"/>
-        </w:rPr>
-        <w:t xml:space="preserve"> — Initiative for Climate Action Transparency (ICAT), IPCC TSU &amp; UNDP Learning for Nature (Sep 2026)</w:t>
+        <w:t xml:space="preserve">Biodiversity Finance: Designing and Implementing Finance Plans for Nature</w:t>
+      </w:r>
+      <w:r>
+        <w:rPr>
+          <w:rFonts w:ascii="Arial" w:cs="Arial" w:eastAsia="Arial" w:hAnsi="Arial"/>
+          <w:color w:val="64748B"/>
+          <w:sz w:val="18"/>
+          <w:szCs w:val="18"/>
+        </w:rPr>
+        <w:t xml:space="preserve"> — UNDP Biodiversity Finance Initiative (BIOFIN) &amp; Learning for Nature (Sep 2026)</w:t>
       </w:r>
     </w:p>
     <w:p>
@@ -4488,7 +4488,7 @@
           <w:sz w:val="18"/>
           <w:szCs w:val="18"/>
         </w:rPr>
-        <w:t xml:space="preserve">IPCC Inventory Software, 2006 IPCC Guidelines for National GHG Inventories, Enhanced Transparency Framework (ETF), LULUCF &amp; AFOLU Emission Estimation, UNFCCC ETF Reporting Tool Interoperability, Activity Data &amp; Emission Factor Management</w:t>
+        <w:t xml:space="preserve">BIOFIN Methodology, Biodiversity Expenditure Review (BER), Financial Needs Assessment (FNA), Biodiversity Finance Plan (BFP), Nature-Positive Finance Mechanisms, Sustainable Blended Finance &amp; Impact Investment</w:t>
       </w:r>
     </w:p>
     <w:p>
@@ -4503,7 +4503,7 @@
           <w:sz w:val="18"/>
           <w:szCs w:val="18"/>
         </w:rPr>
-        <w:t xml:space="preserve">Specialized technical training program developed by the Initiative for Climate Action Transparency (ICAT) and the IPCC Task Force on National Greenhouse Gas Inventories Technical Support Unit (IPCC TSU) on UNDP Learning for Nature. Comprehensive operational training covering all IPCC sectors (Energy, IPPU, Agriculture, LULUCF/Forestry, and Waste) to calculate national GHG emissions and removals, apply 2006 IPCC Guidelines, and ensure interoperability with the UNFCCC ETF reporting tool under the Paris Agreement.</w:t>
+        <w:t xml:space="preserve">Comprehensive 12-hour specialized professional course developed by the UNDP Biodiversity Finance Initiative (BIOFIN) on Learning for Nature, based on the BIOFIN Workbook 2024. Covers the complete BIOFIN national methodology: Policy and Institutional Review (PIR), Biodiversity Expenditure Review (BER), Financial Needs Assessment (FNA), and designing and mobilizing high-impact national Biodiversity Finance Plans (BFP) to close global biodiversity financing gaps.</w:t>
       </w:r>
     </w:p>
     <w:p>
@@ -4524,16 +4524,16 @@
           <w:sz w:val="19"/>
           <w:szCs w:val="19"/>
         </w:rPr>
-        <w:t xml:space="preserve">REDD+ Academy: Forest Carbon &amp; National Strategy Capacity Building</w:t>
-      </w:r>
-      <w:r>
-        <w:rPr>
-          <w:rFonts w:ascii="Arial" w:cs="Arial" w:eastAsia="Arial" w:hAnsi="Arial"/>
-          <w:color w:val="64748B"/>
-          <w:sz w:val="18"/>
-          <w:szCs w:val="18"/>
-        </w:rPr>
-        <w:t xml:space="preserve"> — UN-REDD Programme (FAO, UNDP, UNEP) (Sep 2026)</w:t>
+        <w:t xml:space="preserve">ICAT Training on the Use of the IPCC Inventory Software</w:t>
+      </w:r>
+      <w:r>
+        <w:rPr>
+          <w:rFonts w:ascii="Arial" w:cs="Arial" w:eastAsia="Arial" w:hAnsi="Arial"/>
+          <w:color w:val="64748B"/>
+          <w:sz w:val="18"/>
+          <w:szCs w:val="18"/>
+        </w:rPr>
+        <w:t xml:space="preserve"> — Initiative for Climate Action Transparency (ICAT), IPCC TSU &amp; UNDP Learning for Nature (Sep 2026)</w:t>
       </w:r>
     </w:p>
     <w:p>
@@ -4559,7 +4559,7 @@
           <w:sz w:val="18"/>
           <w:szCs w:val="18"/>
         </w:rPr>
-        <w:t xml:space="preserve">REDD+ Architecture &amp; National Strategy, National Forest Monitoring Systems (NFMS), Forest Reference Emission Levels (FREL/FRL), Safeguard Information Systems (SIS), Results-Based Finance &amp; Carbon Markets</w:t>
+        <w:t xml:space="preserve">IPCC Inventory Software, 2006 IPCC Guidelines for National GHG Inventories, Enhanced Transparency Framework (ETF), LULUCF &amp; AFOLU Emission Estimation, UNFCCC ETF Reporting Tool Interoperability, Activity Data &amp; Emission Factor Management</w:t>
       </w:r>
     </w:p>
     <w:p>
@@ -4574,7 +4574,149 @@
           <w:sz w:val="18"/>
           <w:szCs w:val="18"/>
         </w:rPr>
+        <w:t xml:space="preserve">Specialized technical training program developed by the Initiative for Climate Action Transparency (ICAT) and the IPCC Task Force on National Greenhouse Gas Inventories Technical Support Unit (IPCC TSU) on UNDP Learning for Nature. Comprehensive operational training covering all IPCC sectors (Energy, IPPU, Agriculture, LULUCF/Forestry, and Waste) to calculate national GHG emissions and removals, apply 2006 IPCC Guidelines, and ensure interoperability with the UNFCCC ETF reporting tool under the Paris Agreement.</w:t>
+      </w:r>
+    </w:p>
+    <w:p>
+      <w:pPr>
+        <w:pStyle w:val="ListParagraph"/>
+        <w:numPr>
+          <w:ilvl w:val="0"/>
+          <w:numId w:val="1"/>
+        </w:numPr>
+        <w:spacing w:after="20" w:before="20"/>
+      </w:pPr>
+      <w:r>
+        <w:rPr>
+          <w:rFonts w:ascii="Arial" w:cs="Arial" w:eastAsia="Arial" w:hAnsi="Arial"/>
+          <w:b/>
+          <w:bCs/>
+          <w:color w:val="1E293B"/>
+          <w:sz w:val="19"/>
+          <w:szCs w:val="19"/>
+        </w:rPr>
+        <w:t xml:space="preserve">REDD+ Academy: Forest Carbon &amp; National Strategy Capacity Building</w:t>
+      </w:r>
+      <w:r>
+        <w:rPr>
+          <w:rFonts w:ascii="Arial" w:cs="Arial" w:eastAsia="Arial" w:hAnsi="Arial"/>
+          <w:color w:val="64748B"/>
+          <w:sz w:val="18"/>
+          <w:szCs w:val="18"/>
+        </w:rPr>
+        <w:t xml:space="preserve"> — UN-REDD Programme (FAO, UNDP, UNEP) (Sep 2026)</w:t>
+      </w:r>
+    </w:p>
+    <w:p>
+      <w:pPr>
+        <w:spacing w:after="20" w:before="0"/>
+        <w:ind w:left="400"/>
+      </w:pPr>
+      <w:r>
+        <w:rPr>
+          <w:rFonts w:ascii="Arial" w:cs="Arial" w:eastAsia="Arial" w:hAnsi="Arial"/>
+          <w:b/>
+          <w:bCs/>
+          <w:color w:val="0D9488"/>
+          <w:sz w:val="18"/>
+          <w:szCs w:val="18"/>
+        </w:rPr>
+        <w:t xml:space="preserve">Competencies: </w:t>
+      </w:r>
+      <w:r>
+        <w:rPr>
+          <w:rFonts w:ascii="Arial" w:cs="Arial" w:eastAsia="Arial" w:hAnsi="Arial"/>
+          <w:color w:val="1E293B"/>
+          <w:sz w:val="18"/>
+          <w:szCs w:val="18"/>
+        </w:rPr>
+        <w:t xml:space="preserve">REDD+ Architecture &amp; National Strategy, National Forest Monitoring Systems (NFMS), Forest Reference Emission Levels (FREL/FRL), Safeguard Information Systems (SIS), Results-Based Finance &amp; Carbon Markets</w:t>
+      </w:r>
+    </w:p>
+    <w:p>
+      <w:pPr>
+        <w:spacing w:after="40" w:before="0"/>
+        <w:ind w:left="400"/>
+      </w:pPr>
+      <w:r>
+        <w:rPr>
+          <w:rFonts w:ascii="Arial" w:cs="Arial" w:eastAsia="Arial" w:hAnsi="Arial"/>
+          <w:color w:val="64748B"/>
+          <w:sz w:val="18"/>
+          <w:szCs w:val="18"/>
+        </w:rPr>
         <w:t xml:space="preserve">Flagship capacity-building training program by the UN-REDD Programme (FAO, UNDP, UNEP), covering national REDD+ architecture, Forest Reference Emission Levels (FREL), National Forest Monitoring Systems (NFMS), Safeguards &amp; Safeguard Information Systems (SIS), and results-based climate finance.</w:t>
+      </w:r>
+    </w:p>
+    <w:p>
+      <w:pPr>
+        <w:pStyle w:val="ListParagraph"/>
+        <w:numPr>
+          <w:ilvl w:val="0"/>
+          <w:numId w:val="1"/>
+        </w:numPr>
+        <w:spacing w:after="20" w:before="20"/>
+      </w:pPr>
+      <w:r>
+        <w:rPr>
+          <w:rFonts w:ascii="Arial" w:cs="Arial" w:eastAsia="Arial" w:hAnsi="Arial"/>
+          <w:b/>
+          <w:bCs/>
+          <w:color w:val="1E293B"/>
+          <w:sz w:val="19"/>
+          <w:szCs w:val="19"/>
+        </w:rPr>
+        <w:t xml:space="preserve">201 Basics of Organizational GHG Accounting (Certificate of Proficiency)</w:t>
+      </w:r>
+      <w:r>
+        <w:rPr>
+          <w:rFonts w:ascii="Arial" w:cs="Arial" w:eastAsia="Arial" w:hAnsi="Arial"/>
+          <w:color w:val="64748B"/>
+          <w:sz w:val="18"/>
+          <w:szCs w:val="18"/>
+        </w:rPr>
+        <w:t xml:space="preserve"> — The Greenhouse Gas Management Institute (GHGMI) (Aug 2026)</w:t>
+      </w:r>
+    </w:p>
+    <w:p>
+      <w:pPr>
+        <w:spacing w:after="20" w:before="0"/>
+        <w:ind w:left="400"/>
+      </w:pPr>
+      <w:r>
+        <w:rPr>
+          <w:rFonts w:ascii="Arial" w:cs="Arial" w:eastAsia="Arial" w:hAnsi="Arial"/>
+          <w:b/>
+          <w:bCs/>
+          <w:color w:val="0D9488"/>
+          <w:sz w:val="18"/>
+          <w:szCs w:val="18"/>
+        </w:rPr>
+        <w:t xml:space="preserve">Competencies: </w:t>
+      </w:r>
+      <w:r>
+        <w:rPr>
+          <w:rFonts w:ascii="Arial" w:cs="Arial" w:eastAsia="Arial" w:hAnsi="Arial"/>
+          <w:color w:val="1E293B"/>
+          <w:sz w:val="18"/>
+          <w:szCs w:val="18"/>
+        </w:rPr>
+        <w:t xml:space="preserve">Organizational GHG Accounting, GHG Protocol Corporate Standard, ISO 14064-1, Scope 1, Scope 2 &amp; Scope 3 Emissions, Inventory Quality Management, Baseline Recalculation</w:t>
+      </w:r>
+    </w:p>
+    <w:p>
+      <w:pPr>
+        <w:spacing w:after="40" w:before="0"/>
+        <w:ind w:left="400"/>
+      </w:pPr>
+      <w:r>
+        <w:rPr>
+          <w:rFonts w:ascii="Arial" w:cs="Arial" w:eastAsia="Arial" w:hAnsi="Arial"/>
+          <w:color w:val="64748B"/>
+          <w:sz w:val="18"/>
+          <w:szCs w:val="18"/>
+        </w:rPr>
+        <w:t xml:space="preserve">Formal professional certificate of proficiency issued by the Greenhouse Gas Management Institute (GHGMI) under Dean Michael Gillenwater (Credential Code: 201EX2046 / BOGAEX2046). Rigorous curriculum covering organizational carbon accounting principles, organizational and operational boundary setting, Scope 1, 2, and 3 emission quantification methodologies, activity data collection, emission factor selection, and uncertainty management aligned with the GHG Protocol and ISO 14064.</w:t>
       </w:r>
     </w:p>
     <w:p>

</xml_diff>

<commit_message>
feat: sync curated 30 project experiences and remove irrelevant items
</commit_message>
<xml_diff>
--- a/I Gede Mahendra Wijaya_Master CV.docx
+++ b/I Gede Mahendra Wijaya_Master CV.docx
@@ -164,7 +164,7 @@
           <w:sz w:val="20"/>
           <w:szCs w:val="20"/>
         </w:rPr>
-        <w:t xml:space="preserve">30+ </w:t>
+        <w:t xml:space="preserve">30 </w:t>
       </w:r>
       <w:r>
         <w:rPr>
@@ -194,7 +194,7 @@
           <w:sz w:val="20"/>
           <w:szCs w:val="20"/>
         </w:rPr>
-        <w:t xml:space="preserve">70+ </w:t>
+        <w:t xml:space="preserve">67 </w:t>
       </w:r>
       <w:r>
         <w:rPr>
@@ -224,7 +224,7 @@
           <w:sz w:val="20"/>
           <w:szCs w:val="20"/>
         </w:rPr>
-        <w:t xml:space="preserve">15+ </w:t>
+        <w:t xml:space="preserve">5 </w:t>
       </w:r>
       <w:r>
         <w:rPr>
@@ -931,7 +931,7 @@
           <w:sz w:val="24"/>
           <w:szCs w:val="24"/>
         </w:rPr>
-        <w:t xml:space="preserve">KEY PROJECT EXPERIENCES (TOTAL: 35 PROJECTS)</w:t>
+        <w:t xml:space="preserve">KEY PROJECT EXPERIENCES (TOTAL: 30 PROJECTS)</w:t>
       </w:r>
     </w:p>
     <w:p>
@@ -3275,7 +3275,7 @@
           <w:sz w:val="20"/>
           <w:szCs w:val="20"/>
         </w:rPr>
-        <w:t xml:space="preserve">25. Marine Biodiversity Survey &amp; Ecological Monitoring in Anambas Islands Marine Tourism Park</w:t>
+        <w:t xml:space="preserve">25. Rapid Scoping Study on High-Growth Investment Opportunities in Indonesian Aquaculture</w:t>
       </w:r>
     </w:p>
     <w:p>
@@ -3300,7 +3300,7 @@
           <w:sz w:val="18"/>
           <w:szCs w:val="18"/>
         </w:rPr>
-        <w:t xml:space="preserve">PT Hatfield Indonesia / Conservation Partners  |  </w:t>
+        <w:t xml:space="preserve">PT Hatfield Indonesia / Aquaculture Development Partners  |  </w:t>
       </w:r>
       <w:r>
         <w:rPr>
@@ -3320,7 +3320,7 @@
           <w:sz w:val="18"/>
           <w:szCs w:val="18"/>
         </w:rPr>
-        <w:t xml:space="preserve">2019 - 2021  |  </w:t>
+        <w:t xml:space="preserve">2020 - 2021  |  </w:t>
       </w:r>
       <w:r>
         <w:rPr>
@@ -3342,7 +3342,7 @@
           <w:sz w:val="18"/>
           <w:szCs w:val="18"/>
         </w:rPr>
-        <w:t xml:space="preserve">MARINE</w:t>
+        <w:t xml:space="preserve">AQUACULTURE</w:t>
       </w:r>
     </w:p>
     <w:p>
@@ -3356,7 +3356,7 @@
           <w:sz w:val="19"/>
           <w:szCs w:val="19"/>
         </w:rPr>
-        <w:t xml:space="preserve">Conducted comprehensive marine biodiversity assessments, underwater visual census (UVC) for coral reef benthic cover and reef fish biomass, and megafauna habitat surveys across the remote Anambas Islands Marine Tourism Park (TWP Anambas).</w:t>
+        <w:t xml:space="preserve">Delivered a strategic scoping assessment analyzing bankable investment opportunities, technological scalability, biosecurity risks, and environmental sustainability in Indonesia's brackish water shrimp, marine finfish, and seaweed aquaculture sectors.</w:t>
       </w:r>
     </w:p>
     <w:p>
@@ -3372,7 +3372,7 @@
           <w:sz w:val="20"/>
           <w:szCs w:val="20"/>
         </w:rPr>
-        <w:t xml:space="preserve">26. Rapid Scoping Study on High-Growth Investment Opportunities in Indonesian Aquaculture</w:t>
+        <w:t xml:space="preserve">26. Sectoral Review of Indonesian Tuna Purse Seine Fisheries for FIP &amp; MSC Readiness</w:t>
       </w:r>
     </w:p>
     <w:p>
@@ -3397,7 +3397,7 @@
           <w:sz w:val="18"/>
           <w:szCs w:val="18"/>
         </w:rPr>
-        <w:t xml:space="preserve">PT Hatfield Indonesia / Aquaculture Development Partners  |  </w:t>
+        <w:t xml:space="preserve">PT Hatfield Indonesia / FIP Partners  |  </w:t>
       </w:r>
       <w:r>
         <w:rPr>
@@ -3417,7 +3417,7 @@
           <w:sz w:val="18"/>
           <w:szCs w:val="18"/>
         </w:rPr>
-        <w:t xml:space="preserve">2020 - 2021  |  </w:t>
+        <w:t xml:space="preserve">2020 - 2022  |  </w:t>
       </w:r>
       <w:r>
         <w:rPr>
@@ -3439,7 +3439,7 @@
           <w:sz w:val="18"/>
           <w:szCs w:val="18"/>
         </w:rPr>
-        <w:t xml:space="preserve">AQUACULTURE</w:t>
+        <w:t xml:space="preserve">MARINE</w:t>
       </w:r>
     </w:p>
     <w:p>
@@ -3453,7 +3453,7 @@
           <w:sz w:val="19"/>
           <w:szCs w:val="19"/>
         </w:rPr>
-        <w:t xml:space="preserve">Delivered a strategic scoping assessment analyzing bankable investment opportunities, technological scalability, biosecurity risks, and environmental sustainability in Indonesia's brackish water shrimp, marine finfish, and seaweed aquaculture sectors.</w:t>
+        <w:t xml:space="preserve">Conducted a detailed technical review and Marine Stewardship Council (MSC) pre-assessment of Indonesia's industrial and semi-industrial tuna purse seine fleet, developing time-bound Action Plans for harvest strategy compliance, FAD management, and bycatch reduction.</w:t>
       </w:r>
     </w:p>
     <w:p>
@@ -3469,7 +3469,7 @@
           <w:sz w:val="20"/>
           <w:szCs w:val="20"/>
         </w:rPr>
-        <w:t xml:space="preserve">27. Sectoral Review of Indonesian Tuna Purse Seine Fisheries for FIP &amp; MSC Readiness</w:t>
+        <w:t xml:space="preserve">27. Environmental and Social Impact Assessment (ESIA) for Kendari Eco-Fishing Port Modernization</w:t>
       </w:r>
     </w:p>
     <w:p>
@@ -3494,7 +3494,7 @@
           <w:sz w:val="18"/>
           <w:szCs w:val="18"/>
         </w:rPr>
-        <w:t xml:space="preserve">PT Hatfield Indonesia / FIP Partners  |  </w:t>
+        <w:t xml:space="preserve">Agence Française de Développement (AFD) / PT Hatfield Indonesia  |  </w:t>
       </w:r>
       <w:r>
         <w:rPr>
@@ -3514,7 +3514,7 @@
           <w:sz w:val="18"/>
           <w:szCs w:val="18"/>
         </w:rPr>
-        <w:t xml:space="preserve">2020 - 2022  |  </w:t>
+        <w:t xml:space="preserve">2021 - 2022  |  </w:t>
       </w:r>
       <w:r>
         <w:rPr>
@@ -3536,7 +3536,7 @@
           <w:sz w:val="18"/>
           <w:szCs w:val="18"/>
         </w:rPr>
-        <w:t xml:space="preserve">MARINE</w:t>
+        <w:t xml:space="preserve">ENVIRONMENT</w:t>
       </w:r>
     </w:p>
     <w:p>
@@ -3550,7 +3550,7 @@
           <w:sz w:val="19"/>
           <w:szCs w:val="19"/>
         </w:rPr>
-        <w:t xml:space="preserve">Conducted a detailed technical review and Marine Stewardship Council (MSC) pre-assessment of Indonesia's industrial and semi-industrial tuna purse seine fleet, developing time-bound Action Plans for harvest strategy compliance, FAD management, and bycatch reduction.</w:t>
+        <w:t xml:space="preserve">Authored the full Environmental and Social Impact Assessment (ESIA), Environmental and Social Management Plan (ESMP), and Stakeholder Engagement Plan (SEP) for the major modernization and infrastructure expansion of PPS Kendari funded by AFD.</w:t>
       </w:r>
     </w:p>
     <w:p>
@@ -3566,7 +3566,7 @@
           <w:sz w:val="20"/>
           <w:szCs w:val="20"/>
         </w:rPr>
-        <w:t xml:space="preserve">28. Feasibility Assessment and Wildlife Protection Mechanisms for Lucipara Atolls</w:t>
+        <w:t xml:space="preserve">28. World Bank Coral Bond IPF: Marine Law Enforcement &amp; Surveillance Capacity Assessment</w:t>
       </w:r>
     </w:p>
     <w:p>
@@ -3591,7 +3591,7 @@
           <w:sz w:val="18"/>
           <w:szCs w:val="18"/>
         </w:rPr>
-        <w:t xml:space="preserve">PT Hatfield Indonesia / Marine Conservation Partners  |  </w:t>
+        <w:t xml:space="preserve">World Bank Group / PT Hatfield Indonesia  |  </w:t>
       </w:r>
       <w:r>
         <w:rPr>
@@ -3611,7 +3611,7 @@
           <w:sz w:val="18"/>
           <w:szCs w:val="18"/>
         </w:rPr>
-        <w:t xml:space="preserve">2019 - 2021  |  </w:t>
+        <w:t xml:space="preserve">2021 - 2022  |  </w:t>
       </w:r>
       <w:r>
         <w:rPr>
@@ -3647,7 +3647,7 @@
           <w:sz w:val="19"/>
           <w:szCs w:val="19"/>
         </w:rPr>
-        <w:t xml:space="preserve">Formulated conservation options, ecological baseline reviews, and legal governance mechanisms for the protection of critical nesting seabird colonies, sea turtle rookeries, and pristine coral atoll ecosystems in the remote Lucipara and Penyu Islands (Banda Sea).</w:t>
+        <w:t xml:space="preserve">Conducted a national institutional capacity assessment on maritime surveillance, monitoring, control, and surveillance (MCS) infrastructure, and judicial enforcement across priority Marine Protected Areas supporting the design of the World Bank Coral Bond Investment Project Financing (IPF).</w:t>
       </w:r>
     </w:p>
     <w:p>
@@ -3663,7 +3663,7 @@
           <w:sz w:val="20"/>
           <w:szCs w:val="20"/>
         </w:rPr>
-        <w:t xml:space="preserve">29. National Policy Note on Sustainable Coastal Governance &amp; Blue Investment Opportunities</w:t>
+        <w:t xml:space="preserve">29. Socio-Economic Baseline, Gender Action Plan &amp; Stakeholder Impact Analysis for PPS Cilacap</w:t>
       </w:r>
     </w:p>
     <w:p>
@@ -3688,7 +3688,7 @@
           <w:sz w:val="18"/>
           <w:szCs w:val="18"/>
         </w:rPr>
-        <w:t xml:space="preserve">PT Hatfield Indonesia / Policy Partners  |  </w:t>
+        <w:t xml:space="preserve">AFD / PT Hatfield Indonesia  |  </w:t>
       </w:r>
       <w:r>
         <w:rPr>
@@ -3730,7 +3730,7 @@
           <w:sz w:val="18"/>
           <w:szCs w:val="18"/>
         </w:rPr>
-        <w:t xml:space="preserve">MARINE</w:t>
+        <w:t xml:space="preserve">ENVIRONMENT</w:t>
       </w:r>
     </w:p>
     <w:p>
@@ -3744,7 +3744,7 @@
           <w:sz w:val="19"/>
           <w:szCs w:val="19"/>
         </w:rPr>
-        <w:t xml:space="preserve">Authored a high-level policy review synthesizing national coastal legislation (UU 27/2007, UU 1/2014), integrated coastal zone management (ICZM) frameworks, and institutional barriers to unlock sustainable blue finance for coastal ecosystem conservation in Indonesia.</w:t>
+        <w:t xml:space="preserve">Executed extensive socio-economic field surveys, gender vulnerability analyses, and stakeholder consultation matrices for the modernization of Cilacap Oceanic Fishing Port (PPS Cilacap), formulating inclusive resettlement frameworks and women-empowerment livelihood strategies.</w:t>
       </w:r>
     </w:p>
     <w:p>
@@ -3760,492 +3760,7 @@
           <w:sz w:val="20"/>
           <w:szCs w:val="20"/>
         </w:rPr>
-        <w:t xml:space="preserve">30. Oceans MDTF Analytical Report: Gap Analysis of Public-Private Partnerships in Alor MPA</w:t>
-      </w:r>
-    </w:p>
-    <w:p>
-      <w:pPr>
-        <w:spacing w:after="30" w:before="0"/>
-      </w:pPr>
-      <w:r>
-        <w:rPr>
-          <w:rFonts w:ascii="Arial" w:cs="Arial" w:eastAsia="Arial" w:hAnsi="Arial"/>
-          <w:b/>
-          <w:bCs/>
-          <w:color w:val="1E293B"/>
-          <w:sz w:val="18"/>
-          <w:szCs w:val="18"/>
-        </w:rPr>
-        <w:t xml:space="preserve">Client/Partner: </w:t>
-      </w:r>
-      <w:r>
-        <w:rPr>
-          <w:rFonts w:ascii="Arial" w:cs="Arial" w:eastAsia="Arial" w:hAnsi="Arial"/>
-          <w:color w:val="0D9488"/>
-          <w:sz w:val="18"/>
-          <w:szCs w:val="18"/>
-        </w:rPr>
-        <w:t xml:space="preserve">Oceans MDTF / World Bank / PT Hatfield Indonesia  |  </w:t>
-      </w:r>
-      <w:r>
-        <w:rPr>
-          <w:rFonts w:ascii="Arial" w:cs="Arial" w:eastAsia="Arial" w:hAnsi="Arial"/>
-          <w:b/>
-          <w:bCs/>
-          <w:color w:val="1E293B"/>
-          <w:sz w:val="18"/>
-          <w:szCs w:val="18"/>
-        </w:rPr>
-        <w:t xml:space="preserve">Period: </w:t>
-      </w:r>
-      <w:r>
-        <w:rPr>
-          <w:rFonts w:ascii="Arial" w:cs="Arial" w:eastAsia="Arial" w:hAnsi="Arial"/>
-          <w:color w:val="64748B"/>
-          <w:sz w:val="18"/>
-          <w:szCs w:val="18"/>
-        </w:rPr>
-        <w:t xml:space="preserve">2021 - 2022  |  </w:t>
-      </w:r>
-      <w:r>
-        <w:rPr>
-          <w:rFonts w:ascii="Arial" w:cs="Arial" w:eastAsia="Arial" w:hAnsi="Arial"/>
-          <w:b/>
-          <w:bCs/>
-          <w:color w:val="1E293B"/>
-          <w:sz w:val="18"/>
-          <w:szCs w:val="18"/>
-        </w:rPr>
-        <w:t xml:space="preserve">Category: </w:t>
-      </w:r>
-      <w:r>
-        <w:rPr>
-          <w:rFonts w:ascii="Arial" w:cs="Arial" w:eastAsia="Arial" w:hAnsi="Arial"/>
-          <w:b/>
-          <w:bCs/>
-          <w:color w:val="0F3A5D"/>
-          <w:sz w:val="18"/>
-          <w:szCs w:val="18"/>
-        </w:rPr>
-        <w:t xml:space="preserve">MARINE</w:t>
-      </w:r>
-    </w:p>
-    <w:p>
-      <w:pPr>
-        <w:spacing w:after="100" w:before="0"/>
-      </w:pPr>
-      <w:r>
-        <w:rPr>
-          <w:rFonts w:ascii="Arial" w:cs="Arial" w:eastAsia="Arial" w:hAnsi="Arial"/>
-          <w:color w:val="1E293B"/>
-          <w:sz w:val="19"/>
-          <w:szCs w:val="19"/>
-        </w:rPr>
-        <w:t xml:space="preserve">Conducted an institutional and legal gap analysis of Public-Private Partnership (PPP) and co-management financing models for the Alor Marine Protected Area (KKPD Alor), evaluating revenue-generation mechanisms, dive tourism fees, and customary marine tenure (Molo) integration.</w:t>
-      </w:r>
-    </w:p>
-    <w:p>
-      <w:pPr>
-        <w:spacing w:after="20" w:before="100"/>
-      </w:pPr>
-      <w:r>
-        <w:rPr>
-          <w:rFonts w:ascii="Arial" w:cs="Arial" w:eastAsia="Arial" w:hAnsi="Arial"/>
-          <w:b/>
-          <w:bCs/>
-          <w:color w:val="0F3A5D"/>
-          <w:sz w:val="20"/>
-          <w:szCs w:val="20"/>
-        </w:rPr>
-        <w:t xml:space="preserve">31. Diagnostic Study on Gaps &amp; Implementation Challenges of RZWP3K Coastal Zoning in NTT</w:t>
-      </w:r>
-    </w:p>
-    <w:p>
-      <w:pPr>
-        <w:spacing w:after="30" w:before="0"/>
-      </w:pPr>
-      <w:r>
-        <w:rPr>
-          <w:rFonts w:ascii="Arial" w:cs="Arial" w:eastAsia="Arial" w:hAnsi="Arial"/>
-          <w:b/>
-          <w:bCs/>
-          <w:color w:val="1E293B"/>
-          <w:sz w:val="18"/>
-          <w:szCs w:val="18"/>
-        </w:rPr>
-        <w:t xml:space="preserve">Client/Partner: </w:t>
-      </w:r>
-      <w:r>
-        <w:rPr>
-          <w:rFonts w:ascii="Arial" w:cs="Arial" w:eastAsia="Arial" w:hAnsi="Arial"/>
-          <w:color w:val="0D9488"/>
-          <w:sz w:val="18"/>
-          <w:szCs w:val="18"/>
-        </w:rPr>
-        <w:t xml:space="preserve">PT Hatfield Indonesia / Regional Coastal Partners  |  </w:t>
-      </w:r>
-      <w:r>
-        <w:rPr>
-          <w:rFonts w:ascii="Arial" w:cs="Arial" w:eastAsia="Arial" w:hAnsi="Arial"/>
-          <w:b/>
-          <w:bCs/>
-          <w:color w:val="1E293B"/>
-          <w:sz w:val="18"/>
-          <w:szCs w:val="18"/>
-        </w:rPr>
-        <w:t xml:space="preserve">Period: </w:t>
-      </w:r>
-      <w:r>
-        <w:rPr>
-          <w:rFonts w:ascii="Arial" w:cs="Arial" w:eastAsia="Arial" w:hAnsi="Arial"/>
-          <w:color w:val="64748B"/>
-          <w:sz w:val="18"/>
-          <w:szCs w:val="18"/>
-        </w:rPr>
-        <w:t xml:space="preserve">2020 - 2022  |  </w:t>
-      </w:r>
-      <w:r>
-        <w:rPr>
-          <w:rFonts w:ascii="Arial" w:cs="Arial" w:eastAsia="Arial" w:hAnsi="Arial"/>
-          <w:b/>
-          <w:bCs/>
-          <w:color w:val="1E293B"/>
-          <w:sz w:val="18"/>
-          <w:szCs w:val="18"/>
-        </w:rPr>
-        <w:t xml:space="preserve">Category: </w:t>
-      </w:r>
-      <w:r>
-        <w:rPr>
-          <w:rFonts w:ascii="Arial" w:cs="Arial" w:eastAsia="Arial" w:hAnsi="Arial"/>
-          <w:b/>
-          <w:bCs/>
-          <w:color w:val="0F3A5D"/>
-          <w:sz w:val="18"/>
-          <w:szCs w:val="18"/>
-        </w:rPr>
-        <w:t xml:space="preserve">MARINE</w:t>
-      </w:r>
-    </w:p>
-    <w:p>
-      <w:pPr>
-        <w:spacing w:after="100" w:before="0"/>
-      </w:pPr>
-      <w:r>
-        <w:rPr>
-          <w:rFonts w:ascii="Arial" w:cs="Arial" w:eastAsia="Arial" w:hAnsi="Arial"/>
-          <w:color w:val="1E293B"/>
-          <w:sz w:val="19"/>
-          <w:szCs w:val="19"/>
-        </w:rPr>
-        <w:t xml:space="preserve">Delivered a diagnostic study examining regulatory conflicts, spatial data incongruities, and inter-agency enforcement bottlenecks in implementing the Provincial Coastal and Small Islands Zoning Plan (RZWP-3-K) across East Nusa Tenggara (NTT) Province.</w:t>
-      </w:r>
-    </w:p>
-    <w:p>
-      <w:pPr>
-        <w:spacing w:after="20" w:before="100"/>
-      </w:pPr>
-      <w:r>
-        <w:rPr>
-          <w:rFonts w:ascii="Arial" w:cs="Arial" w:eastAsia="Arial" w:hAnsi="Arial"/>
-          <w:b/>
-          <w:bCs/>
-          <w:color w:val="0F3A5D"/>
-          <w:sz w:val="20"/>
-          <w:szCs w:val="20"/>
-        </w:rPr>
-        <w:t xml:space="preserve">32. Environmental and Social Impact Assessment (ESIA) for Kendari Eco-Fishing Port Modernization</w:t>
-      </w:r>
-    </w:p>
-    <w:p>
-      <w:pPr>
-        <w:spacing w:after="30" w:before="0"/>
-      </w:pPr>
-      <w:r>
-        <w:rPr>
-          <w:rFonts w:ascii="Arial" w:cs="Arial" w:eastAsia="Arial" w:hAnsi="Arial"/>
-          <w:b/>
-          <w:bCs/>
-          <w:color w:val="1E293B"/>
-          <w:sz w:val="18"/>
-          <w:szCs w:val="18"/>
-        </w:rPr>
-        <w:t xml:space="preserve">Client/Partner: </w:t>
-      </w:r>
-      <w:r>
-        <w:rPr>
-          <w:rFonts w:ascii="Arial" w:cs="Arial" w:eastAsia="Arial" w:hAnsi="Arial"/>
-          <w:color w:val="0D9488"/>
-          <w:sz w:val="18"/>
-          <w:szCs w:val="18"/>
-        </w:rPr>
-        <w:t xml:space="preserve">Agence Française de Développement (AFD) / PT Hatfield Indonesia  |  </w:t>
-      </w:r>
-      <w:r>
-        <w:rPr>
-          <w:rFonts w:ascii="Arial" w:cs="Arial" w:eastAsia="Arial" w:hAnsi="Arial"/>
-          <w:b/>
-          <w:bCs/>
-          <w:color w:val="1E293B"/>
-          <w:sz w:val="18"/>
-          <w:szCs w:val="18"/>
-        </w:rPr>
-        <w:t xml:space="preserve">Period: </w:t>
-      </w:r>
-      <w:r>
-        <w:rPr>
-          <w:rFonts w:ascii="Arial" w:cs="Arial" w:eastAsia="Arial" w:hAnsi="Arial"/>
-          <w:color w:val="64748B"/>
-          <w:sz w:val="18"/>
-          <w:szCs w:val="18"/>
-        </w:rPr>
-        <w:t xml:space="preserve">2021 - 2022  |  </w:t>
-      </w:r>
-      <w:r>
-        <w:rPr>
-          <w:rFonts w:ascii="Arial" w:cs="Arial" w:eastAsia="Arial" w:hAnsi="Arial"/>
-          <w:b/>
-          <w:bCs/>
-          <w:color w:val="1E293B"/>
-          <w:sz w:val="18"/>
-          <w:szCs w:val="18"/>
-        </w:rPr>
-        <w:t xml:space="preserve">Category: </w:t>
-      </w:r>
-      <w:r>
-        <w:rPr>
-          <w:rFonts w:ascii="Arial" w:cs="Arial" w:eastAsia="Arial" w:hAnsi="Arial"/>
-          <w:b/>
-          <w:bCs/>
-          <w:color w:val="0F3A5D"/>
-          <w:sz w:val="18"/>
-          <w:szCs w:val="18"/>
-        </w:rPr>
-        <w:t xml:space="preserve">ENVIRONMENT</w:t>
-      </w:r>
-    </w:p>
-    <w:p>
-      <w:pPr>
-        <w:spacing w:after="100" w:before="0"/>
-      </w:pPr>
-      <w:r>
-        <w:rPr>
-          <w:rFonts w:ascii="Arial" w:cs="Arial" w:eastAsia="Arial" w:hAnsi="Arial"/>
-          <w:color w:val="1E293B"/>
-          <w:sz w:val="19"/>
-          <w:szCs w:val="19"/>
-        </w:rPr>
-        <w:t xml:space="preserve">Authored the full Environmental and Social Impact Assessment (ESIA), Environmental and Social Management Plan (ESMP), and Stakeholder Engagement Plan (SEP) for the major modernization and infrastructure expansion of PPS Kendari funded by AFD.</w:t>
-      </w:r>
-    </w:p>
-    <w:p>
-      <w:pPr>
-        <w:spacing w:after="20" w:before="100"/>
-      </w:pPr>
-      <w:r>
-        <w:rPr>
-          <w:rFonts w:ascii="Arial" w:cs="Arial" w:eastAsia="Arial" w:hAnsi="Arial"/>
-          <w:b/>
-          <w:bCs/>
-          <w:color w:val="0F3A5D"/>
-          <w:sz w:val="20"/>
-          <w:szCs w:val="20"/>
-        </w:rPr>
-        <w:t xml:space="preserve">33. World Bank Coral Bond IPF: Marine Law Enforcement &amp; Surveillance Capacity Assessment</w:t>
-      </w:r>
-    </w:p>
-    <w:p>
-      <w:pPr>
-        <w:spacing w:after="30" w:before="0"/>
-      </w:pPr>
-      <w:r>
-        <w:rPr>
-          <w:rFonts w:ascii="Arial" w:cs="Arial" w:eastAsia="Arial" w:hAnsi="Arial"/>
-          <w:b/>
-          <w:bCs/>
-          <w:color w:val="1E293B"/>
-          <w:sz w:val="18"/>
-          <w:szCs w:val="18"/>
-        </w:rPr>
-        <w:t xml:space="preserve">Client/Partner: </w:t>
-      </w:r>
-      <w:r>
-        <w:rPr>
-          <w:rFonts w:ascii="Arial" w:cs="Arial" w:eastAsia="Arial" w:hAnsi="Arial"/>
-          <w:color w:val="0D9488"/>
-          <w:sz w:val="18"/>
-          <w:szCs w:val="18"/>
-        </w:rPr>
-        <w:t xml:space="preserve">World Bank Group / PT Hatfield Indonesia  |  </w:t>
-      </w:r>
-      <w:r>
-        <w:rPr>
-          <w:rFonts w:ascii="Arial" w:cs="Arial" w:eastAsia="Arial" w:hAnsi="Arial"/>
-          <w:b/>
-          <w:bCs/>
-          <w:color w:val="1E293B"/>
-          <w:sz w:val="18"/>
-          <w:szCs w:val="18"/>
-        </w:rPr>
-        <w:t xml:space="preserve">Period: </w:t>
-      </w:r>
-      <w:r>
-        <w:rPr>
-          <w:rFonts w:ascii="Arial" w:cs="Arial" w:eastAsia="Arial" w:hAnsi="Arial"/>
-          <w:color w:val="64748B"/>
-          <w:sz w:val="18"/>
-          <w:szCs w:val="18"/>
-        </w:rPr>
-        <w:t xml:space="preserve">2021 - 2022  |  </w:t>
-      </w:r>
-      <w:r>
-        <w:rPr>
-          <w:rFonts w:ascii="Arial" w:cs="Arial" w:eastAsia="Arial" w:hAnsi="Arial"/>
-          <w:b/>
-          <w:bCs/>
-          <w:color w:val="1E293B"/>
-          <w:sz w:val="18"/>
-          <w:szCs w:val="18"/>
-        </w:rPr>
-        <w:t xml:space="preserve">Category: </w:t>
-      </w:r>
-      <w:r>
-        <w:rPr>
-          <w:rFonts w:ascii="Arial" w:cs="Arial" w:eastAsia="Arial" w:hAnsi="Arial"/>
-          <w:b/>
-          <w:bCs/>
-          <w:color w:val="0F3A5D"/>
-          <w:sz w:val="18"/>
-          <w:szCs w:val="18"/>
-        </w:rPr>
-        <w:t xml:space="preserve">MARINE</w:t>
-      </w:r>
-    </w:p>
-    <w:p>
-      <w:pPr>
-        <w:spacing w:after="100" w:before="0"/>
-      </w:pPr>
-      <w:r>
-        <w:rPr>
-          <w:rFonts w:ascii="Arial" w:cs="Arial" w:eastAsia="Arial" w:hAnsi="Arial"/>
-          <w:color w:val="1E293B"/>
-          <w:sz w:val="19"/>
-          <w:szCs w:val="19"/>
-        </w:rPr>
-        <w:t xml:space="preserve">Conducted a national institutional capacity assessment on maritime surveillance, monitoring, control, and surveillance (MCS) infrastructure, and judicial enforcement across priority Marine Protected Areas supporting the design of the World Bank Coral Bond Investment Project Financing (IPF).</w:t>
-      </w:r>
-    </w:p>
-    <w:p>
-      <w:pPr>
-        <w:spacing w:after="20" w:before="100"/>
-      </w:pPr>
-      <w:r>
-        <w:rPr>
-          <w:rFonts w:ascii="Arial" w:cs="Arial" w:eastAsia="Arial" w:hAnsi="Arial"/>
-          <w:b/>
-          <w:bCs/>
-          <w:color w:val="0F3A5D"/>
-          <w:sz w:val="20"/>
-          <w:szCs w:val="20"/>
-        </w:rPr>
-        <w:t xml:space="preserve">34. Socio-Economic Baseline, Gender Action Plan &amp; Stakeholder Impact Analysis for PPS Cilacap</w:t>
-      </w:r>
-    </w:p>
-    <w:p>
-      <w:pPr>
-        <w:spacing w:after="30" w:before="0"/>
-      </w:pPr>
-      <w:r>
-        <w:rPr>
-          <w:rFonts w:ascii="Arial" w:cs="Arial" w:eastAsia="Arial" w:hAnsi="Arial"/>
-          <w:b/>
-          <w:bCs/>
-          <w:color w:val="1E293B"/>
-          <w:sz w:val="18"/>
-          <w:szCs w:val="18"/>
-        </w:rPr>
-        <w:t xml:space="preserve">Client/Partner: </w:t>
-      </w:r>
-      <w:r>
-        <w:rPr>
-          <w:rFonts w:ascii="Arial" w:cs="Arial" w:eastAsia="Arial" w:hAnsi="Arial"/>
-          <w:color w:val="0D9488"/>
-          <w:sz w:val="18"/>
-          <w:szCs w:val="18"/>
-        </w:rPr>
-        <w:t xml:space="preserve">AFD / PT Hatfield Indonesia  |  </w:t>
-      </w:r>
-      <w:r>
-        <w:rPr>
-          <w:rFonts w:ascii="Arial" w:cs="Arial" w:eastAsia="Arial" w:hAnsi="Arial"/>
-          <w:b/>
-          <w:bCs/>
-          <w:color w:val="1E293B"/>
-          <w:sz w:val="18"/>
-          <w:szCs w:val="18"/>
-        </w:rPr>
-        <w:t xml:space="preserve">Period: </w:t>
-      </w:r>
-      <w:r>
-        <w:rPr>
-          <w:rFonts w:ascii="Arial" w:cs="Arial" w:eastAsia="Arial" w:hAnsi="Arial"/>
-          <w:color w:val="64748B"/>
-          <w:sz w:val="18"/>
-          <w:szCs w:val="18"/>
-        </w:rPr>
-        <w:t xml:space="preserve">2021 - 2022  |  </w:t>
-      </w:r>
-      <w:r>
-        <w:rPr>
-          <w:rFonts w:ascii="Arial" w:cs="Arial" w:eastAsia="Arial" w:hAnsi="Arial"/>
-          <w:b/>
-          <w:bCs/>
-          <w:color w:val="1E293B"/>
-          <w:sz w:val="18"/>
-          <w:szCs w:val="18"/>
-        </w:rPr>
-        <w:t xml:space="preserve">Category: </w:t>
-      </w:r>
-      <w:r>
-        <w:rPr>
-          <w:rFonts w:ascii="Arial" w:cs="Arial" w:eastAsia="Arial" w:hAnsi="Arial"/>
-          <w:b/>
-          <w:bCs/>
-          <w:color w:val="0F3A5D"/>
-          <w:sz w:val="18"/>
-          <w:szCs w:val="18"/>
-        </w:rPr>
-        <w:t xml:space="preserve">ENVIRONMENT</w:t>
-      </w:r>
-    </w:p>
-    <w:p>
-      <w:pPr>
-        <w:spacing w:after="100" w:before="0"/>
-      </w:pPr>
-      <w:r>
-        <w:rPr>
-          <w:rFonts w:ascii="Arial" w:cs="Arial" w:eastAsia="Arial" w:hAnsi="Arial"/>
-          <w:color w:val="1E293B"/>
-          <w:sz w:val="19"/>
-          <w:szCs w:val="19"/>
-        </w:rPr>
-        <w:t xml:space="preserve">Executed extensive socio-economic field surveys, gender vulnerability analyses, and stakeholder consultation matrices for the modernization of Cilacap Oceanic Fishing Port (PPS Cilacap), formulating inclusive resettlement frameworks and women-empowerment livelihood strategies.</w:t>
-      </w:r>
-    </w:p>
-    <w:p>
-      <w:pPr>
-        <w:spacing w:after="20" w:before="100"/>
-      </w:pPr>
-      <w:r>
-        <w:rPr>
-          <w:rFonts w:ascii="Arial" w:cs="Arial" w:eastAsia="Arial" w:hAnsi="Arial"/>
-          <w:b/>
-          <w:bCs/>
-          <w:color w:val="0F3A5D"/>
-          <w:sz w:val="20"/>
-          <w:szCs w:val="20"/>
-        </w:rPr>
-        <w:t xml:space="preserve">35. Zoning Document and Spatial Management Plan for Kolepom Island Marine Protected Area</w:t>
+        <w:t xml:space="preserve">30. Zoning Document and Spatial Management Plan for Kolepom Island Marine Protected Area</w:t>
       </w:r>
     </w:p>
     <w:p>

</xml_diff>

<commit_message>
feat: add TNC and Total E&P projects, update SRUK, >200k ha Papua wetland/peatland, remove Plan Vivo
</commit_message>
<xml_diff>
--- a/I Gede Mahendra Wijaya_Master CV.docx
+++ b/I Gede Mahendra Wijaya_Master CV.docx
@@ -164,7 +164,7 @@
           <w:sz w:val="20"/>
           <w:szCs w:val="20"/>
         </w:rPr>
-        <w:t xml:space="preserve">30 </w:t>
+        <w:t xml:space="preserve">32 </w:t>
       </w:r>
       <w:r>
         <w:rPr>
@@ -582,7 +582,7 @@
           <w:sz w:val="19"/>
           <w:szCs w:val="19"/>
         </w:rPr>
-        <w:t xml:space="preserve">Providing strategic and technical leadership for end-to-end carbon mitigation projects across market-based carbon mechanisms, spanning both Voluntary Carbon Markets (VCM) and Compliance Markets (SRN-PPI, IDXCarbon, and international compliance). Directing the development, technical review, and validation of Project Design Documents (PDD) and Dokumen Rencana Aksi Mitigasi Iklim (DRAM) aligned with Core Carbon Principles (CCPs) of the Integrity Council for the Voluntary Carbon Market (ICVCM) and Paris Agreement Article 6 mechanisms (Articles 6.2 and 6.4 for ITMOs and authorized carbon crediting). Overseeing portfolio-wide carbon rating evaluations and integrity due diligence (benchmarked against BeZero, Sylvera, and Calyx Global) to guarantee robust additionality, baseline credibility, and permanence. Managing technical compliance, MRV, and greenhouse gas accounting for AFOLU (Agriculture, Forestry, and Other Land Use - REDD+, ARR, coastal blue carbon) and Waste Sectors (Palm Oil Mill Effluent / POME Methane Capture &amp; Biogas-to-Energy). Providing technical direction over &gt;100,000 hectares of peatlands and wetlands concessions in Indonesia, embedding ESG frameworks, Verra VCS + CCB, Plan Vivo, ART TREES, and high-integrity nature and biodiversity credit standards.</w:t>
+        <w:t xml:space="preserve">Providing strategic and technical leadership for end-to-end carbon mitigation projects across market-based carbon mechanisms, spanning both Voluntary Carbon Markets (VCM) and Compliance Markets (Sistem Registry Unit Karbon Indonesia / SRUK, IDXCarbon, and international compliance). Directing the development, technical review, and validation of Project Design Documents (PDD) and Dokumen Rencana Aksi Mitigasi Iklim (DRAM) aligned with Core Carbon Principles (CCPs) of the Integrity Council for the Voluntary Carbon Market (ICVCM) and Paris Agreement Article 6 mechanisms (Articles 6.2 and 6.4 for ITMOs and authorized carbon crediting). Overseeing portfolio-wide carbon rating evaluations and integrity due diligence (benchmarked against BeZero, Sylvera, and Calyx Global) to guarantee robust additionality, baseline credibility, and permanence. Managing technical compliance, MRV, and greenhouse gas accounting for AFOLU (Agriculture, Forestry, and Other Land Use - REDD+, ARR, coastal blue carbon) and Waste Sectors (Palm Oil Mill Effluent / POME Methane Capture &amp; Biogas-to-Energy). Providing technical direction over &gt;200,000 hectares of peatlands and wetlands concessions in West Papua and Southwest Papua, embedding ESG frameworks, Verra VCS + CCB, ART TREES, and high-integrity nature and biodiversity credit standards.</w:t>
       </w:r>
     </w:p>
     <w:p>
@@ -637,7 +637,7 @@
           <w:sz w:val="19"/>
           <w:szCs w:val="19"/>
         </w:rPr>
-        <w:t xml:space="preserve">Managed full project lifecycles for large-scale terrestrial, peatland, and coastal ecosystem restoration concessions (&gt;100,000 ha) across Papua and Sumatra. Directed multidisciplinary field teams conducting ecological baseline surveys, High Carbon Stock Approach (HCSA), High Conservation Value (HCV), and ground-based carbon stock accounting (SNI 7724). Designed and facilitated Free, Prior, and Informed Consent (FPIC) processes and inclusive benefit-sharing frameworks with indigenous customary communities (Masyarakat Hukum Adat). Led regulatory liaison and licensing with the Ministry of Environment and Forestry (MoEF / KLHK), Peatland &amp; Mangrove Restoration Agency (BRGM), and Ministry of Marine Affairs and Fisheries (KKP). Formulated comprehensive Environmental &amp; Social Management Plans (ESMP), ESIA / AMDAL compliance frameworks, and established rigorous Monitoring, Reporting, and Verification (MRV) systems.</w:t>
+        <w:t xml:space="preserve">Managed full project lifecycles for large-scale terrestrial, peatland, and coastal wetland ecosystem restoration concessions (&gt;200,000 ha) across West Papua and Southwest Papua. Directed multidisciplinary field teams conducting ecological baseline surveys, High Carbon Stock Approach (HCSA), High Conservation Value (HCV), and ground-based carbon stock accounting (SNI 7724). Designed and facilitated Free, Prior, and Informed Consent (FPIC) processes and inclusive benefit-sharing frameworks with indigenous customary communities (Masyarakat Hukum Adat). Led regulatory liaison and licensing with the Ministry of Environment and Forestry (MoEF / KLHK), Peatland &amp; Mangrove Restoration Agency (BRGM), and Ministry of Marine Affairs and Fisheries (KKP). Formulated comprehensive Environmental &amp; Social Management Plans (ESMP), ESIA / AMDAL compliance frameworks, and established rigorous Monitoring, Reporting, and Verification (MRV) systems.</w:t>
       </w:r>
     </w:p>
     <w:p>
@@ -931,7 +931,7 @@
           <w:sz w:val="24"/>
           <w:szCs w:val="24"/>
         </w:rPr>
-        <w:t xml:space="preserve">KEY PROJECT EXPERIENCES (TOTAL: 30 PROJECTS)</w:t>
+        <w:t xml:space="preserve">KEY PROJECT EXPERIENCES (TOTAL: 32 PROJECTS)</w:t>
       </w:r>
     </w:p>
     <w:p>
@@ -1125,7 +1125,7 @@
           <w:sz w:val="19"/>
           <w:szCs w:val="19"/>
         </w:rPr>
-        <w:t xml:space="preserve">Delivered a high-level feasibility study and carbon scoping assessment across &gt;100,000 hectares of forest concessions in Southwest Papua and West Papua Provinces. Synthesized remote sensing GIS analysis, forest carbon stock estimates, baseline deforestation drivers, regulatory compliance pathways (SRN-PPI &amp; Verra VCS), and socio-economic risk evaluations to establish project viability for carbon credit generation and biodiversity conservation.</w:t>
+        <w:t xml:space="preserve">Delivered a high-level feasibility study and carbon scoping assessment across &gt;200,000 hectares of wetland and peatland forest concessions in Southwest Papua and West Papua Provinces. Synthesized remote sensing GIS analysis, forest carbon stock estimates, baseline deforestation drivers, regulatory compliance pathways (Sistem Registry Unit Karbon Indonesia / SRUK &amp; Verra VCS), and socio-economic risk evaluations to establish project viability for carbon credit generation and biodiversity conservation.</w:t>
       </w:r>
     </w:p>
     <w:p>
@@ -3842,6 +3842,200 @@
           <w:szCs w:val="19"/>
         </w:rPr>
         <w:t xml:space="preserve">Formulated the comprehensive technical zoning document and 20-year spatial management plan for the 356,000-hectare Kolepom Island MPA in South Papua, integrating core conservation zones, limited utilization zones for indigenous artisanal fisheries, and other sustainable use sub-zones.</w:t>
+      </w:r>
+    </w:p>
+    <w:p>
+      <w:pPr>
+        <w:spacing w:after="20" w:before="100"/>
+      </w:pPr>
+      <w:r>
+        <w:rPr>
+          <w:rFonts w:ascii="Arial" w:cs="Arial" w:eastAsia="Arial" w:hAnsi="Arial"/>
+          <w:b/>
+          <w:bCs/>
+          <w:color w:val="0F3A5D"/>
+          <w:sz w:val="20"/>
+          <w:szCs w:val="20"/>
+        </w:rPr>
+        <w:t xml:space="preserve">31. Sustainable Tuna Fisheries Management Based on Acoustic Measurement, Length-Based Assessment, and FAD Management</w:t>
+      </w:r>
+    </w:p>
+    <w:p>
+      <w:pPr>
+        <w:spacing w:after="30" w:before="0"/>
+      </w:pPr>
+      <w:r>
+        <w:rPr>
+          <w:rFonts w:ascii="Arial" w:cs="Arial" w:eastAsia="Arial" w:hAnsi="Arial"/>
+          <w:b/>
+          <w:bCs/>
+          <w:color w:val="1E293B"/>
+          <w:sz w:val="18"/>
+          <w:szCs w:val="18"/>
+        </w:rPr>
+        <w:t xml:space="preserve">Client/Partner: </w:t>
+      </w:r>
+      <w:r>
+        <w:rPr>
+          <w:rFonts w:ascii="Arial" w:cs="Arial" w:eastAsia="Arial" w:hAnsi="Arial"/>
+          <w:color w:val="0D9488"/>
+          <w:sz w:val="18"/>
+          <w:szCs w:val="18"/>
+        </w:rPr>
+        <w:t xml:space="preserve">The Nature Conservancy (TNC)  |  </w:t>
+      </w:r>
+      <w:r>
+        <w:rPr>
+          <w:rFonts w:ascii="Arial" w:cs="Arial" w:eastAsia="Arial" w:hAnsi="Arial"/>
+          <w:b/>
+          <w:bCs/>
+          <w:color w:val="1E293B"/>
+          <w:sz w:val="18"/>
+          <w:szCs w:val="18"/>
+        </w:rPr>
+        <w:t xml:space="preserve">Period: </w:t>
+      </w:r>
+      <w:r>
+        <w:rPr>
+          <w:rFonts w:ascii="Arial" w:cs="Arial" w:eastAsia="Arial" w:hAnsi="Arial"/>
+          <w:color w:val="64748B"/>
+          <w:sz w:val="18"/>
+          <w:szCs w:val="18"/>
+        </w:rPr>
+        <w:t xml:space="preserve">January - December 2017  |  </w:t>
+      </w:r>
+      <w:r>
+        <w:rPr>
+          <w:rFonts w:ascii="Arial" w:cs="Arial" w:eastAsia="Arial" w:hAnsi="Arial"/>
+          <w:b/>
+          <w:bCs/>
+          <w:color w:val="1E293B"/>
+          <w:sz w:val="18"/>
+          <w:szCs w:val="18"/>
+        </w:rPr>
+        <w:t xml:space="preserve">Category: </w:t>
+      </w:r>
+      <w:r>
+        <w:rPr>
+          <w:rFonts w:ascii="Arial" w:cs="Arial" w:eastAsia="Arial" w:hAnsi="Arial"/>
+          <w:b/>
+          <w:bCs/>
+          <w:color w:val="0F3A5D"/>
+          <w:sz w:val="18"/>
+          <w:szCs w:val="18"/>
+        </w:rPr>
+        <w:t xml:space="preserve">MARINE &amp; FISHERIES GOVERNANCE</w:t>
+      </w:r>
+    </w:p>
+    <w:p>
+      <w:pPr>
+        <w:spacing w:after="100" w:before="0"/>
+      </w:pPr>
+      <w:r>
+        <w:rPr>
+          <w:rFonts w:ascii="Arial" w:cs="Arial" w:eastAsia="Arial" w:hAnsi="Arial"/>
+          <w:color w:val="1E293B"/>
+          <w:sz w:val="19"/>
+          <w:szCs w:val="19"/>
+        </w:rPr>
+        <w:t xml:space="preserve">Led the technical implementation of low-cost marine bioacoustic surveys and hydroacoustic telemetry beneath Fish Aggregating Devices (FADs / Rumpon) to quantify juvenile tuna biomass and deep-water pelagic schooling behavior. Integrated hydroacoustic data with on-board Captain-Operated Data Recording Systems (CODRS) and length-based spawning potential ratio (SPR) assessments to formulate policy briefs on voluntary FAD management guidelines and harvest strategy compliance in Indonesian tuna fisheries.</w:t>
+      </w:r>
+    </w:p>
+    <w:p>
+      <w:pPr>
+        <w:spacing w:after="20" w:before="100"/>
+      </w:pPr>
+      <w:r>
+        <w:rPr>
+          <w:rFonts w:ascii="Arial" w:cs="Arial" w:eastAsia="Arial" w:hAnsi="Arial"/>
+          <w:b/>
+          <w:bCs/>
+          <w:color w:val="0F3A5D"/>
+          <w:sz w:val="20"/>
+          <w:szCs w:val="20"/>
+        </w:rPr>
+        <w:t xml:space="preserve">32. Marine Mammal Monitoring and Mitigation Plan for 3D Marine Seismic Acquisition in Mentawai Block</w:t>
+      </w:r>
+    </w:p>
+    <w:p>
+      <w:pPr>
+        <w:spacing w:after="30" w:before="0"/>
+      </w:pPr>
+      <w:r>
+        <w:rPr>
+          <w:rFonts w:ascii="Arial" w:cs="Arial" w:eastAsia="Arial" w:hAnsi="Arial"/>
+          <w:b/>
+          <w:bCs/>
+          <w:color w:val="1E293B"/>
+          <w:sz w:val="18"/>
+          <w:szCs w:val="18"/>
+        </w:rPr>
+        <w:t xml:space="preserve">Client/Partner: </w:t>
+      </w:r>
+      <w:r>
+        <w:rPr>
+          <w:rFonts w:ascii="Arial" w:cs="Arial" w:eastAsia="Arial" w:hAnsi="Arial"/>
+          <w:color w:val="0D9488"/>
+          <w:sz w:val="18"/>
+          <w:szCs w:val="18"/>
+        </w:rPr>
+        <w:t xml:space="preserve">Total E&amp;P Indonesie Mentawai B.V. / PPLH IPB  |  </w:t>
+      </w:r>
+      <w:r>
+        <w:rPr>
+          <w:rFonts w:ascii="Arial" w:cs="Arial" w:eastAsia="Arial" w:hAnsi="Arial"/>
+          <w:b/>
+          <w:bCs/>
+          <w:color w:val="1E293B"/>
+          <w:sz w:val="18"/>
+          <w:szCs w:val="18"/>
+        </w:rPr>
+        <w:t xml:space="preserve">Period: </w:t>
+      </w:r>
+      <w:r>
+        <w:rPr>
+          <w:rFonts w:ascii="Arial" w:cs="Arial" w:eastAsia="Arial" w:hAnsi="Arial"/>
+          <w:color w:val="64748B"/>
+          <w:sz w:val="18"/>
+          <w:szCs w:val="18"/>
+        </w:rPr>
+        <w:t xml:space="preserve">December 2015 - January 2016  |  </w:t>
+      </w:r>
+      <w:r>
+        <w:rPr>
+          <w:rFonts w:ascii="Arial" w:cs="Arial" w:eastAsia="Arial" w:hAnsi="Arial"/>
+          <w:b/>
+          <w:bCs/>
+          <w:color w:val="1E293B"/>
+          <w:sz w:val="18"/>
+          <w:szCs w:val="18"/>
+        </w:rPr>
+        <w:t xml:space="preserve">Category: </w:t>
+      </w:r>
+      <w:r>
+        <w:rPr>
+          <w:rFonts w:ascii="Arial" w:cs="Arial" w:eastAsia="Arial" w:hAnsi="Arial"/>
+          <w:b/>
+          <w:bCs/>
+          <w:color w:val="0F3A5D"/>
+          <w:sz w:val="18"/>
+          <w:szCs w:val="18"/>
+        </w:rPr>
+        <w:t xml:space="preserve">MARINE ENVIRONMENTAL ASSESSMENT &amp; SAFEGUARDS</w:t>
+      </w:r>
+    </w:p>
+    <w:p>
+      <w:pPr>
+        <w:spacing w:after="100" w:before="0"/>
+      </w:pPr>
+      <w:r>
+        <w:rPr>
+          <w:rFonts w:ascii="Arial" w:cs="Arial" w:eastAsia="Arial" w:hAnsi="Arial"/>
+          <w:color w:val="1E293B"/>
+          <w:sz w:val="19"/>
+          <w:szCs w:val="19"/>
+        </w:rPr>
+        <w:t xml:space="preserve">Led technical health, safety, and environmental (HSE) protocols and JNCC-compliant Marine Mammal Observation (MMO) and Passive Acoustic Monitoring (PAM) during the deep-water 3D marine seismic survey using airgun arrays in the Total E&amp;P Indonesie Mentawai B.V. Block (Indian Ocean). Executed 360-degree pre-shooting visual and acoustic scans, enforced safety exclusion zones, managed soft-start ramp-up procedures to prevent acoustic trauma to marine mammals, and delivered daily environmental compliance reports to the Party Chief and international operators.</w:t>
       </w:r>
     </w:p>
     <w:p>

</xml_diff>

<commit_message>
fix: update Marine Mammal Interactions project to focus strictly on commercial fisheries
</commit_message>
<xml_diff>
--- a/I Gede Mahendra Wijaya_Master CV.docx
+++ b/I Gede Mahendra Wijaya_Master CV.docx
@@ -3081,7 +3081,7 @@
           <w:sz w:val="20"/>
           <w:szCs w:val="20"/>
         </w:rPr>
-        <w:t xml:space="preserve">23. Scientific Assessment of Marine Mammal Interactions with Offshore Operations &amp; Fisheries</w:t>
+        <w:t xml:space="preserve">23. Scientific Assessment of Marine Mammal Interactions with Commercial Fisheries</w:t>
       </w:r>
     </w:p>
     <w:p>
@@ -3162,7 +3162,7 @@
           <w:sz w:val="19"/>
           <w:szCs w:val="19"/>
         </w:rPr>
-        <w:t xml:space="preserve">Conducted scientific risk modeling and field investigations on acoustic disturbance, vessel strike vulnerability, and bycatch entanglement risks for cetaceans and dugongs interacting with commercial purse seine fisheries and offshore energy operations in Indonesian seas.</w:t>
+        <w:t xml:space="preserve">Conducted scientific risk modeling and field investigations on acoustic disturbance, vessel strike vulnerability, and bycatch entanglement risks for cetaceans and dugongs interacting with commercial purse seine, longline, and artisanal fisheries in Indonesian seas, developing practical mitigation strategies to minimize fishery-mammal interactions.</w:t>
       </w:r>
     </w:p>
     <w:p>

</xml_diff>

<commit_message>
feat: add Article 6 Decision-Making and Source-to-Sea Management certifications
</commit_message>
<xml_diff>
--- a/I Gede Mahendra Wijaya_Master CV.docx
+++ b/I Gede Mahendra Wijaya_Master CV.docx
@@ -194,7 +194,7 @@
           <w:sz w:val="20"/>
           <w:szCs w:val="20"/>
         </w:rPr>
-        <w:t xml:space="preserve">67 </w:t>
+        <w:t xml:space="preserve">69 </w:t>
       </w:r>
       <w:r>
         <w:rPr>
@@ -4054,7 +4054,7 @@
           <w:sz w:val="24"/>
           <w:szCs w:val="24"/>
         </w:rPr>
-        <w:t xml:space="preserve">PROFESSIONAL CERTIFICATIONS &amp; SPECIALIZED TRAINING (TOTAL: 67)</w:t>
+        <w:t xml:space="preserve">PROFESSIONAL CERTIFICATIONS &amp; SPECIALIZED TRAINING (TOTAL: 69)</w:t>
       </w:r>
     </w:p>
     <w:p>
@@ -4070,7 +4070,7 @@
           <w:sz w:val="21"/>
           <w:szCs w:val="21"/>
         </w:rPr>
-        <w:t xml:space="preserve">1. Carbon, Climate &amp; Ecosystem Services (Blue Carbon, Forest Carbon &amp; Climate Finance) (19 Programs)</w:t>
+        <w:t xml:space="preserve">1. Carbon, Climate &amp; Ecosystem Services (Blue Carbon, Forest Carbon &amp; Climate Finance) (20 Programs)</w:t>
       </w:r>
     </w:p>
     <w:p>
@@ -4375,16 +4375,16 @@
           <w:sz w:val="19"/>
           <w:szCs w:val="19"/>
         </w:rPr>
-        <w:t xml:space="preserve">201 Basics of Organizational GHG Accounting (Certificate of Proficiency)</w:t>
-      </w:r>
-      <w:r>
-        <w:rPr>
-          <w:rFonts w:ascii="Arial" w:cs="Arial" w:eastAsia="Arial" w:hAnsi="Arial"/>
-          <w:color w:val="64748B"/>
-          <w:sz w:val="18"/>
-          <w:szCs w:val="18"/>
-        </w:rPr>
-        <w:t xml:space="preserve"> — The Greenhouse Gas Management Institute (GHGMI) (Aug 2026)</w:t>
+        <w:t xml:space="preserve">Article 6 Decision-Making: Training for Practitioners</w:t>
+      </w:r>
+      <w:r>
+        <w:rPr>
+          <w:rFonts w:ascii="Arial" w:cs="Arial" w:eastAsia="Arial" w:hAnsi="Arial"/>
+          <w:color w:val="64748B"/>
+          <w:sz w:val="18"/>
+          <w:szCs w:val="18"/>
+        </w:rPr>
+        <w:t xml:space="preserve"> — Paris Agreement Article 6 Implementation Partnership (A6IP) Center, Perspectives Climate Research &amp; GHGMI (Sep 2026)</w:t>
       </w:r>
     </w:p>
     <w:p>
@@ -4410,7 +4410,7 @@
           <w:sz w:val="18"/>
           <w:szCs w:val="18"/>
         </w:rPr>
-        <w:t xml:space="preserve">Organizational GHG Accounting, GHG Protocol Corporate Standard, ISO 14064-1, Scope 1, Scope 2 &amp; Scope 3 Emissions, Inventory Quality Management, Baseline Recalculation</w:t>
+        <w:t xml:space="preserve">Paris Agreement Article 6.2 &amp; 6.4, Internationally Transferred Mitigation Outcomes (ITMOs), Carbon Market Decision-Making, Corresponding Adjustments, GHG Accounting &amp; MRV, Carbon Crediting Mechanisms, Institutional Arrangements</w:t>
       </w:r>
     </w:p>
     <w:p>
@@ -4425,7 +4425,7 @@
           <w:sz w:val="18"/>
           <w:szCs w:val="18"/>
         </w:rPr>
-        <w:t xml:space="preserve">Formal professional certificate of proficiency issued by the Greenhouse Gas Management Institute (GHGMI) under Dean Michael Gillenwater (Credential Code: 201EX2046 / BOGAEX2046). Rigorous curriculum covering organizational carbon accounting principles, organizational and operational boundary setting, Scope 1, 2, and 3 emission quantification methodologies, activity data collection, emission factor selection, and uncertainty management aligned with the GHG Protocol and ISO 14064.</w:t>
+        <w:t xml:space="preserve">Advanced professional training for carbon market practitioners developed by Perspectives Climate Research and the Greenhouse Gas Management Institute (GHGMI), supported by the Paris Agreement Article 6 Implementation Partnership (A6IP) Center, Ministry of the Environment Japan (MOEJ), and BMWK Germany. Rigorous curriculum covering strategic evaluation of Article 6 mechanisms (6.2 cooperative approaches and 6.4 crediting mechanism), international carbon market dynamics, project-level GHG accounting, corresponding adjustments, and national institutional readiness for market-based mitigation.</w:t>
       </w:r>
     </w:p>
     <w:p>
@@ -4446,16 +4446,16 @@
           <w:sz w:val="19"/>
           <w:szCs w:val="19"/>
         </w:rPr>
-        <w:t xml:space="preserve">The German Supply Chain Due Diligence Act (LkSG / SCDDA)</w:t>
-      </w:r>
-      <w:r>
-        <w:rPr>
-          <w:rFonts w:ascii="Arial" w:cs="Arial" w:eastAsia="Arial" w:hAnsi="Arial"/>
-          <w:color w:val="64748B"/>
-          <w:sz w:val="18"/>
-          <w:szCs w:val="18"/>
-        </w:rPr>
-        <w:t xml:space="preserve"> — Import Promotion Desk (IPD Germany) (Aug 2026)</w:t>
+        <w:t xml:space="preserve">201 Basics of Organizational GHG Accounting (Certificate of Proficiency)</w:t>
+      </w:r>
+      <w:r>
+        <w:rPr>
+          <w:rFonts w:ascii="Arial" w:cs="Arial" w:eastAsia="Arial" w:hAnsi="Arial"/>
+          <w:color w:val="64748B"/>
+          <w:sz w:val="18"/>
+          <w:szCs w:val="18"/>
+        </w:rPr>
+        <w:t xml:space="preserve"> — The Greenhouse Gas Management Institute (GHGMI) (Aug 2026)</w:t>
       </w:r>
     </w:p>
     <w:p>
@@ -4481,7 +4481,7 @@
           <w:sz w:val="18"/>
           <w:szCs w:val="18"/>
         </w:rPr>
-        <w:t xml:space="preserve">Supply Chain Due Diligence (LkSG / SCDDA), Human Rights &amp; Environmental Risk Analysis, EU Market Compliance, Sustainable Sourcing</w:t>
+        <w:t xml:space="preserve">Organizational GHG Accounting, GHG Protocol Corporate Standard, ISO 14064-1, Scope 1, Scope 2 &amp; Scope 3 Emissions, Inventory Quality Management, Baseline Recalculation</w:t>
       </w:r>
     </w:p>
     <w:p>
@@ -4496,7 +4496,7 @@
           <w:sz w:val="18"/>
           <w:szCs w:val="18"/>
         </w:rPr>
-        <w:t xml:space="preserve">Comprehensive e-learning program on complying with the German Supply Chain Due Diligence Act (Lieferkettensorgfaltspflichtengesetz - LkSG), addressing human rights and environmental risk analysis, grievance mechanisms, and sustainable supply chain governance for international exporters.</w:t>
+        <w:t xml:space="preserve">Formal professional certificate of proficiency issued by the Greenhouse Gas Management Institute (GHGMI) under Dean Michael Gillenwater (Credential Code: 201EX2046 / BOGAEX2046). Rigorous curriculum covering organizational carbon accounting principles, organizational and operational boundary setting, Scope 1, 2, and 3 emission quantification methodologies, activity data collection, emission factor selection, and uncertainty management aligned with the GHG Protocol and ISO 14064.</w:t>
       </w:r>
     </w:p>
     <w:p>
@@ -4517,7 +4517,7 @@
           <w:sz w:val="19"/>
           <w:szCs w:val="19"/>
         </w:rPr>
-        <w:t xml:space="preserve">EU Deforestation Regulation (EUDR) Compliance &amp; Due Diligence</w:t>
+        <w:t xml:space="preserve">The German Supply Chain Due Diligence Act (LkSG / SCDDA)</w:t>
       </w:r>
       <w:r>
         <w:rPr>
@@ -4552,7 +4552,7 @@
           <w:sz w:val="18"/>
           <w:szCs w:val="18"/>
         </w:rPr>
-        <w:t xml:space="preserve">EU Deforestation Regulation (EUDR) Compliance, Supply Chain Geolocation &amp; Traceability, Deforestation-Free Commodity Due Diligence, Legality &amp; Risk Assessment</w:t>
+        <w:t xml:space="preserve">Supply Chain Due Diligence (LkSG / SCDDA), Human Rights &amp; Environmental Risk Analysis, EU Market Compliance, Sustainable Sourcing</w:t>
       </w:r>
     </w:p>
     <w:p>
@@ -4567,7 +4567,7 @@
           <w:sz w:val="18"/>
           <w:szCs w:val="18"/>
         </w:rPr>
-        <w:t xml:space="preserve">Specialized training on the EU Deforestation Regulation (EUDR), addressing regulatory compliance, supply chain due diligence, geolocation traceability, and legality verification for deforestation-free commodities entering the EU market (palm oil, wood, rubber, cocoa, coffee, soy, cattle).</w:t>
+        <w:t xml:space="preserve">Comprehensive e-learning program on complying with the German Supply Chain Due Diligence Act (Lieferkettensorgfaltspflichtengesetz - LkSG), addressing human rights and environmental risk analysis, grievance mechanisms, and sustainable supply chain governance for international exporters.</w:t>
       </w:r>
     </w:p>
     <w:p>
@@ -4588,76 +4588,16 @@
           <w:sz w:val="19"/>
           <w:szCs w:val="19"/>
         </w:rPr>
-        <w:t xml:space="preserve">Blue Carbon Fundamentals</w:t>
-      </w:r>
-      <w:r>
-        <w:rPr>
-          <w:rFonts w:ascii="Arial" w:cs="Arial" w:eastAsia="Arial" w:hAnsi="Arial"/>
-          <w:color w:val="64748B"/>
-          <w:sz w:val="18"/>
-          <w:szCs w:val="18"/>
-        </w:rPr>
-        <w:t xml:space="preserve"> — World Bank Group (Jul 2026)</w:t>
-      </w:r>
-    </w:p>
-    <w:p>
-      <w:pPr>
-        <w:pStyle w:val="ListParagraph"/>
-        <w:numPr>
-          <w:ilvl w:val="0"/>
-          <w:numId w:val="1"/>
-        </w:numPr>
-        <w:spacing w:after="20" w:before="20"/>
-      </w:pPr>
-      <w:r>
-        <w:rPr>
-          <w:rFonts w:ascii="Arial" w:cs="Arial" w:eastAsia="Arial" w:hAnsi="Arial"/>
-          <w:b/>
-          <w:bCs/>
-          <w:color w:val="1E293B"/>
-          <w:sz w:val="19"/>
-          <w:szCs w:val="19"/>
-        </w:rPr>
-        <w:t xml:space="preserve">Green Economic Acceleration: A Japan-ASEAN Strategic Programme for Sustainable Green Finance</w:t>
-      </w:r>
-      <w:r>
-        <w:rPr>
-          <w:rFonts w:ascii="Arial" w:cs="Arial" w:eastAsia="Arial" w:hAnsi="Arial"/>
-          <w:color w:val="64748B"/>
-          <w:sz w:val="18"/>
-          <w:szCs w:val="18"/>
-        </w:rPr>
-        <w:t xml:space="preserve"> — United Nations Institute for Training and Research (UNITAR) (Jul 2026)</w:t>
-      </w:r>
-    </w:p>
-    <w:p>
-      <w:pPr>
-        <w:pStyle w:val="ListParagraph"/>
-        <w:numPr>
-          <w:ilvl w:val="0"/>
-          <w:numId w:val="1"/>
-        </w:numPr>
-        <w:spacing w:after="20" w:before="20"/>
-      </w:pPr>
-      <w:r>
-        <w:rPr>
-          <w:rFonts w:ascii="Arial" w:cs="Arial" w:eastAsia="Arial" w:hAnsi="Arial"/>
-          <w:b/>
-          <w:bCs/>
-          <w:color w:val="1E293B"/>
-          <w:sz w:val="19"/>
-          <w:szCs w:val="19"/>
-        </w:rPr>
-        <w:t xml:space="preserve">Blue Carbon Project Development &amp; MRV Specialist Training</w:t>
-      </w:r>
-      <w:r>
-        <w:rPr>
-          <w:rFonts w:ascii="Arial" w:cs="Arial" w:eastAsia="Arial" w:hAnsi="Arial"/>
-          <w:color w:val="64748B"/>
-          <w:sz w:val="18"/>
-          <w:szCs w:val="18"/>
-        </w:rPr>
-        <w:t xml:space="preserve"> — Fair Carbon (Blue Carbon Academy) (May 2026)</w:t>
+        <w:t xml:space="preserve">EU Deforestation Regulation (EUDR) Compliance &amp; Due Diligence</w:t>
+      </w:r>
+      <w:r>
+        <w:rPr>
+          <w:rFonts w:ascii="Arial" w:cs="Arial" w:eastAsia="Arial" w:hAnsi="Arial"/>
+          <w:color w:val="64748B"/>
+          <w:sz w:val="18"/>
+          <w:szCs w:val="18"/>
+        </w:rPr>
+        <w:t xml:space="preserve"> — Import Promotion Desk (IPD Germany) (Aug 2026)</w:t>
       </w:r>
     </w:p>
     <w:p>
@@ -4683,7 +4623,7 @@
           <w:sz w:val="18"/>
           <w:szCs w:val="18"/>
         </w:rPr>
-        <w:t xml:space="preserve">Blue Carbon Project Development, Feasibility &amp; PIN Assessment, Project Design Document (PDD), Investment Due Diligence, MRV Design &amp; Verification</w:t>
+        <w:t xml:space="preserve">EU Deforestation Regulation (EUDR) Compliance, Supply Chain Geolocation &amp; Traceability, Deforestation-Free Commodity Due Diligence, Legality &amp; Risk Assessment</w:t>
       </w:r>
     </w:p>
     <w:p>
@@ -4698,6 +4638,137 @@
           <w:sz w:val="18"/>
           <w:szCs w:val="18"/>
         </w:rPr>
+        <w:t xml:space="preserve">Specialized training on the EU Deforestation Regulation (EUDR), addressing regulatory compliance, supply chain due diligence, geolocation traceability, and legality verification for deforestation-free commodities entering the EU market (palm oil, wood, rubber, cocoa, coffee, soy, cattle).</w:t>
+      </w:r>
+    </w:p>
+    <w:p>
+      <w:pPr>
+        <w:pStyle w:val="ListParagraph"/>
+        <w:numPr>
+          <w:ilvl w:val="0"/>
+          <w:numId w:val="1"/>
+        </w:numPr>
+        <w:spacing w:after="20" w:before="20"/>
+      </w:pPr>
+      <w:r>
+        <w:rPr>
+          <w:rFonts w:ascii="Arial" w:cs="Arial" w:eastAsia="Arial" w:hAnsi="Arial"/>
+          <w:b/>
+          <w:bCs/>
+          <w:color w:val="1E293B"/>
+          <w:sz w:val="19"/>
+          <w:szCs w:val="19"/>
+        </w:rPr>
+        <w:t xml:space="preserve">Blue Carbon Fundamentals</w:t>
+      </w:r>
+      <w:r>
+        <w:rPr>
+          <w:rFonts w:ascii="Arial" w:cs="Arial" w:eastAsia="Arial" w:hAnsi="Arial"/>
+          <w:color w:val="64748B"/>
+          <w:sz w:val="18"/>
+          <w:szCs w:val="18"/>
+        </w:rPr>
+        <w:t xml:space="preserve"> — World Bank Group (Jul 2026)</w:t>
+      </w:r>
+    </w:p>
+    <w:p>
+      <w:pPr>
+        <w:pStyle w:val="ListParagraph"/>
+        <w:numPr>
+          <w:ilvl w:val="0"/>
+          <w:numId w:val="1"/>
+        </w:numPr>
+        <w:spacing w:after="20" w:before="20"/>
+      </w:pPr>
+      <w:r>
+        <w:rPr>
+          <w:rFonts w:ascii="Arial" w:cs="Arial" w:eastAsia="Arial" w:hAnsi="Arial"/>
+          <w:b/>
+          <w:bCs/>
+          <w:color w:val="1E293B"/>
+          <w:sz w:val="19"/>
+          <w:szCs w:val="19"/>
+        </w:rPr>
+        <w:t xml:space="preserve">Green Economic Acceleration: A Japan-ASEAN Strategic Programme for Sustainable Green Finance</w:t>
+      </w:r>
+      <w:r>
+        <w:rPr>
+          <w:rFonts w:ascii="Arial" w:cs="Arial" w:eastAsia="Arial" w:hAnsi="Arial"/>
+          <w:color w:val="64748B"/>
+          <w:sz w:val="18"/>
+          <w:szCs w:val="18"/>
+        </w:rPr>
+        <w:t xml:space="preserve"> — United Nations Institute for Training and Research (UNITAR) (Jul 2026)</w:t>
+      </w:r>
+    </w:p>
+    <w:p>
+      <w:pPr>
+        <w:pStyle w:val="ListParagraph"/>
+        <w:numPr>
+          <w:ilvl w:val="0"/>
+          <w:numId w:val="1"/>
+        </w:numPr>
+        <w:spacing w:after="20" w:before="20"/>
+      </w:pPr>
+      <w:r>
+        <w:rPr>
+          <w:rFonts w:ascii="Arial" w:cs="Arial" w:eastAsia="Arial" w:hAnsi="Arial"/>
+          <w:b/>
+          <w:bCs/>
+          <w:color w:val="1E293B"/>
+          <w:sz w:val="19"/>
+          <w:szCs w:val="19"/>
+        </w:rPr>
+        <w:t xml:space="preserve">Blue Carbon Project Development &amp; MRV Specialist Training</w:t>
+      </w:r>
+      <w:r>
+        <w:rPr>
+          <w:rFonts w:ascii="Arial" w:cs="Arial" w:eastAsia="Arial" w:hAnsi="Arial"/>
+          <w:color w:val="64748B"/>
+          <w:sz w:val="18"/>
+          <w:szCs w:val="18"/>
+        </w:rPr>
+        <w:t xml:space="preserve"> — Fair Carbon (Blue Carbon Academy) (May 2026)</w:t>
+      </w:r>
+    </w:p>
+    <w:p>
+      <w:pPr>
+        <w:spacing w:after="20" w:before="0"/>
+        <w:ind w:left="400"/>
+      </w:pPr>
+      <w:r>
+        <w:rPr>
+          <w:rFonts w:ascii="Arial" w:cs="Arial" w:eastAsia="Arial" w:hAnsi="Arial"/>
+          <w:b/>
+          <w:bCs/>
+          <w:color w:val="0D9488"/>
+          <w:sz w:val="18"/>
+          <w:szCs w:val="18"/>
+        </w:rPr>
+        <w:t xml:space="preserve">Competencies: </w:t>
+      </w:r>
+      <w:r>
+        <w:rPr>
+          <w:rFonts w:ascii="Arial" w:cs="Arial" w:eastAsia="Arial" w:hAnsi="Arial"/>
+          <w:color w:val="1E293B"/>
+          <w:sz w:val="18"/>
+          <w:szCs w:val="18"/>
+        </w:rPr>
+        <w:t xml:space="preserve">Blue Carbon Project Development, Feasibility &amp; PIN Assessment, Project Design Document (PDD), Investment Due Diligence, MRV Design &amp; Verification</w:t>
+      </w:r>
+    </w:p>
+    <w:p>
+      <w:pPr>
+        <w:spacing w:after="40" w:before="0"/>
+        <w:ind w:left="400"/>
+      </w:pPr>
+      <w:r>
+        <w:rPr>
+          <w:rFonts w:ascii="Arial" w:cs="Arial" w:eastAsia="Arial" w:hAnsi="Arial"/>
+          <w:color w:val="64748B"/>
+          <w:sz w:val="18"/>
+          <w:szCs w:val="18"/>
+        </w:rPr>
         <w:t xml:space="preserve">Comprehensive training covering the full project development lifecycle for coastal blue carbon (mangroves and seagrass), from baseline feasibility &amp; Project Idea Note (PIN), standardized PDD design, investment due diligence, to scientific Monitoring, Reporting &amp; Verification (MRV) systems and carbon credit integrity.</w:t>
       </w:r>
     </w:p>
@@ -4984,7 +5055,78 @@
           <w:sz w:val="21"/>
           <w:szCs w:val="21"/>
         </w:rPr>
-        <w:t xml:space="preserve">2. Marine, Coastal &amp; Fisheries Governance (Ocean Governance, IWRM &amp; Bioacoustics) (16 Programs)</w:t>
+        <w:t xml:space="preserve">2. Marine, Coastal &amp; Fisheries Governance (Ocean Governance, IWRM &amp; Bioacoustics) (17 Programs)</w:t>
+      </w:r>
+    </w:p>
+    <w:p>
+      <w:pPr>
+        <w:pStyle w:val="ListParagraph"/>
+        <w:numPr>
+          <w:ilvl w:val="0"/>
+          <w:numId w:val="1"/>
+        </w:numPr>
+        <w:spacing w:after="20" w:before="20"/>
+      </w:pPr>
+      <w:r>
+        <w:rPr>
+          <w:rFonts w:ascii="Arial" w:cs="Arial" w:eastAsia="Arial" w:hAnsi="Arial"/>
+          <w:b/>
+          <w:bCs/>
+          <w:color w:val="1E293B"/>
+          <w:sz w:val="19"/>
+          <w:szCs w:val="19"/>
+        </w:rPr>
+        <w:t xml:space="preserve">Source-to-Sea (S2S) Management Course</w:t>
+      </w:r>
+      <w:r>
+        <w:rPr>
+          <w:rFonts w:ascii="Arial" w:cs="Arial" w:eastAsia="Arial" w:hAnsi="Arial"/>
+          <w:color w:val="64748B"/>
+          <w:sz w:val="18"/>
+          <w:szCs w:val="18"/>
+        </w:rPr>
+        <w:t xml:space="preserve"> — Cap-Net UNDP, SIWI &amp; Action Platform for Source-to-Sea Management (Sep 2026)</w:t>
+      </w:r>
+    </w:p>
+    <w:p>
+      <w:pPr>
+        <w:spacing w:after="20" w:before="0"/>
+        <w:ind w:left="400"/>
+      </w:pPr>
+      <w:r>
+        <w:rPr>
+          <w:rFonts w:ascii="Arial" w:cs="Arial" w:eastAsia="Arial" w:hAnsi="Arial"/>
+          <w:b/>
+          <w:bCs/>
+          <w:color w:val="0D9488"/>
+          <w:sz w:val="18"/>
+          <w:szCs w:val="18"/>
+        </w:rPr>
+        <w:t xml:space="preserve">Competencies: </w:t>
+      </w:r>
+      <w:r>
+        <w:rPr>
+          <w:rFonts w:ascii="Arial" w:cs="Arial" w:eastAsia="Arial" w:hAnsi="Arial"/>
+          <w:color w:val="1E293B"/>
+          <w:sz w:val="18"/>
+          <w:szCs w:val="18"/>
+        </w:rPr>
+        <w:t xml:space="preserve">Source-to-Sea (S2S) Governance, Integrated Water Resources Management (IWRM), Land-Sea Interaction Modeling, Freshwater &amp; Coastal Linkages, Upstream Pollution Abatement, Marine Spatial Governance</w:t>
+      </w:r>
+    </w:p>
+    <w:p>
+      <w:pPr>
+        <w:spacing w:after="40" w:before="0"/>
+        <w:ind w:left="400"/>
+      </w:pPr>
+      <w:r>
+        <w:rPr>
+          <w:rFonts w:ascii="Arial" w:cs="Arial" w:eastAsia="Arial" w:hAnsi="Arial"/>
+          <w:color w:val="64748B"/>
+          <w:sz w:val="18"/>
+          <w:szCs w:val="18"/>
+        </w:rPr>
+        <w:t xml:space="preserve">Specialized international certification on holistic Source-to-Sea (S2S) management issued by Cap-Net UNDP, Stockholm International Water Institute (SIWI), and the Action Platform for Source-to-Sea Management. Comprehensive curriculum addressing transboundary river-coastal linkages, upstream land-based pollution mitigation, sediment and nutrient flow governance, and integrated watershed-to-marine ecosystem planning.</w:t>
       </w:r>
     </w:p>
     <w:p>

</xml_diff>

<commit_message>
feat: add Cambridge DemEd Global SDG scholarship and UNITAR green finance awards with dynamic CV and web sync
</commit_message>
<xml_diff>
--- a/I Gede Mahendra Wijaya_Master CV.docx
+++ b/I Gede Mahendra Wijaya_Master CV.docx
@@ -7091,7 +7091,7 @@
           <w:ilvl w:val="0"/>
           <w:numId w:val="1"/>
         </w:numPr>
-        <w:spacing w:after="30" w:before="20"/>
+        <w:spacing w:after="20" w:before="20"/>
       </w:pPr>
       <w:r>
         <w:rPr>
@@ -7113,26 +7113,97 @@
           <w:sz w:val="19"/>
           <w:szCs w:val="19"/>
         </w:rPr>
-        <w:t xml:space="preserve">Fellowship in Green Economic Acceleration: A Japan-ASEAN Strategic Programme for Sustainable Green Finance </w:t>
-      </w:r>
-      <w:r>
-        <w:rPr>
-          <w:rFonts w:ascii="Arial" w:cs="Arial" w:eastAsia="Arial" w:hAnsi="Arial"/>
-          <w:color w:val="64748B"/>
-          <w:sz w:val="18"/>
-          <w:szCs w:val="18"/>
-        </w:rPr>
-        <w:t xml:space="preserve">— The United Nations Institute for Training and Research (UNITAR)</w:t>
-      </w:r>
-    </w:p>
-    <w:p>
-      <w:pPr>
-        <w:pStyle w:val="ListParagraph"/>
-        <w:numPr>
-          <w:ilvl w:val="0"/>
-          <w:numId w:val="1"/>
-        </w:numPr>
-        <w:spacing w:after="30" w:before="20"/>
+        <w:t xml:space="preserve">Key Essentials: The Sustainable Development Goals and the Law </w:t>
+      </w:r>
+      <w:r>
+        <w:rPr>
+          <w:rFonts w:ascii="Arial" w:cs="Arial" w:eastAsia="Arial" w:hAnsi="Arial"/>
+          <w:color w:val="64748B"/>
+          <w:sz w:val="18"/>
+          <w:szCs w:val="18"/>
+        </w:rPr>
+        <w:t xml:space="preserve">— Democratising Education for Global Sustainability and Justice (DemEd Global) / University of Cambridge</w:t>
+      </w:r>
+    </w:p>
+    <w:p>
+      <w:pPr>
+        <w:spacing w:after="30" w:before="0"/>
+        <w:ind w:left="360"/>
+      </w:pPr>
+      <w:r>
+        <w:rPr>
+          <w:rFonts w:ascii="Arial" w:cs="Arial" w:eastAsia="Arial" w:hAnsi="Arial"/>
+          <w:color w:val="64748B"/>
+          <w:sz w:val="17"/>
+          <w:szCs w:val="17"/>
+        </w:rPr>
+        <w:t xml:space="preserve">Selected among 4,800+ global applicants across 150+ countries to receive a donor-funded scholarship for the intensive short course on Sustainable Development Goals and the Law, delivered by Lucy Cavendish College and Hughes Hall, University of Cambridge.</w:t>
+      </w:r>
+    </w:p>
+    <w:p>
+      <w:pPr>
+        <w:pStyle w:val="ListParagraph"/>
+        <w:numPr>
+          <w:ilvl w:val="0"/>
+          <w:numId w:val="1"/>
+        </w:numPr>
+        <w:spacing w:after="20" w:before="20"/>
+      </w:pPr>
+      <w:r>
+        <w:rPr>
+          <w:rFonts w:ascii="Arial" w:cs="Arial" w:eastAsia="Arial" w:hAnsi="Arial"/>
+          <w:b/>
+          <w:bCs/>
+          <w:color w:val="0F3A5D"/>
+          <w:sz w:val="19"/>
+          <w:szCs w:val="19"/>
+        </w:rPr>
+        <w:t xml:space="preserve">[2026] </w:t>
+      </w:r>
+      <w:r>
+        <w:rPr>
+          <w:rFonts w:ascii="Arial" w:cs="Arial" w:eastAsia="Arial" w:hAnsi="Arial"/>
+          <w:b/>
+          <w:bCs/>
+          <w:color w:val="1E293B"/>
+          <w:sz w:val="19"/>
+          <w:szCs w:val="19"/>
+        </w:rPr>
+        <w:t xml:space="preserve">UNITAR Green Economic Acceleration: A Japan–ASEAN Strategic Programme for Sustainable Green Finance </w:t>
+      </w:r>
+      <w:r>
+        <w:rPr>
+          <w:rFonts w:ascii="Arial" w:cs="Arial" w:eastAsia="Arial" w:hAnsi="Arial"/>
+          <w:color w:val="64748B"/>
+          <w:sz w:val="18"/>
+          <w:szCs w:val="18"/>
+        </w:rPr>
+        <w:t xml:space="preserve">— United Nations Institute for Training and Research (UNITAR) and UN CC:Learn</w:t>
+      </w:r>
+    </w:p>
+    <w:p>
+      <w:pPr>
+        <w:spacing w:after="30" w:before="0"/>
+        <w:ind w:left="360"/>
+      </w:pPr>
+      <w:r>
+        <w:rPr>
+          <w:rFonts w:ascii="Arial" w:cs="Arial" w:eastAsia="Arial" w:hAnsi="Arial"/>
+          <w:color w:val="64748B"/>
+          <w:sz w:val="17"/>
+          <w:szCs w:val="17"/>
+        </w:rPr>
+        <w:t xml:space="preserve">Selected through a competitive selection process among applicants across the ASEAN region for the Japan–ASEAN strategic initiative delivered by UNITAR. The program focuses on sustainable green finance mechanisms, bankable green project design, and regional policies driving the green economic transition.</w:t>
+      </w:r>
+    </w:p>
+    <w:p>
+      <w:pPr>
+        <w:pStyle w:val="ListParagraph"/>
+        <w:numPr>
+          <w:ilvl w:val="0"/>
+          <w:numId w:val="1"/>
+        </w:numPr>
+        <w:spacing w:after="20" w:before="20"/>
       </w:pPr>
       <w:r>
         <w:rPr>
@@ -7163,17 +7234,32 @@
           <w:sz w:val="18"/>
           <w:szCs w:val="18"/>
         </w:rPr>
-        <w:t xml:space="preserve">— Business Innovation Center (BIC) &amp; Ministry of Research and Technology</w:t>
-      </w:r>
-    </w:p>
-    <w:p>
-      <w:pPr>
-        <w:pStyle w:val="ListParagraph"/>
-        <w:numPr>
-          <w:ilvl w:val="0"/>
-          <w:numId w:val="1"/>
-        </w:numPr>
-        <w:spacing w:after="30" w:before="20"/>
+        <w:t xml:space="preserve">— Business Innovation Center (BIC) &amp; Ministry of Research and Technology (Kemenristek/BRIN)</w:t>
+      </w:r>
+    </w:p>
+    <w:p>
+      <w:pPr>
+        <w:spacing w:after="30" w:before="0"/>
+        <w:ind w:left="360"/>
+      </w:pPr>
+      <w:r>
+        <w:rPr>
+          <w:rFonts w:ascii="Arial" w:cs="Arial" w:eastAsia="Arial" w:hAnsi="Arial"/>
+          <w:color w:val="64748B"/>
+          <w:sz w:val="17"/>
+          <w:szCs w:val="17"/>
+        </w:rPr>
+        <w:t xml:space="preserve">National innovation recognition awarded for applied marine technology and sustainable fisheries innovation.</w:t>
+      </w:r>
+    </w:p>
+    <w:p>
+      <w:pPr>
+        <w:pStyle w:val="ListParagraph"/>
+        <w:numPr>
+          <w:ilvl w:val="0"/>
+          <w:numId w:val="1"/>
+        </w:numPr>
+        <w:spacing w:after="20" w:before="20"/>
       </w:pPr>
       <w:r>
         <w:rPr>
@@ -7209,12 +7295,27 @@
     </w:p>
     <w:p>
       <w:pPr>
-        <w:pStyle w:val="ListParagraph"/>
-        <w:numPr>
-          <w:ilvl w:val="0"/>
-          <w:numId w:val="1"/>
-        </w:numPr>
-        <w:spacing w:after="30" w:before="20"/>
+        <w:spacing w:after="30" w:before="0"/>
+        <w:ind w:left="360"/>
+      </w:pPr>
+      <w:r>
+        <w:rPr>
+          <w:rFonts w:ascii="Arial" w:cs="Arial" w:eastAsia="Arial" w:hAnsi="Arial"/>
+          <w:color w:val="64748B"/>
+          <w:sz w:val="17"/>
+          <w:szCs w:val="17"/>
+        </w:rPr>
+        <w:t xml:space="preserve">Selected candidate for the national economic and leadership acceleration initiative by Bank Indonesia Institute.</w:t>
+      </w:r>
+    </w:p>
+    <w:p>
+      <w:pPr>
+        <w:pStyle w:val="ListParagraph"/>
+        <w:numPr>
+          <w:ilvl w:val="0"/>
+          <w:numId w:val="1"/>
+        </w:numPr>
+        <w:spacing w:after="20" w:before="20"/>
       </w:pPr>
       <w:r>
         <w:rPr>
@@ -7236,26 +7337,41 @@
           <w:sz w:val="19"/>
           <w:szCs w:val="19"/>
         </w:rPr>
-        <w:t xml:space="preserve">Speaker at DigiFish "Incubating Ecosystem of Digital Innovation" </w:t>
-      </w:r>
-      <w:r>
-        <w:rPr>
-          <w:rFonts w:ascii="Arial" w:cs="Arial" w:eastAsia="Arial" w:hAnsi="Arial"/>
-          <w:color w:val="64748B"/>
-          <w:sz w:val="18"/>
-          <w:szCs w:val="18"/>
-        </w:rPr>
-        <w:t xml:space="preserve">— DigiFish Network &amp; Ministry of Marine Affairs and Fisheries</w:t>
-      </w:r>
-    </w:p>
-    <w:p>
-      <w:pPr>
-        <w:pStyle w:val="ListParagraph"/>
-        <w:numPr>
-          <w:ilvl w:val="0"/>
-          <w:numId w:val="1"/>
-        </w:numPr>
-        <w:spacing w:after="30" w:before="20"/>
+        <w:t xml:space="preserve">Featured Speaker at DigiFish Incubating Ecosystem of Digital Innovation </w:t>
+      </w:r>
+      <w:r>
+        <w:rPr>
+          <w:rFonts w:ascii="Arial" w:cs="Arial" w:eastAsia="Arial" w:hAnsi="Arial"/>
+          <w:color w:val="64748B"/>
+          <w:sz w:val="18"/>
+          <w:szCs w:val="18"/>
+        </w:rPr>
+        <w:t xml:space="preserve">— DigiFish Network &amp; Ministry of Marine Affairs and Fisheries (KKP)</w:t>
+      </w:r>
+    </w:p>
+    <w:p>
+      <w:pPr>
+        <w:spacing w:after="30" w:before="0"/>
+        <w:ind w:left="360"/>
+      </w:pPr>
+      <w:r>
+        <w:rPr>
+          <w:rFonts w:ascii="Arial" w:cs="Arial" w:eastAsia="Arial" w:hAnsi="Arial"/>
+          <w:color w:val="64748B"/>
+          <w:sz w:val="17"/>
+          <w:szCs w:val="17"/>
+        </w:rPr>
+        <w:t xml:space="preserve">Invited keynote and expert speaker on digital transformation, satellite VMS, and IoT smart aquaculture platforms.</w:t>
+      </w:r>
+    </w:p>
+    <w:p>
+      <w:pPr>
+        <w:pStyle w:val="ListParagraph"/>
+        <w:numPr>
+          <w:ilvl w:val="0"/>
+          <w:numId w:val="1"/>
+        </w:numPr>
+        <w:spacing w:after="20" w:before="20"/>
       </w:pPr>
       <w:r>
         <w:rPr>
@@ -7286,17 +7402,32 @@
           <w:sz w:val="18"/>
           <w:szCs w:val="18"/>
         </w:rPr>
-        <w:t xml:space="preserve">— Inovasia Indonesia</w:t>
-      </w:r>
-    </w:p>
-    <w:p>
-      <w:pPr>
-        <w:pStyle w:val="ListParagraph"/>
-        <w:numPr>
-          <w:ilvl w:val="0"/>
-          <w:numId w:val="1"/>
-        </w:numPr>
-        <w:spacing w:after="30" w:before="20"/>
+        <w:t xml:space="preserve">— Inovasia Indonesia &amp; Kemenpora RI</w:t>
+      </w:r>
+    </w:p>
+    <w:p>
+      <w:pPr>
+        <w:spacing w:after="30" w:before="0"/>
+        <w:ind w:left="360"/>
+      </w:pPr>
+      <w:r>
+        <w:rPr>
+          <w:rFonts w:ascii="Arial" w:cs="Arial" w:eastAsia="Arial" w:hAnsi="Arial"/>
+          <w:color w:val="64748B"/>
+          <w:sz w:val="17"/>
+          <w:szCs w:val="17"/>
+        </w:rPr>
+        <w:t xml:space="preserve">Recognized among top national youth innovators for applied environmental and acoustic research.</w:t>
+      </w:r>
+    </w:p>
+    <w:p>
+      <w:pPr>
+        <w:pStyle w:val="ListParagraph"/>
+        <w:numPr>
+          <w:ilvl w:val="0"/>
+          <w:numId w:val="1"/>
+        </w:numPr>
+        <w:spacing w:after="20" w:before="20"/>
       </w:pPr>
       <w:r>
         <w:rPr>
@@ -7332,12 +7463,27 @@
     </w:p>
     <w:p>
       <w:pPr>
-        <w:pStyle w:val="ListParagraph"/>
-        <w:numPr>
-          <w:ilvl w:val="0"/>
-          <w:numId w:val="1"/>
-        </w:numPr>
-        <w:spacing w:after="30" w:before="20"/>
+        <w:spacing w:after="30" w:before="0"/>
+        <w:ind w:left="360"/>
+      </w:pPr>
+      <w:r>
+        <w:rPr>
+          <w:rFonts w:ascii="Arial" w:cs="Arial" w:eastAsia="Arial" w:hAnsi="Arial"/>
+          <w:color w:val="64748B"/>
+          <w:sz w:val="17"/>
+          <w:szCs w:val="17"/>
+        </w:rPr>
+        <w:t xml:space="preserve">Selected youth parliamentary representative advocating coastal governance, archipelagic policy, and marine conservation.</w:t>
+      </w:r>
+    </w:p>
+    <w:p>
+      <w:pPr>
+        <w:pStyle w:val="ListParagraph"/>
+        <w:numPr>
+          <w:ilvl w:val="0"/>
+          <w:numId w:val="1"/>
+        </w:numPr>
+        <w:spacing w:after="20" w:before="20"/>
       </w:pPr>
       <w:r>
         <w:rPr>
@@ -7373,12 +7519,27 @@
     </w:p>
     <w:p>
       <w:pPr>
-        <w:pStyle w:val="ListParagraph"/>
-        <w:numPr>
-          <w:ilvl w:val="0"/>
-          <w:numId w:val="1"/>
-        </w:numPr>
-        <w:spacing w:after="30" w:before="20"/>
+        <w:spacing w:after="30" w:before="0"/>
+        <w:ind w:left="360"/>
+      </w:pPr>
+      <w:r>
+        <w:rPr>
+          <w:rFonts w:ascii="Arial" w:cs="Arial" w:eastAsia="Arial" w:hAnsi="Arial"/>
+          <w:color w:val="64748B"/>
+          <w:sz w:val="17"/>
+          <w:szCs w:val="17"/>
+        </w:rPr>
+        <w:t xml:space="preserve">Awarded for pioneering undergraduate research on bioacoustics and acoustic fish behavior.</w:t>
+      </w:r>
+    </w:p>
+    <w:p>
+      <w:pPr>
+        <w:pStyle w:val="ListParagraph"/>
+        <w:numPr>
+          <w:ilvl w:val="0"/>
+          <w:numId w:val="1"/>
+        </w:numPr>
+        <w:spacing w:after="20" w:before="20"/>
       </w:pPr>
       <w:r>
         <w:rPr>
@@ -7410,6 +7571,21 @@
           <w:szCs w:val="18"/>
         </w:rPr>
         <w:t xml:space="preserve">— IPB University</w:t>
+      </w:r>
+    </w:p>
+    <w:p>
+      <w:pPr>
+        <w:spacing w:after="30" w:before="0"/>
+        <w:ind w:left="360"/>
+      </w:pPr>
+      <w:r>
+        <w:rPr>
+          <w:rFonts w:ascii="Arial" w:cs="Arial" w:eastAsia="Arial" w:hAnsi="Arial"/>
+          <w:color w:val="64748B"/>
+          <w:sz w:val="17"/>
+          <w:szCs w:val="17"/>
+        </w:rPr>
+        <w:t xml:space="preserve">Selected participant for intensive student leadership and governance camp.</w:t>
       </w:r>
     </w:p>
     <w:p>

</xml_diff>

<commit_message>
feat: add Asian Fisheries Acoustics Society (AFAS) membership and update marine, forest concession & POME waste sector profiles
</commit_message>
<xml_diff>
--- a/I Gede Mahendra Wijaya_Master CV.docx
+++ b/I Gede Mahendra Wijaya_Master CV.docx
@@ -94,7 +94,7 @@
           <w:sz w:val="20"/>
           <w:szCs w:val="20"/>
         </w:rPr>
-        <w:t xml:space="preserve">Marine environmental specialist with over 13 years of experience delivering high-level technical support across marine-based industries directly affected by climate change. Expertise spans marine and coastal management, fisheries governance, carbon and ecosystem services, environmental and social impact assessment, and community development. A track record of success with major international clients: World Bank, ADB, FAO, UNDP, WWF, and The Nature Conservancy, including award-winning innovation recognised by Indonesia's Business Innovation Centre (BIC). Highly skilled in project management, stakeholder engagement, M&amp;E frameworks, and applying innovative digital solutions to conservation challenges. Passionate about advancing marine environmental management through rigorous research and collaborative partnerships.</w:t>
+        <w:t xml:space="preserve">Marine environmental specialist with over 13 years of experience delivering high-level technical leadership across marine-based sectors, forest concessions, and industrial waste decarbonization. Formally trained in marine science and acoustics (IPB University), with expertise spanning coastal and ocean governance, sustainable fisheries, forest concession licensing (PBPH), and carbon mitigation across AFOLU (&gt;200,000 ha peatland/wetland concessions in Papua) and Waste sectors (Palm Oil Mill Effluent / POME methane capture &amp; biogas-to-energy). Proven track record with major international institutions (World Bank, ADB, FAO, UNDP, WWF, TNC) and national innovation award recognition (BIC). Highly skilled in carbon accounting (SRUK, VCM, Paris Agreement Article 6), MRV, environmental safeguards (ESIA/AMDAL), and multi-stakeholder engagement.</w:t>
       </w:r>
     </w:p>
     <w:p>
@@ -7586,6 +7586,70 @@
           <w:szCs w:val="17"/>
         </w:rPr>
         <w:t xml:space="preserve">Selected participant for intensive student leadership and governance camp.</w:t>
+      </w:r>
+    </w:p>
+    <w:p>
+      <w:pPr>
+        <w:pBdr>
+          <w:bottom w:val="single" w:color="0D9488" w:sz="12" w:space="4"/>
+        </w:pBdr>
+        <w:spacing w:after="80" w:before="280"/>
+      </w:pPr>
+      <w:r>
+        <w:rPr>
+          <w:rFonts w:ascii="Arial" w:cs="Arial" w:eastAsia="Arial" w:hAnsi="Arial"/>
+          <w:b/>
+          <w:bCs/>
+          <w:color w:val="0F3A5D"/>
+          <w:sz w:val="24"/>
+          <w:szCs w:val="24"/>
+        </w:rPr>
+        <w:t xml:space="preserve">PROFESSIONAL MEMBERSHIPS &amp; AFFILIATIONS</w:t>
+      </w:r>
+    </w:p>
+    <w:p>
+      <w:pPr>
+        <w:pStyle w:val="ListParagraph"/>
+        <w:numPr>
+          <w:ilvl w:val="0"/>
+          <w:numId w:val="1"/>
+        </w:numPr>
+        <w:spacing w:after="20" w:before="20"/>
+      </w:pPr>
+      <w:r>
+        <w:rPr>
+          <w:rFonts w:ascii="Arial" w:cs="Arial" w:eastAsia="Arial" w:hAnsi="Arial"/>
+          <w:b/>
+          <w:bCs/>
+          <w:color w:val="0F3A5D"/>
+          <w:sz w:val="19"/>
+          <w:szCs w:val="19"/>
+        </w:rPr>
+        <w:t xml:space="preserve">Asian Fisheries Acoustics Society (AFAS) </w:t>
+      </w:r>
+      <w:r>
+        <w:rPr>
+          <w:rFonts w:ascii="Arial" w:cs="Arial" w:eastAsia="Arial" w:hAnsi="Arial"/>
+          <w:color w:val="1E293B"/>
+          <w:sz w:val="18"/>
+          <w:szCs w:val="18"/>
+        </w:rPr>
+        <w:t xml:space="preserve">— Member (2012 – Present)</w:t>
+      </w:r>
+    </w:p>
+    <w:p>
+      <w:pPr>
+        <w:spacing w:after="30" w:before="0"/>
+        <w:ind w:left="360"/>
+      </w:pPr>
+      <w:r>
+        <w:rPr>
+          <w:rFonts w:ascii="Arial" w:cs="Arial" w:eastAsia="Arial" w:hAnsi="Arial"/>
+          <w:color w:val="64748B"/>
+          <w:sz w:val="17"/>
+          <w:szCs w:val="17"/>
+        </w:rPr>
+        <w:t xml:space="preserve">Active member contributing to regional advancements in underwater bioacoustics, fisheries acoustic survey technologies, optical-acoustic integration, and marine ecosystem monitoring across Asian and global waters.</w:t>
       </w:r>
     </w:p>
     <w:p>

</xml_diff>

<commit_message>
feat: sync Article 6.2, Climate Finance Transparency, and Coastal Restoration certificates (total: 72 active certifications)
</commit_message>
<xml_diff>
--- a/I Gede Mahendra Wijaya_Master CV.docx
+++ b/I Gede Mahendra Wijaya_Master CV.docx
@@ -194,7 +194,7 @@
           <w:sz w:val="20"/>
           <w:szCs w:val="20"/>
         </w:rPr>
-        <w:t xml:space="preserve">69 </w:t>
+        <w:t xml:space="preserve">72 </w:t>
       </w:r>
       <w:r>
         <w:rPr>
@@ -4054,7 +4054,7 @@
           <w:sz w:val="24"/>
           <w:szCs w:val="24"/>
         </w:rPr>
-        <w:t xml:space="preserve">PROFESSIONAL CERTIFICATIONS &amp; SPECIALIZED TRAINING (TOTAL: 69)</w:t>
+        <w:t xml:space="preserve">PROFESSIONAL CERTIFICATIONS &amp; SPECIALIZED TRAINING (TOTAL: 72)</w:t>
       </w:r>
     </w:p>
     <w:p>
@@ -4070,7 +4070,7 @@
           <w:sz w:val="21"/>
           <w:szCs w:val="21"/>
         </w:rPr>
-        <w:t xml:space="preserve">1. Carbon, Climate &amp; Ecosystem Services (Blue Carbon, Forest Carbon &amp; Climate Finance) (20 Programs)</w:t>
+        <w:t xml:space="preserve">1. Carbon, Climate &amp; Ecosystem Services (Blue Carbon, Forest Carbon &amp; Climate Finance) (22 Programs)</w:t>
       </w:r>
     </w:p>
     <w:p>
@@ -4091,16 +4091,16 @@
           <w:sz w:val="19"/>
           <w:szCs w:val="19"/>
         </w:rPr>
-        <w:t xml:space="preserve">Introduction to Biodiversity Credits (Learning Journey)</w:t>
-      </w:r>
-      <w:r>
-        <w:rPr>
-          <w:rFonts w:ascii="Arial" w:cs="Arial" w:eastAsia="Arial" w:hAnsi="Arial"/>
-          <w:color w:val="64748B"/>
-          <w:sz w:val="18"/>
-          <w:szCs w:val="18"/>
-        </w:rPr>
-        <w:t xml:space="preserve"> — Biodiversity Credit Alliance (BCA), Nature for Life Hub &amp; University of Nottingham (Sep 2026)</w:t>
+        <w:t xml:space="preserve">Operationalizing Article 6.2 of the Paris Agreement: Achieving Ambitious Climate Action Through Cooperative Approaches</w:t>
+      </w:r>
+      <w:r>
+        <w:rPr>
+          <w:rFonts w:ascii="Arial" w:cs="Arial" w:eastAsia="Arial" w:hAnsi="Arial"/>
+          <w:color w:val="64748B"/>
+          <w:sz w:val="18"/>
+          <w:szCs w:val="18"/>
+        </w:rPr>
+        <w:t xml:space="preserve"> — United Nations Development Programme (UNDP), UNFCCC &amp; Learning for Nature (Oct 2026)</w:t>
       </w:r>
     </w:p>
     <w:p>
@@ -4126,7 +4126,7 @@
           <w:sz w:val="18"/>
           <w:szCs w:val="18"/>
         </w:rPr>
-        <w:t xml:space="preserve">Biodiversity Credits Framework, High-Integrity Nature Credits, Biodiversity Credit Alliance (BCA) Principles, Nature-Positive Market Mechanisms, Indigenous &amp; Community Rights (IPLC Safeguards), Biodiversity Metrics &amp; Monitoring</w:t>
+        <w:t xml:space="preserve">Paris Agreement Article 6.2 Governance, Internationally Transferred Mitigation Outcomes (ITMOs), Bilateral Cooperative Approaches, Corresponding Adjustments &amp; NDC Accounting, National Registry &amp; Tracking, Authorization Frameworks</w:t>
       </w:r>
     </w:p>
     <w:p>
@@ -4141,7 +4141,7 @@
           <w:sz w:val="18"/>
           <w:szCs w:val="18"/>
         </w:rPr>
-        <w:t xml:space="preserve">Specialized learning journey certification on biodiversity credits awarded by the Biodiversity Credit Alliance (BCA) and Nature for Life Hub in collaboration with the University of Nottingham. Comprehensive training on high-integrity biodiversity credit markets, nature-positive crediting mechanisms, biodiversity metrics, integrity governance, and community benefit-sharing models.</w:t>
+        <w:t xml:space="preserve">Specialized training certification developed by UNDP in partnership with the UNFCCC and delivered via Learning for Nature / UN CC:Learn. Covers key requirements and national building blocks for operationalizing Article 6.2 cooperative approaches, including bilateral trading of Internationally Transferred Mitigation Outcomes (ITMOs), robust NDC accounting, avoiding double-counting with corresponding adjustments, and institutional arrangements.</w:t>
       </w:r>
     </w:p>
     <w:p>
@@ -4162,16 +4162,16 @@
           <w:sz w:val="19"/>
           <w:szCs w:val="19"/>
         </w:rPr>
-        <w:t xml:space="preserve">Biodiversity Finance: Designing and Implementing Finance Plans for Nature</w:t>
-      </w:r>
-      <w:r>
-        <w:rPr>
-          <w:rFonts w:ascii="Arial" w:cs="Arial" w:eastAsia="Arial" w:hAnsi="Arial"/>
-          <w:color w:val="64748B"/>
-          <w:sz w:val="18"/>
-          <w:szCs w:val="18"/>
-        </w:rPr>
-        <w:t xml:space="preserve"> — UNDP Biodiversity Finance Initiative (BIOFIN) &amp; Learning for Nature (Sep 2026)</w:t>
+        <w:t xml:space="preserve">Introduction to Biodiversity Credits (Learning Journey)</w:t>
+      </w:r>
+      <w:r>
+        <w:rPr>
+          <w:rFonts w:ascii="Arial" w:cs="Arial" w:eastAsia="Arial" w:hAnsi="Arial"/>
+          <w:color w:val="64748B"/>
+          <w:sz w:val="18"/>
+          <w:szCs w:val="18"/>
+        </w:rPr>
+        <w:t xml:space="preserve"> — Biodiversity Credit Alliance (BCA), Nature for Life Hub &amp; University of Nottingham (Sep 2026)</w:t>
       </w:r>
     </w:p>
     <w:p>
@@ -4197,7 +4197,7 @@
           <w:sz w:val="18"/>
           <w:szCs w:val="18"/>
         </w:rPr>
-        <w:t xml:space="preserve">BIOFIN Methodology, Biodiversity Expenditure Review (BER), Financial Needs Assessment (FNA), Biodiversity Finance Plan (BFP), Nature-Positive Finance Mechanisms, Sustainable Blended Finance &amp; Impact Investment</w:t>
+        <w:t xml:space="preserve">Biodiversity Credits Framework, High-Integrity Nature Credits, Biodiversity Credit Alliance (BCA) Principles, Nature-Positive Market Mechanisms, Indigenous &amp; Community Rights (IPLC Safeguards), Biodiversity Metrics &amp; Monitoring</w:t>
       </w:r>
     </w:p>
     <w:p>
@@ -4212,7 +4212,7 @@
           <w:sz w:val="18"/>
           <w:szCs w:val="18"/>
         </w:rPr>
-        <w:t xml:space="preserve">Comprehensive 12-hour specialized professional course developed by the UNDP Biodiversity Finance Initiative (BIOFIN) on Learning for Nature, based on the BIOFIN Workbook 2024. Covers the complete BIOFIN national methodology: Policy and Institutional Review (PIR), Biodiversity Expenditure Review (BER), Financial Needs Assessment (FNA), and designing and mobilizing high-impact national Biodiversity Finance Plans (BFP) to close global biodiversity financing gaps.</w:t>
+        <w:t xml:space="preserve">Specialized learning journey certification on biodiversity credits awarded by the Biodiversity Credit Alliance (BCA) and Nature for Life Hub in collaboration with the University of Nottingham. Comprehensive training on high-integrity biodiversity credit markets, nature-positive crediting mechanisms, biodiversity metrics, integrity governance, and community benefit-sharing models.</w:t>
       </w:r>
     </w:p>
     <w:p>
@@ -4233,16 +4233,16 @@
           <w:sz w:val="19"/>
           <w:szCs w:val="19"/>
         </w:rPr>
-        <w:t xml:space="preserve">ICAT Training on the Use of the IPCC Inventory Software</w:t>
-      </w:r>
-      <w:r>
-        <w:rPr>
-          <w:rFonts w:ascii="Arial" w:cs="Arial" w:eastAsia="Arial" w:hAnsi="Arial"/>
-          <w:color w:val="64748B"/>
-          <w:sz w:val="18"/>
-          <w:szCs w:val="18"/>
-        </w:rPr>
-        <w:t xml:space="preserve"> — Initiative for Climate Action Transparency (ICAT), IPCC TSU &amp; UNDP Learning for Nature (Sep 2026)</w:t>
+        <w:t xml:space="preserve">Climate Finance Transparency</w:t>
+      </w:r>
+      <w:r>
+        <w:rPr>
+          <w:rFonts w:ascii="Arial" w:cs="Arial" w:eastAsia="Arial" w:hAnsi="Arial"/>
+          <w:color w:val="64748B"/>
+          <w:sz w:val="18"/>
+          <w:szCs w:val="18"/>
+        </w:rPr>
+        <w:t xml:space="preserve"> — Initiative for Climate Action Transparency (ICAT) &amp; Learning for Nature (Sep 2026)</w:t>
       </w:r>
     </w:p>
     <w:p>
@@ -4268,7 +4268,7 @@
           <w:sz w:val="18"/>
           <w:szCs w:val="18"/>
         </w:rPr>
-        <w:t xml:space="preserve">IPCC Inventory Software, 2006 IPCC Guidelines for National GHG Inventories, Enhanced Transparency Framework (ETF), LULUCF &amp; AFOLU Emission Estimation, UNFCCC ETF Reporting Tool Interoperability, Activity Data &amp; Emission Factor Management</w:t>
+        <w:t xml:space="preserve">Climate Finance Tracking, Enhanced Transparency Framework (ETF), Article 9 &amp; 13 Paris Agreement, Climate Finance Needs Assessment, Climate Finance Mobilization, Transparency Metrics &amp; MRV</w:t>
       </w:r>
     </w:p>
     <w:p>
@@ -4283,7 +4283,7 @@
           <w:sz w:val="18"/>
           <w:szCs w:val="18"/>
         </w:rPr>
-        <w:t xml:space="preserve">Specialized technical training program developed by the Initiative for Climate Action Transparency (ICAT) and the IPCC Task Force on National Greenhouse Gas Inventories Technical Support Unit (IPCC TSU) on UNDP Learning for Nature. Comprehensive operational training covering all IPCC sectors (Energy, IPPU, Agriculture, LULUCF/Forestry, and Waste) to calculate national GHG emissions and removals, apply 2006 IPCC Guidelines, and ensure interoperability with the UNFCCC ETF reporting tool under the Paris Agreement.</w:t>
+        <w:t xml:space="preserve">Professional certification developed by the Initiative for Climate Action Transparency (ICAT) on Learning for Nature. Comprehensive training on establishing national climate finance tracking frameworks, assessing financial needs for mitigation and adaptation, mapping climate finance flows, and aligning with the Paris Agreement's Enhanced Transparency Framework (ETF).</w:t>
       </w:r>
     </w:p>
     <w:p>
@@ -4304,16 +4304,16 @@
           <w:sz w:val="19"/>
           <w:szCs w:val="19"/>
         </w:rPr>
-        <w:t xml:space="preserve">REDD+ Academy: Forest Carbon &amp; National Strategy Capacity Building</w:t>
-      </w:r>
-      <w:r>
-        <w:rPr>
-          <w:rFonts w:ascii="Arial" w:cs="Arial" w:eastAsia="Arial" w:hAnsi="Arial"/>
-          <w:color w:val="64748B"/>
-          <w:sz w:val="18"/>
-          <w:szCs w:val="18"/>
-        </w:rPr>
-        <w:t xml:space="preserve"> — UN-REDD Programme (FAO, UNDP, UNEP) (Sep 2026)</w:t>
+        <w:t xml:space="preserve">Biodiversity Finance: Designing and Implementing Finance Plans for Nature</w:t>
+      </w:r>
+      <w:r>
+        <w:rPr>
+          <w:rFonts w:ascii="Arial" w:cs="Arial" w:eastAsia="Arial" w:hAnsi="Arial"/>
+          <w:color w:val="64748B"/>
+          <w:sz w:val="18"/>
+          <w:szCs w:val="18"/>
+        </w:rPr>
+        <w:t xml:space="preserve"> — UNDP Biodiversity Finance Initiative (BIOFIN) &amp; Learning for Nature (Sep 2026)</w:t>
       </w:r>
     </w:p>
     <w:p>
@@ -4339,7 +4339,7 @@
           <w:sz w:val="18"/>
           <w:szCs w:val="18"/>
         </w:rPr>
-        <w:t xml:space="preserve">REDD+ Architecture &amp; National Strategy, National Forest Monitoring Systems (NFMS), Forest Reference Emission Levels (FREL/FRL), Safeguard Information Systems (SIS), Results-Based Finance &amp; Carbon Markets</w:t>
+        <w:t xml:space="preserve">BIOFIN Methodology, Biodiversity Expenditure Review (BER), Financial Needs Assessment (FNA), Biodiversity Finance Plan (BFP), Nature-Positive Finance Mechanisms, Sustainable Blended Finance &amp; Impact Investment</w:t>
       </w:r>
     </w:p>
     <w:p>
@@ -4354,7 +4354,7 @@
           <w:sz w:val="18"/>
           <w:szCs w:val="18"/>
         </w:rPr>
-        <w:t xml:space="preserve">Flagship capacity-building training program by the UN-REDD Programme (FAO, UNDP, UNEP), covering national REDD+ architecture, Forest Reference Emission Levels (FREL), National Forest Monitoring Systems (NFMS), Safeguards &amp; Safeguard Information Systems (SIS), and results-based climate finance.</w:t>
+        <w:t xml:space="preserve">Comprehensive 12-hour specialized professional course developed by the UNDP Biodiversity Finance Initiative (BIOFIN) on Learning for Nature, based on the BIOFIN Workbook 2024. Covers the complete BIOFIN national methodology: Policy and Institutional Review (PIR), Biodiversity Expenditure Review (BER), Financial Needs Assessment (FNA), and designing and mobilizing high-impact national Biodiversity Finance Plans (BFP) to close global biodiversity financing gaps.</w:t>
       </w:r>
     </w:p>
     <w:p>
@@ -4375,16 +4375,16 @@
           <w:sz w:val="19"/>
           <w:szCs w:val="19"/>
         </w:rPr>
-        <w:t xml:space="preserve">Article 6 Decision-Making: Training for Practitioners</w:t>
-      </w:r>
-      <w:r>
-        <w:rPr>
-          <w:rFonts w:ascii="Arial" w:cs="Arial" w:eastAsia="Arial" w:hAnsi="Arial"/>
-          <w:color w:val="64748B"/>
-          <w:sz w:val="18"/>
-          <w:szCs w:val="18"/>
-        </w:rPr>
-        <w:t xml:space="preserve"> — Paris Agreement Article 6 Implementation Partnership (A6IP) Center, Perspectives Climate Research &amp; GHGMI (Sep 2026)</w:t>
+        <w:t xml:space="preserve">ICAT Training on the Use of the IPCC Inventory Software</w:t>
+      </w:r>
+      <w:r>
+        <w:rPr>
+          <w:rFonts w:ascii="Arial" w:cs="Arial" w:eastAsia="Arial" w:hAnsi="Arial"/>
+          <w:color w:val="64748B"/>
+          <w:sz w:val="18"/>
+          <w:szCs w:val="18"/>
+        </w:rPr>
+        <w:t xml:space="preserve"> — Initiative for Climate Action Transparency (ICAT), IPCC TSU &amp; UNDP Learning for Nature (Sep 2026)</w:t>
       </w:r>
     </w:p>
     <w:p>
@@ -4410,7 +4410,7 @@
           <w:sz w:val="18"/>
           <w:szCs w:val="18"/>
         </w:rPr>
-        <w:t xml:space="preserve">Paris Agreement Article 6.2 &amp; 6.4, Internationally Transferred Mitigation Outcomes (ITMOs), Carbon Market Decision-Making, Corresponding Adjustments, GHG Accounting &amp; MRV, Carbon Crediting Mechanisms, Institutional Arrangements</w:t>
+        <w:t xml:space="preserve">IPCC Inventory Software, 2006 IPCC Guidelines for National GHG Inventories, Enhanced Transparency Framework (ETF), LULUCF &amp; AFOLU Emission Estimation, UNFCCC ETF Reporting Tool Interoperability, Activity Data &amp; Emission Factor Management</w:t>
       </w:r>
     </w:p>
     <w:p>
@@ -4425,7 +4425,7 @@
           <w:sz w:val="18"/>
           <w:szCs w:val="18"/>
         </w:rPr>
-        <w:t xml:space="preserve">Advanced professional training for carbon market practitioners developed by Perspectives Climate Research and the Greenhouse Gas Management Institute (GHGMI), supported by the Paris Agreement Article 6 Implementation Partnership (A6IP) Center, Ministry of the Environment Japan (MOEJ), and BMWK Germany. Rigorous curriculum covering strategic evaluation of Article 6 mechanisms (6.2 cooperative approaches and 6.4 crediting mechanism), international carbon market dynamics, project-level GHG accounting, corresponding adjustments, and national institutional readiness for market-based mitigation.</w:t>
+        <w:t xml:space="preserve">Specialized technical training program developed by the Initiative for Climate Action Transparency (ICAT) and the IPCC Task Force on National Greenhouse Gas Inventories Technical Support Unit (IPCC TSU) on UNDP Learning for Nature. Comprehensive operational training covering all IPCC sectors (Energy, IPPU, Agriculture, LULUCF/Forestry, and Waste) to calculate national GHG emissions and removals, apply 2006 IPCC Guidelines, and ensure interoperability with the UNFCCC ETF reporting tool under the Paris Agreement.</w:t>
       </w:r>
     </w:p>
     <w:p>
@@ -4446,16 +4446,16 @@
           <w:sz w:val="19"/>
           <w:szCs w:val="19"/>
         </w:rPr>
-        <w:t xml:space="preserve">201 Basics of Organizational GHG Accounting (Certificate of Proficiency)</w:t>
-      </w:r>
-      <w:r>
-        <w:rPr>
-          <w:rFonts w:ascii="Arial" w:cs="Arial" w:eastAsia="Arial" w:hAnsi="Arial"/>
-          <w:color w:val="64748B"/>
-          <w:sz w:val="18"/>
-          <w:szCs w:val="18"/>
-        </w:rPr>
-        <w:t xml:space="preserve"> — The Greenhouse Gas Management Institute (GHGMI) (Aug 2026)</w:t>
+        <w:t xml:space="preserve">REDD+ Academy: Forest Carbon &amp; National Strategy Capacity Building</w:t>
+      </w:r>
+      <w:r>
+        <w:rPr>
+          <w:rFonts w:ascii="Arial" w:cs="Arial" w:eastAsia="Arial" w:hAnsi="Arial"/>
+          <w:color w:val="64748B"/>
+          <w:sz w:val="18"/>
+          <w:szCs w:val="18"/>
+        </w:rPr>
+        <w:t xml:space="preserve"> — UN-REDD Programme (FAO, UNDP, UNEP) (Sep 2026)</w:t>
       </w:r>
     </w:p>
     <w:p>
@@ -4481,7 +4481,7 @@
           <w:sz w:val="18"/>
           <w:szCs w:val="18"/>
         </w:rPr>
-        <w:t xml:space="preserve">Organizational GHG Accounting, GHG Protocol Corporate Standard, ISO 14064-1, Scope 1, Scope 2 &amp; Scope 3 Emissions, Inventory Quality Management, Baseline Recalculation</w:t>
+        <w:t xml:space="preserve">REDD+ Architecture &amp; National Strategy, National Forest Monitoring Systems (NFMS), Forest Reference Emission Levels (FREL/FRL), Safeguard Information Systems (SIS), Results-Based Finance &amp; Carbon Markets</w:t>
       </w:r>
     </w:p>
     <w:p>
@@ -4496,7 +4496,7 @@
           <w:sz w:val="18"/>
           <w:szCs w:val="18"/>
         </w:rPr>
-        <w:t xml:space="preserve">Formal professional certificate of proficiency issued by the Greenhouse Gas Management Institute (GHGMI) under Dean Michael Gillenwater (Credential Code: 201EX2046 / BOGAEX2046). Rigorous curriculum covering organizational carbon accounting principles, organizational and operational boundary setting, Scope 1, 2, and 3 emission quantification methodologies, activity data collection, emission factor selection, and uncertainty management aligned with the GHG Protocol and ISO 14064.</w:t>
+        <w:t xml:space="preserve">Flagship capacity-building training program by the UN-REDD Programme (FAO, UNDP, UNEP), covering national REDD+ architecture, Forest Reference Emission Levels (FREL), National Forest Monitoring Systems (NFMS), Safeguards &amp; Safeguard Information Systems (SIS), and results-based climate finance.</w:t>
       </w:r>
     </w:p>
     <w:p>
@@ -4517,16 +4517,16 @@
           <w:sz w:val="19"/>
           <w:szCs w:val="19"/>
         </w:rPr>
-        <w:t xml:space="preserve">The German Supply Chain Due Diligence Act (LkSG / SCDDA)</w:t>
-      </w:r>
-      <w:r>
-        <w:rPr>
-          <w:rFonts w:ascii="Arial" w:cs="Arial" w:eastAsia="Arial" w:hAnsi="Arial"/>
-          <w:color w:val="64748B"/>
-          <w:sz w:val="18"/>
-          <w:szCs w:val="18"/>
-        </w:rPr>
-        <w:t xml:space="preserve"> — Import Promotion Desk (IPD Germany) (Aug 2026)</w:t>
+        <w:t xml:space="preserve">Article 6 Decision-Making: Training for Practitioners</w:t>
+      </w:r>
+      <w:r>
+        <w:rPr>
+          <w:rFonts w:ascii="Arial" w:cs="Arial" w:eastAsia="Arial" w:hAnsi="Arial"/>
+          <w:color w:val="64748B"/>
+          <w:sz w:val="18"/>
+          <w:szCs w:val="18"/>
+        </w:rPr>
+        <w:t xml:space="preserve"> — Paris Agreement Article 6 Implementation Partnership (A6IP) Center, Perspectives Climate Research &amp; GHGMI (Sep 2026)</w:t>
       </w:r>
     </w:p>
     <w:p>
@@ -4552,7 +4552,7 @@
           <w:sz w:val="18"/>
           <w:szCs w:val="18"/>
         </w:rPr>
-        <w:t xml:space="preserve">Supply Chain Due Diligence (LkSG / SCDDA), Human Rights &amp; Environmental Risk Analysis, EU Market Compliance, Sustainable Sourcing</w:t>
+        <w:t xml:space="preserve">Paris Agreement Article 6.2 &amp; 6.4, Internationally Transferred Mitigation Outcomes (ITMOs), Carbon Market Decision-Making, Corresponding Adjustments, GHG Accounting &amp; MRV, Carbon Crediting Mechanisms, Institutional Arrangements</w:t>
       </w:r>
     </w:p>
     <w:p>
@@ -4567,7 +4567,7 @@
           <w:sz w:val="18"/>
           <w:szCs w:val="18"/>
         </w:rPr>
-        <w:t xml:space="preserve">Comprehensive e-learning program on complying with the German Supply Chain Due Diligence Act (Lieferkettensorgfaltspflichtengesetz - LkSG), addressing human rights and environmental risk analysis, grievance mechanisms, and sustainable supply chain governance for international exporters.</w:t>
+        <w:t xml:space="preserve">Advanced professional training for carbon market practitioners developed by Perspectives Climate Research and the Greenhouse Gas Management Institute (GHGMI), supported by the Paris Agreement Article 6 Implementation Partnership (A6IP) Center, Ministry of the Environment Japan (MOEJ), and BMWK Germany. Rigorous curriculum covering strategic evaluation of Article 6 mechanisms (6.2 cooperative approaches and 6.4 crediting mechanism), international carbon market dynamics, project-level GHG accounting, corresponding adjustments, and national institutional readiness for market-based mitigation.</w:t>
       </w:r>
     </w:p>
     <w:p>
@@ -4588,16 +4588,16 @@
           <w:sz w:val="19"/>
           <w:szCs w:val="19"/>
         </w:rPr>
-        <w:t xml:space="preserve">EU Deforestation Regulation (EUDR) Compliance &amp; Due Diligence</w:t>
-      </w:r>
-      <w:r>
-        <w:rPr>
-          <w:rFonts w:ascii="Arial" w:cs="Arial" w:eastAsia="Arial" w:hAnsi="Arial"/>
-          <w:color w:val="64748B"/>
-          <w:sz w:val="18"/>
-          <w:szCs w:val="18"/>
-        </w:rPr>
-        <w:t xml:space="preserve"> — Import Promotion Desk (IPD Germany) (Aug 2026)</w:t>
+        <w:t xml:space="preserve">201 Basics of Organizational GHG Accounting (Certificate of Proficiency)</w:t>
+      </w:r>
+      <w:r>
+        <w:rPr>
+          <w:rFonts w:ascii="Arial" w:cs="Arial" w:eastAsia="Arial" w:hAnsi="Arial"/>
+          <w:color w:val="64748B"/>
+          <w:sz w:val="18"/>
+          <w:szCs w:val="18"/>
+        </w:rPr>
+        <w:t xml:space="preserve"> — The Greenhouse Gas Management Institute (GHGMI) (Aug 2026)</w:t>
       </w:r>
     </w:p>
     <w:p>
@@ -4623,7 +4623,7 @@
           <w:sz w:val="18"/>
           <w:szCs w:val="18"/>
         </w:rPr>
-        <w:t xml:space="preserve">EU Deforestation Regulation (EUDR) Compliance, Supply Chain Geolocation &amp; Traceability, Deforestation-Free Commodity Due Diligence, Legality &amp; Risk Assessment</w:t>
+        <w:t xml:space="preserve">Organizational GHG Accounting, GHG Protocol Corporate Standard, ISO 14064-1, Scope 1, Scope 2 &amp; Scope 3 Emissions, Inventory Quality Management, Baseline Recalculation</w:t>
       </w:r>
     </w:p>
     <w:p>
@@ -4638,7 +4638,7 @@
           <w:sz w:val="18"/>
           <w:szCs w:val="18"/>
         </w:rPr>
-        <w:t xml:space="preserve">Specialized training on the EU Deforestation Regulation (EUDR), addressing regulatory compliance, supply chain due diligence, geolocation traceability, and legality verification for deforestation-free commodities entering the EU market (palm oil, wood, rubber, cocoa, coffee, soy, cattle).</w:t>
+        <w:t xml:space="preserve">Formal professional certificate of proficiency issued by the Greenhouse Gas Management Institute (GHGMI) under Dean Michael Gillenwater (Credential Code: 201EX2046 / BOGAEX2046). Rigorous curriculum covering organizational carbon accounting principles, organizational and operational boundary setting, Scope 1, 2, and 3 emission quantification methodologies, activity data collection, emission factor selection, and uncertainty management aligned with the GHG Protocol and ISO 14064.</w:t>
       </w:r>
     </w:p>
     <w:p>
@@ -4659,76 +4659,16 @@
           <w:sz w:val="19"/>
           <w:szCs w:val="19"/>
         </w:rPr>
-        <w:t xml:space="preserve">Blue Carbon Fundamentals</w:t>
-      </w:r>
-      <w:r>
-        <w:rPr>
-          <w:rFonts w:ascii="Arial" w:cs="Arial" w:eastAsia="Arial" w:hAnsi="Arial"/>
-          <w:color w:val="64748B"/>
-          <w:sz w:val="18"/>
-          <w:szCs w:val="18"/>
-        </w:rPr>
-        <w:t xml:space="preserve"> — World Bank Group (Jul 2026)</w:t>
-      </w:r>
-    </w:p>
-    <w:p>
-      <w:pPr>
-        <w:pStyle w:val="ListParagraph"/>
-        <w:numPr>
-          <w:ilvl w:val="0"/>
-          <w:numId w:val="1"/>
-        </w:numPr>
-        <w:spacing w:after="20" w:before="20"/>
-      </w:pPr>
-      <w:r>
-        <w:rPr>
-          <w:rFonts w:ascii="Arial" w:cs="Arial" w:eastAsia="Arial" w:hAnsi="Arial"/>
-          <w:b/>
-          <w:bCs/>
-          <w:color w:val="1E293B"/>
-          <w:sz w:val="19"/>
-          <w:szCs w:val="19"/>
-        </w:rPr>
-        <w:t xml:space="preserve">Green Economic Acceleration: A Japan-ASEAN Strategic Programme for Sustainable Green Finance</w:t>
-      </w:r>
-      <w:r>
-        <w:rPr>
-          <w:rFonts w:ascii="Arial" w:cs="Arial" w:eastAsia="Arial" w:hAnsi="Arial"/>
-          <w:color w:val="64748B"/>
-          <w:sz w:val="18"/>
-          <w:szCs w:val="18"/>
-        </w:rPr>
-        <w:t xml:space="preserve"> — United Nations Institute for Training and Research (UNITAR) (Jul 2026)</w:t>
-      </w:r>
-    </w:p>
-    <w:p>
-      <w:pPr>
-        <w:pStyle w:val="ListParagraph"/>
-        <w:numPr>
-          <w:ilvl w:val="0"/>
-          <w:numId w:val="1"/>
-        </w:numPr>
-        <w:spacing w:after="20" w:before="20"/>
-      </w:pPr>
-      <w:r>
-        <w:rPr>
-          <w:rFonts w:ascii="Arial" w:cs="Arial" w:eastAsia="Arial" w:hAnsi="Arial"/>
-          <w:b/>
-          <w:bCs/>
-          <w:color w:val="1E293B"/>
-          <w:sz w:val="19"/>
-          <w:szCs w:val="19"/>
-        </w:rPr>
-        <w:t xml:space="preserve">Blue Carbon Project Development &amp; MRV Specialist Training</w:t>
-      </w:r>
-      <w:r>
-        <w:rPr>
-          <w:rFonts w:ascii="Arial" w:cs="Arial" w:eastAsia="Arial" w:hAnsi="Arial"/>
-          <w:color w:val="64748B"/>
-          <w:sz w:val="18"/>
-          <w:szCs w:val="18"/>
-        </w:rPr>
-        <w:t xml:space="preserve"> — Fair Carbon (Blue Carbon Academy) (May 2026)</w:t>
+        <w:t xml:space="preserve">The German Supply Chain Due Diligence Act (LkSG / SCDDA)</w:t>
+      </w:r>
+      <w:r>
+        <w:rPr>
+          <w:rFonts w:ascii="Arial" w:cs="Arial" w:eastAsia="Arial" w:hAnsi="Arial"/>
+          <w:color w:val="64748B"/>
+          <w:sz w:val="18"/>
+          <w:szCs w:val="18"/>
+        </w:rPr>
+        <w:t xml:space="preserve"> — Import Promotion Desk (IPD Germany) (Aug 2026)</w:t>
       </w:r>
     </w:p>
     <w:p>
@@ -4754,7 +4694,7 @@
           <w:sz w:val="18"/>
           <w:szCs w:val="18"/>
         </w:rPr>
-        <w:t xml:space="preserve">Blue Carbon Project Development, Feasibility &amp; PIN Assessment, Project Design Document (PDD), Investment Due Diligence, MRV Design &amp; Verification</w:t>
+        <w:t xml:space="preserve">Supply Chain Due Diligence (LkSG / SCDDA), Human Rights &amp; Environmental Risk Analysis, EU Market Compliance, Sustainable Sourcing</w:t>
       </w:r>
     </w:p>
     <w:p>
@@ -4769,6 +4709,208 @@
           <w:sz w:val="18"/>
           <w:szCs w:val="18"/>
         </w:rPr>
+        <w:t xml:space="preserve">Comprehensive e-learning program on complying with the German Supply Chain Due Diligence Act (Lieferkettensorgfaltspflichtengesetz - LkSG), addressing human rights and environmental risk analysis, grievance mechanisms, and sustainable supply chain governance for international exporters.</w:t>
+      </w:r>
+    </w:p>
+    <w:p>
+      <w:pPr>
+        <w:pStyle w:val="ListParagraph"/>
+        <w:numPr>
+          <w:ilvl w:val="0"/>
+          <w:numId w:val="1"/>
+        </w:numPr>
+        <w:spacing w:after="20" w:before="20"/>
+      </w:pPr>
+      <w:r>
+        <w:rPr>
+          <w:rFonts w:ascii="Arial" w:cs="Arial" w:eastAsia="Arial" w:hAnsi="Arial"/>
+          <w:b/>
+          <w:bCs/>
+          <w:color w:val="1E293B"/>
+          <w:sz w:val="19"/>
+          <w:szCs w:val="19"/>
+        </w:rPr>
+        <w:t xml:space="preserve">EU Deforestation Regulation (EUDR) Compliance &amp; Due Diligence</w:t>
+      </w:r>
+      <w:r>
+        <w:rPr>
+          <w:rFonts w:ascii="Arial" w:cs="Arial" w:eastAsia="Arial" w:hAnsi="Arial"/>
+          <w:color w:val="64748B"/>
+          <w:sz w:val="18"/>
+          <w:szCs w:val="18"/>
+        </w:rPr>
+        <w:t xml:space="preserve"> — Import Promotion Desk (IPD Germany) (Aug 2026)</w:t>
+      </w:r>
+    </w:p>
+    <w:p>
+      <w:pPr>
+        <w:spacing w:after="20" w:before="0"/>
+        <w:ind w:left="400"/>
+      </w:pPr>
+      <w:r>
+        <w:rPr>
+          <w:rFonts w:ascii="Arial" w:cs="Arial" w:eastAsia="Arial" w:hAnsi="Arial"/>
+          <w:b/>
+          <w:bCs/>
+          <w:color w:val="0D9488"/>
+          <w:sz w:val="18"/>
+          <w:szCs w:val="18"/>
+        </w:rPr>
+        <w:t xml:space="preserve">Competencies: </w:t>
+      </w:r>
+      <w:r>
+        <w:rPr>
+          <w:rFonts w:ascii="Arial" w:cs="Arial" w:eastAsia="Arial" w:hAnsi="Arial"/>
+          <w:color w:val="1E293B"/>
+          <w:sz w:val="18"/>
+          <w:szCs w:val="18"/>
+        </w:rPr>
+        <w:t xml:space="preserve">EU Deforestation Regulation (EUDR) Compliance, Supply Chain Geolocation &amp; Traceability, Deforestation-Free Commodity Due Diligence, Legality &amp; Risk Assessment</w:t>
+      </w:r>
+    </w:p>
+    <w:p>
+      <w:pPr>
+        <w:spacing w:after="40" w:before="0"/>
+        <w:ind w:left="400"/>
+      </w:pPr>
+      <w:r>
+        <w:rPr>
+          <w:rFonts w:ascii="Arial" w:cs="Arial" w:eastAsia="Arial" w:hAnsi="Arial"/>
+          <w:color w:val="64748B"/>
+          <w:sz w:val="18"/>
+          <w:szCs w:val="18"/>
+        </w:rPr>
+        <w:t xml:space="preserve">Specialized training on the EU Deforestation Regulation (EUDR), addressing regulatory compliance, supply chain due diligence, geolocation traceability, and legality verification for deforestation-free commodities entering the EU market (palm oil, wood, rubber, cocoa, coffee, soy, cattle).</w:t>
+      </w:r>
+    </w:p>
+    <w:p>
+      <w:pPr>
+        <w:pStyle w:val="ListParagraph"/>
+        <w:numPr>
+          <w:ilvl w:val="0"/>
+          <w:numId w:val="1"/>
+        </w:numPr>
+        <w:spacing w:after="20" w:before="20"/>
+      </w:pPr>
+      <w:r>
+        <w:rPr>
+          <w:rFonts w:ascii="Arial" w:cs="Arial" w:eastAsia="Arial" w:hAnsi="Arial"/>
+          <w:b/>
+          <w:bCs/>
+          <w:color w:val="1E293B"/>
+          <w:sz w:val="19"/>
+          <w:szCs w:val="19"/>
+        </w:rPr>
+        <w:t xml:space="preserve">Blue Carbon Fundamentals</w:t>
+      </w:r>
+      <w:r>
+        <w:rPr>
+          <w:rFonts w:ascii="Arial" w:cs="Arial" w:eastAsia="Arial" w:hAnsi="Arial"/>
+          <w:color w:val="64748B"/>
+          <w:sz w:val="18"/>
+          <w:szCs w:val="18"/>
+        </w:rPr>
+        <w:t xml:space="preserve"> — World Bank Group (Jul 2026)</w:t>
+      </w:r>
+    </w:p>
+    <w:p>
+      <w:pPr>
+        <w:pStyle w:val="ListParagraph"/>
+        <w:numPr>
+          <w:ilvl w:val="0"/>
+          <w:numId w:val="1"/>
+        </w:numPr>
+        <w:spacing w:after="20" w:before="20"/>
+      </w:pPr>
+      <w:r>
+        <w:rPr>
+          <w:rFonts w:ascii="Arial" w:cs="Arial" w:eastAsia="Arial" w:hAnsi="Arial"/>
+          <w:b/>
+          <w:bCs/>
+          <w:color w:val="1E293B"/>
+          <w:sz w:val="19"/>
+          <w:szCs w:val="19"/>
+        </w:rPr>
+        <w:t xml:space="preserve">Green Economic Acceleration: A Japan-ASEAN Strategic Programme for Sustainable Green Finance</w:t>
+      </w:r>
+      <w:r>
+        <w:rPr>
+          <w:rFonts w:ascii="Arial" w:cs="Arial" w:eastAsia="Arial" w:hAnsi="Arial"/>
+          <w:color w:val="64748B"/>
+          <w:sz w:val="18"/>
+          <w:szCs w:val="18"/>
+        </w:rPr>
+        <w:t xml:space="preserve"> — United Nations Institute for Training and Research (UNITAR) (Jul 2026)</w:t>
+      </w:r>
+    </w:p>
+    <w:p>
+      <w:pPr>
+        <w:pStyle w:val="ListParagraph"/>
+        <w:numPr>
+          <w:ilvl w:val="0"/>
+          <w:numId w:val="1"/>
+        </w:numPr>
+        <w:spacing w:after="20" w:before="20"/>
+      </w:pPr>
+      <w:r>
+        <w:rPr>
+          <w:rFonts w:ascii="Arial" w:cs="Arial" w:eastAsia="Arial" w:hAnsi="Arial"/>
+          <w:b/>
+          <w:bCs/>
+          <w:color w:val="1E293B"/>
+          <w:sz w:val="19"/>
+          <w:szCs w:val="19"/>
+        </w:rPr>
+        <w:t xml:space="preserve">Blue Carbon Project Development &amp; MRV Specialist Training</w:t>
+      </w:r>
+      <w:r>
+        <w:rPr>
+          <w:rFonts w:ascii="Arial" w:cs="Arial" w:eastAsia="Arial" w:hAnsi="Arial"/>
+          <w:color w:val="64748B"/>
+          <w:sz w:val="18"/>
+          <w:szCs w:val="18"/>
+        </w:rPr>
+        <w:t xml:space="preserve"> — Fair Carbon (Blue Carbon Academy) (May 2026)</w:t>
+      </w:r>
+    </w:p>
+    <w:p>
+      <w:pPr>
+        <w:spacing w:after="20" w:before="0"/>
+        <w:ind w:left="400"/>
+      </w:pPr>
+      <w:r>
+        <w:rPr>
+          <w:rFonts w:ascii="Arial" w:cs="Arial" w:eastAsia="Arial" w:hAnsi="Arial"/>
+          <w:b/>
+          <w:bCs/>
+          <w:color w:val="0D9488"/>
+          <w:sz w:val="18"/>
+          <w:szCs w:val="18"/>
+        </w:rPr>
+        <w:t xml:space="preserve">Competencies: </w:t>
+      </w:r>
+      <w:r>
+        <w:rPr>
+          <w:rFonts w:ascii="Arial" w:cs="Arial" w:eastAsia="Arial" w:hAnsi="Arial"/>
+          <w:color w:val="1E293B"/>
+          <w:sz w:val="18"/>
+          <w:szCs w:val="18"/>
+        </w:rPr>
+        <w:t xml:space="preserve">Blue Carbon Project Development, Feasibility &amp; PIN Assessment, Project Design Document (PDD), Investment Due Diligence, MRV Design &amp; Verification</w:t>
+      </w:r>
+    </w:p>
+    <w:p>
+      <w:pPr>
+        <w:spacing w:after="40" w:before="0"/>
+        <w:ind w:left="400"/>
+      </w:pPr>
+      <w:r>
+        <w:rPr>
+          <w:rFonts w:ascii="Arial" w:cs="Arial" w:eastAsia="Arial" w:hAnsi="Arial"/>
+          <w:color w:val="64748B"/>
+          <w:sz w:val="18"/>
+          <w:szCs w:val="18"/>
+        </w:rPr>
         <w:t xml:space="preserve">Comprehensive training covering the full project development lifecycle for coastal blue carbon (mangroves and seagrass), from baseline feasibility &amp; Project Idea Note (PIN), standardized PDD design, investment due diligence, to scientific Monitoring, Reporting &amp; Verification (MRV) systems and carbon credit integrity.</w:t>
       </w:r>
     </w:p>
@@ -5055,7 +5197,78 @@
           <w:sz w:val="21"/>
           <w:szCs w:val="21"/>
         </w:rPr>
-        <w:t xml:space="preserve">2. Marine, Coastal &amp; Fisheries Governance (Ocean Governance, IWRM &amp; Bioacoustics) (17 Programs)</w:t>
+        <w:t xml:space="preserve">2. Marine, Coastal &amp; Fisheries Governance (Ocean Governance, IWRM &amp; Bioacoustics) (18 Programs)</w:t>
+      </w:r>
+    </w:p>
+    <w:p>
+      <w:pPr>
+        <w:pStyle w:val="ListParagraph"/>
+        <w:numPr>
+          <w:ilvl w:val="0"/>
+          <w:numId w:val="1"/>
+        </w:numPr>
+        <w:spacing w:after="20" w:before="20"/>
+      </w:pPr>
+      <w:r>
+        <w:rPr>
+          <w:rFonts w:ascii="Arial" w:cs="Arial" w:eastAsia="Arial" w:hAnsi="Arial"/>
+          <w:b/>
+          <w:bCs/>
+          <w:color w:val="1E293B"/>
+          <w:sz w:val="19"/>
+          <w:szCs w:val="19"/>
+        </w:rPr>
+        <w:t xml:space="preserve">Building Skills for Coastal Restoration with Nature and People</w:t>
+      </w:r>
+      <w:r>
+        <w:rPr>
+          <w:rFonts w:ascii="Arial" w:cs="Arial" w:eastAsia="Arial" w:hAnsi="Arial"/>
+          <w:color w:val="64748B"/>
+          <w:sz w:val="18"/>
+          <w:szCs w:val="18"/>
+        </w:rPr>
+        <w:t xml:space="preserve"> — UNESCO/IOC OceanTeacher Global Academy (OTGA) &amp; A-AAGORA Project (Sep 2026)</w:t>
+      </w:r>
+    </w:p>
+    <w:p>
+      <w:pPr>
+        <w:spacing w:after="20" w:before="0"/>
+        <w:ind w:left="400"/>
+      </w:pPr>
+      <w:r>
+        <w:rPr>
+          <w:rFonts w:ascii="Arial" w:cs="Arial" w:eastAsia="Arial" w:hAnsi="Arial"/>
+          <w:b/>
+          <w:bCs/>
+          <w:color w:val="0D9488"/>
+          <w:sz w:val="18"/>
+          <w:szCs w:val="18"/>
+        </w:rPr>
+        <w:t xml:space="preserve">Competencies: </w:t>
+      </w:r>
+      <w:r>
+        <w:rPr>
+          <w:rFonts w:ascii="Arial" w:cs="Arial" w:eastAsia="Arial" w:hAnsi="Arial"/>
+          <w:color w:val="1E293B"/>
+          <w:sz w:val="18"/>
+          <w:szCs w:val="18"/>
+        </w:rPr>
+        <w:t xml:space="preserve">Coastal Ecosystem Restoration, Nature-based Solutions (NbS), Community-Led Marine Stewardship, Marine Spatial Planning, Biodiversity Enhancement, Ecosystem Resilience</w:t>
+      </w:r>
+    </w:p>
+    <w:p>
+      <w:pPr>
+        <w:spacing w:after="40" w:before="0"/>
+        <w:ind w:left="400"/>
+      </w:pPr>
+      <w:r>
+        <w:rPr>
+          <w:rFonts w:ascii="Arial" w:cs="Arial" w:eastAsia="Arial" w:hAnsi="Arial"/>
+          <w:color w:val="64748B"/>
+          <w:sz w:val="18"/>
+          <w:szCs w:val="18"/>
+        </w:rPr>
+        <w:t xml:space="preserve">Specialized 25-hour professional MOOC certification delivered by the UNESCO/IOC OceanTeacher Global Academy (OTGA) in partnership with the EU A-AAGORA project. Comprehensive training on designing and scaling real-world Nature-based Solutions (NbS) for coastal restoration, engaging local coastal communities, marine biodiversity protection, and climate resilience.</w:t>
       </w:r>
     </w:p>
     <w:p>

</xml_diff>

<commit_message>
feat: remove WWF Malaysia project and update metrics across master CV and portfolio
</commit_message>
<xml_diff>
--- a/I Gede Mahendra Wijaya_Master CV.docx
+++ b/I Gede Mahendra Wijaya_Master CV.docx
@@ -94,7 +94,7 @@
           <w:sz w:val="20"/>
           <w:szCs w:val="20"/>
         </w:rPr>
-        <w:t xml:space="preserve">Marine environmental specialist with over 13 years of experience delivering high-level technical leadership across marine-based sectors, forest concessions, and industrial waste decarbonization. Formally trained in marine science and acoustics (IPB University), with expertise spanning coastal and ocean governance, sustainable fisheries, forest concession licensing (PBPH), and carbon mitigation across AFOLU (&gt;200,000 ha peatland/wetland concessions in Papua) and Waste sectors (Palm Oil Mill Effluent / POME methane capture &amp; biogas-to-energy). Proven track record with major international institutions (World Bank, ADB, FAO, UNDP, WWF, TNC) and national innovation award recognition (BIC). Highly skilled in carbon accounting (SRUK, VCM, Paris Agreement Article 6), MRV, environmental safeguards (ESIA/AMDAL), and multi-stakeholder engagement.</w:t>
+        <w:t xml:space="preserve">Marine environmental specialist with over 13 years of experience delivering high-level technical leadership across marine-based sectors, forest concessions, and industrial waste decarbonization. Formally trained in marine science and acoustics (IPB University), with expertise spanning coastal and ocean governance, sustainable fisheries, forest concession licensing (PBPH), and carbon mitigation across AFOLU (&gt;200,000 ha peatland/wetland concessions in Papua) and Waste sectors (Palm Oil Mill Effluent / POME methane capture &amp; biogas-to-energy). Proven track record with major international institutions (World Bank, ADB, FAO, UNDP, TNC) and national innovation award recognition (BIC). Highly skilled in carbon accounting (SRUK, VCM, Paris Agreement Article 6), MRV, environmental safeguards (ESIA/AMDAL), and multi-stakeholder engagement.</w:t>
       </w:r>
     </w:p>
     <w:p>
@@ -164,7 +164,7 @@
           <w:sz w:val="20"/>
           <w:szCs w:val="20"/>
         </w:rPr>
-        <w:t xml:space="preserve">32 </w:t>
+        <w:t xml:space="preserve">31 </w:t>
       </w:r>
       <w:r>
         <w:rPr>
@@ -747,7 +747,7 @@
           <w:sz w:val="19"/>
           <w:szCs w:val="19"/>
         </w:rPr>
-        <w:t xml:space="preserve">Served as technical lead and specialist for marine ecology, oceanographic baseline assessments, fisheries resource economics, and environmental impact assessments (ESIA / AMDAL / UKL-UPL). Designed and executed extensive marine field sampling campaigns (water quality, sediment chemistry, benthic communities, coral reef health, and pelagic fish biomass). Formulated Environmental and Social Management Plans (ESMP), stakeholder engagement frameworks, and Marine Protected Area (MPA) zoning plans. Led digital innovation initiatives for sustainable fisheries, including the development and deployment of satellite Vessel Monitoring Systems (VMS) with Inmarsat and UK Space Agency, smart aquaculture IoT solutions, and geofencing applications. Authored major technical reports and policy briefs for the World Bank, Asian Development Bank, AFD, FAO, WWF, and Indonesian government ministries.</w:t>
+        <w:t xml:space="preserve">Served as technical lead and specialist for marine ecology, oceanographic baseline assessments, fisheries resource economics, and environmental impact assessments (ESIA / AMDAL / UKL-UPL). Designed and executed extensive marine field sampling campaigns (water quality, sediment chemistry, benthic communities, coral reef health, and pelagic fish biomass). Formulated Environmental and Social Management Plans (ESMP), stakeholder engagement frameworks, and Marine Protected Area (MPA) zoning plans. Led digital innovation initiatives for sustainable fisheries, including the development and deployment of satellite Vessel Monitoring Systems (VMS) with Inmarsat and UK Space Agency, smart aquaculture IoT solutions, and geofencing applications. Authored major technical reports and policy briefs for the World Bank, Asian Development Bank, AFD, FAO, and Indonesian government ministries.</w:t>
       </w:r>
     </w:p>
     <w:p>
@@ -931,7 +931,7 @@
           <w:sz w:val="24"/>
           <w:szCs w:val="24"/>
         </w:rPr>
-        <w:t xml:space="preserve">KEY PROJECT EXPERIENCES (TOTAL: 32 PROJECTS)</w:t>
+        <w:t xml:space="preserve">KEY PROJECT EXPERIENCES (TOTAL: 31 PROJECTS)</w:t>
       </w:r>
     </w:p>
     <w:p>
@@ -1820,7 +1820,7 @@
           <w:sz w:val="20"/>
           <w:szCs w:val="20"/>
         </w:rPr>
-        <w:t xml:space="preserve">10. Independent Evaluation of the Marine Conservation Programme of WWF Malaysia</w:t>
+        <w:t xml:space="preserve">10. Outer Ring Fishing Ports Development Project (Eco-Fishing Ports) ESIA</w:t>
       </w:r>
     </w:p>
     <w:p>
@@ -1845,7 +1845,7 @@
           <w:sz w:val="18"/>
           <w:szCs w:val="18"/>
         </w:rPr>
-        <w:t xml:space="preserve">WWF Malaysia  |  </w:t>
+        <w:t xml:space="preserve">Agence Française de Développement (AFD)  |  </w:t>
       </w:r>
       <w:r>
         <w:rPr>
@@ -1865,7 +1865,7 @@
           <w:sz w:val="18"/>
           <w:szCs w:val="18"/>
         </w:rPr>
-        <w:t xml:space="preserve">March 2020 - December 2021  |  </w:t>
+        <w:t xml:space="preserve">March 2021 - October 2022  |  </w:t>
       </w:r>
       <w:r>
         <w:rPr>
@@ -1901,7 +1901,7 @@
           <w:sz w:val="19"/>
           <w:szCs w:val="19"/>
         </w:rPr>
-        <w:t xml:space="preserve">Conducted an independent, rigorous performance evaluation of WWF Malaysia's multi-year Marine Conservation Programme. Evaluated achievements, financial efficacy, and conservation impacts across Marine Spatial Planning, sustainable fisheries management (MSC certification support), shark conservation, and community co-management models in Sabah and Peninsular Malaysia.</w:t>
+        <w:t xml:space="preserve">Led environmental, social, climate resilience, and gender safeguard preparation studies for the USD 111M AFD-funded Eco-Fishing Ports Modernization Project across four strategic national fishing ports (PPS Kendari, PPS Cilacap, PPN Belawan, and PPN Sibolga). Formulated ESIA terms of reference, climate vulnerability profiles, and port decarbonization action plans.</w:t>
       </w:r>
     </w:p>
     <w:p>
@@ -1917,7 +1917,7 @@
           <w:sz w:val="20"/>
           <w:szCs w:val="20"/>
         </w:rPr>
-        <w:t xml:space="preserve">11. Outer Ring Fishing Ports Development Project (Eco-Fishing Ports) ESIA</w:t>
+        <w:t xml:space="preserve">11. Benefit Story Development for IPP Low-Cost Technology Pilot Project</w:t>
       </w:r>
     </w:p>
     <w:p>
@@ -1942,7 +1942,7 @@
           <w:sz w:val="18"/>
           <w:szCs w:val="18"/>
         </w:rPr>
-        <w:t xml:space="preserve">Agence Française de Développement (AFD)  |  </w:t>
+        <w:t xml:space="preserve">Inmarsat (UK) / MMAF  |  </w:t>
       </w:r>
       <w:r>
         <w:rPr>
@@ -1962,7 +1962,7 @@
           <w:sz w:val="18"/>
           <w:szCs w:val="18"/>
         </w:rPr>
-        <w:t xml:space="preserve">March 2021 - October 2022  |  </w:t>
+        <w:t xml:space="preserve">December 2021 - March 2022  |  </w:t>
       </w:r>
       <w:r>
         <w:rPr>
@@ -1984,7 +1984,7 @@
           <w:sz w:val="18"/>
           <w:szCs w:val="18"/>
         </w:rPr>
-        <w:t xml:space="preserve">MARINE</w:t>
+        <w:t xml:space="preserve">DIGITAL</w:t>
       </w:r>
     </w:p>
     <w:p>
@@ -1998,7 +1998,7 @@
           <w:sz w:val="19"/>
           <w:szCs w:val="19"/>
         </w:rPr>
-        <w:t xml:space="preserve">Led environmental, social, climate resilience, and gender safeguard preparation studies for the USD 111M AFD-funded Eco-Fishing Ports Modernization Project across four strategic national fishing ports (PPS Kendari, PPS Cilacap, PPN Belawan, and PPN Sibolga). Formulated ESIA terms of reference, climate vulnerability profiles, and port decarbonization action plans.</w:t>
+        <w:t xml:space="preserve">Developed impact evaluation benefit stories, socio-economic surveys, and case studies demonstrating the tangible safety-at-sea, operational efficiency, and catch reporting benefits of low-cost satellite Vessel Monitoring Systems (VMS) deployed on small-scale fishing vessels (&lt;30 GT) across Indonesian coastal communities.</w:t>
       </w:r>
     </w:p>
     <w:p>
@@ -2014,7 +2014,7 @@
           <w:sz w:val="20"/>
           <w:szCs w:val="20"/>
         </w:rPr>
-        <w:t xml:space="preserve">12. Benefit Story Development for IPP Low-Cost Technology Pilot Project</w:t>
+        <w:t xml:space="preserve">12. Satellite Vessel Monitoring System (VMS) Implementation &amp; Migration Program</w:t>
       </w:r>
     </w:p>
     <w:p>
@@ -2039,7 +2039,7 @@
           <w:sz w:val="18"/>
           <w:szCs w:val="18"/>
         </w:rPr>
-        <w:t xml:space="preserve">Inmarsat (UK) / MMAF  |  </w:t>
+        <w:t xml:space="preserve">Inmarsat (UK) / UK Space Agency  |  </w:t>
       </w:r>
       <w:r>
         <w:rPr>
@@ -2059,7 +2059,7 @@
           <w:sz w:val="18"/>
           <w:szCs w:val="18"/>
         </w:rPr>
-        <w:t xml:space="preserve">December 2021 - March 2022  |  </w:t>
+        <w:t xml:space="preserve">August 2018 - October 2019  |  </w:t>
       </w:r>
       <w:r>
         <w:rPr>
@@ -2095,7 +2095,7 @@
           <w:sz w:val="19"/>
           <w:szCs w:val="19"/>
         </w:rPr>
-        <w:t xml:space="preserve">Developed impact evaluation benefit stories, socio-economic surveys, and case studies demonstrating the tangible safety-at-sea, operational efficiency, and catch reporting benefits of low-cost satellite Vessel Monitoring Systems (VMS) deployed on small-scale fishing vessels (&lt;30 GT) across Indonesian coastal communities.</w:t>
+        <w:t xml:space="preserve">Coordinated technical deployment, transceiver installation, API data pipeline integration, and user capacity building for advanced satellite VMS terminals across 400 commercial fishing vessels (20-30 GT and &gt;30 GT) to strengthen national fisheries surveillance and combat Illegal, Unreported, and Unregulated (IUU) fishing.</w:t>
       </w:r>
     </w:p>
     <w:p>
@@ -2111,7 +2111,7 @@
           <w:sz w:val="20"/>
           <w:szCs w:val="20"/>
         </w:rPr>
-        <w:t xml:space="preserve">13. Satellite Vessel Monitoring System (VMS) Implementation &amp; Migration Program</w:t>
+        <w:t xml:space="preserve">13. Web-Based Geofencing Application Development for Marine Protected Areas</w:t>
       </w:r>
     </w:p>
     <w:p>
@@ -2136,7 +2136,7 @@
           <w:sz w:val="18"/>
           <w:szCs w:val="18"/>
         </w:rPr>
-        <w:t xml:space="preserve">Inmarsat (UK) / UK Space Agency  |  </w:t>
+        <w:t xml:space="preserve">Inmarsat (UK)  |  </w:t>
       </w:r>
       <w:r>
         <w:rPr>
@@ -2156,7 +2156,7 @@
           <w:sz w:val="18"/>
           <w:szCs w:val="18"/>
         </w:rPr>
-        <w:t xml:space="preserve">August 2018 - October 2019  |  </w:t>
+        <w:t xml:space="preserve">October 2017 - October 2019  |  </w:t>
       </w:r>
       <w:r>
         <w:rPr>
@@ -2192,7 +2192,7 @@
           <w:sz w:val="19"/>
           <w:szCs w:val="19"/>
         </w:rPr>
-        <w:t xml:space="preserve">Coordinated technical deployment, transceiver installation, API data pipeline integration, and user capacity building for advanced satellite VMS terminals across 400 commercial fishing vessels (20-30 GT and &gt;30 GT) to strengthen national fisheries surveillance and combat Illegal, Unreported, and Unregulated (IUU) fishing.</w:t>
+        <w:t xml:space="preserve">Designed spatial specifications and user workflows for an automated web-based geofencing application integrating satellite VMS vessel telemetry with national Marine Protected Area boundaries, enabling real-time alerting for unauthorized incursions and spatial fisheries compliance.</w:t>
       </w:r>
     </w:p>
     <w:p>
@@ -2208,7 +2208,7 @@
           <w:sz w:val="20"/>
           <w:szCs w:val="20"/>
         </w:rPr>
-        <w:t xml:space="preserve">14. Web-Based Geofencing Application Development for Marine Protected Areas</w:t>
+        <w:t xml:space="preserve">14. Independent Environmental &amp; Social Due Diligence (Block 3 CCPP Tambak Lorok)</w:t>
       </w:r>
     </w:p>
     <w:p>
@@ -2233,7 +2233,7 @@
           <w:sz w:val="18"/>
           <w:szCs w:val="18"/>
         </w:rPr>
-        <w:t xml:space="preserve">Inmarsat (UK)  |  </w:t>
+        <w:t xml:space="preserve">PT Indonesia Power  |  </w:t>
       </w:r>
       <w:r>
         <w:rPr>
@@ -2253,7 +2253,7 @@
           <w:sz w:val="18"/>
           <w:szCs w:val="18"/>
         </w:rPr>
-        <w:t xml:space="preserve">October 2017 - October 2019  |  </w:t>
+        <w:t xml:space="preserve">January - November 2022  |  </w:t>
       </w:r>
       <w:r>
         <w:rPr>
@@ -2275,7 +2275,7 @@
           <w:sz w:val="18"/>
           <w:szCs w:val="18"/>
         </w:rPr>
-        <w:t xml:space="preserve">DIGITAL</w:t>
+        <w:t xml:space="preserve">ENVIRONMENT</w:t>
       </w:r>
     </w:p>
     <w:p>
@@ -2289,7 +2289,7 @@
           <w:sz w:val="19"/>
           <w:szCs w:val="19"/>
         </w:rPr>
-        <w:t xml:space="preserve">Designed spatial specifications and user workflows for an automated web-based geofencing application integrating satellite VMS vessel telemetry with national Marine Protected Area boundaries, enabling real-time alerting for unauthorized incursions and spatial fisheries compliance.</w:t>
+        <w:t xml:space="preserve">Executed independent monitoring and technical compliance verification against the Environmental and Social Action Plan (ESAP) for the 780 MW Block 3 Combined Cycle Power Plant (CCPP) project in Tambak Lorok, Semarang, ensuring compliance with international lender standards (World Bank/IFC Performance Standards).</w:t>
       </w:r>
     </w:p>
     <w:p>
@@ -2305,7 +2305,7 @@
           <w:sz w:val="20"/>
           <w:szCs w:val="20"/>
         </w:rPr>
-        <w:t xml:space="preserve">15. Independent Environmental &amp; Social Due Diligence (Block 3 CCPP Tambak Lorok)</w:t>
+        <w:t xml:space="preserve">15. Operational and Scientific Monitoring Plan (OSMP) for Offshore Drilling Campaign</w:t>
       </w:r>
     </w:p>
     <w:p>
@@ -2330,7 +2330,7 @@
           <w:sz w:val="18"/>
           <w:szCs w:val="18"/>
         </w:rPr>
-        <w:t xml:space="preserve">PT Indonesia Power  |  </w:t>
+        <w:t xml:space="preserve">MCC Environmental (Australia)  |  </w:t>
       </w:r>
       <w:r>
         <w:rPr>
@@ -2350,7 +2350,7 @@
           <w:sz w:val="18"/>
           <w:szCs w:val="18"/>
         </w:rPr>
-        <w:t xml:space="preserve">January - November 2022  |  </w:t>
+        <w:t xml:space="preserve">October 2021 - January 2022  |  </w:t>
       </w:r>
       <w:r>
         <w:rPr>
@@ -2386,7 +2386,7 @@
           <w:sz w:val="19"/>
           <w:szCs w:val="19"/>
         </w:rPr>
-        <w:t xml:space="preserve">Executed independent monitoring and technical compliance verification against the Environmental and Social Action Plan (ESAP) for the 780 MW Block 3 Combined Cycle Power Plant (CCPP) project in Tambak Lorok, Semarang, ensuring compliance with international lender standards (World Bank/IFC Performance Standards).</w:t>
+        <w:t xml:space="preserve">Provided marine ecology expertise for the Buffalo-10 Offshore Drilling Campaign in the Timor Sea. Formulated Shoreline Cleanup Assessment Technique (SCAT) protocols and marine fauna sensitivity baseline profiles (cetaceans, marine turtles, and seabirds) for cross-border environmental risk preparedness in Indonesia and Timor-Leste waters.</w:t>
       </w:r>
     </w:p>
     <w:p>
@@ -2402,7 +2402,7 @@
           <w:sz w:val="20"/>
           <w:szCs w:val="20"/>
         </w:rPr>
-        <w:t xml:space="preserve">16. Operational and Scientific Monitoring Plan (OSMP) for Offshore Drilling Campaign</w:t>
+        <w:t xml:space="preserve">16. Patimban Deep-Sea Port Construction Marine Environmental Monitoring Program</w:t>
       </w:r>
     </w:p>
     <w:p>
@@ -2427,7 +2427,7 @@
           <w:sz w:val="18"/>
           <w:szCs w:val="18"/>
         </w:rPr>
-        <w:t xml:space="preserve">MCC Environmental (Australia)  |  </w:t>
+        <w:t xml:space="preserve">Penta Ocean Construction  |  </w:t>
       </w:r>
       <w:r>
         <w:rPr>
@@ -2447,7 +2447,7 @@
           <w:sz w:val="18"/>
           <w:szCs w:val="18"/>
         </w:rPr>
-        <w:t xml:space="preserve">October 2021 - January 2022  |  </w:t>
+        <w:t xml:space="preserve">July 2018 - August 2019  |  </w:t>
       </w:r>
       <w:r>
         <w:rPr>
@@ -2483,7 +2483,7 @@
           <w:sz w:val="19"/>
           <w:szCs w:val="19"/>
         </w:rPr>
-        <w:t xml:space="preserve">Provided marine ecology expertise for the Buffalo-10 Offshore Drilling Campaign in the Timor Sea. Formulated Shoreline Cleanup Assessment Technique (SCAT) protocols and marine fauna sensitivity baseline profiles (cetaceans, marine turtles, and seabirds) for cross-border environmental risk preparedness in Indonesia and Timor-Leste waters.</w:t>
+        <w:t xml:space="preserve">Managed and executed monthly marine environmental compliance monitoring during the Phase 1 construction of Patimban Deep-Sea Port in Subang, West Java. Led offshore sampling and laboratory analysis of seawater physicochemical quality, heavy metal sediment chemistry, benthic infauna diversity, and nekton community dynamics.</w:t>
       </w:r>
     </w:p>
     <w:p>
@@ -2499,7 +2499,7 @@
           <w:sz w:val="20"/>
           <w:szCs w:val="20"/>
         </w:rPr>
-        <w:t xml:space="preserve">17. Patimban Deep-Sea Port Construction Marine Environmental Monitoring Program</w:t>
+        <w:t xml:space="preserve">17. Vocational Shrimp Aquaculture Curriculum &amp; Digital Quality Control Solution</w:t>
       </w:r>
     </w:p>
     <w:p>
@@ -2524,7 +2524,7 @@
           <w:sz w:val="18"/>
           <w:szCs w:val="18"/>
         </w:rPr>
-        <w:t xml:space="preserve">Penta Ocean Construction  |  </w:t>
+        <w:t xml:space="preserve">Walton Family Foundation  |  </w:t>
       </w:r>
       <w:r>
         <w:rPr>
@@ -2544,7 +2544,7 @@
           <w:sz w:val="18"/>
           <w:szCs w:val="18"/>
         </w:rPr>
-        <w:t xml:space="preserve">July 2018 - August 2019  |  </w:t>
+        <w:t xml:space="preserve">August 2019 - January 2022  |  </w:t>
       </w:r>
       <w:r>
         <w:rPr>
@@ -2566,7 +2566,7 @@
           <w:sz w:val="18"/>
           <w:szCs w:val="18"/>
         </w:rPr>
-        <w:t xml:space="preserve">ENVIRONMENT</w:t>
+        <w:t xml:space="preserve">AQUACULTURE</w:t>
       </w:r>
     </w:p>
     <w:p>
@@ -2580,7 +2580,7 @@
           <w:sz w:val="19"/>
           <w:szCs w:val="19"/>
         </w:rPr>
-        <w:t xml:space="preserve">Managed and executed monthly marine environmental compliance monitoring during the Phase 1 construction of Patimban Deep-Sea Port in Subang, West Java. Led offshore sampling and laboratory analysis of seawater physicochemical quality, heavy metal sediment chemistry, benthic infauna diversity, and nekton community dynamics.</w:t>
+        <w:t xml:space="preserve">Developed an accredited blended-learning vocational curriculum and digital standard operating procedure (SOP) quality control platform for commercial shrimp aquaculture, applying Human-Centered Design (HCD) methodologies with over 30 shrimp farm operators across Java and Bali.</w:t>
       </w:r>
     </w:p>
     <w:p>
@@ -2596,7 +2596,7 @@
           <w:sz w:val="20"/>
           <w:szCs w:val="20"/>
         </w:rPr>
-        <w:t xml:space="preserve">18. Vocational Shrimp Aquaculture Curriculum &amp; Digital Quality Control Solution</w:t>
+        <w:t xml:space="preserve">18. Human-Centered Design (HCD) for Smart Aquaculture 4.0 IoT Platform</w:t>
       </w:r>
     </w:p>
     <w:p>
@@ -2641,7 +2641,7 @@
           <w:sz w:val="18"/>
           <w:szCs w:val="18"/>
         </w:rPr>
-        <w:t xml:space="preserve">August 2019 - January 2022  |  </w:t>
+        <w:t xml:space="preserve">August 2018 - January 2021  |  </w:t>
       </w:r>
       <w:r>
         <w:rPr>
@@ -2677,7 +2677,7 @@
           <w:sz w:val="19"/>
           <w:szCs w:val="19"/>
         </w:rPr>
-        <w:t xml:space="preserve">Developed an accredited blended-learning vocational curriculum and digital standard operating procedure (SOP) quality control platform for commercial shrimp aquaculture, applying Human-Centered Design (HCD) methodologies with over 30 shrimp farm operators across Java and Bali.</w:t>
+        <w:t xml:space="preserve">Spearheaded user research, product prototyping, and field testing for an IoT-enabled aquaculture farm management platform combining real-time water quality sensors (DO, pH, salinity, temperature) with a farmer-facing mobile app for predictive disease prevention and feed optimization.</w:t>
       </w:r>
     </w:p>
     <w:p>
@@ -2693,7 +2693,7 @@
           <w:sz w:val="20"/>
           <w:szCs w:val="20"/>
         </w:rPr>
-        <w:t xml:space="preserve">19. Human-Centered Design (HCD) for Smart Aquaculture 4.0 IoT Platform</w:t>
+        <w:t xml:space="preserve">19. Comprehensive Assessment of Octopus Fishery, Supply Chain &amp; International Trade Flow</w:t>
       </w:r>
     </w:p>
     <w:p>
@@ -2718,7 +2718,7 @@
           <w:sz w:val="18"/>
           <w:szCs w:val="18"/>
         </w:rPr>
-        <w:t xml:space="preserve">Walton Family Foundation  |  </w:t>
+        <w:t xml:space="preserve">PT Hatfield Indonesia / Marine &amp; Fisheries Partners  |  </w:t>
       </w:r>
       <w:r>
         <w:rPr>
@@ -2738,7 +2738,7 @@
           <w:sz w:val="18"/>
           <w:szCs w:val="18"/>
         </w:rPr>
-        <w:t xml:space="preserve">August 2018 - January 2021  |  </w:t>
+        <w:t xml:space="preserve">2021 - 2022  |  </w:t>
       </w:r>
       <w:r>
         <w:rPr>
@@ -2760,7 +2760,7 @@
           <w:sz w:val="18"/>
           <w:szCs w:val="18"/>
         </w:rPr>
-        <w:t xml:space="preserve">AQUACULTURE</w:t>
+        <w:t xml:space="preserve">MARINE</w:t>
       </w:r>
     </w:p>
     <w:p>
@@ -2774,7 +2774,7 @@
           <w:sz w:val="19"/>
           <w:szCs w:val="19"/>
         </w:rPr>
-        <w:t xml:space="preserve">Spearheaded user research, product prototyping, and field testing for an IoT-enabled aquaculture farm management platform combining real-time water quality sensors (DO, pH, salinity, temperature) with a farmer-facing mobile app for predictive disease prevention and feed optimization.</w:t>
+        <w:t xml:space="preserve">Authored an in-depth technical report analyzing the biology, stock status, artisanal catch dynamics, cold chain infrastructure, and international export trade routes of Indonesian octopus fisheries (Octopus cyanea and Octopus vulgaris), identifying key pathways for MSC certification and Fisheries Improvement Projects (FIP).</w:t>
       </w:r>
     </w:p>
     <w:p>
@@ -2790,7 +2790,7 @@
           <w:sz w:val="20"/>
           <w:szCs w:val="20"/>
         </w:rPr>
-        <w:t xml:space="preserve">20. Comprehensive Assessment of Octopus Fishery, Supply Chain &amp; International Trade Flow</w:t>
+        <w:t xml:space="preserve">20. Valuation of Pelagic Ecosystem Services and Marine Natural Capital</w:t>
       </w:r>
     </w:p>
     <w:p>
@@ -2815,7 +2815,7 @@
           <w:sz w:val="18"/>
           <w:szCs w:val="18"/>
         </w:rPr>
-        <w:t xml:space="preserve">PT Hatfield Indonesia / Marine &amp; Fisheries Partners  |  </w:t>
+        <w:t xml:space="preserve">PT Hatfield Indonesia / Marine Partners  |  </w:t>
       </w:r>
       <w:r>
         <w:rPr>
@@ -2871,7 +2871,7 @@
           <w:sz w:val="19"/>
           <w:szCs w:val="19"/>
         </w:rPr>
-        <w:t xml:space="preserve">Authored an in-depth technical report analyzing the biology, stock status, artisanal catch dynamics, cold chain infrastructure, and international export trade routes of Indonesian octopus fisheries (Octopus cyanea and Octopus vulgaris), identifying key pathways for MSC certification and Fisheries Improvement Projects (FIP).</w:t>
+        <w:t xml:space="preserve">Executed a comprehensive economic and ecological valuation of pelagic marine ecosystem services in Indonesian waters, quantifying carbon sequestration, primary productivity, commercial fisheries yields, and biodiversity resilience to inform national ocean accounting frameworks.</w:t>
       </w:r>
     </w:p>
     <w:p>
@@ -2887,7 +2887,7 @@
           <w:sz w:val="20"/>
           <w:szCs w:val="20"/>
         </w:rPr>
-        <w:t xml:space="preserve">21. Valuation of Pelagic Ecosystem Services and Marine Natural Capital</w:t>
+        <w:t xml:space="preserve">21. Tongkol (Eastern Little Tuna) Supply Chain, Market Dynamics &amp; Post-Harvest Losses</w:t>
       </w:r>
     </w:p>
     <w:p>
@@ -2912,7 +2912,7 @@
           <w:sz w:val="18"/>
           <w:szCs w:val="18"/>
         </w:rPr>
-        <w:t xml:space="preserve">PT Hatfield Indonesia / Marine Partners  |  </w:t>
+        <w:t xml:space="preserve">PT Hatfield Indonesia / Marine &amp; Fisheries Partners  |  </w:t>
       </w:r>
       <w:r>
         <w:rPr>
@@ -2932,7 +2932,7 @@
           <w:sz w:val="18"/>
           <w:szCs w:val="18"/>
         </w:rPr>
-        <w:t xml:space="preserve">2021 - 2022  |  </w:t>
+        <w:t xml:space="preserve">2020 - 2022  |  </w:t>
       </w:r>
       <w:r>
         <w:rPr>
@@ -2968,7 +2968,7 @@
           <w:sz w:val="19"/>
           <w:szCs w:val="19"/>
         </w:rPr>
-        <w:t xml:space="preserve">Executed a comprehensive economic and ecological valuation of pelagic marine ecosystem services in Indonesian waters, quantifying carbon sequestration, primary productivity, commercial fisheries yields, and biodiversity resilience to inform national ocean accounting frameworks.</w:t>
+        <w:t xml:space="preserve">Conducted field supply chain mapping and market flow analysis for Eastern Little Tuna (Euthynnus affinis) across major landing sites in Indonesia. Evaluated cold chain bottlenecks, post-harvest quality degradation, pricing asymmetries, and socio-economic welfare of coastal smallholder fishing households.</w:t>
       </w:r>
     </w:p>
     <w:p>
@@ -2984,7 +2984,7 @@
           <w:sz w:val="20"/>
           <w:szCs w:val="20"/>
         </w:rPr>
-        <w:t xml:space="preserve">22. Tongkol (Eastern Little Tuna) Supply Chain, Market Dynamics &amp; Post-Harvest Losses</w:t>
+        <w:t xml:space="preserve">22. Scientific Assessment of Marine Mammal Interactions with Commercial Fisheries</w:t>
       </w:r>
     </w:p>
     <w:p>
@@ -3009,7 +3009,7 @@
           <w:sz w:val="18"/>
           <w:szCs w:val="18"/>
         </w:rPr>
-        <w:t xml:space="preserve">PT Hatfield Indonesia / Marine &amp; Fisheries Partners  |  </w:t>
+        <w:t xml:space="preserve">PT Hatfield Indonesia / Conservation Partners  |  </w:t>
       </w:r>
       <w:r>
         <w:rPr>
@@ -3029,7 +3029,7 @@
           <w:sz w:val="18"/>
           <w:szCs w:val="18"/>
         </w:rPr>
-        <w:t xml:space="preserve">2020 - 2022  |  </w:t>
+        <w:t xml:space="preserve">2019 - 2021  |  </w:t>
       </w:r>
       <w:r>
         <w:rPr>
@@ -3065,7 +3065,7 @@
           <w:sz w:val="19"/>
           <w:szCs w:val="19"/>
         </w:rPr>
-        <w:t xml:space="preserve">Conducted field supply chain mapping and market flow analysis for Eastern Little Tuna (Euthynnus affinis) across major landing sites in Indonesia. Evaluated cold chain bottlenecks, post-harvest quality degradation, pricing asymmetries, and socio-economic welfare of coastal smallholder fishing households.</w:t>
+        <w:t xml:space="preserve">Conducted scientific risk modeling and field investigations on acoustic disturbance, vessel strike vulnerability, and bycatch entanglement risks for cetaceans and dugongs interacting with commercial purse seine, longline, and artisanal fisheries in Indonesian seas, developing practical mitigation strategies to minimize fishery-mammal interactions.</w:t>
       </w:r>
     </w:p>
     <w:p>
@@ -3081,7 +3081,7 @@
           <w:sz w:val="20"/>
           <w:szCs w:val="20"/>
         </w:rPr>
-        <w:t xml:space="preserve">23. Scientific Assessment of Marine Mammal Interactions with Commercial Fisheries</w:t>
+        <w:t xml:space="preserve">23. Strategic Tuna Fisheries Investment Roadmap for Walton Family Foundation (WFF)</w:t>
       </w:r>
     </w:p>
     <w:p>
@@ -3106,7 +3106,7 @@
           <w:sz w:val="18"/>
           <w:szCs w:val="18"/>
         </w:rPr>
-        <w:t xml:space="preserve">PT Hatfield Indonesia / Conservation Partners  |  </w:t>
+        <w:t xml:space="preserve">Walton Family Foundation / PT Hatfield Indonesia  |  </w:t>
       </w:r>
       <w:r>
         <w:rPr>
@@ -3126,7 +3126,7 @@
           <w:sz w:val="18"/>
           <w:szCs w:val="18"/>
         </w:rPr>
-        <w:t xml:space="preserve">2019 - 2021  |  </w:t>
+        <w:t xml:space="preserve">2020 - 2022  |  </w:t>
       </w:r>
       <w:r>
         <w:rPr>
@@ -3162,7 +3162,7 @@
           <w:sz w:val="19"/>
           <w:szCs w:val="19"/>
         </w:rPr>
-        <w:t xml:space="preserve">Conducted scientific risk modeling and field investigations on acoustic disturbance, vessel strike vulnerability, and bycatch entanglement risks for cetaceans and dugongs interacting with commercial purse seine, longline, and artisanal fisheries in Indonesian seas, developing practical mitigation strategies to minimize fishery-mammal interactions.</w:t>
+        <w:t xml:space="preserve">Formulated a multi-year philanthropic investment strategy and intervention roadmap for WFF's marine portfolio, targeting rights-based fisheries management, harvest control rules, digital traceability, and coastal community empowerment in Indonesian tuna fisheries.</w:t>
       </w:r>
     </w:p>
     <w:p>
@@ -3178,7 +3178,7 @@
           <w:sz w:val="20"/>
           <w:szCs w:val="20"/>
         </w:rPr>
-        <w:t xml:space="preserve">24. Strategic Tuna Fisheries Investment Roadmap for Walton Family Foundation (WFF)</w:t>
+        <w:t xml:space="preserve">24. Rapid Scoping Study on High-Growth Investment Opportunities in Indonesian Aquaculture</w:t>
       </w:r>
     </w:p>
     <w:p>
@@ -3203,7 +3203,7 @@
           <w:sz w:val="18"/>
           <w:szCs w:val="18"/>
         </w:rPr>
-        <w:t xml:space="preserve">Walton Family Foundation / PT Hatfield Indonesia  |  </w:t>
+        <w:t xml:space="preserve">PT Hatfield Indonesia / Aquaculture Development Partners  |  </w:t>
       </w:r>
       <w:r>
         <w:rPr>
@@ -3223,7 +3223,7 @@
           <w:sz w:val="18"/>
           <w:szCs w:val="18"/>
         </w:rPr>
-        <w:t xml:space="preserve">2020 - 2022  |  </w:t>
+        <w:t xml:space="preserve">2020 - 2021  |  </w:t>
       </w:r>
       <w:r>
         <w:rPr>
@@ -3245,7 +3245,7 @@
           <w:sz w:val="18"/>
           <w:szCs w:val="18"/>
         </w:rPr>
-        <w:t xml:space="preserve">MARINE</w:t>
+        <w:t xml:space="preserve">AQUACULTURE</w:t>
       </w:r>
     </w:p>
     <w:p>
@@ -3259,7 +3259,7 @@
           <w:sz w:val="19"/>
           <w:szCs w:val="19"/>
         </w:rPr>
-        <w:t xml:space="preserve">Formulated a multi-year philanthropic investment strategy and intervention roadmap for WFF's marine portfolio, targeting rights-based fisheries management, harvest control rules, digital traceability, and coastal community empowerment in Indonesian tuna fisheries.</w:t>
+        <w:t xml:space="preserve">Delivered a strategic scoping assessment analyzing bankable investment opportunities, technological scalability, biosecurity risks, and environmental sustainability in Indonesia's brackish water shrimp, marine finfish, and seaweed aquaculture sectors.</w:t>
       </w:r>
     </w:p>
     <w:p>
@@ -3275,7 +3275,7 @@
           <w:sz w:val="20"/>
           <w:szCs w:val="20"/>
         </w:rPr>
-        <w:t xml:space="preserve">25. Rapid Scoping Study on High-Growth Investment Opportunities in Indonesian Aquaculture</w:t>
+        <w:t xml:space="preserve">25. Sectoral Review of Indonesian Tuna Purse Seine Fisheries for FIP &amp; MSC Readiness</w:t>
       </w:r>
     </w:p>
     <w:p>
@@ -3300,7 +3300,7 @@
           <w:sz w:val="18"/>
           <w:szCs w:val="18"/>
         </w:rPr>
-        <w:t xml:space="preserve">PT Hatfield Indonesia / Aquaculture Development Partners  |  </w:t>
+        <w:t xml:space="preserve">PT Hatfield Indonesia / FIP Partners  |  </w:t>
       </w:r>
       <w:r>
         <w:rPr>
@@ -3320,7 +3320,7 @@
           <w:sz w:val="18"/>
           <w:szCs w:val="18"/>
         </w:rPr>
-        <w:t xml:space="preserve">2020 - 2021  |  </w:t>
+        <w:t xml:space="preserve">2020 - 2022  |  </w:t>
       </w:r>
       <w:r>
         <w:rPr>
@@ -3342,7 +3342,7 @@
           <w:sz w:val="18"/>
           <w:szCs w:val="18"/>
         </w:rPr>
-        <w:t xml:space="preserve">AQUACULTURE</w:t>
+        <w:t xml:space="preserve">MARINE</w:t>
       </w:r>
     </w:p>
     <w:p>
@@ -3356,7 +3356,7 @@
           <w:sz w:val="19"/>
           <w:szCs w:val="19"/>
         </w:rPr>
-        <w:t xml:space="preserve">Delivered a strategic scoping assessment analyzing bankable investment opportunities, technological scalability, biosecurity risks, and environmental sustainability in Indonesia's brackish water shrimp, marine finfish, and seaweed aquaculture sectors.</w:t>
+        <w:t xml:space="preserve">Conducted a detailed technical review and Marine Stewardship Council (MSC) pre-assessment of Indonesia's industrial and semi-industrial tuna purse seine fleet, developing time-bound Action Plans for harvest strategy compliance, FAD management, and bycatch reduction.</w:t>
       </w:r>
     </w:p>
     <w:p>
@@ -3372,7 +3372,7 @@
           <w:sz w:val="20"/>
           <w:szCs w:val="20"/>
         </w:rPr>
-        <w:t xml:space="preserve">26. Sectoral Review of Indonesian Tuna Purse Seine Fisheries for FIP &amp; MSC Readiness</w:t>
+        <w:t xml:space="preserve">26. Environmental and Social Impact Assessment (ESIA) for Kendari Eco-Fishing Port Modernization</w:t>
       </w:r>
     </w:p>
     <w:p>
@@ -3397,7 +3397,7 @@
           <w:sz w:val="18"/>
           <w:szCs w:val="18"/>
         </w:rPr>
-        <w:t xml:space="preserve">PT Hatfield Indonesia / FIP Partners  |  </w:t>
+        <w:t xml:space="preserve">Agence Française de Développement (AFD) / PT Hatfield Indonesia  |  </w:t>
       </w:r>
       <w:r>
         <w:rPr>
@@ -3417,7 +3417,7 @@
           <w:sz w:val="18"/>
           <w:szCs w:val="18"/>
         </w:rPr>
-        <w:t xml:space="preserve">2020 - 2022  |  </w:t>
+        <w:t xml:space="preserve">2021 - 2022  |  </w:t>
       </w:r>
       <w:r>
         <w:rPr>
@@ -3439,7 +3439,7 @@
           <w:sz w:val="18"/>
           <w:szCs w:val="18"/>
         </w:rPr>
-        <w:t xml:space="preserve">MARINE</w:t>
+        <w:t xml:space="preserve">ENVIRONMENT</w:t>
       </w:r>
     </w:p>
     <w:p>
@@ -3453,7 +3453,7 @@
           <w:sz w:val="19"/>
           <w:szCs w:val="19"/>
         </w:rPr>
-        <w:t xml:space="preserve">Conducted a detailed technical review and Marine Stewardship Council (MSC) pre-assessment of Indonesia's industrial and semi-industrial tuna purse seine fleet, developing time-bound Action Plans for harvest strategy compliance, FAD management, and bycatch reduction.</w:t>
+        <w:t xml:space="preserve">Authored the full Environmental and Social Impact Assessment (ESIA), Environmental and Social Management Plan (ESMP), and Stakeholder Engagement Plan (SEP) for the major modernization and infrastructure expansion of PPS Kendari funded by AFD.</w:t>
       </w:r>
     </w:p>
     <w:p>
@@ -3469,7 +3469,7 @@
           <w:sz w:val="20"/>
           <w:szCs w:val="20"/>
         </w:rPr>
-        <w:t xml:space="preserve">27. Environmental and Social Impact Assessment (ESIA) for Kendari Eco-Fishing Port Modernization</w:t>
+        <w:t xml:space="preserve">27. World Bank Coral Bond IPF: Marine Law Enforcement &amp; Surveillance Capacity Assessment</w:t>
       </w:r>
     </w:p>
     <w:p>
@@ -3494,7 +3494,7 @@
           <w:sz w:val="18"/>
           <w:szCs w:val="18"/>
         </w:rPr>
-        <w:t xml:space="preserve">Agence Française de Développement (AFD) / PT Hatfield Indonesia  |  </w:t>
+        <w:t xml:space="preserve">World Bank Group / PT Hatfield Indonesia  |  </w:t>
       </w:r>
       <w:r>
         <w:rPr>
@@ -3536,7 +3536,7 @@
           <w:sz w:val="18"/>
           <w:szCs w:val="18"/>
         </w:rPr>
-        <w:t xml:space="preserve">ENVIRONMENT</w:t>
+        <w:t xml:space="preserve">MARINE</w:t>
       </w:r>
     </w:p>
     <w:p>
@@ -3550,7 +3550,7 @@
           <w:sz w:val="19"/>
           <w:szCs w:val="19"/>
         </w:rPr>
-        <w:t xml:space="preserve">Authored the full Environmental and Social Impact Assessment (ESIA), Environmental and Social Management Plan (ESMP), and Stakeholder Engagement Plan (SEP) for the major modernization and infrastructure expansion of PPS Kendari funded by AFD.</w:t>
+        <w:t xml:space="preserve">Conducted a national institutional capacity assessment on maritime surveillance, monitoring, control, and surveillance (MCS) infrastructure, and judicial enforcement across priority Marine Protected Areas supporting the design of the World Bank Coral Bond Investment Project Financing (IPF).</w:t>
       </w:r>
     </w:p>
     <w:p>
@@ -3566,7 +3566,7 @@
           <w:sz w:val="20"/>
           <w:szCs w:val="20"/>
         </w:rPr>
-        <w:t xml:space="preserve">28. World Bank Coral Bond IPF: Marine Law Enforcement &amp; Surveillance Capacity Assessment</w:t>
+        <w:t xml:space="preserve">28. Socio-Economic Baseline, Gender Action Plan &amp; Stakeholder Impact Analysis for PPS Cilacap</w:t>
       </w:r>
     </w:p>
     <w:p>
@@ -3591,7 +3591,7 @@
           <w:sz w:val="18"/>
           <w:szCs w:val="18"/>
         </w:rPr>
-        <w:t xml:space="preserve">World Bank Group / PT Hatfield Indonesia  |  </w:t>
+        <w:t xml:space="preserve">AFD / PT Hatfield Indonesia  |  </w:t>
       </w:r>
       <w:r>
         <w:rPr>
@@ -3633,7 +3633,7 @@
           <w:sz w:val="18"/>
           <w:szCs w:val="18"/>
         </w:rPr>
-        <w:t xml:space="preserve">MARINE</w:t>
+        <w:t xml:space="preserve">ENVIRONMENT</w:t>
       </w:r>
     </w:p>
     <w:p>
@@ -3647,7 +3647,7 @@
           <w:sz w:val="19"/>
           <w:szCs w:val="19"/>
         </w:rPr>
-        <w:t xml:space="preserve">Conducted a national institutional capacity assessment on maritime surveillance, monitoring, control, and surveillance (MCS) infrastructure, and judicial enforcement across priority Marine Protected Areas supporting the design of the World Bank Coral Bond Investment Project Financing (IPF).</w:t>
+        <w:t xml:space="preserve">Executed extensive socio-economic field surveys, gender vulnerability analyses, and stakeholder consultation matrices for the modernization of Cilacap Oceanic Fishing Port (PPS Cilacap), formulating inclusive resettlement frameworks and women-empowerment livelihood strategies.</w:t>
       </w:r>
     </w:p>
     <w:p>
@@ -3663,7 +3663,7 @@
           <w:sz w:val="20"/>
           <w:szCs w:val="20"/>
         </w:rPr>
-        <w:t xml:space="preserve">29. Socio-Economic Baseline, Gender Action Plan &amp; Stakeholder Impact Analysis for PPS Cilacap</w:t>
+        <w:t xml:space="preserve">29. Zoning Document and Spatial Management Plan for Kolepom Island Marine Protected Area</w:t>
       </w:r>
     </w:p>
     <w:p>
@@ -3688,7 +3688,7 @@
           <w:sz w:val="18"/>
           <w:szCs w:val="18"/>
         </w:rPr>
-        <w:t xml:space="preserve">AFD / PT Hatfield Indonesia  |  </w:t>
+        <w:t xml:space="preserve">UNDP / PT Hatfield Indonesia  |  </w:t>
       </w:r>
       <w:r>
         <w:rPr>
@@ -3730,7 +3730,7 @@
           <w:sz w:val="18"/>
           <w:szCs w:val="18"/>
         </w:rPr>
-        <w:t xml:space="preserve">ENVIRONMENT</w:t>
+        <w:t xml:space="preserve">MARINE</w:t>
       </w:r>
     </w:p>
     <w:p>
@@ -3744,7 +3744,7 @@
           <w:sz w:val="19"/>
           <w:szCs w:val="19"/>
         </w:rPr>
-        <w:t xml:space="preserve">Executed extensive socio-economic field surveys, gender vulnerability analyses, and stakeholder consultation matrices for the modernization of Cilacap Oceanic Fishing Port (PPS Cilacap), formulating inclusive resettlement frameworks and women-empowerment livelihood strategies.</w:t>
+        <w:t xml:space="preserve">Formulated the comprehensive technical zoning document and 20-year spatial management plan for the 356,000-hectare Kolepom Island MPA in South Papua, integrating core conservation zones, limited utilization zones for indigenous artisanal fisheries, and other sustainable use sub-zones.</w:t>
       </w:r>
     </w:p>
     <w:p>
@@ -3760,7 +3760,7 @@
           <w:sz w:val="20"/>
           <w:szCs w:val="20"/>
         </w:rPr>
-        <w:t xml:space="preserve">30. Zoning Document and Spatial Management Plan for Kolepom Island Marine Protected Area</w:t>
+        <w:t xml:space="preserve">30. Sustainable Tuna Fisheries Management Based on Acoustic Measurement, Length-Based Assessment, and FAD Management</w:t>
       </w:r>
     </w:p>
     <w:p>
@@ -3785,7 +3785,7 @@
           <w:sz w:val="18"/>
           <w:szCs w:val="18"/>
         </w:rPr>
-        <w:t xml:space="preserve">UNDP / PT Hatfield Indonesia  |  </w:t>
+        <w:t xml:space="preserve">The Nature Conservancy (TNC)  |  </w:t>
       </w:r>
       <w:r>
         <w:rPr>
@@ -3805,7 +3805,7 @@
           <w:sz w:val="18"/>
           <w:szCs w:val="18"/>
         </w:rPr>
-        <w:t xml:space="preserve">2021 - 2022  |  </w:t>
+        <w:t xml:space="preserve">January - December 2017  |  </w:t>
       </w:r>
       <w:r>
         <w:rPr>
@@ -3827,7 +3827,7 @@
           <w:sz w:val="18"/>
           <w:szCs w:val="18"/>
         </w:rPr>
-        <w:t xml:space="preserve">MARINE</w:t>
+        <w:t xml:space="preserve">MARINE &amp; FISHERIES GOVERNANCE</w:t>
       </w:r>
     </w:p>
     <w:p>
@@ -3841,7 +3841,7 @@
           <w:sz w:val="19"/>
           <w:szCs w:val="19"/>
         </w:rPr>
-        <w:t xml:space="preserve">Formulated the comprehensive technical zoning document and 20-year spatial management plan for the 356,000-hectare Kolepom Island MPA in South Papua, integrating core conservation zones, limited utilization zones for indigenous artisanal fisheries, and other sustainable use sub-zones.</w:t>
+        <w:t xml:space="preserve">Led the technical implementation of low-cost marine bioacoustic surveys and hydroacoustic telemetry beneath Fish Aggregating Devices (FADs / Rumpon) to quantify juvenile tuna biomass and deep-water pelagic schooling behavior. Integrated hydroacoustic data with on-board Captain-Operated Data Recording Systems (CODRS) and length-based spawning potential ratio (SPR) assessments to formulate policy briefs on voluntary FAD management guidelines and harvest strategy compliance in Indonesian tuna fisheries.</w:t>
       </w:r>
     </w:p>
     <w:p>
@@ -3857,104 +3857,7 @@
           <w:sz w:val="20"/>
           <w:szCs w:val="20"/>
         </w:rPr>
-        <w:t xml:space="preserve">31. Sustainable Tuna Fisheries Management Based on Acoustic Measurement, Length-Based Assessment, and FAD Management</w:t>
-      </w:r>
-    </w:p>
-    <w:p>
-      <w:pPr>
-        <w:spacing w:after="30" w:before="0"/>
-      </w:pPr>
-      <w:r>
-        <w:rPr>
-          <w:rFonts w:ascii="Arial" w:cs="Arial" w:eastAsia="Arial" w:hAnsi="Arial"/>
-          <w:b/>
-          <w:bCs/>
-          <w:color w:val="1E293B"/>
-          <w:sz w:val="18"/>
-          <w:szCs w:val="18"/>
-        </w:rPr>
-        <w:t xml:space="preserve">Client/Partner: </w:t>
-      </w:r>
-      <w:r>
-        <w:rPr>
-          <w:rFonts w:ascii="Arial" w:cs="Arial" w:eastAsia="Arial" w:hAnsi="Arial"/>
-          <w:color w:val="0D9488"/>
-          <w:sz w:val="18"/>
-          <w:szCs w:val="18"/>
-        </w:rPr>
-        <w:t xml:space="preserve">The Nature Conservancy (TNC)  |  </w:t>
-      </w:r>
-      <w:r>
-        <w:rPr>
-          <w:rFonts w:ascii="Arial" w:cs="Arial" w:eastAsia="Arial" w:hAnsi="Arial"/>
-          <w:b/>
-          <w:bCs/>
-          <w:color w:val="1E293B"/>
-          <w:sz w:val="18"/>
-          <w:szCs w:val="18"/>
-        </w:rPr>
-        <w:t xml:space="preserve">Period: </w:t>
-      </w:r>
-      <w:r>
-        <w:rPr>
-          <w:rFonts w:ascii="Arial" w:cs="Arial" w:eastAsia="Arial" w:hAnsi="Arial"/>
-          <w:color w:val="64748B"/>
-          <w:sz w:val="18"/>
-          <w:szCs w:val="18"/>
-        </w:rPr>
-        <w:t xml:space="preserve">January - December 2017  |  </w:t>
-      </w:r>
-      <w:r>
-        <w:rPr>
-          <w:rFonts w:ascii="Arial" w:cs="Arial" w:eastAsia="Arial" w:hAnsi="Arial"/>
-          <w:b/>
-          <w:bCs/>
-          <w:color w:val="1E293B"/>
-          <w:sz w:val="18"/>
-          <w:szCs w:val="18"/>
-        </w:rPr>
-        <w:t xml:space="preserve">Category: </w:t>
-      </w:r>
-      <w:r>
-        <w:rPr>
-          <w:rFonts w:ascii="Arial" w:cs="Arial" w:eastAsia="Arial" w:hAnsi="Arial"/>
-          <w:b/>
-          <w:bCs/>
-          <w:color w:val="0F3A5D"/>
-          <w:sz w:val="18"/>
-          <w:szCs w:val="18"/>
-        </w:rPr>
-        <w:t xml:space="preserve">MARINE &amp; FISHERIES GOVERNANCE</w:t>
-      </w:r>
-    </w:p>
-    <w:p>
-      <w:pPr>
-        <w:spacing w:after="100" w:before="0"/>
-      </w:pPr>
-      <w:r>
-        <w:rPr>
-          <w:rFonts w:ascii="Arial" w:cs="Arial" w:eastAsia="Arial" w:hAnsi="Arial"/>
-          <w:color w:val="1E293B"/>
-          <w:sz w:val="19"/>
-          <w:szCs w:val="19"/>
-        </w:rPr>
-        <w:t xml:space="preserve">Led the technical implementation of low-cost marine bioacoustic surveys and hydroacoustic telemetry beneath Fish Aggregating Devices (FADs / Rumpon) to quantify juvenile tuna biomass and deep-water pelagic schooling behavior. Integrated hydroacoustic data with on-board Captain-Operated Data Recording Systems (CODRS) and length-based spawning potential ratio (SPR) assessments to formulate policy briefs on voluntary FAD management guidelines and harvest strategy compliance in Indonesian tuna fisheries.</w:t>
-      </w:r>
-    </w:p>
-    <w:p>
-      <w:pPr>
-        <w:spacing w:after="20" w:before="100"/>
-      </w:pPr>
-      <w:r>
-        <w:rPr>
-          <w:rFonts w:ascii="Arial" w:cs="Arial" w:eastAsia="Arial" w:hAnsi="Arial"/>
-          <w:b/>
-          <w:bCs/>
-          <w:color w:val="0F3A5D"/>
-          <w:sz w:val="20"/>
-          <w:szCs w:val="20"/>
-        </w:rPr>
-        <w:t xml:space="preserve">32. Marine Mammal Monitoring and Mitigation Plan for 3D Marine Seismic Acquisition in Mentawai Block</w:t>
+        <w:t xml:space="preserve">31. Marine Mammal Monitoring and Mitigation Plan for 3D Marine Seismic Acquisition in Mentawai Block</w:t>
       </w:r>
     </w:p>
     <w:p>

</xml_diff>

<commit_message>
feat: add Cambridge DemEd Global GBF course to honors and awards
</commit_message>
<xml_diff>
--- a/I Gede Mahendra Wijaya_Master CV.docx
+++ b/I Gede Mahendra Wijaya_Master CV.docx
@@ -7198,6 +7198,62 @@
           <w:szCs w:val="24"/>
         </w:rPr>
         <w:t xml:space="preserve">HONORS, AWARDS &amp; RECOGNITIONS</w:t>
+      </w:r>
+    </w:p>
+    <w:p>
+      <w:pPr>
+        <w:pStyle w:val="ListParagraph"/>
+        <w:numPr>
+          <w:ilvl w:val="0"/>
+          <w:numId w:val="1"/>
+        </w:numPr>
+        <w:spacing w:after="20" w:before="20"/>
+      </w:pPr>
+      <w:r>
+        <w:rPr>
+          <w:rFonts w:ascii="Arial" w:cs="Arial" w:eastAsia="Arial" w:hAnsi="Arial"/>
+          <w:b/>
+          <w:bCs/>
+          <w:color w:val="0F3A5D"/>
+          <w:sz w:val="19"/>
+          <w:szCs w:val="19"/>
+        </w:rPr>
+        <w:t xml:space="preserve">[2026] </w:t>
+      </w:r>
+      <w:r>
+        <w:rPr>
+          <w:rFonts w:ascii="Arial" w:cs="Arial" w:eastAsia="Arial" w:hAnsi="Arial"/>
+          <w:b/>
+          <w:bCs/>
+          <w:color w:val="1E293B"/>
+          <w:sz w:val="19"/>
+          <w:szCs w:val="19"/>
+        </w:rPr>
+        <w:t xml:space="preserve">Key Essentials: The Global Biodiversity Framework, Sustainable Development and the Law </w:t>
+      </w:r>
+      <w:r>
+        <w:rPr>
+          <w:rFonts w:ascii="Arial" w:cs="Arial" w:eastAsia="Arial" w:hAnsi="Arial"/>
+          <w:color w:val="64748B"/>
+          <w:sz w:val="18"/>
+          <w:szCs w:val="18"/>
+        </w:rPr>
+        <w:t xml:space="preserve">— Democratising Education for Global Sustainability and Justice (DemEd Global) / University of Cambridge</w:t>
+      </w:r>
+    </w:p>
+    <w:p>
+      <w:pPr>
+        <w:spacing w:after="30" w:before="0"/>
+        <w:ind w:left="360"/>
+      </w:pPr>
+      <w:r>
+        <w:rPr>
+          <w:rFonts w:ascii="Arial" w:cs="Arial" w:eastAsia="Arial" w:hAnsi="Arial"/>
+          <w:color w:val="64748B"/>
+          <w:sz w:val="17"/>
+          <w:szCs w:val="17"/>
+        </w:rPr>
+        <w:t xml:space="preserve">Selected among competitive global applicants to receive a donor-funded scholarship for the executive course on the Kunming-Montreal Global Biodiversity Framework (GBF), Sustainable Development and the Law, delivered by Lucy Cavendish College and Hughes Hall, University of Cambridge.</w:t>
       </w:r>
     </w:p>
     <w:p>

</xml_diff>

<commit_message>
feat: update registry to Indonesian National Carbon Registry and advisor to Prof. Dr. Henry M. Manik
</commit_message>
<xml_diff>
--- a/I Gede Mahendra Wijaya_Master CV.docx
+++ b/I Gede Mahendra Wijaya_Master CV.docx
@@ -94,7 +94,7 @@
           <w:sz w:val="20"/>
           <w:szCs w:val="20"/>
         </w:rPr>
-        <w:t xml:space="preserve">Marine environmental specialist with over 13 years of experience delivering high-level technical leadership across marine-based sectors, forest concessions, and industrial waste decarbonization. Formally trained in marine science and acoustics (IPB University), with expertise spanning coastal and ocean governance, sustainable fisheries, forest concession licensing (PBPH), and carbon mitigation across AFOLU (&gt;200,000 ha peatland/wetland concessions in Papua) and Waste sectors (Palm Oil Mill Effluent / POME methane capture &amp; biogas-to-energy). Proven track record with major international institutions (World Bank, ADB, FAO, UNDP, TNC) and national innovation award recognition (BIC). Highly skilled in carbon accounting (SRUK, VCM, Paris Agreement Article 6), MRV, environmental safeguards (ESIA/AMDAL), and multi-stakeholder engagement.</w:t>
+        <w:t xml:space="preserve">Marine environmental specialist with over 13 years of experience delivering high-level technical leadership across marine-based sectors, forest concessions, and industrial waste decarbonization. Formally trained in marine science and acoustics (IPB University), with expertise spanning coastal and ocean governance, sustainable fisheries, forest concession licensing (PBPH), and carbon mitigation across AFOLU (&gt;200,000 ha peatland/wetland concessions in Papua) and Waste sectors (Palm Oil Mill Effluent / POME methane capture &amp; biogas-to-energy). Proven track record with major international institutions (World Bank, ADB, FAO, UNDP, TNC) and national innovation award recognition (BIC). Highly skilled in carbon accounting (Indonesian National Carbon Registry / SRUK, VCM, Paris Agreement Article 6), MRV, environmental safeguards (ESIA/AMDAL), and multi-stakeholder engagement.</w:t>
       </w:r>
     </w:p>
     <w:p>
@@ -316,7 +316,7 @@
           <w:sz w:val="19"/>
           <w:szCs w:val="19"/>
         </w:rPr>
-        <w:t xml:space="preserve">Concentration in Marine Acoustic and Remote Sensing Technology | GPA: 3.04. Undergraduate Thesis: "Penerapan Metode Radon Transform untuk Reduksi Gelombang Multiple Seismik 2D di Perairan Barat Sumatra" (Advisor: Dr. Henry M. Manik | IPB Scientific Repository).</w:t>
+        <w:t xml:space="preserve">Concentration in Marine Acoustic and Remote Sensing Technology | GPA: 3.04. Undergraduate Thesis: "Penerapan Metode Radon Transform untuk Reduksi Gelombang Multiple Seismik 2D di Perairan Barat Sumatra" (Advisor: Prof. Dr. Henry M. Manik | IPB Scientific Repository).</w:t>
       </w:r>
     </w:p>
     <w:p>
@@ -582,7 +582,7 @@
           <w:sz w:val="19"/>
           <w:szCs w:val="19"/>
         </w:rPr>
-        <w:t xml:space="preserve">Providing strategic and technical leadership for end-to-end carbon mitigation projects across market-based carbon mechanisms, spanning both Voluntary Carbon Markets (VCM) and Compliance Markets (Sistem Registry Unit Karbon Indonesia / SRUK, IDXCarbon, and international compliance). Directing the development, technical review, and validation of Project Design Documents (PDD) and Dokumen Rencana Aksi Mitigasi Iklim (DRAM) aligned with Core Carbon Principles (CCPs) of the Integrity Council for the Voluntary Carbon Market (ICVCM) and Paris Agreement Article 6 mechanisms (Articles 6.2 and 6.4 for ITMOs and authorized carbon crediting). Overseeing portfolio-wide carbon rating evaluations and integrity due diligence (benchmarked against BeZero, Sylvera, and Calyx Global) to guarantee robust additionality, baseline credibility, and permanence. Managing technical compliance, MRV, and greenhouse gas accounting for AFOLU (Agriculture, Forestry, and Other Land Use - REDD+, ARR, coastal blue carbon) and Waste Sectors (Palm Oil Mill Effluent / POME Methane Capture &amp; Biogas-to-Energy). Providing technical direction over &gt;200,000 hectares of peatlands and wetlands concessions in West Papua and Southwest Papua, embedding ESG frameworks, Verra VCS + CCB, ART TREES, and high-integrity nature and biodiversity credit standards.</w:t>
+        <w:t xml:space="preserve">Providing strategic and technical leadership for end-to-end carbon mitigation projects across market-based carbon mechanisms, spanning both Voluntary Carbon Markets (VCM) and Compliance Markets (Indonesian National Carbon Registry / SRUK, IDXCarbon, and international compliance). Directing the development, technical review, and validation of Project Design Documents (PDD) and Dokumen Rencana Aksi Mitigasi Iklim (DRAM) aligned with Core Carbon Principles (CCPs) of the Integrity Council for the Voluntary Carbon Market (ICVCM) and Paris Agreement Article 6 mechanisms (Articles 6.2 and 6.4 for ITMOs and authorized carbon crediting). Overseeing portfolio-wide carbon rating evaluations and integrity due diligence (benchmarked against BeZero, Sylvera, and Calyx Global) to guarantee robust additionality, baseline credibility, and permanence. Managing technical compliance, MRV, and greenhouse gas accounting for AFOLU (Agriculture, Forestry, and Other Land Use - REDD+, ARR, coastal blue carbon) and Waste Sectors (Palm Oil Mill Effluent / POME Methane Capture &amp; Biogas-to-Energy). Providing technical direction over &gt;200,000 hectares of peatlands and wetlands concessions in West Papua and Southwest Papua, embedding ESG frameworks, Verra VCS + CCB, ART TREES, and high-integrity nature and biodiversity credit standards.</w:t>
       </w:r>
     </w:p>
     <w:p>
@@ -1125,7 +1125,7 @@
           <w:sz w:val="19"/>
           <w:szCs w:val="19"/>
         </w:rPr>
-        <w:t xml:space="preserve">Delivered a high-level feasibility study and carbon scoping assessment across &gt;200,000 hectares of wetland and peatland forest concessions in Southwest Papua and West Papua Provinces. Synthesized remote sensing GIS analysis, forest carbon stock estimates, baseline deforestation drivers, regulatory compliance pathways (Sistem Registry Unit Karbon Indonesia / SRUK &amp; Verra VCS), and socio-economic risk evaluations to establish project viability for carbon credit generation and biodiversity conservation.</w:t>
+        <w:t xml:space="preserve">Delivered a high-level feasibility study and carbon scoping assessment across &gt;200,000 hectares of wetland and peatland forest concessions in Southwest Papua and West Papua Provinces. Synthesized remote sensing GIS analysis, forest carbon stock estimates, baseline deforestation drivers, regulatory compliance pathways (Indonesian National Carbon Registry / SRUK &amp; Verra VCS), and socio-economic risk evaluations to establish project viability for carbon credit generation and biodiversity conservation.</w:t>
       </w:r>
     </w:p>
     <w:p>
@@ -7049,7 +7049,7 @@
           <w:sz w:val="18"/>
           <w:szCs w:val="18"/>
         </w:rPr>
-        <w:t xml:space="preserve">Year: 2013  |  Publisher: IPB University Scientific Repository — Undergraduate Thesis (Advisor: Dr. Henry M. Manik)</w:t>
+        <w:t xml:space="preserve">Year: 2013  |  Publisher: IPB University Scientific Repository — Undergraduate Thesis (Advisor: Prof. Dr. Henry M. Manik)</w:t>
       </w:r>
       <w:r>
         <w:rPr>

</xml_diff>

<commit_message>
style: replace long em/en-dashes with standard hyphens across CV and portfolio
</commit_message>
<xml_diff>
--- a/I Gede Mahendra Wijaya_Master CV.docx
+++ b/I Gede Mahendra Wijaya_Master CV.docx
@@ -277,7 +277,7 @@
           <w:sz w:val="19"/>
           <w:szCs w:val="19"/>
         </w:rPr>
-        <w:t xml:space="preserve">  |  June 2008 – April 2013</w:t>
+        <w:t xml:space="preserve">  |  June 2008 - April 2013</w:t>
       </w:r>
     </w:p>
     <w:p>
@@ -302,7 +302,7 @@
           <w:sz w:val="19"/>
           <w:szCs w:val="19"/>
         </w:rPr>
-        <w:t xml:space="preserve"> — Faculty of Fisheries and Marine Sciences</w:t>
+        <w:t xml:space="preserve"> - Faculty of Fisheries and Marine Sciences</w:t>
       </w:r>
     </w:p>
     <w:p>
@@ -341,7 +341,7 @@
           <w:sz w:val="19"/>
           <w:szCs w:val="19"/>
         </w:rPr>
-        <w:t xml:space="preserve">  |  2023 – Present (Ongoing)</w:t>
+        <w:t xml:space="preserve">  |  2023 - Present (Ongoing)</w:t>
       </w:r>
     </w:p>
     <w:p>
@@ -366,7 +366,7 @@
           <w:sz w:val="19"/>
           <w:szCs w:val="19"/>
         </w:rPr>
-        <w:t xml:space="preserve"> — Online Professional Program</w:t>
+        <w:t xml:space="preserve"> - Online Professional Program</w:t>
       </w:r>
     </w:p>
     <w:p>
@@ -430,7 +430,7 @@
           <w:sz w:val="19"/>
           <w:szCs w:val="19"/>
         </w:rPr>
-        <w:t xml:space="preserve"> — Professional Diploma Program</w:t>
+        <w:t xml:space="preserve"> - Professional Diploma Program</w:t>
       </w:r>
     </w:p>
     <w:p>
@@ -494,7 +494,7 @@
           <w:sz w:val="19"/>
           <w:szCs w:val="19"/>
         </w:rPr>
-        <w:t xml:space="preserve"> — Professional Diploma Program</w:t>
+        <w:t xml:space="preserve"> - Professional Diploma Program</w:t>
       </w:r>
     </w:p>
     <w:p>
@@ -568,7 +568,7 @@
           <w:sz w:val="19"/>
           <w:szCs w:val="19"/>
         </w:rPr>
-        <w:t xml:space="preserve">  |  Denpasar (Hybrid Bali &amp; Papua)  |  June 2026 – Present</w:t>
+        <w:t xml:space="preserve">  |  Denpasar (Hybrid Bali &amp; Papua)  |  June 2026 - Present</w:t>
       </w:r>
     </w:p>
     <w:p>
@@ -623,7 +623,7 @@
           <w:sz w:val="19"/>
           <w:szCs w:val="19"/>
         </w:rPr>
-        <w:t xml:space="preserve">  |  Denpasar (Hybrid Bali &amp; Papua)  |  February 2023 – June 2026</w:t>
+        <w:t xml:space="preserve">  |  Denpasar (Hybrid Bali &amp; Papua)  |  February 2023 - June 2026</w:t>
       </w:r>
     </w:p>
     <w:p>
@@ -4003,7 +4003,7 @@
           <w:sz w:val="18"/>
           <w:szCs w:val="18"/>
         </w:rPr>
-        <w:t xml:space="preserve"> — United Nations Development Programme (UNDP), UNFCCC &amp; Learning for Nature (Oct 2026)</w:t>
+        <w:t xml:space="preserve"> - United Nations Development Programme (UNDP), UNFCCC &amp; Learning for Nature (Oct 2026)</w:t>
       </w:r>
     </w:p>
     <w:p>
@@ -4074,7 +4074,7 @@
           <w:sz w:val="18"/>
           <w:szCs w:val="18"/>
         </w:rPr>
-        <w:t xml:space="preserve"> — Biodiversity Credit Alliance (BCA), Nature for Life Hub &amp; University of Nottingham (Sep 2026)</w:t>
+        <w:t xml:space="preserve"> - Biodiversity Credit Alliance (BCA), Nature for Life Hub &amp; University of Nottingham (Sep 2026)</w:t>
       </w:r>
     </w:p>
     <w:p>
@@ -4145,7 +4145,7 @@
           <w:sz w:val="18"/>
           <w:szCs w:val="18"/>
         </w:rPr>
-        <w:t xml:space="preserve"> — Initiative for Climate Action Transparency (ICAT) &amp; Learning for Nature (Sep 2026)</w:t>
+        <w:t xml:space="preserve"> - Initiative for Climate Action Transparency (ICAT) &amp; Learning for Nature (Sep 2026)</w:t>
       </w:r>
     </w:p>
     <w:p>
@@ -4216,7 +4216,7 @@
           <w:sz w:val="18"/>
           <w:szCs w:val="18"/>
         </w:rPr>
-        <w:t xml:space="preserve"> — UNDP Biodiversity Finance Initiative (BIOFIN) &amp; Learning for Nature (Sep 2026)</w:t>
+        <w:t xml:space="preserve"> - UNDP Biodiversity Finance Initiative (BIOFIN) &amp; Learning for Nature (Sep 2026)</w:t>
       </w:r>
     </w:p>
     <w:p>
@@ -4287,7 +4287,7 @@
           <w:sz w:val="18"/>
           <w:szCs w:val="18"/>
         </w:rPr>
-        <w:t xml:space="preserve"> — Initiative for Climate Action Transparency (ICAT), IPCC TSU &amp; UNDP Learning for Nature (Sep 2026)</w:t>
+        <w:t xml:space="preserve"> - Initiative for Climate Action Transparency (ICAT), IPCC TSU &amp; UNDP Learning for Nature (Sep 2026)</w:t>
       </w:r>
     </w:p>
     <w:p>
@@ -4358,7 +4358,7 @@
           <w:sz w:val="18"/>
           <w:szCs w:val="18"/>
         </w:rPr>
-        <w:t xml:space="preserve"> — UN-REDD Programme (FAO, UNDP, UNEP) (Sep 2026)</w:t>
+        <w:t xml:space="preserve"> - UN-REDD Programme (FAO, UNDP, UNEP) (Sep 2026)</w:t>
       </w:r>
     </w:p>
     <w:p>
@@ -4429,7 +4429,7 @@
           <w:sz w:val="18"/>
           <w:szCs w:val="18"/>
         </w:rPr>
-        <w:t xml:space="preserve"> — Paris Agreement Article 6 Implementation Partnership (A6IP) Center, Perspectives Climate Research &amp; GHGMI (Sep 2026)</w:t>
+        <w:t xml:space="preserve"> - Paris Agreement Article 6 Implementation Partnership (A6IP) Center, Perspectives Climate Research &amp; GHGMI (Sep 2026)</w:t>
       </w:r>
     </w:p>
     <w:p>
@@ -4500,7 +4500,7 @@
           <w:sz w:val="18"/>
           <w:szCs w:val="18"/>
         </w:rPr>
-        <w:t xml:space="preserve"> — The Greenhouse Gas Management Institute (GHGMI) (Aug 2026)</w:t>
+        <w:t xml:space="preserve"> - The Greenhouse Gas Management Institute (GHGMI) (Aug 2026)</w:t>
       </w:r>
     </w:p>
     <w:p>
@@ -4571,7 +4571,7 @@
           <w:sz w:val="18"/>
           <w:szCs w:val="18"/>
         </w:rPr>
-        <w:t xml:space="preserve"> — Import Promotion Desk (IPD Germany) (Aug 2026)</w:t>
+        <w:t xml:space="preserve"> - Import Promotion Desk (IPD Germany) (Aug 2026)</w:t>
       </w:r>
     </w:p>
     <w:p>
@@ -4642,7 +4642,7 @@
           <w:sz w:val="18"/>
           <w:szCs w:val="18"/>
         </w:rPr>
-        <w:t xml:space="preserve"> — Import Promotion Desk (IPD Germany) (Aug 2026)</w:t>
+        <w:t xml:space="preserve"> - Import Promotion Desk (IPD Germany) (Aug 2026)</w:t>
       </w:r>
     </w:p>
     <w:p>
@@ -4713,7 +4713,7 @@
           <w:sz w:val="18"/>
           <w:szCs w:val="18"/>
         </w:rPr>
-        <w:t xml:space="preserve"> — World Bank Group (Jul 2026)</w:t>
+        <w:t xml:space="preserve"> - World Bank Group (Jul 2026)</w:t>
       </w:r>
     </w:p>
     <w:p>
@@ -4743,7 +4743,7 @@
           <w:sz w:val="18"/>
           <w:szCs w:val="18"/>
         </w:rPr>
-        <w:t xml:space="preserve"> — United Nations Institute for Training and Research (UNITAR) (Jul 2026)</w:t>
+        <w:t xml:space="preserve"> - United Nations Institute for Training and Research (UNITAR) (Jul 2026)</w:t>
       </w:r>
     </w:p>
     <w:p>
@@ -4773,7 +4773,7 @@
           <w:sz w:val="18"/>
           <w:szCs w:val="18"/>
         </w:rPr>
-        <w:t xml:space="preserve"> — Fair Carbon (Blue Carbon Academy) (May 2026)</w:t>
+        <w:t xml:space="preserve"> - Fair Carbon (Blue Carbon Academy) (May 2026)</w:t>
       </w:r>
     </w:p>
     <w:p>
@@ -4844,7 +4844,7 @@
           <w:sz w:val="18"/>
           <w:szCs w:val="18"/>
         </w:rPr>
-        <w:t xml:space="preserve"> — Blooms Academy (Apr 2026)</w:t>
+        <w:t xml:space="preserve"> - Blooms Academy (Apr 2026)</w:t>
       </w:r>
     </w:p>
     <w:p>
@@ -4874,7 +4874,7 @@
           <w:sz w:val="18"/>
           <w:szCs w:val="18"/>
         </w:rPr>
-        <w:t xml:space="preserve"> — Global Carbon Summit (Nov 2025)</w:t>
+        <w:t xml:space="preserve"> - Global Carbon Summit (Nov 2025)</w:t>
       </w:r>
     </w:p>
     <w:p>
@@ -4904,7 +4904,7 @@
           <w:sz w:val="18"/>
           <w:szCs w:val="18"/>
         </w:rPr>
-        <w:t xml:space="preserve"> — Society for Ecological Restoration (SER) (Jul 2024)</w:t>
+        <w:t xml:space="preserve"> - Society for Ecological Restoration (SER) (Jul 2024)</w:t>
       </w:r>
     </w:p>
     <w:p>
@@ -4934,7 +4934,7 @@
           <w:sz w:val="18"/>
           <w:szCs w:val="18"/>
         </w:rPr>
-        <w:t xml:space="preserve"> — Pachamama Alliance (Jun 2024)</w:t>
+        <w:t xml:space="preserve"> - Pachamama Alliance (Jun 2024)</w:t>
       </w:r>
     </w:p>
     <w:p>
@@ -4964,7 +4964,7 @@
           <w:sz w:val="18"/>
           <w:szCs w:val="18"/>
         </w:rPr>
-        <w:t xml:space="preserve"> — Generasi Biologi Indonesia (Jun 2024)</w:t>
+        <w:t xml:space="preserve"> - Generasi Biologi Indonesia (Jun 2024)</w:t>
       </w:r>
     </w:p>
     <w:p>
@@ -4994,7 +4994,7 @@
           <w:sz w:val="18"/>
           <w:szCs w:val="18"/>
         </w:rPr>
-        <w:t xml:space="preserve"> — Food and Agriculture Organization (FAO) (Apr 2024)</w:t>
+        <w:t xml:space="preserve"> - Food and Agriculture Organization (FAO) (Apr 2024)</w:t>
       </w:r>
     </w:p>
     <w:p>
@@ -5024,7 +5024,7 @@
           <w:sz w:val="18"/>
           <w:szCs w:val="18"/>
         </w:rPr>
-        <w:t xml:space="preserve"> — Food and Agriculture Organization (FAO) (Apr 2024)</w:t>
+        <w:t xml:space="preserve"> - Food and Agriculture Organization (FAO) (Apr 2024)</w:t>
       </w:r>
     </w:p>
     <w:p>
@@ -5054,7 +5054,7 @@
           <w:sz w:val="18"/>
           <w:szCs w:val="18"/>
         </w:rPr>
-        <w:t xml:space="preserve"> — Asian Development Bank Institute (ADBI) (Nov 2023)</w:t>
+        <w:t xml:space="preserve"> - Asian Development Bank Institute (ADBI) (Nov 2023)</w:t>
       </w:r>
     </w:p>
     <w:p>
@@ -5084,7 +5084,7 @@
           <w:sz w:val="18"/>
           <w:szCs w:val="18"/>
         </w:rPr>
-        <w:t xml:space="preserve"> — B20 Indonesia / KADIN (Aug 2022)</w:t>
+        <w:t xml:space="preserve"> - B20 Indonesia / KADIN (Aug 2022)</w:t>
       </w:r>
     </w:p>
     <w:p>
@@ -5130,7 +5130,7 @@
           <w:sz w:val="18"/>
           <w:szCs w:val="18"/>
         </w:rPr>
-        <w:t xml:space="preserve"> — UNESCO/IOC OceanTeacher Global Academy (OTGA) &amp; A-AAGORA Project (Sep 2026)</w:t>
+        <w:t xml:space="preserve"> - UNESCO/IOC OceanTeacher Global Academy (OTGA) &amp; A-AAGORA Project (Sep 2026)</w:t>
       </w:r>
     </w:p>
     <w:p>
@@ -5201,7 +5201,7 @@
           <w:sz w:val="18"/>
           <w:szCs w:val="18"/>
         </w:rPr>
-        <w:t xml:space="preserve"> — Cap-Net UNDP, SIWI &amp; Action Platform for Source-to-Sea Management (Sep 2026)</w:t>
+        <w:t xml:space="preserve"> - Cap-Net UNDP, SIWI &amp; Action Platform for Source-to-Sea Management (Sep 2026)</w:t>
       </w:r>
     </w:p>
     <w:p>
@@ -5272,7 +5272,7 @@
           <w:sz w:val="18"/>
           <w:szCs w:val="18"/>
         </w:rPr>
-        <w:t xml:space="preserve"> — Cap-Net UNDP &amp; UNEP-DHI Centre (Aug 2026)</w:t>
+        <w:t xml:space="preserve"> - Cap-Net UNDP &amp; UNEP-DHI Centre (Aug 2026)</w:t>
       </w:r>
     </w:p>
     <w:p>
@@ -5343,7 +5343,7 @@
           <w:sz w:val="18"/>
           <w:szCs w:val="18"/>
         </w:rPr>
-        <w:t xml:space="preserve"> — World Bank Group (Jul 2026)</w:t>
+        <w:t xml:space="preserve"> - World Bank Group (Jul 2026)</w:t>
       </w:r>
     </w:p>
     <w:p>
@@ -5373,7 +5373,7 @@
           <w:sz w:val="18"/>
           <w:szCs w:val="18"/>
         </w:rPr>
-        <w:t xml:space="preserve"> — Wildlife Acoustics (Feb 2026)</w:t>
+        <w:t xml:space="preserve"> - Wildlife Acoustics (Feb 2026)</w:t>
       </w:r>
     </w:p>
     <w:p>
@@ -5403,7 +5403,7 @@
           <w:sz w:val="18"/>
           <w:szCs w:val="18"/>
         </w:rPr>
-        <w:t xml:space="preserve"> — Wildlife Acoustics (Feb 2026)</w:t>
+        <w:t xml:space="preserve"> - Wildlife Acoustics (Feb 2026)</w:t>
       </w:r>
     </w:p>
     <w:p>
@@ -5433,7 +5433,7 @@
           <w:sz w:val="18"/>
           <w:szCs w:val="18"/>
         </w:rPr>
-        <w:t xml:space="preserve"> — Wildlife Acoustics (Feb 2026)</w:t>
+        <w:t xml:space="preserve"> - Wildlife Acoustics (Feb 2026)</w:t>
       </w:r>
     </w:p>
     <w:p>
@@ -5463,7 +5463,7 @@
           <w:sz w:val="18"/>
           <w:szCs w:val="18"/>
         </w:rPr>
-        <w:t xml:space="preserve"> — Wildlife Acoustics (Feb 2026)</w:t>
+        <w:t xml:space="preserve"> - Wildlife Acoustics (Feb 2026)</w:t>
       </w:r>
     </w:p>
     <w:p>
@@ -5493,7 +5493,7 @@
           <w:sz w:val="18"/>
           <w:szCs w:val="18"/>
         </w:rPr>
-        <w:t xml:space="preserve"> — Wildlife Acoustics (Feb 2026)</w:t>
+        <w:t xml:space="preserve"> - Wildlife Acoustics (Feb 2026)</w:t>
       </w:r>
     </w:p>
     <w:p>
@@ -5523,7 +5523,7 @@
           <w:sz w:val="18"/>
           <w:szCs w:val="18"/>
         </w:rPr>
-        <w:t xml:space="preserve"> — Wildlife Acoustics (Feb 2026)</w:t>
+        <w:t xml:space="preserve"> - Wildlife Acoustics (Feb 2026)</w:t>
       </w:r>
     </w:p>
     <w:p>
@@ -5553,7 +5553,7 @@
           <w:sz w:val="18"/>
           <w:szCs w:val="18"/>
         </w:rPr>
-        <w:t xml:space="preserve"> — Wildlife Acoustics (Feb 2026)</w:t>
+        <w:t xml:space="preserve"> - Wildlife Acoustics (Feb 2026)</w:t>
       </w:r>
     </w:p>
     <w:p>
@@ -5583,7 +5583,7 @@
           <w:sz w:val="18"/>
           <w:szCs w:val="18"/>
         </w:rPr>
-        <w:t xml:space="preserve"> — Wildlife Acoustics (Feb 2026)</w:t>
+        <w:t xml:space="preserve"> - Wildlife Acoustics (Feb 2026)</w:t>
       </w:r>
     </w:p>
     <w:p>
@@ -5613,7 +5613,7 @@
           <w:sz w:val="18"/>
           <w:szCs w:val="18"/>
         </w:rPr>
-        <w:t xml:space="preserve"> — International Network for Social Network Analysis (INSNA) (Feb 2024)</w:t>
+        <w:t xml:space="preserve"> - International Network for Social Network Analysis (INSNA) (Feb 2024)</w:t>
       </w:r>
     </w:p>
     <w:p>
@@ -5643,7 +5643,7 @@
           <w:sz w:val="18"/>
           <w:szCs w:val="18"/>
         </w:rPr>
-        <w:t xml:space="preserve"> — Wildlife Acoustics (Dec 2023)</w:t>
+        <w:t xml:space="preserve"> - Wildlife Acoustics (Dec 2023)</w:t>
       </w:r>
     </w:p>
     <w:p>
@@ -5673,7 +5673,7 @@
           <w:sz w:val="18"/>
           <w:szCs w:val="18"/>
         </w:rPr>
-        <w:t xml:space="preserve"> — Food and Agriculture Organization (FAO) (Oct 2023)</w:t>
+        <w:t xml:space="preserve"> - Food and Agriculture Organization (FAO) (Oct 2023)</w:t>
       </w:r>
     </w:p>
     <w:p>
@@ -5703,7 +5703,7 @@
           <w:sz w:val="18"/>
           <w:szCs w:val="18"/>
         </w:rPr>
-        <w:t xml:space="preserve"> — Politeknik AUP &amp; Kementerian Kelautan dan Perikanan (KKP) (Sep 2023)</w:t>
+        <w:t xml:space="preserve"> - Politeknik AUP &amp; Kementerian Kelautan dan Perikanan (KKP) (Sep 2023)</w:t>
       </w:r>
     </w:p>
     <w:p>
@@ -5733,7 +5733,7 @@
           <w:sz w:val="18"/>
           <w:szCs w:val="18"/>
         </w:rPr>
-        <w:t xml:space="preserve"> — Food and Agriculture Organization (FAO) (Sep 2023)</w:t>
+        <w:t xml:space="preserve"> - Food and Agriculture Organization (FAO) (Sep 2023)</w:t>
       </w:r>
     </w:p>
     <w:p>
@@ -5763,7 +5763,7 @@
           <w:sz w:val="18"/>
           <w:szCs w:val="18"/>
         </w:rPr>
-        <w:t xml:space="preserve"> — Copernicus Marine Service (Jul 2023)</w:t>
+        <w:t xml:space="preserve"> - Copernicus Marine Service (Jul 2023)</w:t>
       </w:r>
     </w:p>
     <w:p>
@@ -5809,7 +5809,7 @@
           <w:sz w:val="18"/>
           <w:szCs w:val="18"/>
         </w:rPr>
-        <w:t xml:space="preserve"> — United Nations (UNDSS) (Feb 2026)</w:t>
+        <w:t xml:space="preserve"> - United Nations (UNDSS) (Feb 2026)</w:t>
       </w:r>
     </w:p>
     <w:p>
@@ -5839,7 +5839,7 @@
           <w:sz w:val="18"/>
           <w:szCs w:val="18"/>
         </w:rPr>
-        <w:t xml:space="preserve"> — United Nations (UNDSS) (Feb 2026)</w:t>
+        <w:t xml:space="preserve"> - United Nations (UNDSS) (Feb 2026)</w:t>
       </w:r>
     </w:p>
     <w:p>
@@ -5869,7 +5869,7 @@
           <w:sz w:val="18"/>
           <w:szCs w:val="18"/>
         </w:rPr>
-        <w:t xml:space="preserve"> — United Nations (Feb 2026)</w:t>
+        <w:t xml:space="preserve"> - United Nations (Feb 2026)</w:t>
       </w:r>
     </w:p>
     <w:p>
@@ -5899,7 +5899,7 @@
           <w:sz w:val="18"/>
           <w:szCs w:val="18"/>
         </w:rPr>
-        <w:t xml:space="preserve"> — Connected Conservation (Jan 2026)</w:t>
+        <w:t xml:space="preserve"> - Connected Conservation (Jan 2026)</w:t>
       </w:r>
     </w:p>
     <w:p>
@@ -5929,7 +5929,7 @@
           <w:sz w:val="18"/>
           <w:szCs w:val="18"/>
         </w:rPr>
-        <w:t xml:space="preserve"> — Connected Conservation (Jan 2026)</w:t>
+        <w:t xml:space="preserve"> - Connected Conservation (Jan 2026)</w:t>
       </w:r>
     </w:p>
     <w:p>
@@ -5959,7 +5959,7 @@
           <w:sz w:val="18"/>
           <w:szCs w:val="18"/>
         </w:rPr>
-        <w:t xml:space="preserve"> — Corporate Forum for Community Development (CFCD) (Feb 2025)</w:t>
+        <w:t xml:space="preserve"> - Corporate Forum for Community Development (CFCD) (Feb 2025)</w:t>
       </w:r>
     </w:p>
     <w:p>
@@ -5989,7 +5989,7 @@
           <w:sz w:val="18"/>
           <w:szCs w:val="18"/>
         </w:rPr>
-        <w:t xml:space="preserve"> — Asian Development Bank (ADB) (Sep 2024)</w:t>
+        <w:t xml:space="preserve"> - Asian Development Bank (ADB) (Sep 2024)</w:t>
       </w:r>
     </w:p>
     <w:p>
@@ -6019,7 +6019,7 @@
           <w:sz w:val="18"/>
           <w:szCs w:val="18"/>
         </w:rPr>
-        <w:t xml:space="preserve"> — Asian Development Bank (ADB) (Sep 2024)</w:t>
+        <w:t xml:space="preserve"> - Asian Development Bank (ADB) (Sep 2024)</w:t>
       </w:r>
     </w:p>
     <w:p>
@@ -6049,7 +6049,7 @@
           <w:sz w:val="18"/>
           <w:szCs w:val="18"/>
         </w:rPr>
-        <w:t xml:space="preserve"> — Food and Agriculture Organization (FAO) (Apr 2024)</w:t>
+        <w:t xml:space="preserve"> - Food and Agriculture Organization (FAO) (Apr 2024)</w:t>
       </w:r>
     </w:p>
     <w:p>
@@ -6079,7 +6079,7 @@
           <w:sz w:val="18"/>
           <w:szCs w:val="18"/>
         </w:rPr>
-        <w:t xml:space="preserve"> — Forage (Feb 2024)</w:t>
+        <w:t xml:space="preserve"> - Forage (Feb 2024)</w:t>
       </w:r>
     </w:p>
     <w:p>
@@ -6109,7 +6109,7 @@
           <w:sz w:val="18"/>
           <w:szCs w:val="18"/>
         </w:rPr>
-        <w:t xml:space="preserve"> — Moreton Bay Regional Council / Forage (Feb 2024)</w:t>
+        <w:t xml:space="preserve"> - Moreton Bay Regional Council / Forage (Feb 2024)</w:t>
       </w:r>
     </w:p>
     <w:p>
@@ -6139,7 +6139,7 @@
           <w:sz w:val="18"/>
           <w:szCs w:val="18"/>
         </w:rPr>
-        <w:t xml:space="preserve"> — BrightTALK (Nov 2023)</w:t>
+        <w:t xml:space="preserve"> - BrightTALK (Nov 2023)</w:t>
       </w:r>
     </w:p>
     <w:p>
@@ -6169,7 +6169,7 @@
           <w:sz w:val="18"/>
           <w:szCs w:val="18"/>
         </w:rPr>
-        <w:t xml:space="preserve"> — World Bank Group (Nov 2023)</w:t>
+        <w:t xml:space="preserve"> - World Bank Group (Nov 2023)</w:t>
       </w:r>
     </w:p>
     <w:p>
@@ -6199,7 +6199,7 @@
           <w:sz w:val="18"/>
           <w:szCs w:val="18"/>
         </w:rPr>
-        <w:t xml:space="preserve"> — World Bank Group (Nov 2023)</w:t>
+        <w:t xml:space="preserve"> - World Bank Group (Nov 2023)</w:t>
       </w:r>
     </w:p>
     <w:p>
@@ -6229,7 +6229,7 @@
           <w:sz w:val="18"/>
           <w:szCs w:val="18"/>
         </w:rPr>
-        <w:t xml:space="preserve"> — World Bank Group (Nov 2023)</w:t>
+        <w:t xml:space="preserve"> - World Bank Group (Nov 2023)</w:t>
       </w:r>
     </w:p>
     <w:p>
@@ -6259,7 +6259,7 @@
           <w:sz w:val="18"/>
           <w:szCs w:val="18"/>
         </w:rPr>
-        <w:t xml:space="preserve"> — Food and Agriculture Organization (FAO) (Nov 2023)</w:t>
+        <w:t xml:space="preserve"> - Food and Agriculture Organization (FAO) (Nov 2023)</w:t>
       </w:r>
     </w:p>
     <w:p>
@@ -6289,7 +6289,7 @@
           <w:sz w:val="18"/>
           <w:szCs w:val="18"/>
         </w:rPr>
-        <w:t xml:space="preserve"> — Proforest Academy (Oct 2023)</w:t>
+        <w:t xml:space="preserve"> - Proforest Academy (Oct 2023)</w:t>
       </w:r>
     </w:p>
     <w:p>
@@ -6319,7 +6319,7 @@
           <w:sz w:val="18"/>
           <w:szCs w:val="18"/>
         </w:rPr>
-        <w:t xml:space="preserve"> — Proforest Academy (Oct 2023)</w:t>
+        <w:t xml:space="preserve"> - Proforest Academy (Oct 2023)</w:t>
       </w:r>
     </w:p>
     <w:p>
@@ -6349,7 +6349,7 @@
           <w:sz w:val="18"/>
           <w:szCs w:val="18"/>
         </w:rPr>
-        <w:t xml:space="preserve"> — World Bank Group &amp; GEF (Oct 2023)</w:t>
+        <w:t xml:space="preserve"> - World Bank Group &amp; GEF (Oct 2023)</w:t>
       </w:r>
     </w:p>
     <w:p>
@@ -6379,7 +6379,7 @@
           <w:sz w:val="18"/>
           <w:szCs w:val="18"/>
         </w:rPr>
-        <w:t xml:space="preserve"> — Food and Agriculture Organization (FAO) (Aug 2023)</w:t>
+        <w:t xml:space="preserve"> - Food and Agriculture Organization (FAO) (Aug 2023)</w:t>
       </w:r>
     </w:p>
     <w:p>
@@ -6425,7 +6425,7 @@
           <w:sz w:val="18"/>
           <w:szCs w:val="18"/>
         </w:rPr>
-        <w:t xml:space="preserve"> — Alison (Sep 2026)</w:t>
+        <w:t xml:space="preserve"> - Alison (Sep 2026)</w:t>
       </w:r>
     </w:p>
     <w:p>
@@ -6496,7 +6496,7 @@
           <w:sz w:val="18"/>
           <w:szCs w:val="18"/>
         </w:rPr>
-        <w:t xml:space="preserve"> — Alison (Sep 2026)</w:t>
+        <w:t xml:space="preserve"> - Alison (Sep 2026)</w:t>
       </w:r>
     </w:p>
     <w:p>
@@ -6567,7 +6567,7 @@
           <w:sz w:val="18"/>
           <w:szCs w:val="18"/>
         </w:rPr>
-        <w:t xml:space="preserve"> — Palo Alto Networks (Sep 2025)</w:t>
+        <w:t xml:space="preserve"> - Palo Alto Networks (Sep 2025)</w:t>
       </w:r>
     </w:p>
     <w:p>
@@ -6597,7 +6597,7 @@
           <w:sz w:val="18"/>
           <w:szCs w:val="18"/>
         </w:rPr>
-        <w:t xml:space="preserve"> — Asosiasi Pilot Drone Indonesia (APDI) (Dec 2020)</w:t>
+        <w:t xml:space="preserve"> - Asosiasi Pilot Drone Indonesia (APDI) (Dec 2020)</w:t>
       </w:r>
     </w:p>
     <w:p>
@@ -6627,7 +6627,7 @@
           <w:sz w:val="18"/>
           <w:szCs w:val="18"/>
         </w:rPr>
-        <w:t xml:space="preserve"> — Worldwide Quality Assurance (WQA) (Dec 2018)</w:t>
+        <w:t xml:space="preserve"> - Worldwide Quality Assurance (WQA) (Dec 2018)</w:t>
       </w:r>
     </w:p>
     <w:p>
@@ -6657,7 +6657,7 @@
           <w:sz w:val="18"/>
           <w:szCs w:val="18"/>
         </w:rPr>
-        <w:t xml:space="preserve"> — Barron International (Aug 2014)</w:t>
+        <w:t xml:space="preserve"> - Barron International (Aug 2014)</w:t>
       </w:r>
     </w:p>
     <w:p>
@@ -6687,7 +6687,7 @@
           <w:sz w:val="18"/>
           <w:szCs w:val="18"/>
         </w:rPr>
-        <w:t xml:space="preserve"> — Barron International (Aug 2014)</w:t>
+        <w:t xml:space="preserve"> - Barron International (Aug 2014)</w:t>
       </w:r>
     </w:p>
     <w:p>
@@ -6733,7 +6733,7 @@
           <w:sz w:val="18"/>
           <w:szCs w:val="18"/>
         </w:rPr>
-        <w:t xml:space="preserve"> — DisasterReady / Cornerstone OnDemand (Jul 2026)</w:t>
+        <w:t xml:space="preserve"> - DisasterReady / Cornerstone OnDemand (Jul 2026)</w:t>
       </w:r>
     </w:p>
     <w:p>
@@ -6763,7 +6763,7 @@
           <w:sz w:val="18"/>
           <w:szCs w:val="18"/>
         </w:rPr>
-        <w:t xml:space="preserve"> — Alison (Jul 2026)</w:t>
+        <w:t xml:space="preserve"> - Alison (Jul 2026)</w:t>
       </w:r>
     </w:p>
     <w:p>
@@ -6834,7 +6834,7 @@
           <w:sz w:val="18"/>
           <w:szCs w:val="18"/>
         </w:rPr>
-        <w:t xml:space="preserve"> — DisasterReady / Cornerstone OnDemand (Feb 2024)</w:t>
+        <w:t xml:space="preserve"> - DisasterReady / Cornerstone OnDemand (Feb 2024)</w:t>
       </w:r>
     </w:p>
     <w:p>
@@ -6864,7 +6864,7 @@
           <w:sz w:val="18"/>
           <w:szCs w:val="18"/>
         </w:rPr>
-        <w:t xml:space="preserve"> — Professional Institution (Nov 2023)</w:t>
+        <w:t xml:space="preserve"> - Professional Institution (Nov 2023)</w:t>
       </w:r>
     </w:p>
     <w:p>
@@ -6894,7 +6894,7 @@
           <w:sz w:val="18"/>
           <w:szCs w:val="18"/>
         </w:rPr>
-        <w:t xml:space="preserve"> — Bank Indonesia Institute (Jul 2022)</w:t>
+        <w:t xml:space="preserve"> - Bank Indonesia Institute (Jul 2022)</w:t>
       </w:r>
     </w:p>
     <w:p>
@@ -6996,7 +6996,7 @@
           <w:sz w:val="18"/>
           <w:szCs w:val="18"/>
         </w:rPr>
-        <w:t xml:space="preserve">Year: 2016  |  Publisher: Current Status and Conservation, Part 2, Vol 73, AMB, UK: Academic Press, pp. 219–271</w:t>
+        <w:t xml:space="preserve">Year: 2016  |  Publisher: Current Status and Conservation, Part 2, Vol 73, AMB, UK: Academic Press, pp. 219-271</w:t>
       </w:r>
       <w:r>
         <w:rPr>
@@ -7049,7 +7049,7 @@
           <w:sz w:val="18"/>
           <w:szCs w:val="18"/>
         </w:rPr>
-        <w:t xml:space="preserve">Year: 2013  |  Publisher: IPB University Scientific Repository — Undergraduate Thesis (Advisor: Prof. Dr. Henry M. Manik)</w:t>
+        <w:t xml:space="preserve">Year: 2013  |  Publisher: IPB University Scientific Repository - Undergraduate Thesis (Advisor: Prof. Dr. Henry M. Manik)</w:t>
       </w:r>
       <w:r>
         <w:rPr>
@@ -7102,7 +7102,7 @@
           <w:sz w:val="18"/>
           <w:szCs w:val="18"/>
         </w:rPr>
-        <w:t xml:space="preserve">Year: 2012  |  Publisher: Research Innovation Award — Business Innovation Center (BIC), Indonesia</w:t>
+        <w:t xml:space="preserve">Year: 2012  |  Publisher: Research Innovation Award - Business Innovation Center (BIC), Indonesia</w:t>
       </w:r>
       <w:r>
         <w:rPr>
@@ -7238,7 +7238,7 @@
           <w:sz w:val="18"/>
           <w:szCs w:val="18"/>
         </w:rPr>
-        <w:t xml:space="preserve">— Democratising Education for Global Sustainability and Justice (DemEd Global) / University of Cambridge</w:t>
+        <w:t xml:space="preserve">- Democratising Education for Global Sustainability and Justice (DemEd Global) / University of Cambridge</w:t>
       </w:r>
     </w:p>
     <w:p>
@@ -7294,7 +7294,7 @@
           <w:sz w:val="18"/>
           <w:szCs w:val="18"/>
         </w:rPr>
-        <w:t xml:space="preserve">— Democratising Education for Global Sustainability and Justice (DemEd Global) / University of Cambridge</w:t>
+        <w:t xml:space="preserve">- Democratising Education for Global Sustainability and Justice (DemEd Global) / University of Cambridge</w:t>
       </w:r>
     </w:p>
     <w:p>
@@ -7341,16 +7341,16 @@
           <w:sz w:val="19"/>
           <w:szCs w:val="19"/>
         </w:rPr>
-        <w:t xml:space="preserve">UNITAR Green Economic Acceleration: A Japan–ASEAN Strategic Programme for Sustainable Green Finance </w:t>
-      </w:r>
-      <w:r>
-        <w:rPr>
-          <w:rFonts w:ascii="Arial" w:cs="Arial" w:eastAsia="Arial" w:hAnsi="Arial"/>
-          <w:color w:val="64748B"/>
-          <w:sz w:val="18"/>
-          <w:szCs w:val="18"/>
-        </w:rPr>
-        <w:t xml:space="preserve">— United Nations Institute for Training and Research (UNITAR) and UN CC:Learn</w:t>
+        <w:t xml:space="preserve">UNITAR Green Economic Acceleration: A Japan-ASEAN Strategic Programme for Sustainable Green Finance </w:t>
+      </w:r>
+      <w:r>
+        <w:rPr>
+          <w:rFonts w:ascii="Arial" w:cs="Arial" w:eastAsia="Arial" w:hAnsi="Arial"/>
+          <w:color w:val="64748B"/>
+          <w:sz w:val="18"/>
+          <w:szCs w:val="18"/>
+        </w:rPr>
+        <w:t xml:space="preserve">- United Nations Institute for Training and Research (UNITAR) and UN CC:Learn</w:t>
       </w:r>
     </w:p>
     <w:p>
@@ -7365,7 +7365,7 @@
           <w:sz w:val="17"/>
           <w:szCs w:val="17"/>
         </w:rPr>
-        <w:t xml:space="preserve">Selected through a competitive selection process among applicants across the ASEAN region for the Japan–ASEAN strategic initiative delivered by UNITAR. The program focuses on sustainable green finance mechanisms, bankable green project design, and regional policies driving the green economic transition.</w:t>
+        <w:t xml:space="preserve">Selected through a competitive selection process among applicants across the ASEAN region for the Japan-ASEAN strategic initiative delivered by UNITAR. The program focuses on sustainable green finance mechanisms, bankable green project design, and regional policies driving the green economic transition.</w:t>
       </w:r>
     </w:p>
     <w:p>
@@ -7397,16 +7397,16 @@
           <w:sz w:val="19"/>
           <w:szCs w:val="19"/>
         </w:rPr>
-        <w:t xml:space="preserve">The 114th Prospective Innovation Award of Indonesia – 2022 Indonesia Scientist Award </w:t>
-      </w:r>
-      <w:r>
-        <w:rPr>
-          <w:rFonts w:ascii="Arial" w:cs="Arial" w:eastAsia="Arial" w:hAnsi="Arial"/>
-          <w:color w:val="64748B"/>
-          <w:sz w:val="18"/>
-          <w:szCs w:val="18"/>
-        </w:rPr>
-        <w:t xml:space="preserve">— Business Innovation Center (BIC) &amp; Ministry of Research and Technology (Kemenristek/BRIN)</w:t>
+        <w:t xml:space="preserve">The 114th Prospective Innovation Award of Indonesia - 2022 Indonesia Scientist Award </w:t>
+      </w:r>
+      <w:r>
+        <w:rPr>
+          <w:rFonts w:ascii="Arial" w:cs="Arial" w:eastAsia="Arial" w:hAnsi="Arial"/>
+          <w:color w:val="64748B"/>
+          <w:sz w:val="18"/>
+          <w:szCs w:val="18"/>
+        </w:rPr>
+        <w:t xml:space="preserve">- Business Innovation Center (BIC) &amp; Ministry of Research and Technology (Kemenristek/BRIN)</w:t>
       </w:r>
     </w:p>
     <w:p>
@@ -7462,7 +7462,7 @@
           <w:sz w:val="18"/>
           <w:szCs w:val="18"/>
         </w:rPr>
-        <w:t xml:space="preserve">— Bank Indonesia Institute</w:t>
+        <w:t xml:space="preserve">- Bank Indonesia Institute</w:t>
       </w:r>
     </w:p>
     <w:p>
@@ -7518,7 +7518,7 @@
           <w:sz w:val="18"/>
           <w:szCs w:val="18"/>
         </w:rPr>
-        <w:t xml:space="preserve">— DigiFish Network &amp; Ministry of Marine Affairs and Fisheries (KKP)</w:t>
+        <w:t xml:space="preserve">- DigiFish Network &amp; Ministry of Marine Affairs and Fisheries (KKP)</w:t>
       </w:r>
     </w:p>
     <w:p>
@@ -7574,7 +7574,7 @@
           <w:sz w:val="18"/>
           <w:szCs w:val="18"/>
         </w:rPr>
-        <w:t xml:space="preserve">— Inovasia Indonesia &amp; Kemenpora RI</w:t>
+        <w:t xml:space="preserve">- Inovasia Indonesia &amp; Kemenpora RI</w:t>
       </w:r>
     </w:p>
     <w:p>
@@ -7630,7 +7630,7 @@
           <w:sz w:val="18"/>
           <w:szCs w:val="18"/>
         </w:rPr>
-        <w:t xml:space="preserve">— Indonesian Youth Parliament</w:t>
+        <w:t xml:space="preserve">- Indonesian Youth Parliament</w:t>
       </w:r>
     </w:p>
     <w:p>
@@ -7677,16 +7677,16 @@
           <w:sz w:val="19"/>
           <w:szCs w:val="19"/>
         </w:rPr>
-        <w:t xml:space="preserve">The 104th Prospective Innovation Award of Indonesia – 2012 Indonesia Scientist Award </w:t>
-      </w:r>
-      <w:r>
-        <w:rPr>
-          <w:rFonts w:ascii="Arial" w:cs="Arial" w:eastAsia="Arial" w:hAnsi="Arial"/>
-          <w:color w:val="64748B"/>
-          <w:sz w:val="18"/>
-          <w:szCs w:val="18"/>
-        </w:rPr>
-        <w:t xml:space="preserve">— Business Innovation Center (BIC)</w:t>
+        <w:t xml:space="preserve">The 104th Prospective Innovation Award of Indonesia - 2012 Indonesia Scientist Award </w:t>
+      </w:r>
+      <w:r>
+        <w:rPr>
+          <w:rFonts w:ascii="Arial" w:cs="Arial" w:eastAsia="Arial" w:hAnsi="Arial"/>
+          <w:color w:val="64748B"/>
+          <w:sz w:val="18"/>
+          <w:szCs w:val="18"/>
+        </w:rPr>
+        <w:t xml:space="preserve">- Business Innovation Center (BIC)</w:t>
       </w:r>
     </w:p>
     <w:p>
@@ -7742,7 +7742,7 @@
           <w:sz w:val="18"/>
           <w:szCs w:val="18"/>
         </w:rPr>
-        <w:t xml:space="preserve">— IPB University</w:t>
+        <w:t xml:space="preserve">- IPB University</w:t>
       </w:r>
     </w:p>
     <w:p>
@@ -7806,7 +7806,7 @@
           <w:sz w:val="18"/>
           <w:szCs w:val="18"/>
         </w:rPr>
-        <w:t xml:space="preserve">— Member (2012 – Present)</w:t>
+        <w:t xml:space="preserve">- Member (2012 - Present)</w:t>
       </w:r>
     </w:p>
     <w:p>
@@ -7865,7 +7865,7 @@
           <w:sz w:val="19"/>
           <w:szCs w:val="19"/>
         </w:rPr>
-        <w:t xml:space="preserve"> — Director of Marine Unit Service, Hatfield Group</w:t>
+        <w:t xml:space="preserve"> - Director of Marine Unit Service, Hatfield Group</w:t>
       </w:r>
     </w:p>
     <w:p>
@@ -7904,7 +7904,7 @@
           <w:sz w:val="19"/>
           <w:szCs w:val="19"/>
         </w:rPr>
-        <w:t xml:space="preserve"> — Head of Department of Marine Science and Technology, Faculty of Fisheries and Marine Sciences, IPB University</w:t>
+        <w:t xml:space="preserve"> - Head of Department of Marine Science and Technology, Faculty of Fisheries and Marine Sciences, IPB University</w:t>
       </w:r>
     </w:p>
     <w:p>

</xml_diff>

<commit_message>
fix: remove BRGM reference and adjust Kolepom role to supported
</commit_message>
<xml_diff>
--- a/I Gede Mahendra Wijaya_Master CV.docx
+++ b/I Gede Mahendra Wijaya_Master CV.docx
@@ -637,7 +637,7 @@
           <w:sz w:val="19"/>
           <w:szCs w:val="19"/>
         </w:rPr>
-        <w:t xml:space="preserve">Managed full project lifecycles for large-scale terrestrial, peatland, and coastal wetland ecosystem restoration concessions (&gt;200,000 ha) across West Papua and Southwest Papua. Directed multidisciplinary field teams conducting ecological baseline surveys, High Carbon Stock Approach (HCSA), High Conservation Value (HCV), and ground-based carbon stock accounting (SNI 7724). Designed and facilitated Free, Prior, and Informed Consent (FPIC) processes and inclusive benefit-sharing frameworks with indigenous customary communities (Masyarakat Hukum Adat). Led regulatory liaison and licensing with the Ministry of Environment and Forestry (MoEF / KLHK), Peatland &amp; Mangrove Restoration Agency (BRGM), and Ministry of Marine Affairs and Fisheries (KKP). Formulated comprehensive Environmental &amp; Social Management Plans (ESMP), ESIA / AMDAL compliance frameworks, and established rigorous Monitoring, Reporting, and Verification (MRV) systems.</w:t>
+        <w:t xml:space="preserve">Managed full project lifecycles for large-scale terrestrial, peatland, and coastal wetland ecosystem restoration concessions (&gt;200,000 ha) across West Papua and Southwest Papua. Directed multidisciplinary field teams conducting ecological baseline surveys, High Carbon Stock Approach (HCSA), High Conservation Value (HCV), and ground-based carbon stock accounting (SNI 7724). Designed and facilitated Free, Prior, and Informed Consent (FPIC) processes and inclusive benefit-sharing frameworks with indigenous customary communities (Masyarakat Hukum Adat). Led regulatory liaison and licensing with the Ministry of Environment and Forestry (MoEF / KLHK) and Ministry of Marine Affairs and Fisheries (KKP). Formulated comprehensive Environmental &amp; Social Management Plans (ESMP), ESIA / AMDAL compliance frameworks, and established rigorous Monitoring, Reporting, and Verification (MRV) systems.</w:t>
       </w:r>
     </w:p>
     <w:p>
@@ -1416,7 +1416,7 @@
           <w:sz w:val="19"/>
           <w:szCs w:val="19"/>
         </w:rPr>
-        <w:t xml:space="preserve">Led technical facilitation and Working Group (POKJA) coordination for the formal establishment of the 356,000-hectare Kolepom Island Marine Protected Area in Merauke District, South Papua. Authored technical resource potential reports, facilitated public consultations with indigenous coastal tribes, and drafted the MPA management and spatial zoning plan formally gazetted by the Ministry of Marine Affairs and Fisheries (KKP).</w:t>
+        <w:t xml:space="preserve">Supported technical facilitation and Working Group (POKJA) coordination for the formal establishment of the 356,000-hectare Kolepom Island Marine Protected Area in Merauke District, South Papua. Authored technical resource potential reports, facilitated public consultations with indigenous coastal tribes, and drafted the MPA management and spatial zoning plan formally gazetted by the Ministry of Marine Affairs and Fisheries (KKP).</w:t>
       </w:r>
     </w:p>
     <w:p>

</xml_diff>

<commit_message>
fix: update Master CV docx with all latest carbon, SD-VISta and nature framework updates
</commit_message>
<xml_diff>
--- a/I Gede Mahendra Wijaya_Master CV.docx
+++ b/I Gede Mahendra Wijaya_Master CV.docx
@@ -94,7 +94,7 @@
           <w:sz w:val="20"/>
           <w:szCs w:val="20"/>
         </w:rPr>
-        <w:t xml:space="preserve">Marine environmental specialist with over 13 years of experience delivering high-level technical leadership across marine-based sectors, forest concessions, and industrial waste decarbonization. Formally trained in marine science and acoustics (IPB University), with expertise spanning coastal and ocean governance, sustainable fisheries, forest concession licensing (PBPH), and carbon mitigation across AFOLU (&gt;200,000 ha peatland/wetland concessions in Papua) and Waste sectors (Palm Oil Mill Effluent / POME methane capture &amp; biogas-to-energy). Proven track record with major international institutions (World Bank, ADB, FAO, UNDP, TNC) and national innovation award recognition (BIC). Highly skilled in carbon accounting (Indonesian National Carbon Registry / SRUK, VCM, Paris Agreement Article 6), MRV, environmental safeguards (ESIA/AMDAL), and multi-stakeholder engagement.</w:t>
+        <w:t xml:space="preserve">Marine environmental specialist with over 13 years of experience delivering high-level technical leadership across marine-based sectors, forest concessions, and industrial waste decarbonization. Formally trained in marine science and acoustics (IPB University), with expertise spanning coastal and ocean governance, sustainable fisheries, forest concession licensing (PBPH), and carbon mitigation across AFOLU (&gt;200,000 ha peatland/wetland concessions in Papua) and Waste sectors (Palm Oil Mill Effluent / POME methane capture &amp; biogas-to-energy). Proven track record with major international institutions (World Bank, ADB, FAO, UNDP, TNC) and national innovation award recognition (BIC). Highly skilled in carbon accounting (Indonesian National Carbon Units &amp; Registry [SRUK / SRN], VCM, Paris Agreement Article 6), MRV, environmental safeguards (ESIA/AMDAL), and multi-stakeholder engagement.</w:t>
       </w:r>
     </w:p>
     <w:p>
@@ -316,7 +316,7 @@
           <w:sz w:val="19"/>
           <w:szCs w:val="19"/>
         </w:rPr>
-        <w:t xml:space="preserve">Concentration in Marine Acoustic and Remote Sensing Technology | GPA: 3.04. Undergraduate Thesis: "Penerapan Metode Radon Transform untuk Reduksi Gelombang Multiple Seismik 2D di Perairan Barat Sumatra" (Advisor: Prof. Dr. Henry M. Manik | IPB Scientific Repository).</w:t>
+        <w:t xml:space="preserve">Concentration in Marine Acoustic and Remote Sensing Technology | GPA: 3.04. Undergraduate Thesis: "Application of Radon Transform Method for 2D Seismic Multiple Wave Reduction in West Sumatra Waters" (Advisor: Prof. Dr. Henry M. Manik | IPB Scientific Repository).</w:t>
       </w:r>
     </w:p>
     <w:p>
@@ -582,7 +582,7 @@
           <w:sz w:val="19"/>
           <w:szCs w:val="19"/>
         </w:rPr>
-        <w:t xml:space="preserve">Providing strategic and technical leadership for end-to-end carbon mitigation projects across market-based carbon mechanisms, spanning both Voluntary Carbon Markets (VCM) and Compliance Markets (Indonesian National Carbon Registry / SRUK, IDXCarbon, and international compliance). Directing the development, technical review, and validation of Project Design Documents (PDD) and Dokumen Rencana Aksi Mitigasi Iklim (DRAM) aligned with Core Carbon Principles (CCPs) of the Integrity Council for the Voluntary Carbon Market (ICVCM) and Paris Agreement Article 6 mechanisms (Articles 6.2 and 6.4 for ITMOs and authorized carbon crediting). Overseeing portfolio-wide carbon rating evaluations and integrity due diligence (benchmarked against BeZero, Sylvera, and Calyx Global) to guarantee robust additionality, baseline credibility, and permanence. Managing technical compliance, MRV, and greenhouse gas accounting for AFOLU (Agriculture, Forestry, and Other Land Use - REDD+, ARR, coastal blue carbon) and Waste Sectors (Palm Oil Mill Effluent / POME Methane Capture &amp; Biogas-to-Energy). Providing technical direction over &gt;200,000 hectares of peatlands and wetlands concessions in West Papua and Southwest Papua, embedding ESG frameworks, Verra VCS + CCB, ART TREES, and high-integrity nature and biodiversity credit standards.</w:t>
+        <w:t xml:space="preserve">Providing strategic and technical leadership for end-to-end carbon mitigation projects across market-based carbon mechanisms, spanning both Voluntary Carbon Markets (VCM) and Compliance Markets (Indonesian National Carbon Units &amp; Registry [SRUK / SRN], IDXCarbon, and international compliance). Directing the development, technical review, and validation of Project Design Documents (PDD) and Dokumen Rencana Aksi Mitigasi Iklim (DRAM) aligned with Core Carbon Principles (CCPs) of the Integrity Council for the Voluntary Carbon Market (ICVCM) and Paris Agreement Article 6 mechanisms (Articles 6.2 and 6.4 for ITMOs and authorized carbon crediting). Overseeing portfolio-wide carbon rating evaluations and integrity due diligence (benchmarked against BeZero, Sylvera, and Calyx Global) to guarantee robust additionality, baseline credibility, and permanence. Managing technical compliance, MRV, and greenhouse gas accounting for AFOLU (Agriculture, Forestry, and Other Land Use - REDD+, ARR, coastal blue carbon) and Waste Sectors (Palm Oil Mill Effluent / POME Methane Capture &amp; Biogas-to-Energy). Providing technical direction over &gt;200,000 hectares of peatlands and wetlands concessions in West Papua and Southwest Papua, embedding ESG frameworks, Verra VCS + CCB, Verra SD VISta (Sustainable Development Verified Impact Standard), Verra Nature Framework, ART TREES, and high-integrity nature and biodiversity credit standards.</w:t>
       </w:r>
     </w:p>
     <w:p>
@@ -1125,7 +1125,7 @@
           <w:sz w:val="19"/>
           <w:szCs w:val="19"/>
         </w:rPr>
-        <w:t xml:space="preserve">Delivered a high-level feasibility study and carbon scoping assessment across &gt;200,000 hectares of wetland and peatland forest concessions in Southwest Papua and West Papua Provinces. Synthesized remote sensing GIS analysis, forest carbon stock estimates, baseline deforestation drivers, regulatory compliance pathways (Indonesian National Carbon Registry / SRUK &amp; Verra VCS), and socio-economic risk evaluations to establish project viability for carbon credit generation and biodiversity conservation.</w:t>
+        <w:t xml:space="preserve">Delivered a high-level feasibility study and carbon scoping assessment across &gt;200,000 hectares of wetland and peatland forest concessions in Southwest Papua and West Papua Provinces. Synthesized remote sensing GIS analysis, forest carbon stock estimates, baseline deforestation drivers, regulatory compliance pathways (Indonesian National Carbon Units &amp; Registry [SRUK / SRN], Verra VCS + CCB, SD VISta, and Nature Framework), and socio-economic risk evaluations to establish project viability for carbon credit generation and biodiversity conservation.</w:t>
       </w:r>
     </w:p>
     <w:p>
@@ -7035,7 +7035,7 @@
           <w:sz w:val="20"/>
           <w:szCs w:val="20"/>
         </w:rPr>
-        <w:t xml:space="preserve">3. Penerapan Metode Radon Transform untuk Reduksi Gelombang Multiple Seismik 2D di Perairan Barat Sumatra (Application of Radon Transform for 2D Seismic Multiple Wave Reduction)</w:t>
+        <w:t xml:space="preserve">3. Application of Radon Transform Method for 2D Seismic Multiple Wave Reduction in West Sumatra Waters</w:t>
       </w:r>
     </w:p>
     <w:p>

</xml_diff>

<commit_message>
feat: add Prof. Henry M. Manik as reference and hide all personal contact info upon request
</commit_message>
<xml_diff>
--- a/I Gede Mahendra Wijaya_Master CV.docx
+++ b/I Gede Mahendra Wijaya_Master CV.docx
@@ -7865,7 +7865,7 @@
           <w:sz w:val="19"/>
           <w:szCs w:val="19"/>
         </w:rPr>
-        <w:t xml:space="preserve"> - Director of Marine Unit Service, Hatfield Group</w:t>
+        <w:t xml:space="preserve"> - Director of Marine Unit Service, Hatfield Consultant</w:t>
       </w:r>
     </w:p>
     <w:p>
@@ -7879,7 +7879,7 @@
           <w:sz w:val="18"/>
           <w:szCs w:val="18"/>
         </w:rPr>
-        <w:t xml:space="preserve">Email: lpetsoede@hatfieldgroup.com | Phone: +62 812 3818 742</w:t>
+        <w:t xml:space="preserve">Contact available upon request</w:t>
       </w:r>
     </w:p>
     <w:p>
@@ -7904,7 +7904,7 @@
           <w:sz w:val="19"/>
           <w:szCs w:val="19"/>
         </w:rPr>
-        <w:t xml:space="preserve"> - Head of Department of Marine Science and Technology, Faculty of Fisheries and Marine Sciences, IPB University</w:t>
+        <w:t xml:space="preserve"> - Head of Department of Marine Science and Technology, IPB University</w:t>
       </w:r>
     </w:p>
     <w:p>
@@ -7918,7 +7918,46 @@
           <w:sz w:val="18"/>
           <w:szCs w:val="18"/>
         </w:rPr>
-        <w:t xml:space="preserve">Email: i.wayan.nurjaya@ipb.ac.id | Phone: +62 811 110 2525</w:t>
+        <w:t xml:space="preserve">Contact available upon request</w:t>
+      </w:r>
+    </w:p>
+    <w:p>
+      <w:pPr>
+        <w:spacing w:after="20" w:before="60"/>
+      </w:pPr>
+      <w:r>
+        <w:rPr>
+          <w:rFonts w:ascii="Arial" w:cs="Arial" w:eastAsia="Arial" w:hAnsi="Arial"/>
+          <w:b/>
+          <w:bCs/>
+          <w:color w:val="0F3A5D"/>
+          <w:sz w:val="20"/>
+          <w:szCs w:val="20"/>
+        </w:rPr>
+        <w:t xml:space="preserve">Prof. Henry M. Manik, S.Pi., M.T., Ph.D.</w:t>
+      </w:r>
+      <w:r>
+        <w:rPr>
+          <w:rFonts w:ascii="Arial" w:cs="Arial" w:eastAsia="Arial" w:hAnsi="Arial"/>
+          <w:color w:val="1E293B"/>
+          <w:sz w:val="19"/>
+          <w:szCs w:val="19"/>
+        </w:rPr>
+        <w:t xml:space="preserve"> - Professor of Ocean Acoustics and Instrumentation, Department of Marine Science and Technology, IPB University</w:t>
+      </w:r>
+    </w:p>
+    <w:p>
+      <w:pPr>
+        <w:spacing w:after="80" w:before="0"/>
+      </w:pPr>
+      <w:r>
+        <w:rPr>
+          <w:rFonts w:ascii="Arial" w:cs="Arial" w:eastAsia="Arial" w:hAnsi="Arial"/>
+          <w:color w:val="64748B"/>
+          <w:sz w:val="18"/>
+          <w:szCs w:val="18"/>
+        </w:rPr>
+        <w:t xml:space="preserve">Contact available upon request</w:t>
       </w:r>
     </w:p>
     <w:sectPr>

</xml_diff>

<commit_message>
feat: add Dr. Windi Al Zahra and Dias Natasasmita to professional references and update referee affiliations
</commit_message>
<xml_diff>
--- a/I Gede Mahendra Wijaya_Master CV.docx
+++ b/I Gede Mahendra Wijaya_Master CV.docx
@@ -7865,7 +7865,7 @@
           <w:sz w:val="19"/>
           <w:szCs w:val="19"/>
         </w:rPr>
-        <w:t xml:space="preserve"> - Director of Marine Unit Service, Hatfield Consultant</w:t>
+        <w:t xml:space="preserve"> - Director of Marine Unit Service, Hatfield Group</w:t>
       </w:r>
     </w:p>
     <w:p>
@@ -7904,7 +7904,7 @@
           <w:sz w:val="19"/>
           <w:szCs w:val="19"/>
         </w:rPr>
-        <w:t xml:space="preserve"> - Head of Department of Marine Science and Technology, IPB University</w:t>
+        <w:t xml:space="preserve"> - Head of Department of Marine Science and Technology, Bogor Agricultural University (IPB University)</w:t>
       </w:r>
     </w:p>
     <w:p>
@@ -7944,6 +7944,84 @@
           <w:szCs w:val="19"/>
         </w:rPr>
         <w:t xml:space="preserve"> - Professor of Ocean Acoustics and Instrumentation, Department of Marine Science and Technology, IPB University</w:t>
+      </w:r>
+    </w:p>
+    <w:p>
+      <w:pPr>
+        <w:spacing w:after="80" w:before="0"/>
+      </w:pPr>
+      <w:r>
+        <w:rPr>
+          <w:rFonts w:ascii="Arial" w:cs="Arial" w:eastAsia="Arial" w:hAnsi="Arial"/>
+          <w:color w:val="64748B"/>
+          <w:sz w:val="18"/>
+          <w:szCs w:val="18"/>
+        </w:rPr>
+        <w:t xml:space="preserve">Contact available upon request</w:t>
+      </w:r>
+    </w:p>
+    <w:p>
+      <w:pPr>
+        <w:spacing w:after="20" w:before="60"/>
+      </w:pPr>
+      <w:r>
+        <w:rPr>
+          <w:rFonts w:ascii="Arial" w:cs="Arial" w:eastAsia="Arial" w:hAnsi="Arial"/>
+          <w:b/>
+          <w:bCs/>
+          <w:color w:val="0F3A5D"/>
+          <w:sz w:val="20"/>
+          <w:szCs w:val="20"/>
+        </w:rPr>
+        <w:t xml:space="preserve">Dr. Windi Al Zahra</w:t>
+      </w:r>
+      <w:r>
+        <w:rPr>
+          <w:rFonts w:ascii="Arial" w:cs="Arial" w:eastAsia="Arial" w:hAnsi="Arial"/>
+          <w:color w:val="1E293B"/>
+          <w:sz w:val="19"/>
+          <w:szCs w:val="19"/>
+        </w:rPr>
+        <w:t xml:space="preserve"> - Senior Researcher / Climate &amp; Environmental Specialist, Centre for Climate Risk and Opportunity Management (CCROM SEAP), IPB University</w:t>
+      </w:r>
+    </w:p>
+    <w:p>
+      <w:pPr>
+        <w:spacing w:after="80" w:before="0"/>
+      </w:pPr>
+      <w:r>
+        <w:rPr>
+          <w:rFonts w:ascii="Arial" w:cs="Arial" w:eastAsia="Arial" w:hAnsi="Arial"/>
+          <w:color w:val="64748B"/>
+          <w:sz w:val="18"/>
+          <w:szCs w:val="18"/>
+        </w:rPr>
+        <w:t xml:space="preserve">Contact available upon request</w:t>
+      </w:r>
+    </w:p>
+    <w:p>
+      <w:pPr>
+        <w:spacing w:after="20" w:before="60"/>
+      </w:pPr>
+      <w:r>
+        <w:rPr>
+          <w:rFonts w:ascii="Arial" w:cs="Arial" w:eastAsia="Arial" w:hAnsi="Arial"/>
+          <w:b/>
+          <w:bCs/>
+          <w:color w:val="0F3A5D"/>
+          <w:sz w:val="20"/>
+          <w:szCs w:val="20"/>
+        </w:rPr>
+        <w:t xml:space="preserve">Dias Natasasmita</w:t>
+      </w:r>
+      <w:r>
+        <w:rPr>
+          <w:rFonts w:ascii="Arial" w:cs="Arial" w:eastAsia="Arial" w:hAnsi="Arial"/>
+          <w:color w:val="1E293B"/>
+          <w:sz w:val="19"/>
+          <w:szCs w:val="19"/>
+        </w:rPr>
+        <w:t xml:space="preserve"> - Marine Specialist, World Bank Group</w:t>
       </w:r>
     </w:p>
     <w:p>

</xml_diff>

<commit_message>
Pembaruan otomatis CV dari Word & Sertifikat pada 20/10/2026 11:23:22,05
</commit_message>
<xml_diff>
--- a/I Gede Mahendra Wijaya_Master CV.docx
+++ b/I Gede Mahendra Wijaya_Master CV.docx
@@ -94,7 +94,7 @@
           <w:sz w:val="20"/>
           <w:szCs w:val="20"/>
         </w:rPr>
-        <w:t xml:space="preserve">Marine environmental specialist with over 13 years of experience delivering high-level technical leadership across marine-based sectors, forest concessions, and industrial waste decarbonization. Formally trained in marine science and acoustics (IPB University), with expertise spanning coastal and ocean governance, sustainable fisheries, forest concession licensing (PBPH), and carbon mitigation across AFOLU (&gt;200,000 ha peatland/wetland concessions in Papua) and Waste sectors (Palm Oil Mill Effluent / POME methane capture &amp; biogas-to-energy). Proven track record with major international institutions (World Bank, ADB, FAO, UNDP, TNC) and national innovation award recognition (BIC). Highly skilled in carbon accounting (Indonesian National Carbon Units &amp; Registry [SRUK / SRN], VCM, Paris Agreement Article 6), MRV, environmental safeguards (ESIA/AMDAL), and multi-stakeholder engagement.</w:t>
+        <w:t xml:space="preserve">Marine environmental specialist with over 13 years of experience delivering high-level technical leadership across marine-based sectors, forest concessions, and industrial waste decarbonization. Formally trained in marine science and acoustics (IPB University), with expertise spanning coastal and ocean governance, sustainable fisheries, forest concession area, and carbon mitigation across AFOLU (&gt;200,000 ha peatland/wetland concessions in Papua) and Waste sectors (Palm Oil Mill Effluent / POME methane capture &amp; biogas-to-energy). Proven track record with major international institutions (World Bank, ADB, FAO, UNDP, TNC) and national innovation award recognition (BIC). Highly skilled in carbon accounting (carbon unit registry system of Indonesia, VCM, Paris Agreement Article 6), MRV, environmental safeguards (ESIA/AMDAL), and multi-stakeholder engagement.</w:t>
       </w:r>
     </w:p>
     <w:p>
@@ -164,7 +164,7 @@
           <w:sz w:val="20"/>
           <w:szCs w:val="20"/>
         </w:rPr>
-        <w:t xml:space="preserve">31 </w:t>
+        <w:t xml:space="preserve">29 </w:t>
       </w:r>
       <w:r>
         <w:rPr>
@@ -582,7 +582,7 @@
           <w:sz w:val="19"/>
           <w:szCs w:val="19"/>
         </w:rPr>
-        <w:t xml:space="preserve">Providing strategic and technical leadership for end-to-end carbon mitigation projects across market-based carbon mechanisms, spanning both Voluntary Carbon Markets (VCM) and Compliance Markets (Indonesian National Carbon Units &amp; Registry [SRUK / SRN], IDXCarbon, and international compliance). Directing the development, technical review, and validation of Project Design Documents (PDD) and Dokumen Rencana Aksi Mitigasi Iklim (DRAM) aligned with Core Carbon Principles (CCPs) of the Integrity Council for the Voluntary Carbon Market (ICVCM) and Paris Agreement Article 6 mechanisms (Articles 6.2 and 6.4 for ITMOs and authorized carbon crediting). Overseeing portfolio-wide carbon rating evaluations and integrity due diligence (benchmarked against BeZero, Sylvera, and Calyx Global) to guarantee robust additionality, baseline credibility, and permanence. Managing technical compliance, MRV, and greenhouse gas accounting for AFOLU (Agriculture, Forestry, and Other Land Use - REDD+, ARR, coastal blue carbon) and Waste Sectors (Palm Oil Mill Effluent / POME Methane Capture &amp; Biogas-to-Energy). Providing technical direction over &gt;200,000 hectares of peatlands and wetlands concessions in West Papua and Southwest Papua, embedding ESG frameworks, Verra VCS + CCB, Verra SD VISta (Sustainable Development Verified Impact Standard), Verra Nature Framework, ART TREES, and high-integrity nature and biodiversity credit standards.</w:t>
+        <w:t xml:space="preserve">Providing strategic and technical leadership for end-to-end carbon mitigation projects across market-based carbon mechanisms, spanning both Voluntary Carbon Markets (VCM) and Compliance Markets (carbon unit registry system of Indonesia, IDXCarbon, and international compliance). Directing the development, technical review, and validation of Project Design Documents and Climate Mitigation Action Plan Documents aligned with Core Carbon Principles (CCPs) of the Integrity Council for the Voluntary Carbon Market (ICVCM) and Paris Agreement Article 6 mechanisms (Articles 6.2 and 6.4 for ITMOs and authorized carbon crediting). Overseeing portfolio-wide carbon rating evaluations and integrity due diligence (benchmarked against BeZero, Sylvera, and Calyx Global) to guarantee robust additionality, baseline credibility, and permanence. Managing technical compliance, MRV, and greenhouse gas accounting for AFOLU (Agriculture, Forestry, and Other Land Use - REDD+, ARR, coastal blue carbon) and Waste Sectors (Palm Oil Mill Effluent / POME Methane Capture &amp; Biogas-to-Energy). Providing technical direction over &gt;200,000 hectares of peatlands and wetlands concessions in West Papua and Southwest Papua, embedding ESG frameworks, Verra VCS + CCB, Verra SD VISta (Sustainable Development Verified Impact Standard), Verra Nature Framework, ART TREES, and high-integrity nature and biodiversity credit standards.</w:t>
       </w:r>
     </w:p>
     <w:p>
@@ -598,7 +598,7 @@
           <w:sz w:val="21"/>
           <w:szCs w:val="21"/>
         </w:rPr>
-        <w:t xml:space="preserve">2. Project Manager - GHG Actions &amp; Marine Ecosystem Restoration</w:t>
+        <w:t xml:space="preserve">2. Project Manager</w:t>
       </w:r>
     </w:p>
     <w:p>
@@ -637,7 +637,7 @@
           <w:sz w:val="19"/>
           <w:szCs w:val="19"/>
         </w:rPr>
-        <w:t xml:space="preserve">Managed full project lifecycles for large-scale terrestrial, peatland, and coastal wetland ecosystem restoration concessions (&gt;200,000 ha) across West Papua and Southwest Papua. Directed multidisciplinary field teams conducting ecological baseline surveys, High Carbon Stock Approach (HCSA), High Conservation Value (HCV), and ground-based carbon stock accounting (SNI 7724). Designed and facilitated Free, Prior, and Informed Consent (FPIC) processes and inclusive benefit-sharing frameworks with indigenous customary communities (Masyarakat Hukum Adat). Led regulatory liaison and licensing with the Ministry of Environment and Forestry (MoEF / KLHK) and Ministry of Marine Affairs and Fisheries (KKP). Formulated comprehensive Environmental &amp; Social Management Plans (ESMP), ESIA / AMDAL compliance frameworks, and established rigorous Monitoring, Reporting, and Verification (MRV) systems.</w:t>
+        <w:t xml:space="preserve">Managed full project lifecycles for large-scale terrestrial, peatland, and coastal wetland ecosystem restoration concessions (&gt;200,000 ha) across West Papua and Southwest Papua. Directed multidisciplinary field teams conducting ecological baseline surveys, High Carbon Stock Approach (HCSA), High Conservation Value (HCV), and ground-based carbon stock accounting (SNI 7724). Designed and facilitated Free, Prior, and Informed Consent (FPIC) processes and inclusive benefit-sharing frameworks with local customary communities. Led regulatory liaison and licensing with the Ministry of Environment and Forestry (MoEF / KLHK) and Ministry of Marine Affairs and Fisheries (KKP). Formulated comprehensive Environmental &amp; Social Management Plans (ESMP), environmental and social compliance, and established rigorous Monitoring, Reporting, and Verification (MRV) systems.</w:t>
       </w:r>
     </w:p>
     <w:p>
@@ -692,7 +692,7 @@
           <w:sz w:val="19"/>
           <w:szCs w:val="19"/>
         </w:rPr>
-        <w:t xml:space="preserve">Co-led the strategic, operational, and financial management of the Marine and Coastal Development Business Unit, overseeing a multi-million-dollar portfolio of environmental consulting projects for international financial institutions (World Bank, ADB, AFD, UNDP, FAO) and private sector clients. Directed annual business planning, revenue forecasting, project budgeting, and commercial proposal development. Provided executive briefings and milestone reporting to the Board of Directors. Supervised and mentored senior and junior technical staff across marine ecology, fisheries governance, and environmental safeguards. Enforced corporate compliance with ISO 9001 (Quality Management), ISO 14001 (Environmental Management), and ISO 45001 (Occupational Health &amp; Safety) standards across all project operations.</w:t>
+        <w:t xml:space="preserve">Co-led the strategic, operational, and financial management of the Marine and Coastal Development Business Unit, overseeing multiple environmental consulting projects for international financial institutions (World Bank, ADB, AFD, UNDP, FAO) and private sector clients. Directed annual business planning, revenue forecasting, project budgeting, and commercial proposal development. Provided executive briefings and milestone reporting to the Board of Directors. Supervised and mentored senior and junior technical staff across marine ecology, fisheries governance, and environmental safeguards. Enforced corporate compliance with ISO 9001 (Quality Management), ISO 14001 (Environmental Management), and ISO 45001 (Occupational Health &amp; Safety) standards across all project operations.</w:t>
       </w:r>
     </w:p>
     <w:p>
@@ -857,7 +857,7 @@
           <w:sz w:val="19"/>
           <w:szCs w:val="19"/>
         </w:rPr>
-        <w:t xml:space="preserve">Led health, safety, and environmental (HSE) protocols and JNCC-compliant marine mammal observation (MMO) and passive acoustic monitoring (PAM) during 2D and Transition Zone (TZ) marine seismic surveys for KrisEnergy (Udan Emas) BV in Arguni Bay, West Papua. Enforced pre-shooting acoustic visual scans, exclusion zone protocols, and soft-start ramp-up procedures to safeguard cetaceans, dugongs, and coastal fish stocks. Conducted socio-fisheries impact assessments, underwater acoustic propagation analyses, and community consultation with indigenous artisanal fishers.</w:t>
+        <w:t xml:space="preserve">Led health, safety, and environmental (HSE) protocols and JNCC-compliant marine mammal observation (MMO) with dedicated visual observation during 2D and Transition Zone (TZ) marine seismic surveys for KrisEnergy (Udan Emas) BV in Arguni Bay, West Papua. Enforced pre-shooting visual scans, exclusion zone protocols, and soft-start ramp-up procedures to safeguard cetaceans, dugongs, and coastal fish stocks. Conducted socio-fisheries impact assessments, underwater acoustic propagation analyses, and community consultation with indigenous artisanal fishers.</w:t>
       </w:r>
     </w:p>
     <w:p>
@@ -931,7 +931,7 @@
           <w:sz w:val="24"/>
           <w:szCs w:val="24"/>
         </w:rPr>
-        <w:t xml:space="preserve">KEY PROJECT EXPERIENCES (TOTAL: 31 PROJECTS)</w:t>
+        <w:t xml:space="preserve">KEY PROJECT EXPERIENCES (TOTAL: 29 PROJECTS)</w:t>
       </w:r>
     </w:p>
     <w:p>
@@ -1028,7 +1028,7 @@
           <w:sz w:val="19"/>
           <w:szCs w:val="19"/>
         </w:rPr>
-        <w:t xml:space="preserve">Conducted comprehensive pre-socialization assessments, institutional mapping, and multi-tier stakeholder analysis across district and provincial levels in Southwest Papua. Designed the initial stakeholder engagement strategy and Free, Prior, and Informed Consent (FPIC) framework required for PBPH (Perizinan Berusaha Pemanfaatan Hutan) ecosystem restoration and carbon project licensing, ensuring full alignment with local customary land rights (Masyarakat Hukum Adat).</w:t>
+        <w:t xml:space="preserve">Conducted comprehensive pre-socialization assessments, institutional mapping, and multi-tier stakeholder analysis across district and provincial levels in Southwest Papua. Designed the initial stakeholder engagement strategy and Free, Prior, and Informed Consent (FPIC) framework required for forest concession ecosystem restoration and carbon project licensing, ensuring full alignment with local customary land rights.</w:t>
       </w:r>
     </w:p>
     <w:p>
@@ -1125,7 +1125,7 @@
           <w:sz w:val="19"/>
           <w:szCs w:val="19"/>
         </w:rPr>
-        <w:t xml:space="preserve">Delivered a high-level feasibility study and carbon scoping assessment across &gt;200,000 hectares of wetland and peatland forest concessions in Southwest Papua and West Papua Provinces. Synthesized remote sensing GIS analysis, forest carbon stock estimates, baseline deforestation drivers, regulatory compliance pathways (Indonesian National Carbon Units &amp; Registry [SRUK / SRN], Verra VCS + CCB, SD VISta, and Nature Framework), and socio-economic risk evaluations to establish project viability for carbon credit generation and biodiversity conservation.</w:t>
+        <w:t xml:space="preserve">Delivered a high-level feasibility study and carbon scoping assessment across &gt;200,000 hectares of wetland and peatland forest concessions in Southwest Papua and West Papua Provinces. Synthesized remote sensing GIS analysis, forest carbon stock estimates, baseline deforestation drivers, regulatory compliance pathways (carbon unit registry system of Indonesia, Verra VCS + CCB, SD VISta, and Nature Framework), and socio-economic risk evaluations to establish project viability for carbon credit generation and biodiversity conservation.</w:t>
       </w:r>
     </w:p>
     <w:p>
@@ -1901,7 +1901,7 @@
           <w:sz w:val="19"/>
           <w:szCs w:val="19"/>
         </w:rPr>
-        <w:t xml:space="preserve">Led environmental, social, climate resilience, and gender safeguard preparation studies for the USD 111M AFD-funded Eco-Fishing Ports Modernization Project across four strategic national fishing ports (PPS Kendari, PPS Cilacap, PPN Belawan, and PPN Sibolga). Formulated ESIA terms of reference, climate vulnerability profiles, and port decarbonization action plans.</w:t>
+        <w:t xml:space="preserve">Served as National Focal Point, led environmental, social, climate resilience, and gender safeguard preparation studies for the USD 111M AFD-funded Eco-Fishing Ports Modernization Project across four strategic national fishing ports (PPS Kendari, PPS Cilacap, PPN Belawan, and PPN Sibolga). Formulated ESIA terms of reference, climate vulnerability profiles, and port decarbonization action plans.</w:t>
       </w:r>
     </w:p>
     <w:p>
@@ -2790,7 +2790,7 @@
           <w:sz w:val="20"/>
           <w:szCs w:val="20"/>
         </w:rPr>
-        <w:t xml:space="preserve">20. Valuation of Pelagic Ecosystem Services and Marine Natural Capital</w:t>
+        <w:t xml:space="preserve">20. Tongkol (Eastern Little Tuna) Supply Chain, Market Dynamics &amp; Post-Harvest Losses</w:t>
       </w:r>
     </w:p>
     <w:p>
@@ -2815,7 +2815,7 @@
           <w:sz w:val="18"/>
           <w:szCs w:val="18"/>
         </w:rPr>
-        <w:t xml:space="preserve">PT Hatfield Indonesia / Marine Partners  |  </w:t>
+        <w:t xml:space="preserve">PT Hatfield Indonesia / Marine &amp; Fisheries Partners  |  </w:t>
       </w:r>
       <w:r>
         <w:rPr>
@@ -2835,7 +2835,7 @@
           <w:sz w:val="18"/>
           <w:szCs w:val="18"/>
         </w:rPr>
-        <w:t xml:space="preserve">2021 - 2022  |  </w:t>
+        <w:t xml:space="preserve">2020 - 2022  |  </w:t>
       </w:r>
       <w:r>
         <w:rPr>
@@ -2871,7 +2871,7 @@
           <w:sz w:val="19"/>
           <w:szCs w:val="19"/>
         </w:rPr>
-        <w:t xml:space="preserve">Executed a comprehensive economic and ecological valuation of pelagic marine ecosystem services in Indonesian waters, quantifying carbon sequestration, primary productivity, commercial fisheries yields, and biodiversity resilience to inform national ocean accounting frameworks.</w:t>
+        <w:t xml:space="preserve">Conducted field supply chain mapping and market flow analysis for Eastern Little Tuna (Euthynnus affinis) across major landing sites in Indonesia. Evaluated cold chain bottlenecks, post-harvest quality degradation, pricing asymmetries, and socio-economic welfare of coastal smallholder fishing households.</w:t>
       </w:r>
     </w:p>
     <w:p>
@@ -2887,7 +2887,7 @@
           <w:sz w:val="20"/>
           <w:szCs w:val="20"/>
         </w:rPr>
-        <w:t xml:space="preserve">21. Tongkol (Eastern Little Tuna) Supply Chain, Market Dynamics &amp; Post-Harvest Losses</w:t>
+        <w:t xml:space="preserve">21. Scientific Assessment of Marine Mammal Interactions with Commercial Fisheries</w:t>
       </w:r>
     </w:p>
     <w:p>
@@ -2912,7 +2912,7 @@
           <w:sz w:val="18"/>
           <w:szCs w:val="18"/>
         </w:rPr>
-        <w:t xml:space="preserve">PT Hatfield Indonesia / Marine &amp; Fisheries Partners  |  </w:t>
+        <w:t xml:space="preserve">PT Hatfield Indonesia / Conservation Partners  |  </w:t>
       </w:r>
       <w:r>
         <w:rPr>
@@ -2932,7 +2932,7 @@
           <w:sz w:val="18"/>
           <w:szCs w:val="18"/>
         </w:rPr>
-        <w:t xml:space="preserve">2020 - 2022  |  </w:t>
+        <w:t xml:space="preserve">2019 - 2021  |  </w:t>
       </w:r>
       <w:r>
         <w:rPr>
@@ -2968,7 +2968,7 @@
           <w:sz w:val="19"/>
           <w:szCs w:val="19"/>
         </w:rPr>
-        <w:t xml:space="preserve">Conducted field supply chain mapping and market flow analysis for Eastern Little Tuna (Euthynnus affinis) across major landing sites in Indonesia. Evaluated cold chain bottlenecks, post-harvest quality degradation, pricing asymmetries, and socio-economic welfare of coastal smallholder fishing households.</w:t>
+        <w:t xml:space="preserve">Conducted scientific risk modeling and field investigations on acoustic disturbance, vessel strike vulnerability, and bycatch entanglement risks for cetaceans and dugongs interacting with commercial purse seine, longline, and artisanal fisheries in Indonesian seas, developing practical mitigation strategies to minimize fishery-mammal interactions.</w:t>
       </w:r>
     </w:p>
     <w:p>
@@ -2984,7 +2984,7 @@
           <w:sz w:val="20"/>
           <w:szCs w:val="20"/>
         </w:rPr>
-        <w:t xml:space="preserve">22. Scientific Assessment of Marine Mammal Interactions with Commercial Fisheries</w:t>
+        <w:t xml:space="preserve">22. Strategic Tuna Fisheries Investment Roadmap for Walton Family Foundation (WFF)</w:t>
       </w:r>
     </w:p>
     <w:p>
@@ -3009,7 +3009,7 @@
           <w:sz w:val="18"/>
           <w:szCs w:val="18"/>
         </w:rPr>
-        <w:t xml:space="preserve">PT Hatfield Indonesia / Conservation Partners  |  </w:t>
+        <w:t xml:space="preserve">Walton Family Foundation / PT Hatfield Indonesia  |  </w:t>
       </w:r>
       <w:r>
         <w:rPr>
@@ -3029,7 +3029,7 @@
           <w:sz w:val="18"/>
           <w:szCs w:val="18"/>
         </w:rPr>
-        <w:t xml:space="preserve">2019 - 2021  |  </w:t>
+        <w:t xml:space="preserve">2020 - 2022  |  </w:t>
       </w:r>
       <w:r>
         <w:rPr>
@@ -3065,7 +3065,7 @@
           <w:sz w:val="19"/>
           <w:szCs w:val="19"/>
         </w:rPr>
-        <w:t xml:space="preserve">Conducted scientific risk modeling and field investigations on acoustic disturbance, vessel strike vulnerability, and bycatch entanglement risks for cetaceans and dugongs interacting with commercial purse seine, longline, and artisanal fisheries in Indonesian seas, developing practical mitigation strategies to minimize fishery-mammal interactions.</w:t>
+        <w:t xml:space="preserve">Formulated a multi-year philanthropic investment strategy and intervention roadmap for WFF's marine portfolio, targeting rights-based fisheries management, harvest control rules, digital traceability, and coastal community empowerment in Indonesian tuna fisheries.</w:t>
       </w:r>
     </w:p>
     <w:p>
@@ -3081,7 +3081,7 @@
           <w:sz w:val="20"/>
           <w:szCs w:val="20"/>
         </w:rPr>
-        <w:t xml:space="preserve">23. Strategic Tuna Fisheries Investment Roadmap for Walton Family Foundation (WFF)</w:t>
+        <w:t xml:space="preserve">23. Rapid Scoping Study on High-Growth Investment Opportunities in Indonesian Aquaculture</w:t>
       </w:r>
     </w:p>
     <w:p>
@@ -3106,7 +3106,7 @@
           <w:sz w:val="18"/>
           <w:szCs w:val="18"/>
         </w:rPr>
-        <w:t xml:space="preserve">Walton Family Foundation / PT Hatfield Indonesia  |  </w:t>
+        <w:t xml:space="preserve">PT Hatfield Indonesia / Aquaculture Development Partners  |  </w:t>
       </w:r>
       <w:r>
         <w:rPr>
@@ -3126,7 +3126,7 @@
           <w:sz w:val="18"/>
           <w:szCs w:val="18"/>
         </w:rPr>
-        <w:t xml:space="preserve">2020 - 2022  |  </w:t>
+        <w:t xml:space="preserve">2020 - 2021  |  </w:t>
       </w:r>
       <w:r>
         <w:rPr>
@@ -3148,7 +3148,7 @@
           <w:sz w:val="18"/>
           <w:szCs w:val="18"/>
         </w:rPr>
-        <w:t xml:space="preserve">MARINE</w:t>
+        <w:t xml:space="preserve">AQUACULTURE</w:t>
       </w:r>
     </w:p>
     <w:p>
@@ -3162,7 +3162,7 @@
           <w:sz w:val="19"/>
           <w:szCs w:val="19"/>
         </w:rPr>
-        <w:t xml:space="preserve">Formulated a multi-year philanthropic investment strategy and intervention roadmap for WFF's marine portfolio, targeting rights-based fisheries management, harvest control rules, digital traceability, and coastal community empowerment in Indonesian tuna fisheries.</w:t>
+        <w:t xml:space="preserve">Delivered a strategic scoping assessment analyzing bankable investment opportunities, technological scalability, biosecurity risks, and environmental sustainability in Indonesia's brackish water shrimp, marine finfish, and seaweed aquaculture sectors.</w:t>
       </w:r>
     </w:p>
     <w:p>
@@ -3178,7 +3178,7 @@
           <w:sz w:val="20"/>
           <w:szCs w:val="20"/>
         </w:rPr>
-        <w:t xml:space="preserve">24. Rapid Scoping Study on High-Growth Investment Opportunities in Indonesian Aquaculture</w:t>
+        <w:t xml:space="preserve">24. Sectoral Review of Indonesian Tuna Purse Seine Fisheries for FIP &amp; MSC Readiness</w:t>
       </w:r>
     </w:p>
     <w:p>
@@ -3203,7 +3203,7 @@
           <w:sz w:val="18"/>
           <w:szCs w:val="18"/>
         </w:rPr>
-        <w:t xml:space="preserve">PT Hatfield Indonesia / Aquaculture Development Partners  |  </w:t>
+        <w:t xml:space="preserve">PT Hatfield Indonesia / FIP Partners  |  </w:t>
       </w:r>
       <w:r>
         <w:rPr>
@@ -3223,7 +3223,7 @@
           <w:sz w:val="18"/>
           <w:szCs w:val="18"/>
         </w:rPr>
-        <w:t xml:space="preserve">2020 - 2021  |  </w:t>
+        <w:t xml:space="preserve">2020 - 2022  |  </w:t>
       </w:r>
       <w:r>
         <w:rPr>
@@ -3245,7 +3245,7 @@
           <w:sz w:val="18"/>
           <w:szCs w:val="18"/>
         </w:rPr>
-        <w:t xml:space="preserve">AQUACULTURE</w:t>
+        <w:t xml:space="preserve">MARINE</w:t>
       </w:r>
     </w:p>
     <w:p>
@@ -3259,7 +3259,7 @@
           <w:sz w:val="19"/>
           <w:szCs w:val="19"/>
         </w:rPr>
-        <w:t xml:space="preserve">Delivered a strategic scoping assessment analyzing bankable investment opportunities, technological scalability, biosecurity risks, and environmental sustainability in Indonesia's brackish water shrimp, marine finfish, and seaweed aquaculture sectors.</w:t>
+        <w:t xml:space="preserve">Conducted a detailed technical review and Marine Stewardship Council (MSC) pre-assessment of Indonesia's industrial and semi-industrial tuna purse seine fleet, developing time-bound Action Plans for harvest strategy compliance, FAD management, and bycatch reduction.</w:t>
       </w:r>
     </w:p>
     <w:p>
@@ -3275,7 +3275,7 @@
           <w:sz w:val="20"/>
           <w:szCs w:val="20"/>
         </w:rPr>
-        <w:t xml:space="preserve">25. Sectoral Review of Indonesian Tuna Purse Seine Fisheries for FIP &amp; MSC Readiness</w:t>
+        <w:t xml:space="preserve">25. Environmental and Social Impact Assessment (ESIA) for Kendari Eco-Fishing Port Modernization</w:t>
       </w:r>
     </w:p>
     <w:p>
@@ -3300,7 +3300,7 @@
           <w:sz w:val="18"/>
           <w:szCs w:val="18"/>
         </w:rPr>
-        <w:t xml:space="preserve">PT Hatfield Indonesia / FIP Partners  |  </w:t>
+        <w:t xml:space="preserve">Agence Française de Développement (AFD) / PT Hatfield Indonesia  |  </w:t>
       </w:r>
       <w:r>
         <w:rPr>
@@ -3320,7 +3320,7 @@
           <w:sz w:val="18"/>
           <w:szCs w:val="18"/>
         </w:rPr>
-        <w:t xml:space="preserve">2020 - 2022  |  </w:t>
+        <w:t xml:space="preserve">2021 - 2022  |  </w:t>
       </w:r>
       <w:r>
         <w:rPr>
@@ -3342,7 +3342,7 @@
           <w:sz w:val="18"/>
           <w:szCs w:val="18"/>
         </w:rPr>
-        <w:t xml:space="preserve">MARINE</w:t>
+        <w:t xml:space="preserve">ENVIRONMENT</w:t>
       </w:r>
     </w:p>
     <w:p>
@@ -3356,7 +3356,7 @@
           <w:sz w:val="19"/>
           <w:szCs w:val="19"/>
         </w:rPr>
-        <w:t xml:space="preserve">Conducted a detailed technical review and Marine Stewardship Council (MSC) pre-assessment of Indonesia's industrial and semi-industrial tuna purse seine fleet, developing time-bound Action Plans for harvest strategy compliance, FAD management, and bycatch reduction.</w:t>
+        <w:t xml:space="preserve">Authored the full Environmental and Social Impact Assessment (ESIA), Environmental and Social Management Plan (ESMP), and Stakeholder Engagement Plan (SEP) for the major modernization and infrastructure expansion of PPS Kendari funded by AFD.</w:t>
       </w:r>
     </w:p>
     <w:p>
@@ -3372,7 +3372,7 @@
           <w:sz w:val="20"/>
           <w:szCs w:val="20"/>
         </w:rPr>
-        <w:t xml:space="preserve">26. Environmental and Social Impact Assessment (ESIA) for Kendari Eco-Fishing Port Modernization</w:t>
+        <w:t xml:space="preserve">26. Socio-Economic Baseline, Gender Action Plan &amp; Stakeholder Impact Analysis for PPS Cilacap</w:t>
       </w:r>
     </w:p>
     <w:p>
@@ -3397,7 +3397,7 @@
           <w:sz w:val="18"/>
           <w:szCs w:val="18"/>
         </w:rPr>
-        <w:t xml:space="preserve">Agence Française de Développement (AFD) / PT Hatfield Indonesia  |  </w:t>
+        <w:t xml:space="preserve">AFD / PT Hatfield Indonesia  |  </w:t>
       </w:r>
       <w:r>
         <w:rPr>
@@ -3453,7 +3453,7 @@
           <w:sz w:val="19"/>
           <w:szCs w:val="19"/>
         </w:rPr>
-        <w:t xml:space="preserve">Authored the full Environmental and Social Impact Assessment (ESIA), Environmental and Social Management Plan (ESMP), and Stakeholder Engagement Plan (SEP) for the major modernization and infrastructure expansion of PPS Kendari funded by AFD.</w:t>
+        <w:t xml:space="preserve">Executed extensive socio-economic field surveys, gender vulnerability analyses, and stakeholder consultation matrices for the modernization of Cilacap Oceanic Fishing Port (PPS Cilacap), formulating inclusive resettlement frameworks and women-empowerment livelihood strategies.</w:t>
       </w:r>
     </w:p>
     <w:p>
@@ -3469,7 +3469,7 @@
           <w:sz w:val="20"/>
           <w:szCs w:val="20"/>
         </w:rPr>
-        <w:t xml:space="preserve">27. World Bank Coral Bond IPF: Marine Law Enforcement &amp; Surveillance Capacity Assessment</w:t>
+        <w:t xml:space="preserve">27. Zoning Document and Spatial Management Plan for Kolepom Island Marine Protected Area</w:t>
       </w:r>
     </w:p>
     <w:p>
@@ -3494,7 +3494,7 @@
           <w:sz w:val="18"/>
           <w:szCs w:val="18"/>
         </w:rPr>
-        <w:t xml:space="preserve">World Bank Group / PT Hatfield Indonesia  |  </w:t>
+        <w:t xml:space="preserve">UNDP / PT Hatfield Indonesia  |  </w:t>
       </w:r>
       <w:r>
         <w:rPr>
@@ -3550,7 +3550,7 @@
           <w:sz w:val="19"/>
           <w:szCs w:val="19"/>
         </w:rPr>
-        <w:t xml:space="preserve">Conducted a national institutional capacity assessment on maritime surveillance, monitoring, control, and surveillance (MCS) infrastructure, and judicial enforcement across priority Marine Protected Areas supporting the design of the World Bank Coral Bond Investment Project Financing (IPF).</w:t>
+        <w:t xml:space="preserve">Formulated the comprehensive technical zoning document and 20-year spatial management plan for the 356,000-hectare Kolepom Island MPA in South Papua, integrating core conservation zones, limited utilization zones for indigenous artisanal fisheries, and other sustainable use sub-zones.</w:t>
       </w:r>
     </w:p>
     <w:p>
@@ -3566,7 +3566,7 @@
           <w:sz w:val="20"/>
           <w:szCs w:val="20"/>
         </w:rPr>
-        <w:t xml:space="preserve">28. Socio-Economic Baseline, Gender Action Plan &amp; Stakeholder Impact Analysis for PPS Cilacap</w:t>
+        <w:t xml:space="preserve">28. Sustainable Tuna Fisheries Management Based on Acoustic Measurement, Length-Based Assessment, and FAD Management</w:t>
       </w:r>
     </w:p>
     <w:p>
@@ -3591,7 +3591,7 @@
           <w:sz w:val="18"/>
           <w:szCs w:val="18"/>
         </w:rPr>
-        <w:t xml:space="preserve">AFD / PT Hatfield Indonesia  |  </w:t>
+        <w:t xml:space="preserve">The Nature Conservancy (TNC)  |  </w:t>
       </w:r>
       <w:r>
         <w:rPr>
@@ -3611,7 +3611,7 @@
           <w:sz w:val="18"/>
           <w:szCs w:val="18"/>
         </w:rPr>
-        <w:t xml:space="preserve">2021 - 2022  |  </w:t>
+        <w:t xml:space="preserve">January - December 2017  |  </w:t>
       </w:r>
       <w:r>
         <w:rPr>
@@ -3633,7 +3633,7 @@
           <w:sz w:val="18"/>
           <w:szCs w:val="18"/>
         </w:rPr>
-        <w:t xml:space="preserve">ENVIRONMENT</w:t>
+        <w:t xml:space="preserve">MARINE &amp; FISHERIES GOVERNANCE</w:t>
       </w:r>
     </w:p>
     <w:p>
@@ -3647,7 +3647,7 @@
           <w:sz w:val="19"/>
           <w:szCs w:val="19"/>
         </w:rPr>
-        <w:t xml:space="preserve">Executed extensive socio-economic field surveys, gender vulnerability analyses, and stakeholder consultation matrices for the modernization of Cilacap Oceanic Fishing Port (PPS Cilacap), formulating inclusive resettlement frameworks and women-empowerment livelihood strategies.</w:t>
+        <w:t xml:space="preserve">Led the technical implementation of low-cost marine bioacoustic surveys and hydroacoustic telemetry beneath Fish Aggregating Devices (FADs / Rumpon) to quantify juvenile tuna biomass and deep-water pelagic schooling behavior. Integrated hydroacoustic data with on-board Captain-Operated Data Recording Systems (CODRS) and length-based spawning potential ratio (SPR) assessments to formulate policy briefs on voluntary FAD management guidelines and harvest strategy compliance in Indonesian tuna fisheries.</w:t>
       </w:r>
     </w:p>
     <w:p>
@@ -3663,7 +3663,7 @@
           <w:sz w:val="20"/>
           <w:szCs w:val="20"/>
         </w:rPr>
-        <w:t xml:space="preserve">29. Zoning Document and Spatial Management Plan for Kolepom Island Marine Protected Area</w:t>
+        <w:t xml:space="preserve">29. Marine Mammal Monitoring and Mitigation Plan for 3D Marine Seismic Acquisition in Mentawai Block</w:t>
       </w:r>
     </w:p>
     <w:p>
@@ -3688,7 +3688,7 @@
           <w:sz w:val="18"/>
           <w:szCs w:val="18"/>
         </w:rPr>
-        <w:t xml:space="preserve">UNDP / PT Hatfield Indonesia  |  </w:t>
+        <w:t xml:space="preserve">Total E&amp;P Indonesie Mentawai B.V. / PPLH IPB  |  </w:t>
       </w:r>
       <w:r>
         <w:rPr>
@@ -3708,7 +3708,7 @@
           <w:sz w:val="18"/>
           <w:szCs w:val="18"/>
         </w:rPr>
-        <w:t xml:space="preserve">2021 - 2022  |  </w:t>
+        <w:t xml:space="preserve">December 2015 - January 2016  |  </w:t>
       </w:r>
       <w:r>
         <w:rPr>
@@ -3730,7 +3730,7 @@
           <w:sz w:val="18"/>
           <w:szCs w:val="18"/>
         </w:rPr>
-        <w:t xml:space="preserve">MARINE</w:t>
+        <w:t xml:space="preserve">MARINE ENVIRONMENTAL ASSESSMENT &amp; SAFEGUARDS</w:t>
       </w:r>
     </w:p>
     <w:p>
@@ -3744,201 +3744,7 @@
           <w:sz w:val="19"/>
           <w:szCs w:val="19"/>
         </w:rPr>
-        <w:t xml:space="preserve">Formulated the comprehensive technical zoning document and 20-year spatial management plan for the 356,000-hectare Kolepom Island MPA in South Papua, integrating core conservation zones, limited utilization zones for indigenous artisanal fisheries, and other sustainable use sub-zones.</w:t>
-      </w:r>
-    </w:p>
-    <w:p>
-      <w:pPr>
-        <w:spacing w:after="20" w:before="100"/>
-      </w:pPr>
-      <w:r>
-        <w:rPr>
-          <w:rFonts w:ascii="Arial" w:cs="Arial" w:eastAsia="Arial" w:hAnsi="Arial"/>
-          <w:b/>
-          <w:bCs/>
-          <w:color w:val="0F3A5D"/>
-          <w:sz w:val="20"/>
-          <w:szCs w:val="20"/>
-        </w:rPr>
-        <w:t xml:space="preserve">30. Sustainable Tuna Fisheries Management Based on Acoustic Measurement, Length-Based Assessment, and FAD Management</w:t>
-      </w:r>
-    </w:p>
-    <w:p>
-      <w:pPr>
-        <w:spacing w:after="30" w:before="0"/>
-      </w:pPr>
-      <w:r>
-        <w:rPr>
-          <w:rFonts w:ascii="Arial" w:cs="Arial" w:eastAsia="Arial" w:hAnsi="Arial"/>
-          <w:b/>
-          <w:bCs/>
-          <w:color w:val="1E293B"/>
-          <w:sz w:val="18"/>
-          <w:szCs w:val="18"/>
-        </w:rPr>
-        <w:t xml:space="preserve">Client/Partner: </w:t>
-      </w:r>
-      <w:r>
-        <w:rPr>
-          <w:rFonts w:ascii="Arial" w:cs="Arial" w:eastAsia="Arial" w:hAnsi="Arial"/>
-          <w:color w:val="0D9488"/>
-          <w:sz w:val="18"/>
-          <w:szCs w:val="18"/>
-        </w:rPr>
-        <w:t xml:space="preserve">The Nature Conservancy (TNC)  |  </w:t>
-      </w:r>
-      <w:r>
-        <w:rPr>
-          <w:rFonts w:ascii="Arial" w:cs="Arial" w:eastAsia="Arial" w:hAnsi="Arial"/>
-          <w:b/>
-          <w:bCs/>
-          <w:color w:val="1E293B"/>
-          <w:sz w:val="18"/>
-          <w:szCs w:val="18"/>
-        </w:rPr>
-        <w:t xml:space="preserve">Period: </w:t>
-      </w:r>
-      <w:r>
-        <w:rPr>
-          <w:rFonts w:ascii="Arial" w:cs="Arial" w:eastAsia="Arial" w:hAnsi="Arial"/>
-          <w:color w:val="64748B"/>
-          <w:sz w:val="18"/>
-          <w:szCs w:val="18"/>
-        </w:rPr>
-        <w:t xml:space="preserve">January - December 2017  |  </w:t>
-      </w:r>
-      <w:r>
-        <w:rPr>
-          <w:rFonts w:ascii="Arial" w:cs="Arial" w:eastAsia="Arial" w:hAnsi="Arial"/>
-          <w:b/>
-          <w:bCs/>
-          <w:color w:val="1E293B"/>
-          <w:sz w:val="18"/>
-          <w:szCs w:val="18"/>
-        </w:rPr>
-        <w:t xml:space="preserve">Category: </w:t>
-      </w:r>
-      <w:r>
-        <w:rPr>
-          <w:rFonts w:ascii="Arial" w:cs="Arial" w:eastAsia="Arial" w:hAnsi="Arial"/>
-          <w:b/>
-          <w:bCs/>
-          <w:color w:val="0F3A5D"/>
-          <w:sz w:val="18"/>
-          <w:szCs w:val="18"/>
-        </w:rPr>
-        <w:t xml:space="preserve">MARINE &amp; FISHERIES GOVERNANCE</w:t>
-      </w:r>
-    </w:p>
-    <w:p>
-      <w:pPr>
-        <w:spacing w:after="100" w:before="0"/>
-      </w:pPr>
-      <w:r>
-        <w:rPr>
-          <w:rFonts w:ascii="Arial" w:cs="Arial" w:eastAsia="Arial" w:hAnsi="Arial"/>
-          <w:color w:val="1E293B"/>
-          <w:sz w:val="19"/>
-          <w:szCs w:val="19"/>
-        </w:rPr>
-        <w:t xml:space="preserve">Led the technical implementation of low-cost marine bioacoustic surveys and hydroacoustic telemetry beneath Fish Aggregating Devices (FADs / Rumpon) to quantify juvenile tuna biomass and deep-water pelagic schooling behavior. Integrated hydroacoustic data with on-board Captain-Operated Data Recording Systems (CODRS) and length-based spawning potential ratio (SPR) assessments to formulate policy briefs on voluntary FAD management guidelines and harvest strategy compliance in Indonesian tuna fisheries.</w:t>
-      </w:r>
-    </w:p>
-    <w:p>
-      <w:pPr>
-        <w:spacing w:after="20" w:before="100"/>
-      </w:pPr>
-      <w:r>
-        <w:rPr>
-          <w:rFonts w:ascii="Arial" w:cs="Arial" w:eastAsia="Arial" w:hAnsi="Arial"/>
-          <w:b/>
-          <w:bCs/>
-          <w:color w:val="0F3A5D"/>
-          <w:sz w:val="20"/>
-          <w:szCs w:val="20"/>
-        </w:rPr>
-        <w:t xml:space="preserve">31. Marine Mammal Monitoring and Mitigation Plan for 3D Marine Seismic Acquisition in Mentawai Block</w:t>
-      </w:r>
-    </w:p>
-    <w:p>
-      <w:pPr>
-        <w:spacing w:after="30" w:before="0"/>
-      </w:pPr>
-      <w:r>
-        <w:rPr>
-          <w:rFonts w:ascii="Arial" w:cs="Arial" w:eastAsia="Arial" w:hAnsi="Arial"/>
-          <w:b/>
-          <w:bCs/>
-          <w:color w:val="1E293B"/>
-          <w:sz w:val="18"/>
-          <w:szCs w:val="18"/>
-        </w:rPr>
-        <w:t xml:space="preserve">Client/Partner: </w:t>
-      </w:r>
-      <w:r>
-        <w:rPr>
-          <w:rFonts w:ascii="Arial" w:cs="Arial" w:eastAsia="Arial" w:hAnsi="Arial"/>
-          <w:color w:val="0D9488"/>
-          <w:sz w:val="18"/>
-          <w:szCs w:val="18"/>
-        </w:rPr>
-        <w:t xml:space="preserve">Total E&amp;P Indonesie Mentawai B.V. / PPLH IPB  |  </w:t>
-      </w:r>
-      <w:r>
-        <w:rPr>
-          <w:rFonts w:ascii="Arial" w:cs="Arial" w:eastAsia="Arial" w:hAnsi="Arial"/>
-          <w:b/>
-          <w:bCs/>
-          <w:color w:val="1E293B"/>
-          <w:sz w:val="18"/>
-          <w:szCs w:val="18"/>
-        </w:rPr>
-        <w:t xml:space="preserve">Period: </w:t>
-      </w:r>
-      <w:r>
-        <w:rPr>
-          <w:rFonts w:ascii="Arial" w:cs="Arial" w:eastAsia="Arial" w:hAnsi="Arial"/>
-          <w:color w:val="64748B"/>
-          <w:sz w:val="18"/>
-          <w:szCs w:val="18"/>
-        </w:rPr>
-        <w:t xml:space="preserve">December 2015 - January 2016  |  </w:t>
-      </w:r>
-      <w:r>
-        <w:rPr>
-          <w:rFonts w:ascii="Arial" w:cs="Arial" w:eastAsia="Arial" w:hAnsi="Arial"/>
-          <w:b/>
-          <w:bCs/>
-          <w:color w:val="1E293B"/>
-          <w:sz w:val="18"/>
-          <w:szCs w:val="18"/>
-        </w:rPr>
-        <w:t xml:space="preserve">Category: </w:t>
-      </w:r>
-      <w:r>
-        <w:rPr>
-          <w:rFonts w:ascii="Arial" w:cs="Arial" w:eastAsia="Arial" w:hAnsi="Arial"/>
-          <w:b/>
-          <w:bCs/>
-          <w:color w:val="0F3A5D"/>
-          <w:sz w:val="18"/>
-          <w:szCs w:val="18"/>
-        </w:rPr>
-        <w:t xml:space="preserve">MARINE ENVIRONMENTAL ASSESSMENT &amp; SAFEGUARDS</w:t>
-      </w:r>
-    </w:p>
-    <w:p>
-      <w:pPr>
-        <w:spacing w:after="100" w:before="0"/>
-      </w:pPr>
-      <w:r>
-        <w:rPr>
-          <w:rFonts w:ascii="Arial" w:cs="Arial" w:eastAsia="Arial" w:hAnsi="Arial"/>
-          <w:color w:val="1E293B"/>
-          <w:sz w:val="19"/>
-          <w:szCs w:val="19"/>
-        </w:rPr>
-        <w:t xml:space="preserve">Led technical health, safety, and environmental (HSE) protocols and JNCC-compliant Marine Mammal Observation (MMO) and Passive Acoustic Monitoring (PAM) during the deep-water 3D marine seismic survey using airgun arrays in the Total E&amp;P Indonesie Mentawai B.V. Block (Indian Ocean). Executed 360-degree pre-shooting visual and acoustic scans, enforced safety exclusion zones, managed soft-start ramp-up procedures to prevent acoustic trauma to marine mammals, and delivered daily environmental compliance reports to the Party Chief and international operators.</w:t>
+        <w:t xml:space="preserve">Led technical health, safety, and environmental (HSE) protocols and JNCC-compliant Marine Mammal Observation (MMO) with dedicated visual observation during the deep-water 3D marine seismic survey using airgun arrays in the Total E&amp;P Indonesie Mentawai B.V. Block (Indian Ocean). Executed 360-degree pre-shooting visual scans, enforced safety exclusion zones, managed soft-start ramp-up procedures to prevent acoustic trauma to marine mammals, and delivered daily environmental compliance reports to the Party Chief and international operators.</w:t>
       </w:r>
     </w:p>
     <w:p>
@@ -7776,37 +7582,37 @@
           <w:sz w:val="24"/>
           <w:szCs w:val="24"/>
         </w:rPr>
-        <w:t xml:space="preserve">PROFESSIONAL MEMBERSHIPS &amp; AFFILIATIONS</w:t>
-      </w:r>
-    </w:p>
-    <w:p>
-      <w:pPr>
-        <w:pStyle w:val="ListParagraph"/>
-        <w:numPr>
-          <w:ilvl w:val="0"/>
-          <w:numId w:val="1"/>
-        </w:numPr>
-        <w:spacing w:after="20" w:before="20"/>
-      </w:pPr>
-      <w:r>
-        <w:rPr>
-          <w:rFonts w:ascii="Arial" w:cs="Arial" w:eastAsia="Arial" w:hAnsi="Arial"/>
-          <w:b/>
-          <w:bCs/>
-          <w:color w:val="0F3A5D"/>
-          <w:sz w:val="19"/>
-          <w:szCs w:val="19"/>
-        </w:rPr>
-        <w:t xml:space="preserve">Asian Fisheries Acoustics Society (AFAS) </w:t>
-      </w:r>
-      <w:r>
-        <w:rPr>
-          <w:rFonts w:ascii="Arial" w:cs="Arial" w:eastAsia="Arial" w:hAnsi="Arial"/>
-          <w:color w:val="1E293B"/>
-          <w:sz w:val="18"/>
-          <w:szCs w:val="18"/>
-        </w:rPr>
-        <w:t xml:space="preserve">- Member (2012 - Present)</w:t>
+        <w:t xml:space="preserve">PROFESSIONAL MEMBERSHIPS &amp; ACADEMIC AFFILIATIONS</w:t>
+      </w:r>
+    </w:p>
+    <w:p>
+      <w:pPr>
+        <w:pStyle w:val="ListParagraph"/>
+        <w:numPr>
+          <w:ilvl w:val="0"/>
+          <w:numId w:val="1"/>
+        </w:numPr>
+        <w:spacing w:after="20" w:before="20"/>
+      </w:pPr>
+      <w:r>
+        <w:rPr>
+          <w:rFonts w:ascii="Arial" w:cs="Arial" w:eastAsia="Arial" w:hAnsi="Arial"/>
+          <w:b/>
+          <w:bCs/>
+          <w:color w:val="0F3A5D"/>
+          <w:sz w:val="19"/>
+          <w:szCs w:val="19"/>
+        </w:rPr>
+        <w:t xml:space="preserve">Center for Climate Risk and Opportunity Management (CCROM SEAP - IPB University) </w:t>
+      </w:r>
+      <w:r>
+        <w:rPr>
+          <w:rFonts w:ascii="Arial" w:cs="Arial" w:eastAsia="Arial" w:hAnsi="Arial"/>
+          <w:color w:val="1E293B"/>
+          <w:sz w:val="18"/>
+          <w:szCs w:val="18"/>
+        </w:rPr>
+        <w:t xml:space="preserve">- Affiliated Researcher / Climate Mitigation Specialist (2026 - Present)</w:t>
       </w:r>
     </w:p>
     <w:p>
@@ -7821,7 +7627,97 @@
           <w:sz w:val="17"/>
           <w:szCs w:val="17"/>
         </w:rPr>
-        <w:t xml:space="preserve">Active member contributing to regional advancements in underwater bioacoustics, fisheries acoustic survey technologies, optical-acoustic integration, and marine ecosystem monitoring across Asian and global waters.</w:t>
+        <w:t xml:space="preserve">Contributing technical expertise to climate risk assessment, carbon accounting frameworks, and nature-based solutions research in Indonesia.</w:t>
+      </w:r>
+    </w:p>
+    <w:p>
+      <w:pPr>
+        <w:pStyle w:val="ListParagraph"/>
+        <w:numPr>
+          <w:ilvl w:val="0"/>
+          <w:numId w:val="1"/>
+        </w:numPr>
+        <w:spacing w:after="20" w:before="20"/>
+      </w:pPr>
+      <w:r>
+        <w:rPr>
+          <w:rFonts w:ascii="Arial" w:cs="Arial" w:eastAsia="Arial" w:hAnsi="Arial"/>
+          <w:b/>
+          <w:bCs/>
+          <w:color w:val="0F3A5D"/>
+          <w:sz w:val="19"/>
+          <w:szCs w:val="19"/>
+        </w:rPr>
+        <w:t xml:space="preserve">Center for Agricultural and Rural Development Studies (PSP3 - IPB University) </w:t>
+      </w:r>
+      <w:r>
+        <w:rPr>
+          <w:rFonts w:ascii="Arial" w:cs="Arial" w:eastAsia="Arial" w:hAnsi="Arial"/>
+          <w:color w:val="1E293B"/>
+          <w:sz w:val="18"/>
+          <w:szCs w:val="18"/>
+        </w:rPr>
+        <w:t xml:space="preserve">- Associate Researcher / Coastal &amp; Rural Development Specialist (2024 - 2025)</w:t>
+      </w:r>
+    </w:p>
+    <w:p>
+      <w:pPr>
+        <w:spacing w:after="30" w:before="0"/>
+        <w:ind w:left="360"/>
+      </w:pPr>
+      <w:r>
+        <w:rPr>
+          <w:rFonts w:ascii="Arial" w:cs="Arial" w:eastAsia="Arial" w:hAnsi="Arial"/>
+          <w:color w:val="64748B"/>
+          <w:sz w:val="17"/>
+          <w:szCs w:val="17"/>
+        </w:rPr>
+        <w:t xml:space="preserve">Supported participatory customary governance assessments, coastal community livelihood frameworks, and social safeguard audits across Indonesian coastal regions.</w:t>
+      </w:r>
+    </w:p>
+    <w:p>
+      <w:pPr>
+        <w:pStyle w:val="ListParagraph"/>
+        <w:numPr>
+          <w:ilvl w:val="0"/>
+          <w:numId w:val="1"/>
+        </w:numPr>
+        <w:spacing w:after="20" w:before="20"/>
+      </w:pPr>
+      <w:r>
+        <w:rPr>
+          <w:rFonts w:ascii="Arial" w:cs="Arial" w:eastAsia="Arial" w:hAnsi="Arial"/>
+          <w:b/>
+          <w:bCs/>
+          <w:color w:val="0F3A5D"/>
+          <w:sz w:val="19"/>
+          <w:szCs w:val="19"/>
+        </w:rPr>
+        <w:t xml:space="preserve">Asian Fisheries Acoustics Society (AFAS) </w:t>
+      </w:r>
+      <w:r>
+        <w:rPr>
+          <w:rFonts w:ascii="Arial" w:cs="Arial" w:eastAsia="Arial" w:hAnsi="Arial"/>
+          <w:color w:val="1E293B"/>
+          <w:sz w:val="18"/>
+          <w:szCs w:val="18"/>
+        </w:rPr>
+        <w:t xml:space="preserve">- Member (2012 - Present)</w:t>
+      </w:r>
+    </w:p>
+    <w:p>
+      <w:pPr>
+        <w:spacing w:after="30" w:before="0"/>
+        <w:ind w:left="360"/>
+      </w:pPr>
+      <w:r>
+        <w:rPr>
+          <w:rFonts w:ascii="Arial" w:cs="Arial" w:eastAsia="Arial" w:hAnsi="Arial"/>
+          <w:color w:val="64748B"/>
+          <w:sz w:val="17"/>
+          <w:szCs w:val="17"/>
+        </w:rPr>
+        <w:t xml:space="preserve">Active member contributing to regional advancements in underwater bioacoustics, fisheries acoustic survey technologies, optical-acoustic integration, and marine ecosystem monitoring.</w:t>
       </w:r>
     </w:p>
     <w:p>

</xml_diff>

<commit_message>
feat: move WebGIS map to main landing section, remove CCROM and PSP3 memberships, and verify no conflict of interest
</commit_message>
<xml_diff>
--- a/I Gede Mahendra Wijaya_Master CV.docx
+++ b/I Gede Mahendra Wijaya_Master CV.docx
@@ -7583,96 +7583,6 @@
           <w:szCs w:val="24"/>
         </w:rPr>
         <w:t xml:space="preserve">PROFESSIONAL MEMBERSHIPS &amp; ACADEMIC AFFILIATIONS</w:t>
-      </w:r>
-    </w:p>
-    <w:p>
-      <w:pPr>
-        <w:pStyle w:val="ListParagraph"/>
-        <w:numPr>
-          <w:ilvl w:val="0"/>
-          <w:numId w:val="1"/>
-        </w:numPr>
-        <w:spacing w:after="20" w:before="20"/>
-      </w:pPr>
-      <w:r>
-        <w:rPr>
-          <w:rFonts w:ascii="Arial" w:cs="Arial" w:eastAsia="Arial" w:hAnsi="Arial"/>
-          <w:b/>
-          <w:bCs/>
-          <w:color w:val="0F3A5D"/>
-          <w:sz w:val="19"/>
-          <w:szCs w:val="19"/>
-        </w:rPr>
-        <w:t xml:space="preserve">Center for Climate Risk and Opportunity Management (CCROM SEAP - IPB University) </w:t>
-      </w:r>
-      <w:r>
-        <w:rPr>
-          <w:rFonts w:ascii="Arial" w:cs="Arial" w:eastAsia="Arial" w:hAnsi="Arial"/>
-          <w:color w:val="1E293B"/>
-          <w:sz w:val="18"/>
-          <w:szCs w:val="18"/>
-        </w:rPr>
-        <w:t xml:space="preserve">- Affiliated Researcher / Climate Mitigation Specialist (2026 - Present)</w:t>
-      </w:r>
-    </w:p>
-    <w:p>
-      <w:pPr>
-        <w:spacing w:after="30" w:before="0"/>
-        <w:ind w:left="360"/>
-      </w:pPr>
-      <w:r>
-        <w:rPr>
-          <w:rFonts w:ascii="Arial" w:cs="Arial" w:eastAsia="Arial" w:hAnsi="Arial"/>
-          <w:color w:val="64748B"/>
-          <w:sz w:val="17"/>
-          <w:szCs w:val="17"/>
-        </w:rPr>
-        <w:t xml:space="preserve">Contributing technical expertise to climate risk assessment, carbon accounting frameworks, and nature-based solutions research in Indonesia.</w:t>
-      </w:r>
-    </w:p>
-    <w:p>
-      <w:pPr>
-        <w:pStyle w:val="ListParagraph"/>
-        <w:numPr>
-          <w:ilvl w:val="0"/>
-          <w:numId w:val="1"/>
-        </w:numPr>
-        <w:spacing w:after="20" w:before="20"/>
-      </w:pPr>
-      <w:r>
-        <w:rPr>
-          <w:rFonts w:ascii="Arial" w:cs="Arial" w:eastAsia="Arial" w:hAnsi="Arial"/>
-          <w:b/>
-          <w:bCs/>
-          <w:color w:val="0F3A5D"/>
-          <w:sz w:val="19"/>
-          <w:szCs w:val="19"/>
-        </w:rPr>
-        <w:t xml:space="preserve">Center for Agricultural and Rural Development Studies (PSP3 - IPB University) </w:t>
-      </w:r>
-      <w:r>
-        <w:rPr>
-          <w:rFonts w:ascii="Arial" w:cs="Arial" w:eastAsia="Arial" w:hAnsi="Arial"/>
-          <w:color w:val="1E293B"/>
-          <w:sz w:val="18"/>
-          <w:szCs w:val="18"/>
-        </w:rPr>
-        <w:t xml:space="preserve">- Associate Researcher / Coastal &amp; Rural Development Specialist (2024 - 2025)</w:t>
-      </w:r>
-    </w:p>
-    <w:p>
-      <w:pPr>
-        <w:spacing w:after="30" w:before="0"/>
-        <w:ind w:left="360"/>
-      </w:pPr>
-      <w:r>
-        <w:rPr>
-          <w:rFonts w:ascii="Arial" w:cs="Arial" w:eastAsia="Arial" w:hAnsi="Arial"/>
-          <w:color w:val="64748B"/>
-          <w:sz w:val="17"/>
-          <w:szCs w:val="17"/>
-        </w:rPr>
-        <w:t xml:space="preserve">Supported participatory customary governance assessments, coastal community livelihood frameworks, and social safeguard audits across Indonesian coastal regions.</w:t>
       </w:r>
     </w:p>
     <w:p>

</xml_diff>

<commit_message>
refactor(experience): refine Hatfield and PT AMI career descriptions with humble 'contributed to' phrasing and high-integrity carbon focus
</commit_message>
<xml_diff>
--- a/I Gede Mahendra Wijaya_Master CV.docx
+++ b/I Gede Mahendra Wijaya_Master CV.docx
@@ -582,7 +582,7 @@
           <w:sz w:val="19"/>
           <w:szCs w:val="19"/>
         </w:rPr>
-        <w:t xml:space="preserve">Providing strategic and technical leadership for end-to-end carbon mitigation projects across market-based carbon mechanisms, spanning both Voluntary Carbon Markets (VCM) and Compliance Markets (carbon unit registry system of Indonesia, IDXCarbon, and international compliance). Directing the development, technical review, and validation of Project Design Documents and Climate Mitigation Action Plan Documents aligned with Core Carbon Principles (CCPs) of the Integrity Council for the Voluntary Carbon Market (ICVCM) and Paris Agreement Article 6 mechanisms (Articles 6.2 and 6.4 for ITMOs and authorized carbon crediting). Overseeing portfolio-wide carbon rating evaluations and integrity due diligence (benchmarked against BeZero, Sylvera, and Calyx Global) to guarantee robust additionality, baseline credibility, and permanence. Managing technical compliance, MRV, and greenhouse gas accounting for AFOLU (Agriculture, Forestry, and Other Land Use - REDD+, ARR, coastal blue carbon) and Waste Sectors (Palm Oil Mill Effluent / POME Methane Capture &amp; Biogas-to-Energy). Providing technical direction over &gt;200,000 hectares of peatlands and wetlands concessions in West Papua and Southwest Papua, embedding ESG frameworks, Verra VCS + CCB, Verra SD VISta (Sustainable Development Verified Impact Standard), Verra Nature Framework, ART TREES, and high-integrity nature and biodiversity credit standards.</w:t>
+        <w:t xml:space="preserve">Dedicated to delivering and contributing to high-quality and high-integrity carbon projects based on Nature-based Solutions (NbS), AFOLU ecosystem restoration, and robust MRV frameworks. Directing technical strategy, greenhouse gas accounting, and project validation aligned with Core Carbon Principles (CCPs), ICVCM, and Paris Agreement Article 6 mechanisms. Managing technical compliance across peatland, wetland, and forest concession areas (&gt;200,000 ha) in Papua under the carbon unit registry system of Indonesia, Verra VCS + CCB, SD VISta, and Nature Framework to ensure additionality, permanence, and verifiable ecological integrity.</w:t>
       </w:r>
     </w:p>
     <w:p>
@@ -637,7 +637,7 @@
           <w:sz w:val="19"/>
           <w:szCs w:val="19"/>
         </w:rPr>
-        <w:t xml:space="preserve">Managed full project lifecycles for large-scale terrestrial, peatland, and coastal wetland ecosystem restoration concessions (&gt;200,000 ha) across West Papua and Southwest Papua. Directed multidisciplinary field teams conducting ecological baseline surveys, High Carbon Stock Approach (HCSA), High Conservation Value (HCV), and ground-based carbon stock accounting (SNI 7724). Designed and facilitated Free, Prior, and Informed Consent (FPIC) processes and inclusive benefit-sharing frameworks with local customary communities. Led regulatory liaison and licensing with the Ministry of Environment and Forestry (MoEF / KLHK) and Ministry of Marine Affairs and Fisheries (KKP). Formulated comprehensive Environmental &amp; Social Management Plans (ESMP), environmental and social compliance, and established rigorous Monitoring, Reporting, and Verification (MRV) systems.</w:t>
+        <w:t xml:space="preserve">Contributed to and managed terrestrial, peatland, and coastal wetland carbon project operations (&gt;200,000 ha) in West Papua and Southwest Papua. Led multidisciplinary field teams executing ecological baselines, High Carbon Stock Approach (HCSA), High Conservation Value (HCV), and ground-based carbon stock accounting (SNI 7724). Designed and facilitated Free, Prior, and Informed Consent (FPIC) with local customary communities to establish inclusive benefit-sharing frameworks. Directed regulatory licensing with the Ministry of Environment and Forestry and Ministry of Marine Affairs and Fisheries, formulating Environmental &amp; Social Management Plans (ESMP) and establishing rigorous MRV systems.</w:t>
       </w:r>
     </w:p>
     <w:p>
@@ -692,7 +692,7 @@
           <w:sz w:val="19"/>
           <w:szCs w:val="19"/>
         </w:rPr>
-        <w:t xml:space="preserve">Co-led the strategic, operational, and financial management of the Marine and Coastal Development Business Unit, overseeing multiple environmental consulting projects for international financial institutions (World Bank, ADB, AFD, UNDP, FAO) and private sector clients. Directed annual business planning, revenue forecasting, project budgeting, and commercial proposal development. Provided executive briefings and milestone reporting to the Board of Directors. Supervised and mentored senior and junior technical staff across marine ecology, fisheries governance, and environmental safeguards. Enforced corporate compliance with ISO 9001 (Quality Management), ISO 14001 (Environmental Management), and ISO 45001 (Occupational Health &amp; Safety) standards across all project operations.</w:t>
+        <w:t xml:space="preserve">Promoted to Deputy Unit Leader in 2022. Contributed to multi-year marine and coastal projects funded by IFIs and UN agencies including World Bank, ADB, AFD, and FAO, delivering ecological baseline assessments and spatial governance. Co-led the strategic, operational, and financial management of the Business Unit, directing business planning, commercial proposals, and multi-disciplinary teams across marine conservation, fisheries governance, and environmental safeguards.</w:t>
       </w:r>
     </w:p>
     <w:p>
@@ -747,7 +747,7 @@
           <w:sz w:val="19"/>
           <w:szCs w:val="19"/>
         </w:rPr>
-        <w:t xml:space="preserve">Served as technical lead and specialist for marine ecology, oceanographic baseline assessments, fisheries resource economics, and environmental impact assessments (ESIA / AMDAL / UKL-UPL). Designed and executed extensive marine field sampling campaigns (water quality, sediment chemistry, benthic communities, coral reef health, and pelagic fish biomass). Formulated Environmental and Social Management Plans (ESMP), stakeholder engagement frameworks, and Marine Protected Area (MPA) zoning plans. Led digital innovation initiatives for sustainable fisheries, including the development and deployment of satellite Vessel Monitoring Systems (VMS) with Inmarsat and UK Space Agency, smart aquaculture IoT solutions, and geofencing applications. Authored major technical reports and policy briefs for the World Bank, Asian Development Bank, AFD, FAO, and Indonesian government ministries.</w:t>
+        <w:t xml:space="preserve">Served as technical specialist contributing to marine ecology, oceanographic baseline assessments, fisheries resource management, and environmental and social compliance. Contributed to multi-year initiatives including fisheries and aquaculture programs supported by the Walton Family Foundation. Designed and executed comprehensive marine surveys (water quality, benthic communities, coral reef health, pelagic fish acoustics), formulated Environmental and Social Management Plans (ESMP), and advanced digital fisheries monitoring (satellite VMS with Inmarsat and UK Space Agency). Delivered high-impact technical reports and policy recommendations for the World Bank, ADB, AFD, FAO, and MMAF.</w:t>
       </w:r>
     </w:p>
     <w:p>

</xml_diff>

<commit_message>
fix: remove S.Pi. degree abbreviation, purge AMDAL acronym in favor of ESIA, and ensure Verra targeting
</commit_message>
<xml_diff>
--- a/I Gede Mahendra Wijaya_Master CV.docx
+++ b/I Gede Mahendra Wijaya_Master CV.docx
@@ -94,7 +94,7 @@
           <w:sz w:val="20"/>
           <w:szCs w:val="20"/>
         </w:rPr>
-        <w:t xml:space="preserve">Marine environmental specialist with over 13 years of experience delivering high-level technical leadership across marine-based sectors, forest concessions, and industrial waste decarbonization. Formally trained in marine science and acoustics (IPB University), with expertise spanning coastal and ocean governance, sustainable fisheries, forest concession area, and carbon mitigation across AFOLU (&gt;200,000 ha peatland/wetland concessions in Papua) and Waste sectors (Palm Oil Mill Effluent / POME methane capture &amp; biogas-to-energy). Proven track record with major international institutions (World Bank, ADB, FAO, UNDP, TNC) and national innovation award recognition (BIC). Highly skilled in carbon accounting (carbon unit registry system of Indonesia, VCM, Paris Agreement Article 6), MRV, environmental safeguards (ESIA/AMDAL), and multi-stakeholder engagement.</w:t>
+        <w:t xml:space="preserve">Marine environmental specialist with over 13 years of experience delivering high-level technical leadership across marine-based sectors, forest concessions, and industrial waste decarbonization. Formally trained in marine science and acoustics (IPB University), with expertise spanning coastal and ocean governance, sustainable fisheries, forest concession area, and carbon mitigation across AFOLU (&gt;200,000 ha peatland/wetland concessions in Papua) and Waste sectors (Palm Oil Mill Effluent / POME methane capture &amp; biogas-to-energy). Proven track record with major international institutions (World Bank, ADB, FAO, UNDP, TNC) and national innovation award recognition (BIC). Highly skilled in carbon accounting (carbon unit registry system of Indonesia, VCM, Paris Agreement Article 6), MRV, environmental and social compliance (ESIA), and multi-stakeholder engagement.</w:t>
       </w:r>
     </w:p>
     <w:p>
@@ -268,7 +268,7 @@
           <w:sz w:val="21"/>
           <w:szCs w:val="21"/>
         </w:rPr>
-        <w:t xml:space="preserve">Bachelor of Marine Science and Technology (S.Pi.)</w:t>
+        <w:t xml:space="preserve">Bachelor of Marine Science and Technology</w:t>
       </w:r>
       <w:r>
         <w:rPr>

</xml_diff>

<commit_message>
Pembaruan otomatis CV dari Word & Sertifikat pada 21/10/2026 10:32:24,48
</commit_message>
<xml_diff>
--- a/I Gede Mahendra Wijaya_Master CV.docx
+++ b/I Gede Mahendra Wijaya_Master CV.docx
@@ -41,7 +41,7 @@
         <w:spacing w:after="40" w:before="0"/>
         <w:jc w:val="center"/>
       </w:pPr>
-      <w:hyperlink w:history="1" r:id="rId_x9ghwjl-qw1jfaiqcmks">
+      <w:hyperlink w:history="1" r:id="rIdpif7-3ieaydmyby9pylc2">
         <w:r>
           <w:rPr>
             <w:rFonts w:ascii="Arial" w:cs="Arial" w:eastAsia="Arial" w:hAnsi="Arial"/>
@@ -62,7 +62,7 @@
         </w:rPr>
         <w:t xml:space="preserve">  |  </w:t>
       </w:r>
-      <w:hyperlink w:history="1" r:id="rIdtcv4fs458uny8ncgcliml">
+      <w:hyperlink w:history="1" r:id="rIdic4ncexh_h_kf8qp5n0wh">
         <w:r>
           <w:rPr>
             <w:rFonts w:ascii="Arial" w:cs="Arial" w:eastAsia="Arial" w:hAnsi="Arial"/>
@@ -83,7 +83,7 @@
         </w:rPr>
         <w:t xml:space="preserve">  |  </w:t>
       </w:r>
-      <w:hyperlink w:history="1" r:id="rId1kwxgrszthwjcedcaj9xy">
+      <w:hyperlink w:history="1" r:id="rIdyylyfqk1p2acg406p4tqk">
         <w:r>
           <w:rPr>
             <w:rFonts w:ascii="Arial" w:cs="Arial" w:eastAsia="Arial" w:hAnsi="Arial"/>
@@ -7487,6 +7487,45 @@
           <w:szCs w:val="18"/>
         </w:rPr>
         <w:t xml:space="preserve"> — Marine Specialist, World Bank Group</w:t>
+      </w:r>
+    </w:p>
+    <w:p>
+      <w:pPr>
+        <w:spacing w:after="50" w:before="10"/>
+      </w:pPr>
+      <w:r>
+        <w:rPr>
+          <w:rFonts w:ascii="Arial" w:cs="Arial" w:eastAsia="Arial" w:hAnsi="Arial"/>
+          <w:color w:val="64748B"/>
+          <w:sz w:val="18"/>
+          <w:szCs w:val="18"/>
+        </w:rPr>
+        <w:t xml:space="preserve">Contact / Context: Contact available upon request (undefined)</w:t>
+      </w:r>
+    </w:p>
+    <w:p>
+      <w:pPr>
+        <w:spacing w:after="20" w:before="60"/>
+      </w:pPr>
+      <w:r>
+        <w:rPr>
+          <w:rFonts w:ascii="Arial" w:cs="Arial" w:eastAsia="Arial" w:hAnsi="Arial"/>
+          <w:b/>
+          <w:bCs/>
+          <w:color w:val="0F3A5D"/>
+          <w:sz w:val="20"/>
+          <w:szCs w:val="20"/>
+        </w:rPr>
+        <w:t xml:space="preserve">6. Prof. Dr. Ir. Harpasis Sanusi, M.Sc.</w:t>
+      </w:r>
+      <w:r>
+        <w:rPr>
+          <w:rFonts w:ascii="Arial" w:cs="Arial" w:eastAsia="Arial" w:hAnsi="Arial"/>
+          <w:color w:val="0D9488"/>
+          <w:sz w:val="18"/>
+          <w:szCs w:val="18"/>
+        </w:rPr>
+        <w:t xml:space="preserve"> — Professor of Chemical Oceanography &amp; Marine Pollution, Department of Marine Science and Technology, IPB University</w:t>
       </w:r>
     </w:p>
     <w:p>

</xml_diff>

<commit_message>
feat(references): add Prof. Dr. Ir. Harpasis Sanusi, M.Sc. as distinguished academic reference
</commit_message>
<xml_diff>
--- a/I Gede Mahendra Wijaya_Master CV.docx
+++ b/I Gede Mahendra Wijaya_Master CV.docx
@@ -41,7 +41,7 @@
         <w:spacing w:after="40" w:before="0"/>
         <w:jc w:val="center"/>
       </w:pPr>
-      <w:hyperlink w:history="1" r:id="rIdpif7-3ieaydmyby9pylc2">
+      <w:hyperlink w:history="1" r:id="rIdzxjwag6uv43vptehrla9e">
         <w:r>
           <w:rPr>
             <w:rFonts w:ascii="Arial" w:cs="Arial" w:eastAsia="Arial" w:hAnsi="Arial"/>
@@ -62,7 +62,7 @@
         </w:rPr>
         <w:t xml:space="preserve">  |  </w:t>
       </w:r>
-      <w:hyperlink w:history="1" r:id="rIdic4ncexh_h_kf8qp5n0wh">
+      <w:hyperlink w:history="1" r:id="rId7p1oln0jbuytvjpx6dga4">
         <w:r>
           <w:rPr>
             <w:rFonts w:ascii="Arial" w:cs="Arial" w:eastAsia="Arial" w:hAnsi="Arial"/>
@@ -83,7 +83,7 @@
         </w:rPr>
         <w:t xml:space="preserve">  |  </w:t>
       </w:r>
-      <w:hyperlink w:history="1" r:id="rIdyylyfqk1p2acg406p4tqk">
+      <w:hyperlink w:history="1" r:id="rIdf1xeqisnuz0tbwyz8ntec">
         <w:r>
           <w:rPr>
             <w:rFonts w:ascii="Arial" w:cs="Arial" w:eastAsia="Arial" w:hAnsi="Arial"/>
@@ -7344,7 +7344,7 @@
           <w:sz w:val="18"/>
           <w:szCs w:val="18"/>
         </w:rPr>
-        <w:t xml:space="preserve">Contact / Context: Contact available upon request (undefined)</w:t>
+        <w:t xml:space="preserve">Contact / Context: Contact available upon request</w:t>
       </w:r>
     </w:p>
     <w:p>
@@ -7383,7 +7383,7 @@
           <w:sz w:val="18"/>
           <w:szCs w:val="18"/>
         </w:rPr>
-        <w:t xml:space="preserve">Contact / Context: Contact available upon request (undefined)</w:t>
+        <w:t xml:space="preserve">Contact / Context: Contact available upon request</w:t>
       </w:r>
     </w:p>
     <w:p>
@@ -7422,7 +7422,7 @@
           <w:sz w:val="18"/>
           <w:szCs w:val="18"/>
         </w:rPr>
-        <w:t xml:space="preserve">Contact / Context: Contact available upon request (undefined)</w:t>
+        <w:t xml:space="preserve">Contact / Context: Contact available upon request</w:t>
       </w:r>
     </w:p>
     <w:p>
@@ -7461,7 +7461,7 @@
           <w:sz w:val="18"/>
           <w:szCs w:val="18"/>
         </w:rPr>
-        <w:t xml:space="preserve">Contact / Context: Contact available upon request (undefined)</w:t>
+        <w:t xml:space="preserve">Contact / Context: Contact available upon request</w:t>
       </w:r>
     </w:p>
     <w:p>
@@ -7500,7 +7500,7 @@
           <w:sz w:val="18"/>
           <w:szCs w:val="18"/>
         </w:rPr>
-        <w:t xml:space="preserve">Contact / Context: Contact available upon request (undefined)</w:t>
+        <w:t xml:space="preserve">Contact / Context: Contact available upon request</w:t>
       </w:r>
     </w:p>
     <w:p>
@@ -7539,7 +7539,7 @@
           <w:sz w:val="18"/>
           <w:szCs w:val="18"/>
         </w:rPr>
-        <w:t xml:space="preserve">Contact / Context: Contact available upon request (undefined)</w:t>
+        <w:t xml:space="preserve">Contact / Context: Contact available upon request</w:t>
       </w:r>
     </w:p>
     <w:sectPr>

</xml_diff>

<commit_message>
refactor(references): elevate Professors to Tier 1 and cleanup duplicate word file
</commit_message>
<xml_diff>
--- a/I Gede Mahendra Wijaya_Master CV.docx
+++ b/I Gede Mahendra Wijaya_Master CV.docx
@@ -41,7 +41,7 @@
         <w:spacing w:after="40" w:before="0"/>
         <w:jc w:val="center"/>
       </w:pPr>
-      <w:hyperlink w:history="1" r:id="rIdzxjwag6uv43vptehrla9e">
+      <w:hyperlink w:history="1" r:id="rId51fynfycaxt_09arp6vmr">
         <w:r>
           <w:rPr>
             <w:rFonts w:ascii="Arial" w:cs="Arial" w:eastAsia="Arial" w:hAnsi="Arial"/>
@@ -62,7 +62,7 @@
         </w:rPr>
         <w:t xml:space="preserve">  |  </w:t>
       </w:r>
-      <w:hyperlink w:history="1" r:id="rId7p1oln0jbuytvjpx6dga4">
+      <w:hyperlink w:history="1" r:id="rIdwgxw6aobpcm5fydvrjpzm">
         <w:r>
           <w:rPr>
             <w:rFonts w:ascii="Arial" w:cs="Arial" w:eastAsia="Arial" w:hAnsi="Arial"/>
@@ -83,7 +83,7 @@
         </w:rPr>
         <w:t xml:space="preserve">  |  </w:t>
       </w:r>
-      <w:hyperlink w:history="1" r:id="rIdf1xeqisnuz0tbwyz8ntec">
+      <w:hyperlink w:history="1" r:id="rIdh68v7sfebgqotvjvynrh3">
         <w:r>
           <w:rPr>
             <w:rFonts w:ascii="Arial" w:cs="Arial" w:eastAsia="Arial" w:hAnsi="Arial"/>
@@ -7321,16 +7321,16 @@
           <w:sz w:val="20"/>
           <w:szCs w:val="20"/>
         </w:rPr>
-        <w:t xml:space="preserve">1. Dr. Lida Pet-Soede</w:t>
-      </w:r>
-      <w:r>
-        <w:rPr>
-          <w:rFonts w:ascii="Arial" w:cs="Arial" w:eastAsia="Arial" w:hAnsi="Arial"/>
-          <w:color w:val="0D9488"/>
-          <w:sz w:val="18"/>
-          <w:szCs w:val="18"/>
-        </w:rPr>
-        <w:t xml:space="preserve"> — Director of Marine Unit Service, Hatfield Group</w:t>
+        <w:t xml:space="preserve">1. Prof. Henry M. Manik, S.Pi., M.T., Ph.D.</w:t>
+      </w:r>
+      <w:r>
+        <w:rPr>
+          <w:rFonts w:ascii="Arial" w:cs="Arial" w:eastAsia="Arial" w:hAnsi="Arial"/>
+          <w:color w:val="0D9488"/>
+          <w:sz w:val="18"/>
+          <w:szCs w:val="18"/>
+        </w:rPr>
+        <w:t xml:space="preserve"> — Professor of Ocean Acoustics and Instrumentation, Department of Marine Science and Technology, IPB University</w:t>
       </w:r>
     </w:p>
     <w:p>
@@ -7360,16 +7360,16 @@
           <w:sz w:val="20"/>
           <w:szCs w:val="20"/>
         </w:rPr>
-        <w:t xml:space="preserve">2. Dr. I Wayan Nurjaya</w:t>
-      </w:r>
-      <w:r>
-        <w:rPr>
-          <w:rFonts w:ascii="Arial" w:cs="Arial" w:eastAsia="Arial" w:hAnsi="Arial"/>
-          <w:color w:val="0D9488"/>
-          <w:sz w:val="18"/>
-          <w:szCs w:val="18"/>
-        </w:rPr>
-        <w:t xml:space="preserve"> — Head of Department of Marine Science and Technology, Bogor Agricultural University (IPB University)</w:t>
+        <w:t xml:space="preserve">2. Prof. Dr. Ir. Harpasis Sanusi, M.Sc.</w:t>
+      </w:r>
+      <w:r>
+        <w:rPr>
+          <w:rFonts w:ascii="Arial" w:cs="Arial" w:eastAsia="Arial" w:hAnsi="Arial"/>
+          <w:color w:val="0D9488"/>
+          <w:sz w:val="18"/>
+          <w:szCs w:val="18"/>
+        </w:rPr>
+        <w:t xml:space="preserve"> — Professor of Chemical Oceanography &amp; Marine Pollution, Department of Marine Science and Technology, IPB University</w:t>
       </w:r>
     </w:p>
     <w:p>
@@ -7399,16 +7399,16 @@
           <w:sz w:val="20"/>
           <w:szCs w:val="20"/>
         </w:rPr>
-        <w:t xml:space="preserve">3. Prof. Henry M. Manik, S.Pi., M.T., Ph.D.</w:t>
-      </w:r>
-      <w:r>
-        <w:rPr>
-          <w:rFonts w:ascii="Arial" w:cs="Arial" w:eastAsia="Arial" w:hAnsi="Arial"/>
-          <w:color w:val="0D9488"/>
-          <w:sz w:val="18"/>
-          <w:szCs w:val="18"/>
-        </w:rPr>
-        <w:t xml:space="preserve"> — Professor of Ocean Acoustics and Instrumentation, Department of Marine Science and Technology, IPB University</w:t>
+        <w:t xml:space="preserve">3. Dr. I Wayan Nurjaya</w:t>
+      </w:r>
+      <w:r>
+        <w:rPr>
+          <w:rFonts w:ascii="Arial" w:cs="Arial" w:eastAsia="Arial" w:hAnsi="Arial"/>
+          <w:color w:val="0D9488"/>
+          <w:sz w:val="18"/>
+          <w:szCs w:val="18"/>
+        </w:rPr>
+        <w:t xml:space="preserve"> — Head of Department of Marine Science and Technology, Bogor Agricultural University (IPB University)</w:t>
       </w:r>
     </w:p>
     <w:p>
@@ -7438,16 +7438,16 @@
           <w:sz w:val="20"/>
           <w:szCs w:val="20"/>
         </w:rPr>
-        <w:t xml:space="preserve">4. Dr. Windi Al Zahra</w:t>
-      </w:r>
-      <w:r>
-        <w:rPr>
-          <w:rFonts w:ascii="Arial" w:cs="Arial" w:eastAsia="Arial" w:hAnsi="Arial"/>
-          <w:color w:val="0D9488"/>
-          <w:sz w:val="18"/>
-          <w:szCs w:val="18"/>
-        </w:rPr>
-        <w:t xml:space="preserve"> — Senior Researcher / Climate &amp; Environmental Specialist, Centre for Climate Risk and Opportunity Management (CCROM SEAP), IPB University</w:t>
+        <w:t xml:space="preserve">4. Dr. Lida Pet-Soede</w:t>
+      </w:r>
+      <w:r>
+        <w:rPr>
+          <w:rFonts w:ascii="Arial" w:cs="Arial" w:eastAsia="Arial" w:hAnsi="Arial"/>
+          <w:color w:val="0D9488"/>
+          <w:sz w:val="18"/>
+          <w:szCs w:val="18"/>
+        </w:rPr>
+        <w:t xml:space="preserve"> — Director of Marine Unit Service, Hatfield Group</w:t>
       </w:r>
     </w:p>
     <w:p>
@@ -7516,16 +7516,16 @@
           <w:sz w:val="20"/>
           <w:szCs w:val="20"/>
         </w:rPr>
-        <w:t xml:space="preserve">6. Prof. Dr. Ir. Harpasis Sanusi, M.Sc.</w:t>
-      </w:r>
-      <w:r>
-        <w:rPr>
-          <w:rFonts w:ascii="Arial" w:cs="Arial" w:eastAsia="Arial" w:hAnsi="Arial"/>
-          <w:color w:val="0D9488"/>
-          <w:sz w:val="18"/>
-          <w:szCs w:val="18"/>
-        </w:rPr>
-        <w:t xml:space="preserve"> — Professor of Chemical Oceanography &amp; Marine Pollution, Department of Marine Science and Technology, IPB University</w:t>
+        <w:t xml:space="preserve">6. Dr. Windi Al Zahra</w:t>
+      </w:r>
+      <w:r>
+        <w:rPr>
+          <w:rFonts w:ascii="Arial" w:cs="Arial" w:eastAsia="Arial" w:hAnsi="Arial"/>
+          <w:color w:val="0D9488"/>
+          <w:sz w:val="18"/>
+          <w:szCs w:val="18"/>
+        </w:rPr>
+        <w:t xml:space="preserve"> — Senior Researcher / Climate &amp; Environmental Specialist, Centre for Climate Risk and Opportunity Management (CCROM SEAP), IPB University</w:t>
       </w:r>
     </w:p>
     <w:p>

</xml_diff>

<commit_message>
fix(cv): eliminate undefined bugs, justify text, format hyphens, and add project involvement summary
</commit_message>
<xml_diff>
--- a/I Gede Mahendra Wijaya_Master CV.docx
+++ b/I Gede Mahendra Wijaya_Master CV.docx
@@ -41,7 +41,7 @@
         <w:spacing w:after="40" w:before="0"/>
         <w:jc w:val="center"/>
       </w:pPr>
-      <w:hyperlink w:history="1" r:id="rId51fynfycaxt_09arp6vmr">
+      <w:hyperlink w:history="1" r:id="rIde4g6ggdcivsesbxdt0lk3">
         <w:r>
           <w:rPr>
             <w:rFonts w:ascii="Arial" w:cs="Arial" w:eastAsia="Arial" w:hAnsi="Arial"/>
@@ -62,7 +62,7 @@
         </w:rPr>
         <w:t xml:space="preserve">  |  </w:t>
       </w:r>
-      <w:hyperlink w:history="1" r:id="rIdwgxw6aobpcm5fydvrjpzm">
+      <w:hyperlink w:history="1" r:id="rIdxtqh-c-qz1xoscnb9dyou">
         <w:r>
           <w:rPr>
             <w:rFonts w:ascii="Arial" w:cs="Arial" w:eastAsia="Arial" w:hAnsi="Arial"/>
@@ -83,7 +83,7 @@
         </w:rPr>
         <w:t xml:space="preserve">  |  </w:t>
       </w:r>
-      <w:hyperlink w:history="1" r:id="rIdh68v7sfebgqotvjvynrh3">
+      <w:hyperlink w:history="1" r:id="rIdfk-quhranggatlv-9leza">
         <w:r>
           <w:rPr>
             <w:rFonts w:ascii="Arial" w:cs="Arial" w:eastAsia="Arial" w:hAnsi="Arial"/>
@@ -617,7 +617,7 @@
           <w:sz w:val="20"/>
           <w:szCs w:val="20"/>
         </w:rPr>
-        <w:t xml:space="preserve">  |  PT Aksi Mitigasi Iklim (GHG Actions)</w:t>
+        <w:t xml:space="preserve"> | PT Aksi Mitigasi Iklim (GHG Actions)</w:t>
       </w:r>
     </w:p>
     <w:p>
@@ -633,7 +633,7 @@
           <w:sz w:val="18"/>
           <w:szCs w:val="18"/>
         </w:rPr>
-        <w:t xml:space="preserve">Denpasar (Hybrid Bali &amp; Papua)  |  June 2026 - Present</w:t>
+        <w:t xml:space="preserve">Denpasar (Hybrid Bali &amp; Papua) | June 2026 - Present</w:t>
       </w:r>
     </w:p>
     <w:p>
@@ -674,7 +674,7 @@
           <w:sz w:val="20"/>
           <w:szCs w:val="20"/>
         </w:rPr>
-        <w:t xml:space="preserve">  |  PT Aksi Mitigasi Iklim (GHG Actions)</w:t>
+        <w:t xml:space="preserve"> | PT Aksi Mitigasi Iklim (GHG Actions)</w:t>
       </w:r>
     </w:p>
     <w:p>
@@ -690,7 +690,7 @@
           <w:sz w:val="18"/>
           <w:szCs w:val="18"/>
         </w:rPr>
-        <w:t xml:space="preserve">Denpasar (Hybrid Bali &amp; Papua)  |  February 2023 - June 2026</w:t>
+        <w:t xml:space="preserve">Denpasar (Hybrid Bali &amp; Papua) | February 2023 - June 2026</w:t>
       </w:r>
     </w:p>
     <w:p>
@@ -731,7 +731,7 @@
           <w:sz w:val="20"/>
           <w:szCs w:val="20"/>
         </w:rPr>
-        <w:t xml:space="preserve">  |  PT Hatfield Indonesia</w:t>
+        <w:t xml:space="preserve"> | PT Hatfield Indonesia</w:t>
       </w:r>
     </w:p>
     <w:p>
@@ -747,7 +747,7 @@
           <w:sz w:val="18"/>
           <w:szCs w:val="18"/>
         </w:rPr>
-        <w:t xml:space="preserve">Bogor / Jakarta  |  January 2022 - February 2023</w:t>
+        <w:t xml:space="preserve">Bogor / Jakarta | January 2022 - February 2023</w:t>
       </w:r>
     </w:p>
     <w:p>
@@ -788,7 +788,7 @@
           <w:sz w:val="20"/>
           <w:szCs w:val="20"/>
         </w:rPr>
-        <w:t xml:space="preserve">  |  PT Hatfield Indonesia</w:t>
+        <w:t xml:space="preserve"> | PT Hatfield Indonesia</w:t>
       </w:r>
     </w:p>
     <w:p>
@@ -804,7 +804,7 @@
           <w:sz w:val="18"/>
           <w:szCs w:val="18"/>
         </w:rPr>
-        <w:t xml:space="preserve">Bogor / Jakarta  |  June 2016 - December 2021</w:t>
+        <w:t xml:space="preserve">Bogor / Jakarta | June 2016 - December 2021</w:t>
       </w:r>
     </w:p>
     <w:p>
@@ -845,7 +845,7 @@
           <w:sz w:val="20"/>
           <w:szCs w:val="20"/>
         </w:rPr>
-        <w:t xml:space="preserve">  |  Nusa Dua Reef Foundation</w:t>
+        <w:t xml:space="preserve"> | Nusa Dua Reef Foundation</w:t>
       </w:r>
     </w:p>
     <w:p>
@@ -861,7 +861,7 @@
           <w:sz w:val="18"/>
           <w:szCs w:val="18"/>
         </w:rPr>
-        <w:t xml:space="preserve">Bali, Indonesia  |  April 2016 - June 2016</w:t>
+        <w:t xml:space="preserve">Bali, Indonesia | April 2016 - June 2016</w:t>
       </w:r>
     </w:p>
     <w:p>
@@ -902,7 +902,7 @@
           <w:sz w:val="20"/>
           <w:szCs w:val="20"/>
         </w:rPr>
-        <w:t xml:space="preserve">  |  PT Quest Geophysical Asia - West Papua Project</w:t>
+        <w:t xml:space="preserve"> | PT Quest Geophysical Asia - West Papua Project</w:t>
       </w:r>
     </w:p>
     <w:p>
@@ -918,7 +918,7 @@
           <w:sz w:val="18"/>
           <w:szCs w:val="18"/>
         </w:rPr>
-        <w:t xml:space="preserve">Arguni Bay, West Papua  |  January 2015 - August 2015</w:t>
+        <w:t xml:space="preserve">Arguni Bay, West Papua | January 2015 - August 2015</w:t>
       </w:r>
     </w:p>
     <w:p>
@@ -959,7 +959,7 @@
           <w:sz w:val="20"/>
           <w:szCs w:val="20"/>
         </w:rPr>
-        <w:t xml:space="preserve">  |  Marine Science &amp; Technology Dept, IPB University</w:t>
+        <w:t xml:space="preserve"> | Marine Science &amp; Technology Dept, IPB University</w:t>
       </w:r>
     </w:p>
     <w:p>
@@ -975,7 +975,7 @@
           <w:sz w:val="18"/>
           <w:szCs w:val="18"/>
         </w:rPr>
-        <w:t xml:space="preserve">Bogor, Indonesia  |  2012 - 2014</w:t>
+        <w:t xml:space="preserve">Bogor, Indonesia | 2012 - 2014</w:t>
       </w:r>
     </w:p>
     <w:p>
@@ -1013,6 +1013,20 @@
     </w:p>
     <w:p>
       <w:pPr>
+        <w:spacing w:after="120" w:before="60"/>
+      </w:pPr>
+      <w:r>
+        <w:rPr>
+          <w:rFonts w:ascii="Arial" w:cs="Arial" w:eastAsia="Arial" w:hAnsi="Arial"/>
+          <w:color w:val="1E293B"/>
+          <w:sz w:val="19"/>
+          <w:szCs w:val="19"/>
+        </w:rPr>
+        <w:t xml:space="preserve">Over the past 13+ years, I Gede Mahendra Wijaya has directed, managed, and contributed to 29 high-impact multidisciplinary projects spanning marine environmental assessments, nature-based climate solutions, sustainable fisheries governance, and environmental and social compliance across the Indonesian archipelago. His technical involvement encompasses leading international financial institution (IFI) and UN-backed programs (World Bank, ADB, AFD, FAO, UNDP), directing large-scale AFOLU carbon feasibility and ecosystem restoration concessions (&gt;200,000 ha), conducting ecological baselines, formulating ESMP/ESIA safeguards, and deploying digital marine monitoring technologies. Below is the detailed catalog of key project assignments, technical scopes, and deliverables.</w:t>
+      </w:r>
+    </w:p>
+    <w:p>
+      <w:pPr>
         <w:spacing w:after="20" w:before="80"/>
       </w:pPr>
       <w:r>
@@ -1049,7 +1063,7 @@
           <w:sz w:val="18"/>
           <w:szCs w:val="18"/>
         </w:rPr>
-        <w:t xml:space="preserve">PT Salawati Hijau Lestari (SHL)  |  </w:t>
+        <w:t xml:space="preserve">PT Salawati Hijau Lestari (SHL) | </w:t>
       </w:r>
       <w:r>
         <w:rPr>
@@ -1069,7 +1083,7 @@
           <w:sz w:val="18"/>
           <w:szCs w:val="18"/>
         </w:rPr>
-        <w:t xml:space="preserve">June - August 2023  |  </w:t>
+        <w:t xml:space="preserve">June - August 2023 | </w:t>
       </w:r>
       <w:r>
         <w:rPr>
@@ -1103,6 +1117,7 @@
           <w:sz w:val="19"/>
           <w:szCs w:val="19"/>
         </w:rPr>
+        <w:t xml:space="preserve">Conducted comprehensive pre-socialization assessments, institutional mapping, and multi-tier stakeholder analysis across district and provincial levels in Southwest Papua. Designed the initial stakeholder engagement strategy and Free, Prior, and Informed Consent (FPIC) framework required for forest concession ecosystem restoration and carbon project licensing, ensuring full alignment with local customary land rights.</w:t>
       </w:r>
     </w:p>
     <w:p>
@@ -1143,7 +1158,7 @@
           <w:sz w:val="18"/>
           <w:szCs w:val="18"/>
         </w:rPr>
-        <w:t xml:space="preserve">PT SHL &amp; PT Sorong Hijau Ekosistem (SHE)  |  </w:t>
+        <w:t xml:space="preserve">PT SHL &amp; PT Sorong Hijau Ekosistem (SHE) | </w:t>
       </w:r>
       <w:r>
         <w:rPr>
@@ -1163,7 +1178,7 @@
           <w:sz w:val="18"/>
           <w:szCs w:val="18"/>
         </w:rPr>
-        <w:t xml:space="preserve">March - June 2023  |  </w:t>
+        <w:t xml:space="preserve">March - June 2023 | </w:t>
       </w:r>
       <w:r>
         <w:rPr>
@@ -1197,6 +1212,7 @@
           <w:sz w:val="19"/>
           <w:szCs w:val="19"/>
         </w:rPr>
+        <w:t xml:space="preserve">Delivered a high-level feasibility study and carbon scoping assessment across &gt;200,000 hectares of wetland and peatland forest concessions in Southwest Papua and West Papua Provinces. Synthesized remote sensing GIS analysis, forest carbon stock estimates, baseline deforestation drivers, regulatory compliance pathways (carbon unit registry system of Indonesia, Verra VCS + CCB, SD VISta, and Nature Framework), and socio-economic risk evaluations to establish project viability for carbon credit generation and biodiversity conservation.</w:t>
       </w:r>
     </w:p>
     <w:p>
@@ -1237,7 +1253,7 @@
           <w:sz w:val="18"/>
           <w:szCs w:val="18"/>
         </w:rPr>
-        <w:t xml:space="preserve">APRIL Group  |  </w:t>
+        <w:t xml:space="preserve">APRIL Group | </w:t>
       </w:r>
       <w:r>
         <w:rPr>
@@ -1257,7 +1273,7 @@
           <w:sz w:val="18"/>
           <w:szCs w:val="18"/>
         </w:rPr>
-        <w:t xml:space="preserve">September 2022 - January 2023  |  </w:t>
+        <w:t xml:space="preserve">September 2022 - January 2023 | </w:t>
       </w:r>
       <w:r>
         <w:rPr>
@@ -1291,6 +1307,7 @@
           <w:sz w:val="19"/>
           <w:szCs w:val="19"/>
         </w:rPr>
+        <w:t xml:space="preserve">Served as Social Expert for integrated HCV-HCSA full assessments covering three supply partner concessions in Northern Sumatra. Conducted field participatory mapping, customary land tenure analyses, community livelihood assessments, and FPIC verification to delineate High Carbon Stock forest patches and High Conservation Value areas for sustainable landscape management and zero-deforestation compliance.</w:t>
       </w:r>
     </w:p>
     <w:p>
@@ -1331,7 +1348,7 @@
           <w:sz w:val="18"/>
           <w:szCs w:val="18"/>
         </w:rPr>
-        <w:t xml:space="preserve">Asian Development Bank (ADB)  |  </w:t>
+        <w:t xml:space="preserve">Asian Development Bank (ADB) | </w:t>
       </w:r>
       <w:r>
         <w:rPr>
@@ -1351,7 +1368,7 @@
           <w:sz w:val="18"/>
           <w:szCs w:val="18"/>
         </w:rPr>
-        <w:t xml:space="preserve">August 2022 - January 2023  |  </w:t>
+        <w:t xml:space="preserve">August 2022 - January 2023 | </w:t>
       </w:r>
       <w:r>
         <w:rPr>
@@ -1385,6 +1402,7 @@
           <w:sz w:val="19"/>
           <w:szCs w:val="19"/>
         </w:rPr>
+        <w:t xml:space="preserve">Delivered high-level scoping, environmental and social baseline evaluations, and regulatory framework analysis for the ADB Energy Transition Mechanism (ETM) in Indonesia. Facilitated national multi-stakeholder SESA consultation workshops involving central ministries (ESDM, MoEF, Bappenas), PLN, IPPs, CSOs, and academic experts to ensure social equity and environmental safeguards during the early retirement and repurposing of coal-fired power plants.</w:t>
       </w:r>
     </w:p>
     <w:p>
@@ -1425,7 +1443,7 @@
           <w:sz w:val="18"/>
           <w:szCs w:val="18"/>
         </w:rPr>
-        <w:t xml:space="preserve">UNDP / ATSEA-2 Program  |  </w:t>
+        <w:t xml:space="preserve">UNDP / ATSEA-2 Program | </w:t>
       </w:r>
       <w:r>
         <w:rPr>
@@ -1445,7 +1463,7 @@
           <w:sz w:val="18"/>
           <w:szCs w:val="18"/>
         </w:rPr>
-        <w:t xml:space="preserve">November 2021 - September 2022  |  </w:t>
+        <w:t xml:space="preserve">November 2021 - September 2022 | </w:t>
       </w:r>
       <w:r>
         <w:rPr>
@@ -1479,6 +1497,7 @@
           <w:sz w:val="19"/>
           <w:szCs w:val="19"/>
         </w:rPr>
+        <w:t xml:space="preserve">Supported technical facilitation and Working Group (POKJA) coordination for the formal establishment of the 356,000-hectare Kolepom Island Marine Protected Area in Merauke District, South Papua. Authored technical resource potential reports, facilitated public consultations with indigenous coastal tribes, and drafted the MPA management and spatial zoning plan formally gazetted by the Ministry of Marine Affairs and Fisheries (KKP).</w:t>
       </w:r>
     </w:p>
     <w:p>
@@ -1519,7 +1538,7 @@
           <w:sz w:val="18"/>
           <w:szCs w:val="18"/>
         </w:rPr>
-        <w:t xml:space="preserve">World Bank Group  |  </w:t>
+        <w:t xml:space="preserve">World Bank Group | </w:t>
       </w:r>
       <w:r>
         <w:rPr>
@@ -1539,7 +1558,7 @@
           <w:sz w:val="18"/>
           <w:szCs w:val="18"/>
         </w:rPr>
-        <w:t xml:space="preserve">September 2020 - September 2022  |  </w:t>
+        <w:t xml:space="preserve">September 2020 - September 2022 | </w:t>
       </w:r>
       <w:r>
         <w:rPr>
@@ -1573,6 +1592,7 @@
           <w:sz w:val="19"/>
           <w:szCs w:val="19"/>
         </w:rPr>
+        <w:t xml:space="preserve">Prepared foundational analytical studies and project design components for the World Bank Oceans for Prosperity Program (LAUTRA - USD 210M). Addressed fisheries governance reforms, coastal poverty alleviation, marine spatial planning, and sustainable value chain investments across Fisheries Management Areas (WPPNRI 715, 718, and 573).</w:t>
       </w:r>
     </w:p>
     <w:p>
@@ -1613,7 +1633,7 @@
           <w:sz w:val="18"/>
           <w:szCs w:val="18"/>
         </w:rPr>
-        <w:t xml:space="preserve">World Bank Group / Poseidon Aquatic Resource Management  |  </w:t>
+        <w:t xml:space="preserve">World Bank Group / Poseidon Aquatic Resource Management | </w:t>
       </w:r>
       <w:r>
         <w:rPr>
@@ -1633,7 +1653,7 @@
           <w:sz w:val="18"/>
           <w:szCs w:val="18"/>
         </w:rPr>
-        <w:t xml:space="preserve">August 2020 - August 2022  |  </w:t>
+        <w:t xml:space="preserve">August 2020 - August 2022 | </w:t>
       </w:r>
       <w:r>
         <w:rPr>
@@ -1667,6 +1687,7 @@
           <w:sz w:val="19"/>
           <w:szCs w:val="19"/>
         </w:rPr>
+        <w:t xml:space="preserve">Conducted a nationwide pre-feasibility assessment on the retrieval, circular recycling, and port reception facilities for Abandoned, Lost, and Discarded Fishing Gear (ALDFG) and plastic waste generated by intensive shrimp and fish aquaculture. Formulated actionable policy roadmaps and circular economy interventions for the Ministry of Marine Affairs and Fisheries and donor agencies.</w:t>
       </w:r>
     </w:p>
     <w:p>
@@ -1707,7 +1728,7 @@
           <w:sz w:val="18"/>
           <w:szCs w:val="18"/>
         </w:rPr>
-        <w:t xml:space="preserve">World Bank Group / GEF  |  </w:t>
+        <w:t xml:space="preserve">World Bank Group / GEF | </w:t>
       </w:r>
       <w:r>
         <w:rPr>
@@ -1727,7 +1748,7 @@
           <w:sz w:val="18"/>
           <w:szCs w:val="18"/>
         </w:rPr>
-        <w:t xml:space="preserve">June 2020 - September 2022  |  </w:t>
+        <w:t xml:space="preserve">June 2020 - September 2022 | </w:t>
       </w:r>
       <w:r>
         <w:rPr>
@@ -1761,6 +1782,7 @@
           <w:sz w:val="19"/>
           <w:szCs w:val="19"/>
         </w:rPr>
+        <w:t xml:space="preserve">Supported business incubation, investment pitch development, and environmental-social due diligence for sustainable coastal fisheries enterprises under the GEF-World Bank CFI Challenge Fund. Evaluated SME business models in sustainable tuna, mud crab, and seaweed sectors to unlock private capital and impact investment.</w:t>
       </w:r>
     </w:p>
     <w:p>
@@ -1801,7 +1823,7 @@
           <w:sz w:val="18"/>
           <w:szCs w:val="18"/>
         </w:rPr>
-        <w:t xml:space="preserve">Food and Agriculture Organization (FAO)  |  </w:t>
+        <w:t xml:space="preserve">Food and Agriculture Organization (FAO) | </w:t>
       </w:r>
       <w:r>
         <w:rPr>
@@ -1821,7 +1843,7 @@
           <w:sz w:val="18"/>
           <w:szCs w:val="18"/>
         </w:rPr>
-        <w:t xml:space="preserve">June 2020 - March 2022  |  </w:t>
+        <w:t xml:space="preserve">June 2020 - March 2022 | </w:t>
       </w:r>
       <w:r>
         <w:rPr>
@@ -1855,6 +1877,7 @@
           <w:sz w:val="19"/>
           <w:szCs w:val="19"/>
         </w:rPr>
+        <w:t xml:space="preserve">Authored specialized thematic diagnostic chapters on oceanographic baseline conditions, fisheries resources, marine environmental degradation, and governance frameworks for the Indonesian Seas Large Marine Ecosystem (ISLME) spanning Indonesia and Timor-Leste, establishing the scientific baseline for the regional Strategic Action Programme (SAP).</w:t>
       </w:r>
     </w:p>
     <w:p>
@@ -1895,7 +1918,7 @@
           <w:sz w:val="18"/>
           <w:szCs w:val="18"/>
         </w:rPr>
-        <w:t xml:space="preserve">Agence Française de Développement (AFD)  |  </w:t>
+        <w:t xml:space="preserve">Agence Française de Développement (AFD) | </w:t>
       </w:r>
       <w:r>
         <w:rPr>
@@ -1915,7 +1938,7 @@
           <w:sz w:val="18"/>
           <w:szCs w:val="18"/>
         </w:rPr>
-        <w:t xml:space="preserve">March 2021 - October 2022  |  </w:t>
+        <w:t xml:space="preserve">March 2021 - October 2022 | </w:t>
       </w:r>
       <w:r>
         <w:rPr>
@@ -1949,6 +1972,7 @@
           <w:sz w:val="19"/>
           <w:szCs w:val="19"/>
         </w:rPr>
+        <w:t xml:space="preserve">Served as National Focal Point, led environmental, social, climate resilience, and gender safeguard preparation studies for the USD 111M AFD-funded Eco-Fishing Ports Modernization Project across four strategic national fishing ports (PPS Kendari, PPS Cilacap, PPN Belawan, and PPN Sibolga). Formulated ESIA terms of reference, climate vulnerability profiles, and port decarbonization action plans.</w:t>
       </w:r>
     </w:p>
     <w:p>
@@ -1989,7 +2013,7 @@
           <w:sz w:val="18"/>
           <w:szCs w:val="18"/>
         </w:rPr>
-        <w:t xml:space="preserve">Inmarsat (UK) / MMAF  |  </w:t>
+        <w:t xml:space="preserve">Inmarsat (UK) / MMAF | </w:t>
       </w:r>
       <w:r>
         <w:rPr>
@@ -2009,7 +2033,7 @@
           <w:sz w:val="18"/>
           <w:szCs w:val="18"/>
         </w:rPr>
-        <w:t xml:space="preserve">December 2021 - March 2022  |  </w:t>
+        <w:t xml:space="preserve">December 2021 - March 2022 | </w:t>
       </w:r>
       <w:r>
         <w:rPr>
@@ -2043,6 +2067,7 @@
           <w:sz w:val="19"/>
           <w:szCs w:val="19"/>
         </w:rPr>
+        <w:t xml:space="preserve">Developed impact evaluation benefit stories, socio-economic surveys, and case studies demonstrating the tangible safety-at-sea, operational efficiency, and catch reporting benefits of low-cost satellite Vessel Monitoring Systems (VMS) deployed on small-scale fishing vessels (&lt;30 GT) across Indonesian coastal communities.</w:t>
       </w:r>
     </w:p>
     <w:p>
@@ -2083,7 +2108,7 @@
           <w:sz w:val="18"/>
           <w:szCs w:val="18"/>
         </w:rPr>
-        <w:t xml:space="preserve">Inmarsat (UK) / UK Space Agency  |  </w:t>
+        <w:t xml:space="preserve">Inmarsat (UK) / UK Space Agency | </w:t>
       </w:r>
       <w:r>
         <w:rPr>
@@ -2103,7 +2128,7 @@
           <w:sz w:val="18"/>
           <w:szCs w:val="18"/>
         </w:rPr>
-        <w:t xml:space="preserve">August 2018 - October 2019  |  </w:t>
+        <w:t xml:space="preserve">August 2018 - October 2019 | </w:t>
       </w:r>
       <w:r>
         <w:rPr>
@@ -2137,6 +2162,7 @@
           <w:sz w:val="19"/>
           <w:szCs w:val="19"/>
         </w:rPr>
+        <w:t xml:space="preserve">Coordinated technical deployment, transceiver installation, API data pipeline integration, and user capacity building for advanced satellite VMS terminals across 400 commercial fishing vessels (20-30 GT and &gt;30 GT) to strengthen national fisheries surveillance and combat Illegal, Unreported, and Unregulated (IUU) fishing.</w:t>
       </w:r>
     </w:p>
     <w:p>
@@ -2177,7 +2203,7 @@
           <w:sz w:val="18"/>
           <w:szCs w:val="18"/>
         </w:rPr>
-        <w:t xml:space="preserve">Inmarsat (UK)  |  </w:t>
+        <w:t xml:space="preserve">Inmarsat (UK) | </w:t>
       </w:r>
       <w:r>
         <w:rPr>
@@ -2197,7 +2223,7 @@
           <w:sz w:val="18"/>
           <w:szCs w:val="18"/>
         </w:rPr>
-        <w:t xml:space="preserve">October 2017 - October 2019  |  </w:t>
+        <w:t xml:space="preserve">October 2017 - October 2019 | </w:t>
       </w:r>
       <w:r>
         <w:rPr>
@@ -2231,6 +2257,7 @@
           <w:sz w:val="19"/>
           <w:szCs w:val="19"/>
         </w:rPr>
+        <w:t xml:space="preserve">Designed spatial specifications and user workflows for an automated web-based geofencing application integrating satellite VMS vessel telemetry with national Marine Protected Area boundaries, enabling real-time alerting for unauthorized incursions and spatial fisheries compliance.</w:t>
       </w:r>
     </w:p>
     <w:p>
@@ -2271,7 +2298,7 @@
           <w:sz w:val="18"/>
           <w:szCs w:val="18"/>
         </w:rPr>
-        <w:t xml:space="preserve">PT Indonesia Power  |  </w:t>
+        <w:t xml:space="preserve">PT Indonesia Power | </w:t>
       </w:r>
       <w:r>
         <w:rPr>
@@ -2291,7 +2318,7 @@
           <w:sz w:val="18"/>
           <w:szCs w:val="18"/>
         </w:rPr>
-        <w:t xml:space="preserve">January - November 2022  |  </w:t>
+        <w:t xml:space="preserve">January - November 2022 | </w:t>
       </w:r>
       <w:r>
         <w:rPr>
@@ -2325,6 +2352,7 @@
           <w:sz w:val="19"/>
           <w:szCs w:val="19"/>
         </w:rPr>
+        <w:t xml:space="preserve">Executed independent monitoring and technical compliance verification against the Environmental and Social Action Plan (ESAP) for the 780 MW Block 3 Combined Cycle Power Plant (CCPP) project in Tambak Lorok, Semarang, ensuring compliance with international lender standards (World Bank/IFC Performance Standards).</w:t>
       </w:r>
     </w:p>
     <w:p>
@@ -2365,7 +2393,7 @@
           <w:sz w:val="18"/>
           <w:szCs w:val="18"/>
         </w:rPr>
-        <w:t xml:space="preserve">MCC Environmental (Australia)  |  </w:t>
+        <w:t xml:space="preserve">MCC Environmental (Australia) | </w:t>
       </w:r>
       <w:r>
         <w:rPr>
@@ -2385,7 +2413,7 @@
           <w:sz w:val="18"/>
           <w:szCs w:val="18"/>
         </w:rPr>
-        <w:t xml:space="preserve">October 2021 - January 2022  |  </w:t>
+        <w:t xml:space="preserve">October 2021 - January 2022 | </w:t>
       </w:r>
       <w:r>
         <w:rPr>
@@ -2419,6 +2447,7 @@
           <w:sz w:val="19"/>
           <w:szCs w:val="19"/>
         </w:rPr>
+        <w:t xml:space="preserve">Provided marine ecology expertise for the Buffalo-10 Offshore Drilling Campaign in the Timor Sea. Formulated Shoreline Cleanup Assessment Technique (SCAT) protocols and marine fauna sensitivity baseline profiles (cetaceans, marine turtles, and seabirds) for cross-border environmental risk preparedness in Indonesia and Timor-Leste waters.</w:t>
       </w:r>
     </w:p>
     <w:p>
@@ -2459,7 +2488,7 @@
           <w:sz w:val="18"/>
           <w:szCs w:val="18"/>
         </w:rPr>
-        <w:t xml:space="preserve">Penta Ocean Construction  |  </w:t>
+        <w:t xml:space="preserve">Penta Ocean Construction | </w:t>
       </w:r>
       <w:r>
         <w:rPr>
@@ -2479,7 +2508,7 @@
           <w:sz w:val="18"/>
           <w:szCs w:val="18"/>
         </w:rPr>
-        <w:t xml:space="preserve">July 2018 - August 2019  |  </w:t>
+        <w:t xml:space="preserve">July 2018 - August 2019 | </w:t>
       </w:r>
       <w:r>
         <w:rPr>
@@ -2513,6 +2542,7 @@
           <w:sz w:val="19"/>
           <w:szCs w:val="19"/>
         </w:rPr>
+        <w:t xml:space="preserve">Managed and executed monthly marine environmental compliance monitoring during the Phase 1 construction of Patimban Deep-Sea Port in Subang, West Java. Led offshore sampling and laboratory analysis of seawater physicochemical quality, heavy metal sediment chemistry, benthic infauna diversity, and nekton community dynamics.</w:t>
       </w:r>
     </w:p>
     <w:p>
@@ -2553,7 +2583,7 @@
           <w:sz w:val="18"/>
           <w:szCs w:val="18"/>
         </w:rPr>
-        <w:t xml:space="preserve">Walton Family Foundation  |  </w:t>
+        <w:t xml:space="preserve">Walton Family Foundation | </w:t>
       </w:r>
       <w:r>
         <w:rPr>
@@ -2573,7 +2603,7 @@
           <w:sz w:val="18"/>
           <w:szCs w:val="18"/>
         </w:rPr>
-        <w:t xml:space="preserve">August 2019 - January 2022  |  </w:t>
+        <w:t xml:space="preserve">August 2019 - January 2022 | </w:t>
       </w:r>
       <w:r>
         <w:rPr>
@@ -2607,6 +2637,7 @@
           <w:sz w:val="19"/>
           <w:szCs w:val="19"/>
         </w:rPr>
+        <w:t xml:space="preserve">Developed an accredited blended-learning vocational curriculum and digital standard operating procedure (SOP) quality control platform for commercial shrimp aquaculture, applying Human-Centered Design (HCD) methodologies with over 30 shrimp farm operators across Java and Bali.</w:t>
       </w:r>
     </w:p>
     <w:p>
@@ -2647,7 +2678,7 @@
           <w:sz w:val="18"/>
           <w:szCs w:val="18"/>
         </w:rPr>
-        <w:t xml:space="preserve">Walton Family Foundation  |  </w:t>
+        <w:t xml:space="preserve">Walton Family Foundation | </w:t>
       </w:r>
       <w:r>
         <w:rPr>
@@ -2667,7 +2698,7 @@
           <w:sz w:val="18"/>
           <w:szCs w:val="18"/>
         </w:rPr>
-        <w:t xml:space="preserve">August 2018 - January 2021  |  </w:t>
+        <w:t xml:space="preserve">August 2018 - January 2021 | </w:t>
       </w:r>
       <w:r>
         <w:rPr>
@@ -2701,6 +2732,7 @@
           <w:sz w:val="19"/>
           <w:szCs w:val="19"/>
         </w:rPr>
+        <w:t xml:space="preserve">Spearheaded user research, product prototyping, and field testing for an IoT-enabled aquaculture farm management platform combining real-time water quality sensors (DO, pH, salinity, temperature) with a farmer-facing mobile app for predictive disease prevention and feed optimization.</w:t>
       </w:r>
     </w:p>
     <w:p>
@@ -2741,7 +2773,7 @@
           <w:sz w:val="18"/>
           <w:szCs w:val="18"/>
         </w:rPr>
-        <w:t xml:space="preserve">PT Hatfield Indonesia / Marine &amp; Fisheries Partners  |  </w:t>
+        <w:t xml:space="preserve">PT Hatfield Indonesia / Marine &amp; Fisheries Partners | </w:t>
       </w:r>
       <w:r>
         <w:rPr>
@@ -2761,7 +2793,7 @@
           <w:sz w:val="18"/>
           <w:szCs w:val="18"/>
         </w:rPr>
-        <w:t xml:space="preserve">2021 - 2022  |  </w:t>
+        <w:t xml:space="preserve">2021 - 2022 | </w:t>
       </w:r>
       <w:r>
         <w:rPr>
@@ -2795,6 +2827,7 @@
           <w:sz w:val="19"/>
           <w:szCs w:val="19"/>
         </w:rPr>
+        <w:t xml:space="preserve">Authored an in-depth technical report analyzing the biology, stock status, artisanal catch dynamics, cold chain infrastructure, and international export trade routes of Indonesian octopus fisheries (Octopus cyanea and Octopus vulgaris), identifying key pathways for MSC certification and Fisheries Improvement Projects (FIP).</w:t>
       </w:r>
     </w:p>
     <w:p>
@@ -2835,7 +2868,7 @@
           <w:sz w:val="18"/>
           <w:szCs w:val="18"/>
         </w:rPr>
-        <w:t xml:space="preserve">PT Hatfield Indonesia / Marine &amp; Fisheries Partners  |  </w:t>
+        <w:t xml:space="preserve">PT Hatfield Indonesia / Marine &amp; Fisheries Partners | </w:t>
       </w:r>
       <w:r>
         <w:rPr>
@@ -2855,7 +2888,7 @@
           <w:sz w:val="18"/>
           <w:szCs w:val="18"/>
         </w:rPr>
-        <w:t xml:space="preserve">2020 - 2022  |  </w:t>
+        <w:t xml:space="preserve">2020 - 2022 | </w:t>
       </w:r>
       <w:r>
         <w:rPr>
@@ -2889,6 +2922,7 @@
           <w:sz w:val="19"/>
           <w:szCs w:val="19"/>
         </w:rPr>
+        <w:t xml:space="preserve">Conducted field supply chain mapping and market flow analysis for Eastern Little Tuna (Euthynnus affinis) across major landing sites in Indonesia. Evaluated cold chain bottlenecks, post-harvest quality degradation, pricing asymmetries, and socio-economic welfare of coastal smallholder fishing households.</w:t>
       </w:r>
     </w:p>
     <w:p>
@@ -2929,7 +2963,7 @@
           <w:sz w:val="18"/>
           <w:szCs w:val="18"/>
         </w:rPr>
-        <w:t xml:space="preserve">PT Hatfield Indonesia / Conservation Partners  |  </w:t>
+        <w:t xml:space="preserve">PT Hatfield Indonesia / Conservation Partners | </w:t>
       </w:r>
       <w:r>
         <w:rPr>
@@ -2949,7 +2983,7 @@
           <w:sz w:val="18"/>
           <w:szCs w:val="18"/>
         </w:rPr>
-        <w:t xml:space="preserve">2019 - 2021  |  </w:t>
+        <w:t xml:space="preserve">2019 - 2021 | </w:t>
       </w:r>
       <w:r>
         <w:rPr>
@@ -2983,6 +3017,7 @@
           <w:sz w:val="19"/>
           <w:szCs w:val="19"/>
         </w:rPr>
+        <w:t xml:space="preserve">Conducted scientific risk modeling and field investigations on acoustic disturbance, vessel strike vulnerability, and bycatch entanglement risks for cetaceans and dugongs interacting with commercial purse seine, longline, and artisanal fisheries in Indonesian seas, developing practical mitigation strategies to minimize fishery-mammal interactions.</w:t>
       </w:r>
     </w:p>
     <w:p>
@@ -3023,7 +3058,7 @@
           <w:sz w:val="18"/>
           <w:szCs w:val="18"/>
         </w:rPr>
-        <w:t xml:space="preserve">Walton Family Foundation / PT Hatfield Indonesia  |  </w:t>
+        <w:t xml:space="preserve">Walton Family Foundation / PT Hatfield Indonesia | </w:t>
       </w:r>
       <w:r>
         <w:rPr>
@@ -3043,7 +3078,7 @@
           <w:sz w:val="18"/>
           <w:szCs w:val="18"/>
         </w:rPr>
-        <w:t xml:space="preserve">2020 - 2022  |  </w:t>
+        <w:t xml:space="preserve">2020 - 2022 | </w:t>
       </w:r>
       <w:r>
         <w:rPr>
@@ -3077,6 +3112,7 @@
           <w:sz w:val="19"/>
           <w:szCs w:val="19"/>
         </w:rPr>
+        <w:t xml:space="preserve">Formulated a multi-year philanthropic investment strategy and intervention roadmap for WFF's marine portfolio, targeting rights-based fisheries management, harvest control rules, digital traceability, and coastal community empowerment in Indonesian tuna fisheries.</w:t>
       </w:r>
     </w:p>
     <w:p>
@@ -3117,7 +3153,7 @@
           <w:sz w:val="18"/>
           <w:szCs w:val="18"/>
         </w:rPr>
-        <w:t xml:space="preserve">PT Hatfield Indonesia / Aquaculture Development Partners  |  </w:t>
+        <w:t xml:space="preserve">PT Hatfield Indonesia / Aquaculture Development Partners | </w:t>
       </w:r>
       <w:r>
         <w:rPr>
@@ -3137,7 +3173,7 @@
           <w:sz w:val="18"/>
           <w:szCs w:val="18"/>
         </w:rPr>
-        <w:t xml:space="preserve">2020 - 2021  |  </w:t>
+        <w:t xml:space="preserve">2020 - 2021 | </w:t>
       </w:r>
       <w:r>
         <w:rPr>
@@ -3171,6 +3207,7 @@
           <w:sz w:val="19"/>
           <w:szCs w:val="19"/>
         </w:rPr>
+        <w:t xml:space="preserve">Delivered a strategic scoping assessment analyzing bankable investment opportunities, technological scalability, biosecurity risks, and environmental sustainability in Indonesia's brackish water shrimp, marine finfish, and seaweed aquaculture sectors.</w:t>
       </w:r>
     </w:p>
     <w:p>
@@ -3211,7 +3248,7 @@
           <w:sz w:val="18"/>
           <w:szCs w:val="18"/>
         </w:rPr>
-        <w:t xml:space="preserve">PT Hatfield Indonesia / FIP Partners  |  </w:t>
+        <w:t xml:space="preserve">PT Hatfield Indonesia / FIP Partners | </w:t>
       </w:r>
       <w:r>
         <w:rPr>
@@ -3231,7 +3268,7 @@
           <w:sz w:val="18"/>
           <w:szCs w:val="18"/>
         </w:rPr>
-        <w:t xml:space="preserve">2020 - 2022  |  </w:t>
+        <w:t xml:space="preserve">2020 - 2022 | </w:t>
       </w:r>
       <w:r>
         <w:rPr>
@@ -3265,6 +3302,7 @@
           <w:sz w:val="19"/>
           <w:szCs w:val="19"/>
         </w:rPr>
+        <w:t xml:space="preserve">Conducted a detailed technical review and Marine Stewardship Council (MSC) pre-assessment of Indonesia's industrial and semi-industrial tuna purse seine fleet, developing time-bound Action Plans for harvest strategy compliance, FAD management, and bycatch reduction.</w:t>
       </w:r>
     </w:p>
     <w:p>
@@ -3305,7 +3343,7 @@
           <w:sz w:val="18"/>
           <w:szCs w:val="18"/>
         </w:rPr>
-        <w:t xml:space="preserve">Agence Française de Développement (AFD) / PT Hatfield Indonesia  |  </w:t>
+        <w:t xml:space="preserve">Agence Française de Développement (AFD) / PT Hatfield Indonesia | </w:t>
       </w:r>
       <w:r>
         <w:rPr>
@@ -3325,7 +3363,7 @@
           <w:sz w:val="18"/>
           <w:szCs w:val="18"/>
         </w:rPr>
-        <w:t xml:space="preserve">2021 - 2022  |  </w:t>
+        <w:t xml:space="preserve">2021 - 2022 | </w:t>
       </w:r>
       <w:r>
         <w:rPr>
@@ -3359,6 +3397,7 @@
           <w:sz w:val="19"/>
           <w:szCs w:val="19"/>
         </w:rPr>
+        <w:t xml:space="preserve">Authored the full Environmental and Social Impact Assessment (ESIA), Environmental and Social Management Plan (ESMP), and Stakeholder Engagement Plan (SEP) for the major modernization and infrastructure expansion of PPS Kendari funded by AFD.</w:t>
       </w:r>
     </w:p>
     <w:p>
@@ -3399,7 +3438,7 @@
           <w:sz w:val="18"/>
           <w:szCs w:val="18"/>
         </w:rPr>
-        <w:t xml:space="preserve">AFD / PT Hatfield Indonesia  |  </w:t>
+        <w:t xml:space="preserve">AFD / PT Hatfield Indonesia | </w:t>
       </w:r>
       <w:r>
         <w:rPr>
@@ -3419,7 +3458,7 @@
           <w:sz w:val="18"/>
           <w:szCs w:val="18"/>
         </w:rPr>
-        <w:t xml:space="preserve">2021 - 2022  |  </w:t>
+        <w:t xml:space="preserve">2021 - 2022 | </w:t>
       </w:r>
       <w:r>
         <w:rPr>
@@ -3453,6 +3492,7 @@
           <w:sz w:val="19"/>
           <w:szCs w:val="19"/>
         </w:rPr>
+        <w:t xml:space="preserve">Executed extensive socio-economic field surveys, gender vulnerability analyses, and stakeholder consultation matrices for the modernization of Cilacap Oceanic Fishing Port (PPS Cilacap), formulating inclusive resettlement frameworks and women-empowerment livelihood strategies.</w:t>
       </w:r>
     </w:p>
     <w:p>
@@ -3493,7 +3533,7 @@
           <w:sz w:val="18"/>
           <w:szCs w:val="18"/>
         </w:rPr>
-        <w:t xml:space="preserve">UNDP / PT Hatfield Indonesia  |  </w:t>
+        <w:t xml:space="preserve">UNDP / PT Hatfield Indonesia | </w:t>
       </w:r>
       <w:r>
         <w:rPr>
@@ -3513,7 +3553,7 @@
           <w:sz w:val="18"/>
           <w:szCs w:val="18"/>
         </w:rPr>
-        <w:t xml:space="preserve">2021 - 2022  |  </w:t>
+        <w:t xml:space="preserve">2021 - 2022 | </w:t>
       </w:r>
       <w:r>
         <w:rPr>
@@ -3547,6 +3587,7 @@
           <w:sz w:val="19"/>
           <w:szCs w:val="19"/>
         </w:rPr>
+        <w:t xml:space="preserve">Formulated the comprehensive technical zoning document and 20-year spatial management plan for the 356,000-hectare Kolepom Island MPA in South Papua, integrating core conservation zones, limited utilization zones for indigenous artisanal fisheries, and other sustainable use sub-zones.</w:t>
       </w:r>
     </w:p>
     <w:p>
@@ -3587,7 +3628,7 @@
           <w:sz w:val="18"/>
           <w:szCs w:val="18"/>
         </w:rPr>
-        <w:t xml:space="preserve">The Nature Conservancy (TNC)  |  </w:t>
+        <w:t xml:space="preserve">The Nature Conservancy (TNC) | </w:t>
       </w:r>
       <w:r>
         <w:rPr>
@@ -3607,7 +3648,7 @@
           <w:sz w:val="18"/>
           <w:szCs w:val="18"/>
         </w:rPr>
-        <w:t xml:space="preserve">January - December 2017  |  </w:t>
+        <w:t xml:space="preserve">January - December 2017 | </w:t>
       </w:r>
       <w:r>
         <w:rPr>
@@ -3641,6 +3682,7 @@
           <w:sz w:val="19"/>
           <w:szCs w:val="19"/>
         </w:rPr>
+        <w:t xml:space="preserve">Led the technical implementation of low-cost marine bioacoustic surveys and hydroacoustic telemetry beneath Fish Aggregating Devices (FADs / Rumpon) to quantify juvenile tuna biomass and deep-water pelagic schooling behavior. Integrated hydroacoustic data with on-board Captain-Operated Data Recording Systems (CODRS) and length-based spawning potential ratio (SPR) assessments to formulate policy briefs on voluntary FAD management guidelines and harvest strategy compliance in Indonesian tuna fisheries.</w:t>
       </w:r>
     </w:p>
     <w:p>
@@ -3681,7 +3723,7 @@
           <w:sz w:val="18"/>
           <w:szCs w:val="18"/>
         </w:rPr>
-        <w:t xml:space="preserve">Total E&amp;P Indonesie Mentawai B.V. / PPLH IPB  |  </w:t>
+        <w:t xml:space="preserve">Total E&amp;P Indonesie Mentawai B.V. / PPLH IPB | </w:t>
       </w:r>
       <w:r>
         <w:rPr>
@@ -3701,7 +3743,7 @@
           <w:sz w:val="18"/>
           <w:szCs w:val="18"/>
         </w:rPr>
-        <w:t xml:space="preserve">December 2015 - January 2016  |  </w:t>
+        <w:t xml:space="preserve">December 2015 - January 2016 | </w:t>
       </w:r>
       <w:r>
         <w:rPr>
@@ -3735,6 +3777,7 @@
           <w:sz w:val="19"/>
           <w:szCs w:val="19"/>
         </w:rPr>
+        <w:t xml:space="preserve">Led technical health, safety, and environmental (HSE) protocols and JNCC-compliant Marine Mammal Observation (MMO) with dedicated visual observation during the deep-water 3D marine seismic survey using airgun arrays in the Total E&amp;P Indonesie Mentawai B.V. Block (Indian Ocean). Executed 360-degree pre-shooting visual scans, enforced safety exclusion zones, managed soft-start ramp-up procedures to prevent acoustic trauma to marine mammals, and delivered daily environmental compliance reports to the Party Chief and international operators.</w:t>
       </w:r>
     </w:p>
     <w:p>
@@ -3774,16 +3817,16 @@
     </w:p>
     <w:p>
       <w:pPr>
-        <w:spacing w:after="60" w:before="10"/>
-      </w:pPr>
-      <w:r>
-        <w:rPr>
-          <w:rFonts w:ascii="Arial" w:cs="Arial" w:eastAsia="Arial" w:hAnsi="Arial"/>
-          <w:color w:val="1E293B"/>
-          <w:sz w:val="18"/>
-          <w:szCs w:val="18"/>
-        </w:rPr>
-        <w:t xml:space="preserve">undefined (2019). </w:t>
+        <w:spacing w:after="30" w:before="10"/>
+      </w:pPr>
+      <w:r>
+        <w:rPr>
+          <w:rFonts w:ascii="Arial" w:cs="Arial" w:eastAsia="Arial" w:hAnsi="Arial"/>
+          <w:color w:val="1E293B"/>
+          <w:sz w:val="18"/>
+          <w:szCs w:val="18"/>
+        </w:rPr>
+        <w:t xml:space="preserve">(2019). </w:t>
       </w:r>
       <w:r>
         <w:rPr>
@@ -3808,6 +3851,20 @@
     </w:p>
     <w:p>
       <w:pPr>
+        <w:spacing w:after="60" w:before="10"/>
+      </w:pPr>
+      <w:r>
+        <w:rPr>
+          <w:rFonts w:ascii="Arial" w:cs="Arial" w:eastAsia="Arial" w:hAnsi="Arial"/>
+          <w:color w:val="1E293B"/>
+          <w:sz w:val="18"/>
+          <w:szCs w:val="18"/>
+        </w:rPr>
+        <w:t xml:space="preserve">Research paper assessing spatial interactions and mitigation strategies between marine mammal populations and industrial tuna longline fisheries across Indonesian fishing zones.</w:t>
+      </w:r>
+    </w:p>
+    <w:p>
+      <w:pPr>
         <w:spacing w:after="20" w:before="70"/>
       </w:pPr>
       <w:r>
@@ -3824,16 +3881,16 @@
     </w:p>
     <w:p>
       <w:pPr>
-        <w:spacing w:after="60" w:before="10"/>
-      </w:pPr>
-      <w:r>
-        <w:rPr>
-          <w:rFonts w:ascii="Arial" w:cs="Arial" w:eastAsia="Arial" w:hAnsi="Arial"/>
-          <w:color w:val="1E293B"/>
-          <w:sz w:val="18"/>
-          <w:szCs w:val="18"/>
-        </w:rPr>
-        <w:t xml:space="preserve">undefined (2016). </w:t>
+        <w:spacing w:after="30" w:before="10"/>
+      </w:pPr>
+      <w:r>
+        <w:rPr>
+          <w:rFonts w:ascii="Arial" w:cs="Arial" w:eastAsia="Arial" w:hAnsi="Arial"/>
+          <w:color w:val="1E293B"/>
+          <w:sz w:val="18"/>
+          <w:szCs w:val="18"/>
+        </w:rPr>
+        <w:t xml:space="preserve">(2016). </w:t>
       </w:r>
       <w:r>
         <w:rPr>
@@ -3858,6 +3915,20 @@
     </w:p>
     <w:p>
       <w:pPr>
+        <w:spacing w:after="60" w:before="10"/>
+      </w:pPr>
+      <w:r>
+        <w:rPr>
+          <w:rFonts w:ascii="Arial" w:cs="Arial" w:eastAsia="Arial" w:hAnsi="Arial"/>
+          <w:color w:val="1E293B"/>
+          <w:sz w:val="18"/>
+          <w:szCs w:val="18"/>
+        </w:rPr>
+        <w:t xml:space="preserve">Comprehensive peer-reviewed book chapter and field study documenting the distribution, ecology, and conservation status of Australian humpback dolphins in the Pacific and New Guinea.</w:t>
+      </w:r>
+    </w:p>
+    <w:p>
+      <w:pPr>
         <w:spacing w:after="20" w:before="70"/>
       </w:pPr>
       <w:r>
@@ -3874,16 +3945,16 @@
     </w:p>
     <w:p>
       <w:pPr>
-        <w:spacing w:after="60" w:before="10"/>
-      </w:pPr>
-      <w:r>
-        <w:rPr>
-          <w:rFonts w:ascii="Arial" w:cs="Arial" w:eastAsia="Arial" w:hAnsi="Arial"/>
-          <w:color w:val="1E293B"/>
-          <w:sz w:val="18"/>
-          <w:szCs w:val="18"/>
-        </w:rPr>
-        <w:t xml:space="preserve">undefined (2013). </w:t>
+        <w:spacing w:after="30" w:before="10"/>
+      </w:pPr>
+      <w:r>
+        <w:rPr>
+          <w:rFonts w:ascii="Arial" w:cs="Arial" w:eastAsia="Arial" w:hAnsi="Arial"/>
+          <w:color w:val="1E293B"/>
+          <w:sz w:val="18"/>
+          <w:szCs w:val="18"/>
+        </w:rPr>
+        <w:t xml:space="preserve">(2013). </w:t>
       </w:r>
       <w:r>
         <w:rPr>
@@ -3908,6 +3979,20 @@
     </w:p>
     <w:p>
       <w:pPr>
+        <w:spacing w:after="60" w:before="10"/>
+      </w:pPr>
+      <w:r>
+        <w:rPr>
+          <w:rFonts w:ascii="Arial" w:cs="Arial" w:eastAsia="Arial" w:hAnsi="Arial"/>
+          <w:color w:val="1E293B"/>
+          <w:sz w:val="18"/>
+          <w:szCs w:val="18"/>
+        </w:rPr>
+        <w:t xml:space="preserve">Undergraduate research in marine geophysics and seismic data processing applying Radon Transform (Tau-P Analysis) to attenuate surface multiples on 2D marine seismic line SUME23.31 in West Sumatra waters.</w:t>
+      </w:r>
+    </w:p>
+    <w:p>
+      <w:pPr>
         <w:spacing w:after="20" w:before="70"/>
       </w:pPr>
       <w:r>
@@ -3924,16 +4009,16 @@
     </w:p>
     <w:p>
       <w:pPr>
-        <w:spacing w:after="60" w:before="10"/>
-      </w:pPr>
-      <w:r>
-        <w:rPr>
-          <w:rFonts w:ascii="Arial" w:cs="Arial" w:eastAsia="Arial" w:hAnsi="Arial"/>
-          <w:color w:val="1E293B"/>
-          <w:sz w:val="18"/>
-          <w:szCs w:val="18"/>
-        </w:rPr>
-        <w:t xml:space="preserve">undefined (2012). </w:t>
+        <w:spacing w:after="30" w:before="10"/>
+      </w:pPr>
+      <w:r>
+        <w:rPr>
+          <w:rFonts w:ascii="Arial" w:cs="Arial" w:eastAsia="Arial" w:hAnsi="Arial"/>
+          <w:color w:val="1E293B"/>
+          <w:sz w:val="18"/>
+          <w:szCs w:val="18"/>
+        </w:rPr>
+        <w:t xml:space="preserve">(2012). </w:t>
       </w:r>
       <w:r>
         <w:rPr>
@@ -3958,6 +4043,20 @@
     </w:p>
     <w:p>
       <w:pPr>
+        <w:spacing w:after="60" w:before="10"/>
+      </w:pPr>
+      <w:r>
+        <w:rPr>
+          <w:rFonts w:ascii="Arial" w:cs="Arial" w:eastAsia="Arial" w:hAnsi="Arial"/>
+          <w:color w:val="1E293B"/>
+          <w:sz w:val="18"/>
+          <w:szCs w:val="18"/>
+        </w:rPr>
+        <w:t xml:space="preserve">National award-winning research innovation on passive acoustic detection and bioacoustic monitoring for fish productivity.</w:t>
+      </w:r>
+    </w:p>
+    <w:p>
+      <w:pPr>
         <w:spacing w:after="20" w:before="70"/>
       </w:pPr>
       <w:r>
@@ -3974,16 +4073,16 @@
     </w:p>
     <w:p>
       <w:pPr>
-        <w:spacing w:after="60" w:before="10"/>
-      </w:pPr>
-      <w:r>
-        <w:rPr>
-          <w:rFonts w:ascii="Arial" w:cs="Arial" w:eastAsia="Arial" w:hAnsi="Arial"/>
-          <w:color w:val="1E293B"/>
-          <w:sz w:val="18"/>
-          <w:szCs w:val="18"/>
-        </w:rPr>
-        <w:t xml:space="preserve">undefined (2012). </w:t>
+        <w:spacing w:after="30" w:before="10"/>
+      </w:pPr>
+      <w:r>
+        <w:rPr>
+          <w:rFonts w:ascii="Arial" w:cs="Arial" w:eastAsia="Arial" w:hAnsi="Arial"/>
+          <w:color w:val="1E293B"/>
+          <w:sz w:val="18"/>
+          <w:szCs w:val="18"/>
+        </w:rPr>
+        <w:t xml:space="preserve">(2012). </w:t>
       </w:r>
       <w:r>
         <w:rPr>
@@ -4004,6 +4103,20 @@
           <w:szCs w:val="18"/>
         </w:rPr>
         <w:t xml:space="preserve">DOI/Link: https://repository.ipb.ac.id</w:t>
+      </w:r>
+    </w:p>
+    <w:p>
+      <w:pPr>
+        <w:spacing w:after="60" w:before="10"/>
+      </w:pPr>
+      <w:r>
+        <w:rPr>
+          <w:rFonts w:ascii="Arial" w:cs="Arial" w:eastAsia="Arial" w:hAnsi="Arial"/>
+          <w:color w:val="1E293B"/>
+          <w:sz w:val="18"/>
+          <w:szCs w:val="18"/>
+        </w:rPr>
+        <w:t xml:space="preserve">Estuarine and coastal water quality assessment analyzing terrestrial sediment runoff, salinity gradients, and environmental impacts on coastal ecosystems.</w:t>
       </w:r>
     </w:p>
     <w:p>
@@ -4052,7 +4165,7 @@
           <w:sz w:val="18"/>
           <w:szCs w:val="18"/>
         </w:rPr>
-        <w:t xml:space="preserve">— United Nations Development Programme (UNDP), UNFCCC &amp; Learning for Nature (Oct 2026)</w:t>
+        <w:t xml:space="preserve"> | United Nations Development Programme (UNDP), UNFCCC &amp; Learning for Nature (Oct 2026)</w:t>
       </w:r>
       <w:r>
         <w:rPr>
@@ -4091,7 +4204,7 @@
           <w:sz w:val="18"/>
           <w:szCs w:val="18"/>
         </w:rPr>
-        <w:t xml:space="preserve">— UNESCO/IOC OceanTeacher Global Academy (OTGA) &amp; A-AAGORA Project (Sep 2026)</w:t>
+        <w:t xml:space="preserve"> | UNESCO/IOC OceanTeacher Global Academy (OTGA) &amp; A-AAGORA Project (Sep 2026)</w:t>
       </w:r>
       <w:r>
         <w:rPr>
@@ -4130,7 +4243,7 @@
           <w:sz w:val="18"/>
           <w:szCs w:val="18"/>
         </w:rPr>
-        <w:t xml:space="preserve">— Biodiversity Credit Alliance (BCA), Nature for Life Hub &amp; University of Nottingham (Sep 2026)</w:t>
+        <w:t xml:space="preserve"> | Biodiversity Credit Alliance (BCA), Nature for Life Hub &amp; University of Nottingham (Sep 2026)</w:t>
       </w:r>
       <w:r>
         <w:rPr>
@@ -4169,7 +4282,7 @@
           <w:sz w:val="18"/>
           <w:szCs w:val="18"/>
         </w:rPr>
-        <w:t xml:space="preserve">— Initiative for Climate Action Transparency (ICAT) &amp; Learning for Nature (Sep 2026)</w:t>
+        <w:t xml:space="preserve"> | Initiative for Climate Action Transparency (ICAT) &amp; Learning for Nature (Sep 2026)</w:t>
       </w:r>
       <w:r>
         <w:rPr>
@@ -4208,7 +4321,7 @@
           <w:sz w:val="18"/>
           <w:szCs w:val="18"/>
         </w:rPr>
-        <w:t xml:space="preserve">— UNDP Biodiversity Finance Initiative (BIOFIN) &amp; Learning for Nature (Sep 2026)</w:t>
+        <w:t xml:space="preserve"> | UNDP Biodiversity Finance Initiative (BIOFIN) &amp; Learning for Nature (Sep 2026)</w:t>
       </w:r>
       <w:r>
         <w:rPr>
@@ -4247,7 +4360,7 @@
           <w:sz w:val="18"/>
           <w:szCs w:val="18"/>
         </w:rPr>
-        <w:t xml:space="preserve">— Initiative for Climate Action Transparency (ICAT), IPCC TSU &amp; UNDP Learning for Nature (Sep 2026)</w:t>
+        <w:t xml:space="preserve"> | Initiative for Climate Action Transparency (ICAT), IPCC TSU &amp; UNDP Learning for Nature (Sep 2026)</w:t>
       </w:r>
       <w:r>
         <w:rPr>
@@ -4286,7 +4399,7 @@
           <w:sz w:val="18"/>
           <w:szCs w:val="18"/>
         </w:rPr>
-        <w:t xml:space="preserve">— Cap-Net UNDP, SIWI &amp; Action Platform for Source-to-Sea Management (Sep 2026)</w:t>
+        <w:t xml:space="preserve"> | Cap-Net UNDP, SIWI &amp; Action Platform for Source-to-Sea Management (Sep 2026)</w:t>
       </w:r>
       <w:r>
         <w:rPr>
@@ -4325,7 +4438,7 @@
           <w:sz w:val="18"/>
           <w:szCs w:val="18"/>
         </w:rPr>
-        <w:t xml:space="preserve">— UN-REDD Programme (FAO, UNDP, UNEP) (Sep 2026)</w:t>
+        <w:t xml:space="preserve"> | UN-REDD Programme (FAO, UNDP, UNEP) (Sep 2026)</w:t>
       </w:r>
       <w:r>
         <w:rPr>
@@ -4364,7 +4477,7 @@
           <w:sz w:val="18"/>
           <w:szCs w:val="18"/>
         </w:rPr>
-        <w:t xml:space="preserve">— Alison (Sep 2026)</w:t>
+        <w:t xml:space="preserve"> | Alison (Sep 2026)</w:t>
       </w:r>
       <w:r>
         <w:rPr>
@@ -4403,7 +4516,7 @@
           <w:sz w:val="18"/>
           <w:szCs w:val="18"/>
         </w:rPr>
-        <w:t xml:space="preserve">— Alison (Sep 2026)</w:t>
+        <w:t xml:space="preserve"> | Alison (Sep 2026)</w:t>
       </w:r>
       <w:r>
         <w:rPr>
@@ -4442,7 +4555,7 @@
           <w:sz w:val="18"/>
           <w:szCs w:val="18"/>
         </w:rPr>
-        <w:t xml:space="preserve">— Paris Agreement Article 6 Implementation Partnership (A6IP) Center, Perspectives Climate Research &amp; GHGMI (Sep 2026)</w:t>
+        <w:t xml:space="preserve"> | Paris Agreement Article 6 Implementation Partnership (A6IP) Center, Perspectives Climate Research &amp; GHGMI (Sep 2026)</w:t>
       </w:r>
       <w:r>
         <w:rPr>
@@ -4481,7 +4594,7 @@
           <w:sz w:val="18"/>
           <w:szCs w:val="18"/>
         </w:rPr>
-        <w:t xml:space="preserve">— The Greenhouse Gas Management Institute (GHGMI) (Aug 2026)</w:t>
+        <w:t xml:space="preserve"> | The Greenhouse Gas Management Institute (GHGMI) (Aug 2026)</w:t>
       </w:r>
       <w:r>
         <w:rPr>
@@ -4520,7 +4633,7 @@
           <w:sz w:val="18"/>
           <w:szCs w:val="18"/>
         </w:rPr>
-        <w:t xml:space="preserve">— Cap-Net UNDP &amp; UNEP-DHI Centre (Aug 2026)</w:t>
+        <w:t xml:space="preserve"> | Cap-Net UNDP &amp; UNEP-DHI Centre (Aug 2026)</w:t>
       </w:r>
       <w:r>
         <w:rPr>
@@ -4559,7 +4672,7 @@
           <w:sz w:val="18"/>
           <w:szCs w:val="18"/>
         </w:rPr>
-        <w:t xml:space="preserve">— Import Promotion Desk (IPD Germany) (Aug 2026)</w:t>
+        <w:t xml:space="preserve"> | Import Promotion Desk (IPD Germany) (Aug 2026)</w:t>
       </w:r>
       <w:r>
         <w:rPr>
@@ -4598,7 +4711,7 @@
           <w:sz w:val="18"/>
           <w:szCs w:val="18"/>
         </w:rPr>
-        <w:t xml:space="preserve">— Import Promotion Desk (IPD Germany) (Aug 2026)</w:t>
+        <w:t xml:space="preserve"> | Import Promotion Desk (IPD Germany) (Aug 2026)</w:t>
       </w:r>
       <w:r>
         <w:rPr>
@@ -4637,7 +4750,7 @@
           <w:sz w:val="18"/>
           <w:szCs w:val="18"/>
         </w:rPr>
-        <w:t xml:space="preserve">— World Bank Group (Jul 2026)</w:t>
+        <w:t xml:space="preserve"> | World Bank Group (Jul 2026)</w:t>
       </w:r>
       <w:r>
         <w:rPr>
@@ -4676,7 +4789,7 @@
           <w:sz w:val="18"/>
           <w:szCs w:val="18"/>
         </w:rPr>
-        <w:t xml:space="preserve">— World Bank Group (Jul 2026)</w:t>
+        <w:t xml:space="preserve"> | World Bank Group (Jul 2026)</w:t>
       </w:r>
       <w:r>
         <w:rPr>
@@ -4715,7 +4828,7 @@
           <w:sz w:val="18"/>
           <w:szCs w:val="18"/>
         </w:rPr>
-        <w:t xml:space="preserve">— DisasterReady / Cornerstone OnDemand (Jul 2026)</w:t>
+        <w:t xml:space="preserve"> | DisasterReady / Cornerstone OnDemand (Jul 2026)</w:t>
       </w:r>
       <w:r>
         <w:rPr>
@@ -4754,7 +4867,7 @@
           <w:sz w:val="18"/>
           <w:szCs w:val="18"/>
         </w:rPr>
-        <w:t xml:space="preserve">— Alison (Jul 2026)</w:t>
+        <w:t xml:space="preserve"> | Alison (Jul 2026)</w:t>
       </w:r>
       <w:r>
         <w:rPr>
@@ -4793,7 +4906,7 @@
           <w:sz w:val="18"/>
           <w:szCs w:val="18"/>
         </w:rPr>
-        <w:t xml:space="preserve">— United Nations Institute for Training and Research (UNITAR) (Jul 2026)</w:t>
+        <w:t xml:space="preserve"> | United Nations Institute for Training and Research (UNITAR) (Jul 2026)</w:t>
       </w:r>
       <w:r>
         <w:rPr>
@@ -4832,7 +4945,7 @@
           <w:sz w:val="18"/>
           <w:szCs w:val="18"/>
         </w:rPr>
-        <w:t xml:space="preserve">— Fair Carbon (Blue Carbon Academy) (May 2026)</w:t>
+        <w:t xml:space="preserve"> | Fair Carbon (Blue Carbon Academy) (May 2026)</w:t>
       </w:r>
       <w:r>
         <w:rPr>
@@ -4871,7 +4984,7 @@
           <w:sz w:val="18"/>
           <w:szCs w:val="18"/>
         </w:rPr>
-        <w:t xml:space="preserve">— Blooms Academy (Apr 2026)</w:t>
+        <w:t xml:space="preserve"> | Blooms Academy (Apr 2026)</w:t>
       </w:r>
       <w:r>
         <w:rPr>
@@ -4910,7 +5023,7 @@
           <w:sz w:val="18"/>
           <w:szCs w:val="18"/>
         </w:rPr>
-        <w:t xml:space="preserve">— United Nations (UNDSS) (Feb 2026)</w:t>
+        <w:t xml:space="preserve"> | United Nations (UNDSS) (Feb 2026)</w:t>
       </w:r>
       <w:r>
         <w:rPr>
@@ -4949,7 +5062,7 @@
           <w:sz w:val="18"/>
           <w:szCs w:val="18"/>
         </w:rPr>
-        <w:t xml:space="preserve">— Wildlife Acoustics (Feb 2026)</w:t>
+        <w:t xml:space="preserve"> | Wildlife Acoustics (Feb 2026)</w:t>
       </w:r>
       <w:r>
         <w:rPr>
@@ -4988,7 +5101,7 @@
           <w:sz w:val="18"/>
           <w:szCs w:val="18"/>
         </w:rPr>
-        <w:t xml:space="preserve">— Wildlife Acoustics (Feb 2026)</w:t>
+        <w:t xml:space="preserve"> | Wildlife Acoustics (Feb 2026)</w:t>
       </w:r>
       <w:r>
         <w:rPr>
@@ -5027,7 +5140,7 @@
           <w:sz w:val="18"/>
           <w:szCs w:val="18"/>
         </w:rPr>
-        <w:t xml:space="preserve">— Wildlife Acoustics (Feb 2026)</w:t>
+        <w:t xml:space="preserve"> | Wildlife Acoustics (Feb 2026)</w:t>
       </w:r>
       <w:r>
         <w:rPr>
@@ -5066,7 +5179,7 @@
           <w:sz w:val="18"/>
           <w:szCs w:val="18"/>
         </w:rPr>
-        <w:t xml:space="preserve">— Wildlife Acoustics (Feb 2026)</w:t>
+        <w:t xml:space="preserve"> | Wildlife Acoustics (Feb 2026)</w:t>
       </w:r>
       <w:r>
         <w:rPr>
@@ -5105,7 +5218,7 @@
           <w:sz w:val="18"/>
           <w:szCs w:val="18"/>
         </w:rPr>
-        <w:t xml:space="preserve">— Wildlife Acoustics (Feb 2026)</w:t>
+        <w:t xml:space="preserve"> | Wildlife Acoustics (Feb 2026)</w:t>
       </w:r>
       <w:r>
         <w:rPr>
@@ -5144,7 +5257,7 @@
           <w:sz w:val="18"/>
           <w:szCs w:val="18"/>
         </w:rPr>
-        <w:t xml:space="preserve">— Wildlife Acoustics (Feb 2026)</w:t>
+        <w:t xml:space="preserve"> | Wildlife Acoustics (Feb 2026)</w:t>
       </w:r>
       <w:r>
         <w:rPr>
@@ -5183,7 +5296,7 @@
           <w:sz w:val="18"/>
           <w:szCs w:val="18"/>
         </w:rPr>
-        <w:t xml:space="preserve">— Wildlife Acoustics (Feb 2026)</w:t>
+        <w:t xml:space="preserve"> | Wildlife Acoustics (Feb 2026)</w:t>
       </w:r>
       <w:r>
         <w:rPr>
@@ -5222,7 +5335,7 @@
           <w:sz w:val="18"/>
           <w:szCs w:val="18"/>
         </w:rPr>
-        <w:t xml:space="preserve">— Wildlife Acoustics (Feb 2026)</w:t>
+        <w:t xml:space="preserve"> | Wildlife Acoustics (Feb 2026)</w:t>
       </w:r>
       <w:r>
         <w:rPr>
@@ -5261,7 +5374,7 @@
           <w:sz w:val="18"/>
           <w:szCs w:val="18"/>
         </w:rPr>
-        <w:t xml:space="preserve">— United Nations (UNDSS) (Feb 2026)</w:t>
+        <w:t xml:space="preserve"> | United Nations (UNDSS) (Feb 2026)</w:t>
       </w:r>
       <w:r>
         <w:rPr>
@@ -5300,7 +5413,7 @@
           <w:sz w:val="18"/>
           <w:szCs w:val="18"/>
         </w:rPr>
-        <w:t xml:space="preserve">— United Nations (Feb 2026)</w:t>
+        <w:t xml:space="preserve"> | United Nations (Feb 2026)</w:t>
       </w:r>
       <w:r>
         <w:rPr>
@@ -5339,7 +5452,7 @@
           <w:sz w:val="18"/>
           <w:szCs w:val="18"/>
         </w:rPr>
-        <w:t xml:space="preserve">— Connected Conservation (Jan 2026)</w:t>
+        <w:t xml:space="preserve"> | Connected Conservation (Jan 2026)</w:t>
       </w:r>
       <w:r>
         <w:rPr>
@@ -5378,7 +5491,7 @@
           <w:sz w:val="18"/>
           <w:szCs w:val="18"/>
         </w:rPr>
-        <w:t xml:space="preserve">— Connected Conservation (Jan 2026)</w:t>
+        <w:t xml:space="preserve"> | Connected Conservation (Jan 2026)</w:t>
       </w:r>
       <w:r>
         <w:rPr>
@@ -5417,7 +5530,7 @@
           <w:sz w:val="18"/>
           <w:szCs w:val="18"/>
         </w:rPr>
-        <w:t xml:space="preserve">— Global Carbon Summit (Nov 2025)</w:t>
+        <w:t xml:space="preserve"> | Global Carbon Summit (Nov 2025)</w:t>
       </w:r>
       <w:r>
         <w:rPr>
@@ -5456,7 +5569,7 @@
           <w:sz w:val="18"/>
           <w:szCs w:val="18"/>
         </w:rPr>
-        <w:t xml:space="preserve">— Palo Alto Networks (Sep 2025)</w:t>
+        <w:t xml:space="preserve"> | Palo Alto Networks (Sep 2025)</w:t>
       </w:r>
       <w:r>
         <w:rPr>
@@ -5495,7 +5608,7 @@
           <w:sz w:val="18"/>
           <w:szCs w:val="18"/>
         </w:rPr>
-        <w:t xml:space="preserve">— Corporate Forum for Community Development (CFCD) (Feb 2025)</w:t>
+        <w:t xml:space="preserve"> | Corporate Forum for Community Development (CFCD) (Feb 2025)</w:t>
       </w:r>
       <w:r>
         <w:rPr>
@@ -5534,7 +5647,7 @@
           <w:sz w:val="18"/>
           <w:szCs w:val="18"/>
         </w:rPr>
-        <w:t xml:space="preserve">— Asian Development Bank (ADB) (Sep 2024)</w:t>
+        <w:t xml:space="preserve"> | Asian Development Bank (ADB) (Sep 2024)</w:t>
       </w:r>
       <w:r>
         <w:rPr>
@@ -5573,7 +5686,7 @@
           <w:sz w:val="18"/>
           <w:szCs w:val="18"/>
         </w:rPr>
-        <w:t xml:space="preserve">— Asian Development Bank (ADB) (Sep 2024)</w:t>
+        <w:t xml:space="preserve"> | Asian Development Bank (ADB) (Sep 2024)</w:t>
       </w:r>
       <w:r>
         <w:rPr>
@@ -5612,7 +5725,7 @@
           <w:sz w:val="18"/>
           <w:szCs w:val="18"/>
         </w:rPr>
-        <w:t xml:space="preserve">— Society for Ecological Restoration (SER) (Jul 2024)</w:t>
+        <w:t xml:space="preserve"> | Society for Ecological Restoration (SER) (Jul 2024)</w:t>
       </w:r>
       <w:r>
         <w:rPr>
@@ -5651,7 +5764,7 @@
           <w:sz w:val="18"/>
           <w:szCs w:val="18"/>
         </w:rPr>
-        <w:t xml:space="preserve">— Pachamama Alliance (Jun 2024)</w:t>
+        <w:t xml:space="preserve"> | Pachamama Alliance (Jun 2024)</w:t>
       </w:r>
       <w:r>
         <w:rPr>
@@ -5690,7 +5803,7 @@
           <w:sz w:val="18"/>
           <w:szCs w:val="18"/>
         </w:rPr>
-        <w:t xml:space="preserve">— Generasi Biologi Indonesia (Jun 2024)</w:t>
+        <w:t xml:space="preserve"> | Generasi Biologi Indonesia (Jun 2024)</w:t>
       </w:r>
       <w:r>
         <w:rPr>
@@ -5729,7 +5842,7 @@
           <w:sz w:val="18"/>
           <w:szCs w:val="18"/>
         </w:rPr>
-        <w:t xml:space="preserve">— Food and Agriculture Organization (FAO) (Apr 2024)</w:t>
+        <w:t xml:space="preserve"> | Food and Agriculture Organization (FAO) (Apr 2024)</w:t>
       </w:r>
       <w:r>
         <w:rPr>
@@ -5768,7 +5881,7 @@
           <w:sz w:val="18"/>
           <w:szCs w:val="18"/>
         </w:rPr>
-        <w:t xml:space="preserve">— Food and Agriculture Organization (FAO) (Apr 2024)</w:t>
+        <w:t xml:space="preserve"> | Food and Agriculture Organization (FAO) (Apr 2024)</w:t>
       </w:r>
       <w:r>
         <w:rPr>
@@ -5807,7 +5920,7 @@
           <w:sz w:val="18"/>
           <w:szCs w:val="18"/>
         </w:rPr>
-        <w:t xml:space="preserve">— Food and Agriculture Organization (FAO) (Apr 2024)</w:t>
+        <w:t xml:space="preserve"> | Food and Agriculture Organization (FAO) (Apr 2024)</w:t>
       </w:r>
       <w:r>
         <w:rPr>
@@ -5846,7 +5959,7 @@
           <w:sz w:val="18"/>
           <w:szCs w:val="18"/>
         </w:rPr>
-        <w:t xml:space="preserve">— Forage (Feb 2024)</w:t>
+        <w:t xml:space="preserve"> | Forage (Feb 2024)</w:t>
       </w:r>
       <w:r>
         <w:rPr>
@@ -5885,7 +5998,7 @@
           <w:sz w:val="18"/>
           <w:szCs w:val="18"/>
         </w:rPr>
-        <w:t xml:space="preserve">— Moreton Bay Regional Council / Forage (Feb 2024)</w:t>
+        <w:t xml:space="preserve"> | Moreton Bay Regional Council / Forage (Feb 2024)</w:t>
       </w:r>
       <w:r>
         <w:rPr>
@@ -5924,7 +6037,7 @@
           <w:sz w:val="18"/>
           <w:szCs w:val="18"/>
         </w:rPr>
-        <w:t xml:space="preserve">— DisasterReady / Cornerstone OnDemand (Feb 2024)</w:t>
+        <w:t xml:space="preserve"> | DisasterReady / Cornerstone OnDemand (Feb 2024)</w:t>
       </w:r>
       <w:r>
         <w:rPr>
@@ -5963,7 +6076,7 @@
           <w:sz w:val="18"/>
           <w:szCs w:val="18"/>
         </w:rPr>
-        <w:t xml:space="preserve">— International Network for Social Network Analysis (INSNA) (Feb 2024)</w:t>
+        <w:t xml:space="preserve"> | International Network for Social Network Analysis (INSNA) (Feb 2024)</w:t>
       </w:r>
       <w:r>
         <w:rPr>
@@ -6002,7 +6115,7 @@
           <w:sz w:val="18"/>
           <w:szCs w:val="18"/>
         </w:rPr>
-        <w:t xml:space="preserve">— Wildlife Acoustics (Dec 2023)</w:t>
+        <w:t xml:space="preserve"> | Wildlife Acoustics (Dec 2023)</w:t>
       </w:r>
       <w:r>
         <w:rPr>
@@ -6041,7 +6154,7 @@
           <w:sz w:val="18"/>
           <w:szCs w:val="18"/>
         </w:rPr>
-        <w:t xml:space="preserve">— BrightTALK (Nov 2023)</w:t>
+        <w:t xml:space="preserve"> | BrightTALK (Nov 2023)</w:t>
       </w:r>
       <w:r>
         <w:rPr>
@@ -6080,7 +6193,7 @@
           <w:sz w:val="18"/>
           <w:szCs w:val="18"/>
         </w:rPr>
-        <w:t xml:space="preserve">— World Bank Group (Nov 2023)</w:t>
+        <w:t xml:space="preserve"> | World Bank Group (Nov 2023)</w:t>
       </w:r>
       <w:r>
         <w:rPr>
@@ -6119,7 +6232,7 @@
           <w:sz w:val="18"/>
           <w:szCs w:val="18"/>
         </w:rPr>
-        <w:t xml:space="preserve">— World Bank Group (Nov 2023)</w:t>
+        <w:t xml:space="preserve"> | World Bank Group (Nov 2023)</w:t>
       </w:r>
       <w:r>
         <w:rPr>
@@ -6158,7 +6271,7 @@
           <w:sz w:val="18"/>
           <w:szCs w:val="18"/>
         </w:rPr>
-        <w:t xml:space="preserve">— World Bank Group (Nov 2023)</w:t>
+        <w:t xml:space="preserve"> | World Bank Group (Nov 2023)</w:t>
       </w:r>
       <w:r>
         <w:rPr>
@@ -6197,7 +6310,7 @@
           <w:sz w:val="18"/>
           <w:szCs w:val="18"/>
         </w:rPr>
-        <w:t xml:space="preserve">— Professional Institution (Nov 2023)</w:t>
+        <w:t xml:space="preserve"> | Professional Institution (Nov 2023)</w:t>
       </w:r>
       <w:r>
         <w:rPr>
@@ -6236,7 +6349,7 @@
           <w:sz w:val="18"/>
           <w:szCs w:val="18"/>
         </w:rPr>
-        <w:t xml:space="preserve">— Asian Development Bank Institute (ADBI) (Nov 2023)</w:t>
+        <w:t xml:space="preserve"> | Asian Development Bank Institute (ADBI) (Nov 2023)</w:t>
       </w:r>
       <w:r>
         <w:rPr>
@@ -6275,7 +6388,7 @@
           <w:sz w:val="18"/>
           <w:szCs w:val="18"/>
         </w:rPr>
-        <w:t xml:space="preserve">— Food and Agriculture Organization (FAO) (Nov 2023)</w:t>
+        <w:t xml:space="preserve"> | Food and Agriculture Organization (FAO) (Nov 2023)</w:t>
       </w:r>
       <w:r>
         <w:rPr>
@@ -6314,7 +6427,7 @@
           <w:sz w:val="18"/>
           <w:szCs w:val="18"/>
         </w:rPr>
-        <w:t xml:space="preserve">— Proforest Academy (Oct 2023)</w:t>
+        <w:t xml:space="preserve"> | Proforest Academy (Oct 2023)</w:t>
       </w:r>
       <w:r>
         <w:rPr>
@@ -6353,7 +6466,7 @@
           <w:sz w:val="18"/>
           <w:szCs w:val="18"/>
         </w:rPr>
-        <w:t xml:space="preserve">— Proforest Academy (Oct 2023)</w:t>
+        <w:t xml:space="preserve"> | Proforest Academy (Oct 2023)</w:t>
       </w:r>
       <w:r>
         <w:rPr>
@@ -6392,7 +6505,7 @@
           <w:sz w:val="18"/>
           <w:szCs w:val="18"/>
         </w:rPr>
-        <w:t xml:space="preserve">— World Bank Group &amp; GEF (Oct 2023)</w:t>
+        <w:t xml:space="preserve"> | World Bank Group &amp; GEF (Oct 2023)</w:t>
       </w:r>
       <w:r>
         <w:rPr>
@@ -6431,7 +6544,7 @@
           <w:sz w:val="18"/>
           <w:szCs w:val="18"/>
         </w:rPr>
-        <w:t xml:space="preserve">— Food and Agriculture Organization (FAO) (Oct 2023)</w:t>
+        <w:t xml:space="preserve"> | Food and Agriculture Organization (FAO) (Oct 2023)</w:t>
       </w:r>
       <w:r>
         <w:rPr>
@@ -6470,7 +6583,7 @@
           <w:sz w:val="18"/>
           <w:szCs w:val="18"/>
         </w:rPr>
-        <w:t xml:space="preserve">— Politeknik AUP &amp; Kementerian Kelautan dan Perikanan (KKP) (Sep 2023)</w:t>
+        <w:t xml:space="preserve"> | Politeknik AUP &amp; Kementerian Kelautan dan Perikanan (KKP) (Sep 2023)</w:t>
       </w:r>
       <w:r>
         <w:rPr>
@@ -6509,7 +6622,7 @@
           <w:sz w:val="18"/>
           <w:szCs w:val="18"/>
         </w:rPr>
-        <w:t xml:space="preserve">— Food and Agriculture Organization (FAO) (Sep 2023)</w:t>
+        <w:t xml:space="preserve"> | Food and Agriculture Organization (FAO) (Sep 2023)</w:t>
       </w:r>
       <w:r>
         <w:rPr>
@@ -6548,7 +6661,7 @@
           <w:sz w:val="18"/>
           <w:szCs w:val="18"/>
         </w:rPr>
-        <w:t xml:space="preserve">— Food and Agriculture Organization (FAO) (Aug 2023)</w:t>
+        <w:t xml:space="preserve"> | Food and Agriculture Organization (FAO) (Aug 2023)</w:t>
       </w:r>
       <w:r>
         <w:rPr>
@@ -6587,7 +6700,7 @@
           <w:sz w:val="18"/>
           <w:szCs w:val="18"/>
         </w:rPr>
-        <w:t xml:space="preserve">— Copernicus Marine Service (Jul 2023)</w:t>
+        <w:t xml:space="preserve"> | Copernicus Marine Service (Jul 2023)</w:t>
       </w:r>
       <w:r>
         <w:rPr>
@@ -6626,7 +6739,7 @@
           <w:sz w:val="18"/>
           <w:szCs w:val="18"/>
         </w:rPr>
-        <w:t xml:space="preserve">— B20 Indonesia / KADIN (Aug 2022)</w:t>
+        <w:t xml:space="preserve"> | B20 Indonesia / KADIN (Aug 2022)</w:t>
       </w:r>
       <w:r>
         <w:rPr>
@@ -6665,7 +6778,7 @@
           <w:sz w:val="18"/>
           <w:szCs w:val="18"/>
         </w:rPr>
-        <w:t xml:space="preserve">— Bank Indonesia Institute (Jul 2022)</w:t>
+        <w:t xml:space="preserve"> | Bank Indonesia Institute (Jul 2022)</w:t>
       </w:r>
       <w:r>
         <w:rPr>
@@ -6704,7 +6817,7 @@
           <w:sz w:val="18"/>
           <w:szCs w:val="18"/>
         </w:rPr>
-        <w:t xml:space="preserve">— Asosiasi Pilot Drone Indonesia (APDI) (Dec 2020)</w:t>
+        <w:t xml:space="preserve"> | Asosiasi Pilot Drone Indonesia (APDI) (Dec 2020)</w:t>
       </w:r>
       <w:r>
         <w:rPr>
@@ -6743,7 +6856,7 @@
           <w:sz w:val="18"/>
           <w:szCs w:val="18"/>
         </w:rPr>
-        <w:t xml:space="preserve">— Worldwide Quality Assurance (WQA) (Dec 2018)</w:t>
+        <w:t xml:space="preserve"> | Worldwide Quality Assurance (WQA) (Dec 2018)</w:t>
       </w:r>
       <w:r>
         <w:rPr>
@@ -6782,7 +6895,7 @@
           <w:sz w:val="18"/>
           <w:szCs w:val="18"/>
         </w:rPr>
-        <w:t xml:space="preserve">— Barron International (Aug 2014)</w:t>
+        <w:t xml:space="preserve"> | Barron International (Aug 2014)</w:t>
       </w:r>
       <w:r>
         <w:rPr>
@@ -6821,7 +6934,7 @@
           <w:sz w:val="18"/>
           <w:szCs w:val="18"/>
         </w:rPr>
-        <w:t xml:space="preserve">— Barron International (Aug 2014)</w:t>
+        <w:t xml:space="preserve"> | Barron International (Aug 2014)</w:t>
       </w:r>
       <w:r>
         <w:rPr>
@@ -6849,7 +6962,7 @@
           <w:sz w:val="24"/>
           <w:szCs w:val="24"/>
         </w:rPr>
-        <w:t xml:space="preserve">HONORS &amp; NATIONAL INNOVATION AWARDS</w:t>
+        <w:t xml:space="preserve">HONORS &amp; NATIONAL INNOVATION AWARDS (10 HONORS)</w:t>
       </w:r>
     </w:p>
     <w:p>
@@ -6865,16 +6978,16 @@
           <w:sz w:val="20"/>
           <w:szCs w:val="20"/>
         </w:rPr>
-        <w:t xml:space="preserve">1. undefined</w:t>
-      </w:r>
-      <w:r>
-        <w:rPr>
-          <w:rFonts w:ascii="Arial" w:cs="Arial" w:eastAsia="Arial" w:hAnsi="Arial"/>
-          <w:color w:val="0D9488"/>
-          <w:sz w:val="18"/>
-          <w:szCs w:val="18"/>
-        </w:rPr>
-        <w:t xml:space="preserve"> — Democratising Education for Global Sustainability and Justice (DemEd Global) / University of Cambridge (2026)</w:t>
+        <w:t xml:space="preserve">1. Key Essentials: The Global Biodiversity Framework, Sustainable Development and the Law</w:t>
+      </w:r>
+      <w:r>
+        <w:rPr>
+          <w:rFonts w:ascii="Arial" w:cs="Arial" w:eastAsia="Arial" w:hAnsi="Arial"/>
+          <w:color w:val="0D9488"/>
+          <w:sz w:val="18"/>
+          <w:szCs w:val="18"/>
+        </w:rPr>
+        <w:t xml:space="preserve"> | Democratising Education for Global Sustainability and Justice (DemEd Global) / University of Cambridge (2026)</w:t>
       </w:r>
     </w:p>
     <w:p>
@@ -6888,6 +7001,7 @@
           <w:sz w:val="18"/>
           <w:szCs w:val="18"/>
         </w:rPr>
+        <w:t xml:space="preserve">Selected again through a highly competitive global selection process to receive a donor-funded scholarship, and successfully completed the executive short course on the Kunming-Montreal Global Biodiversity Framework (GBF), Sustainable Development and the Law, delivered by Lucy Cavendish College and Hughes Hall, University of Cambridge.</w:t>
       </w:r>
     </w:p>
     <w:p>
@@ -6903,16 +7017,16 @@
           <w:sz w:val="20"/>
           <w:szCs w:val="20"/>
         </w:rPr>
-        <w:t xml:space="preserve">2. undefined</w:t>
-      </w:r>
-      <w:r>
-        <w:rPr>
-          <w:rFonts w:ascii="Arial" w:cs="Arial" w:eastAsia="Arial" w:hAnsi="Arial"/>
-          <w:color w:val="0D9488"/>
-          <w:sz w:val="18"/>
-          <w:szCs w:val="18"/>
-        </w:rPr>
-        <w:t xml:space="preserve"> — Democratising Education for Global Sustainability and Justice (DemEd Global) / University of Cambridge (2026)</w:t>
+        <w:t xml:space="preserve">2. Key Essentials: The Sustainable Development Goals and the Law</w:t>
+      </w:r>
+      <w:r>
+        <w:rPr>
+          <w:rFonts w:ascii="Arial" w:cs="Arial" w:eastAsia="Arial" w:hAnsi="Arial"/>
+          <w:color w:val="0D9488"/>
+          <w:sz w:val="18"/>
+          <w:szCs w:val="18"/>
+        </w:rPr>
+        <w:t xml:space="preserve"> | Democratising Education for Global Sustainability and Justice (DemEd Global) / University of Cambridge (2026)</w:t>
       </w:r>
     </w:p>
     <w:p>
@@ -6926,6 +7040,7 @@
           <w:sz w:val="18"/>
           <w:szCs w:val="18"/>
         </w:rPr>
+        <w:t xml:space="preserve">Selected among 4,800+ global applicants across 150+ countries to receive a donor-funded scholarship for the intensive short course on Sustainable Development Goals and the Law, delivered by Lucy Cavendish College and Hughes Hall, University of Cambridge.</w:t>
       </w:r>
     </w:p>
     <w:p>
@@ -6941,16 +7056,16 @@
           <w:sz w:val="20"/>
           <w:szCs w:val="20"/>
         </w:rPr>
-        <w:t xml:space="preserve">3. undefined</w:t>
-      </w:r>
-      <w:r>
-        <w:rPr>
-          <w:rFonts w:ascii="Arial" w:cs="Arial" w:eastAsia="Arial" w:hAnsi="Arial"/>
-          <w:color w:val="0D9488"/>
-          <w:sz w:val="18"/>
-          <w:szCs w:val="18"/>
-        </w:rPr>
-        <w:t xml:space="preserve"> — United Nations Institute for Training and Research (UNITAR) and UN CC:Learn (2026)</w:t>
+        <w:t xml:space="preserve">3. UNITAR Green Economic Acceleration: A Japan-ASEAN Strategic Programme for Sustainable Green Finance</w:t>
+      </w:r>
+      <w:r>
+        <w:rPr>
+          <w:rFonts w:ascii="Arial" w:cs="Arial" w:eastAsia="Arial" w:hAnsi="Arial"/>
+          <w:color w:val="0D9488"/>
+          <w:sz w:val="18"/>
+          <w:szCs w:val="18"/>
+        </w:rPr>
+        <w:t xml:space="preserve"> | United Nations Institute for Training and Research (UNITAR) and UN CC:Learn (2026)</w:t>
       </w:r>
     </w:p>
     <w:p>
@@ -6964,6 +7079,7 @@
           <w:sz w:val="18"/>
           <w:szCs w:val="18"/>
         </w:rPr>
+        <w:t xml:space="preserve">Selected through a competitive selection process among applicants across the ASEAN region for the Japan-ASEAN strategic initiative delivered by UNITAR. The program focuses on sustainable green finance mechanisms, bankable green project design, and regional policies driving the green economic transition.</w:t>
       </w:r>
     </w:p>
     <w:p>
@@ -6979,16 +7095,16 @@
           <w:sz w:val="20"/>
           <w:szCs w:val="20"/>
         </w:rPr>
-        <w:t xml:space="preserve">4. undefined</w:t>
-      </w:r>
-      <w:r>
-        <w:rPr>
-          <w:rFonts w:ascii="Arial" w:cs="Arial" w:eastAsia="Arial" w:hAnsi="Arial"/>
-          <w:color w:val="0D9488"/>
-          <w:sz w:val="18"/>
-          <w:szCs w:val="18"/>
-        </w:rPr>
-        <w:t xml:space="preserve"> — Business Innovation Center (BIC) &amp; Ministry of Research and Technology (Kemenristek/BRIN) (2022)</w:t>
+        <w:t xml:space="preserve">4. The 114th Prospective Innovation Award of Indonesia - 2022 Indonesia Scientist Award</w:t>
+      </w:r>
+      <w:r>
+        <w:rPr>
+          <w:rFonts w:ascii="Arial" w:cs="Arial" w:eastAsia="Arial" w:hAnsi="Arial"/>
+          <w:color w:val="0D9488"/>
+          <w:sz w:val="18"/>
+          <w:szCs w:val="18"/>
+        </w:rPr>
+        <w:t xml:space="preserve"> | Business Innovation Center (BIC) &amp; Ministry of Research and Technology (Kemenristek/BRIN) (2022)</w:t>
       </w:r>
     </w:p>
     <w:p>
@@ -7002,6 +7118,7 @@
           <w:sz w:val="18"/>
           <w:szCs w:val="18"/>
         </w:rPr>
+        <w:t xml:space="preserve">National innovation recognition awarded for applied marine technology and sustainable fisheries innovation.</w:t>
       </w:r>
     </w:p>
     <w:p>
@@ -7017,16 +7134,16 @@
           <w:sz w:val="20"/>
           <w:szCs w:val="20"/>
         </w:rPr>
-        <w:t xml:space="preserve">5. undefined</w:t>
-      </w:r>
-      <w:r>
-        <w:rPr>
-          <w:rFonts w:ascii="Arial" w:cs="Arial" w:eastAsia="Arial" w:hAnsi="Arial"/>
-          <w:color w:val="0D9488"/>
-          <w:sz w:val="18"/>
-          <w:szCs w:val="18"/>
-        </w:rPr>
-        <w:t xml:space="preserve"> — Bank Indonesia Institute (2022)</w:t>
+        <w:t xml:space="preserve">5. Candidate in Youth Economic Leadership Program (YELP)</w:t>
+      </w:r>
+      <w:r>
+        <w:rPr>
+          <w:rFonts w:ascii="Arial" w:cs="Arial" w:eastAsia="Arial" w:hAnsi="Arial"/>
+          <w:color w:val="0D9488"/>
+          <w:sz w:val="18"/>
+          <w:szCs w:val="18"/>
+        </w:rPr>
+        <w:t xml:space="preserve"> | Bank Indonesia Institute (2022)</w:t>
       </w:r>
     </w:p>
     <w:p>
@@ -7040,6 +7157,7 @@
           <w:sz w:val="18"/>
           <w:szCs w:val="18"/>
         </w:rPr>
+        <w:t xml:space="preserve">Selected candidate for the national economic and leadership acceleration initiative by Bank Indonesia Institute.</w:t>
       </w:r>
     </w:p>
     <w:p>
@@ -7055,16 +7173,16 @@
           <w:sz w:val="20"/>
           <w:szCs w:val="20"/>
         </w:rPr>
-        <w:t xml:space="preserve">6. undefined</w:t>
-      </w:r>
-      <w:r>
-        <w:rPr>
-          <w:rFonts w:ascii="Arial" w:cs="Arial" w:eastAsia="Arial" w:hAnsi="Arial"/>
-          <w:color w:val="0D9488"/>
-          <w:sz w:val="18"/>
-          <w:szCs w:val="18"/>
-        </w:rPr>
-        <w:t xml:space="preserve"> — DigiFish Network &amp; Ministry of Marine Affairs and Fisheries (KKP) (2019)</w:t>
+        <w:t xml:space="preserve">6. Featured Speaker at DigiFish Incubating Ecosystem of Digital Innovation</w:t>
+      </w:r>
+      <w:r>
+        <w:rPr>
+          <w:rFonts w:ascii="Arial" w:cs="Arial" w:eastAsia="Arial" w:hAnsi="Arial"/>
+          <w:color w:val="0D9488"/>
+          <w:sz w:val="18"/>
+          <w:szCs w:val="18"/>
+        </w:rPr>
+        <w:t xml:space="preserve"> | DigiFish Network &amp; Ministry of Marine Affairs and Fisheries (KKP) (2019)</w:t>
       </w:r>
     </w:p>
     <w:p>
@@ -7078,6 +7196,7 @@
           <w:sz w:val="18"/>
           <w:szCs w:val="18"/>
         </w:rPr>
+        <w:t xml:space="preserve">Invited keynote and expert speaker on digital transformation, satellite VMS, and IoT smart aquaculture platforms.</w:t>
       </w:r>
     </w:p>
     <w:p>
@@ -7093,16 +7212,16 @@
           <w:sz w:val="20"/>
           <w:szCs w:val="20"/>
         </w:rPr>
-        <w:t xml:space="preserve">7. undefined</w:t>
-      </w:r>
-      <w:r>
-        <w:rPr>
-          <w:rFonts w:ascii="Arial" w:cs="Arial" w:eastAsia="Arial" w:hAnsi="Arial"/>
-          <w:color w:val="0D9488"/>
-          <w:sz w:val="18"/>
-          <w:szCs w:val="18"/>
-        </w:rPr>
-        <w:t xml:space="preserve"> — Inovasia Indonesia &amp; Kemenpora RI (2014)</w:t>
+        <w:t xml:space="preserve">7. Indonesian Young Innovator Award</w:t>
+      </w:r>
+      <w:r>
+        <w:rPr>
+          <w:rFonts w:ascii="Arial" w:cs="Arial" w:eastAsia="Arial" w:hAnsi="Arial"/>
+          <w:color w:val="0D9488"/>
+          <w:sz w:val="18"/>
+          <w:szCs w:val="18"/>
+        </w:rPr>
+        <w:t xml:space="preserve"> | Inovasia Indonesia &amp; Kemenpora RI (2014)</w:t>
       </w:r>
     </w:p>
     <w:p>
@@ -7116,6 +7235,7 @@
           <w:sz w:val="18"/>
           <w:szCs w:val="18"/>
         </w:rPr>
+        <w:t xml:space="preserve">Recognized among top national youth innovators for applied environmental and acoustic research.</w:t>
       </w:r>
     </w:p>
     <w:p>
@@ -7131,16 +7251,16 @@
           <w:sz w:val="20"/>
           <w:szCs w:val="20"/>
         </w:rPr>
-        <w:t xml:space="preserve">8. undefined</w:t>
-      </w:r>
-      <w:r>
-        <w:rPr>
-          <w:rFonts w:ascii="Arial" w:cs="Arial" w:eastAsia="Arial" w:hAnsi="Arial"/>
-          <w:color w:val="0D9488"/>
-          <w:sz w:val="18"/>
-          <w:szCs w:val="18"/>
-        </w:rPr>
-        <w:t xml:space="preserve"> — Indonesian Youth Parliament (2013)</w:t>
+        <w:t xml:space="preserve">8. Indonesian Youth Parliament Delegate for North Maluku</w:t>
+      </w:r>
+      <w:r>
+        <w:rPr>
+          <w:rFonts w:ascii="Arial" w:cs="Arial" w:eastAsia="Arial" w:hAnsi="Arial"/>
+          <w:color w:val="0D9488"/>
+          <w:sz w:val="18"/>
+          <w:szCs w:val="18"/>
+        </w:rPr>
+        <w:t xml:space="preserve"> | Indonesian Youth Parliament (2013)</w:t>
       </w:r>
     </w:p>
     <w:p>
@@ -7154,6 +7274,7 @@
           <w:sz w:val="18"/>
           <w:szCs w:val="18"/>
         </w:rPr>
+        <w:t xml:space="preserve">Selected youth parliamentary representative advocating coastal governance, archipelagic policy, and marine conservation.</w:t>
       </w:r>
     </w:p>
     <w:p>
@@ -7169,16 +7290,16 @@
           <w:sz w:val="20"/>
           <w:szCs w:val="20"/>
         </w:rPr>
-        <w:t xml:space="preserve">9. undefined</w:t>
-      </w:r>
-      <w:r>
-        <w:rPr>
-          <w:rFonts w:ascii="Arial" w:cs="Arial" w:eastAsia="Arial" w:hAnsi="Arial"/>
-          <w:color w:val="0D9488"/>
-          <w:sz w:val="18"/>
-          <w:szCs w:val="18"/>
-        </w:rPr>
-        <w:t xml:space="preserve"> — Business Innovation Center (BIC) (2012)</w:t>
+        <w:t xml:space="preserve">9. The 104th Prospective Innovation Award of Indonesia - 2012 Indonesia Scientist Award</w:t>
+      </w:r>
+      <w:r>
+        <w:rPr>
+          <w:rFonts w:ascii="Arial" w:cs="Arial" w:eastAsia="Arial" w:hAnsi="Arial"/>
+          <w:color w:val="0D9488"/>
+          <w:sz w:val="18"/>
+          <w:szCs w:val="18"/>
+        </w:rPr>
+        <w:t xml:space="preserve"> | Business Innovation Center (BIC) (2012)</w:t>
       </w:r>
     </w:p>
     <w:p>
@@ -7192,6 +7313,7 @@
           <w:sz w:val="18"/>
           <w:szCs w:val="18"/>
         </w:rPr>
+        <w:t xml:space="preserve">Awarded for pioneering undergraduate research on bioacoustics and acoustic fish behavior.</w:t>
       </w:r>
     </w:p>
     <w:p>
@@ -7207,16 +7329,16 @@
           <w:sz w:val="20"/>
           <w:szCs w:val="20"/>
         </w:rPr>
-        <w:t xml:space="preserve">10. undefined</w:t>
-      </w:r>
-      <w:r>
-        <w:rPr>
-          <w:rFonts w:ascii="Arial" w:cs="Arial" w:eastAsia="Arial" w:hAnsi="Arial"/>
-          <w:color w:val="0D9488"/>
-          <w:sz w:val="18"/>
-          <w:szCs w:val="18"/>
-        </w:rPr>
-        <w:t xml:space="preserve"> — IPB University (2012)</w:t>
+        <w:t xml:space="preserve">10. Candidate in Indonesian Leadership Camp</w:t>
+      </w:r>
+      <w:r>
+        <w:rPr>
+          <w:rFonts w:ascii="Arial" w:cs="Arial" w:eastAsia="Arial" w:hAnsi="Arial"/>
+          <w:color w:val="0D9488"/>
+          <w:sz w:val="18"/>
+          <w:szCs w:val="18"/>
+        </w:rPr>
+        <w:t xml:space="preserve"> | IPB University (2012)</w:t>
       </w:r>
     </w:p>
     <w:p>
@@ -7230,6 +7352,7 @@
           <w:sz w:val="18"/>
           <w:szCs w:val="18"/>
         </w:rPr>
+        <w:t xml:space="preserve">Selected participant for intensive student leadership and governance camp.</w:t>
       </w:r>
     </w:p>
     <w:p>
@@ -7264,16 +7387,16 @@
           <w:sz w:val="20"/>
           <w:szCs w:val="20"/>
         </w:rPr>
-        <w:t xml:space="preserve">1. undefined</w:t>
-      </w:r>
-      <w:r>
-        <w:rPr>
-          <w:rFonts w:ascii="Arial" w:cs="Arial" w:eastAsia="Arial" w:hAnsi="Arial"/>
-          <w:color w:val="0D9488"/>
-          <w:sz w:val="18"/>
-          <w:szCs w:val="18"/>
-        </w:rPr>
-        <w:t xml:space="preserve"> — Member</w:t>
+        <w:t xml:space="preserve">1. Asian Fisheries Acoustics Society (AFAS)</w:t>
+      </w:r>
+      <w:r>
+        <w:rPr>
+          <w:rFonts w:ascii="Arial" w:cs="Arial" w:eastAsia="Arial" w:hAnsi="Arial"/>
+          <w:color w:val="0D9488"/>
+          <w:sz w:val="18"/>
+          <w:szCs w:val="18"/>
+        </w:rPr>
+        <w:t xml:space="preserve"> | Member (2012 - Present)</w:t>
       </w:r>
     </w:p>
     <w:p>
@@ -7287,6 +7410,7 @@
           <w:sz w:val="18"/>
           <w:szCs w:val="18"/>
         </w:rPr>
+        <w:t xml:space="preserve">Active member contributing to regional advancements in underwater bioacoustics, fisheries acoustic survey technologies, optical-acoustic integration, and marine ecosystem monitoring.</w:t>
       </w:r>
     </w:p>
     <w:p>
@@ -7330,7 +7454,7 @@
           <w:sz w:val="18"/>
           <w:szCs w:val="18"/>
         </w:rPr>
-        <w:t xml:space="preserve"> — Professor of Ocean Acoustics and Instrumentation, Department of Marine Science and Technology, IPB University</w:t>
+        <w:t xml:space="preserve"> | Professor of Ocean Acoustics and Instrumentation, Department of Marine Science and Technology, IPB University</w:t>
       </w:r>
     </w:p>
     <w:p>
@@ -7369,7 +7493,7 @@
           <w:sz w:val="18"/>
           <w:szCs w:val="18"/>
         </w:rPr>
-        <w:t xml:space="preserve"> — Professor of Chemical Oceanography &amp; Marine Pollution, Department of Marine Science and Technology, IPB University</w:t>
+        <w:t xml:space="preserve"> | Professor of Chemical Oceanography &amp; Marine Pollution, Department of Marine Science and Technology, IPB University</w:t>
       </w:r>
     </w:p>
     <w:p>
@@ -7408,7 +7532,7 @@
           <w:sz w:val="18"/>
           <w:szCs w:val="18"/>
         </w:rPr>
-        <w:t xml:space="preserve"> — Head of Department of Marine Science and Technology, Bogor Agricultural University (IPB University)</w:t>
+        <w:t xml:space="preserve"> | Head of Department of Marine Science and Technology, Bogor Agricultural University (IPB University)</w:t>
       </w:r>
     </w:p>
     <w:p>
@@ -7447,7 +7571,7 @@
           <w:sz w:val="18"/>
           <w:szCs w:val="18"/>
         </w:rPr>
-        <w:t xml:space="preserve"> — Director of Marine Unit Service, Hatfield Group</w:t>
+        <w:t xml:space="preserve"> | Director of Marine Unit Service, Hatfield Group</w:t>
       </w:r>
     </w:p>
     <w:p>
@@ -7486,7 +7610,7 @@
           <w:sz w:val="18"/>
           <w:szCs w:val="18"/>
         </w:rPr>
-        <w:t xml:space="preserve"> — Marine Specialist, World Bank Group</w:t>
+        <w:t xml:space="preserve"> | Marine Specialist, World Bank Group</w:t>
       </w:r>
     </w:p>
     <w:p>
@@ -7525,7 +7649,7 @@
           <w:sz w:val="18"/>
           <w:szCs w:val="18"/>
         </w:rPr>
-        <w:t xml:space="preserve"> — Senior Researcher / Climate &amp; Environmental Specialist, Centre for Climate Risk and Opportunity Management (CCROM SEAP), IPB University</w:t>
+        <w:t xml:space="preserve"> | Senior Researcher / Climate &amp; Environmental Specialist, Centre for Climate Risk and Opportunity Management (CCROM SEAP), IPB University</w:t>
       </w:r>
     </w:p>
     <w:p>

</xml_diff>

<commit_message>
Pembaruan otomatis CV dari Word & Sertifikat pada 21/10/2026 10:56:50,42
</commit_message>
<xml_diff>
--- a/I Gede Mahendra Wijaya_Master CV.docx
+++ b/I Gede Mahendra Wijaya_Master CV.docx
@@ -41,7 +41,7 @@
         <w:spacing w:after="40" w:before="0"/>
         <w:jc w:val="center"/>
       </w:pPr>
-      <w:hyperlink w:history="1" r:id="rIde4g6ggdcivsesbxdt0lk3">
+      <w:hyperlink w:history="1" r:id="rId6qxczijrenriam6pzkop6">
         <w:r>
           <w:rPr>
             <w:rFonts w:ascii="Arial" w:cs="Arial" w:eastAsia="Arial" w:hAnsi="Arial"/>
@@ -62,7 +62,7 @@
         </w:rPr>
         <w:t xml:space="preserve">  |  </w:t>
       </w:r>
-      <w:hyperlink w:history="1" r:id="rIdxtqh-c-qz1xoscnb9dyou">
+      <w:hyperlink w:history="1" r:id="rIdaa50b056s4evrofvawnim">
         <w:r>
           <w:rPr>
             <w:rFonts w:ascii="Arial" w:cs="Arial" w:eastAsia="Arial" w:hAnsi="Arial"/>
@@ -83,7 +83,7 @@
         </w:rPr>
         <w:t xml:space="preserve">  |  </w:t>
       </w:r>
-      <w:hyperlink w:history="1" r:id="rIdfk-quhranggatlv-9leza">
+      <w:hyperlink w:history="1" r:id="rIdajnl1too5gdweij0ugmis">
         <w:r>
           <w:rPr>
             <w:rFonts w:ascii="Arial" w:cs="Arial" w:eastAsia="Arial" w:hAnsi="Arial"/>

</xml_diff>

<commit_message>
fix(cv): correct academic background to marine science and technology (IPB University)
</commit_message>
<xml_diff>
--- a/I Gede Mahendra Wijaya_Master CV.docx
+++ b/I Gede Mahendra Wijaya_Master CV.docx
@@ -41,7 +41,7 @@
         <w:spacing w:after="40" w:before="0"/>
         <w:jc w:val="center"/>
       </w:pPr>
-      <w:hyperlink w:history="1" r:id="rId6qxczijrenriam6pzkop6">
+      <w:hyperlink w:history="1" r:id="rIdanp1mjyx1aulhkvzquvtz">
         <w:r>
           <w:rPr>
             <w:rFonts w:ascii="Arial" w:cs="Arial" w:eastAsia="Arial" w:hAnsi="Arial"/>
@@ -62,7 +62,7 @@
         </w:rPr>
         <w:t xml:space="preserve">  |  </w:t>
       </w:r>
-      <w:hyperlink w:history="1" r:id="rIdaa50b056s4evrofvawnim">
+      <w:hyperlink w:history="1" r:id="rId7ltqlys5y19bwoolgotis">
         <w:r>
           <w:rPr>
             <w:rFonts w:ascii="Arial" w:cs="Arial" w:eastAsia="Arial" w:hAnsi="Arial"/>
@@ -83,7 +83,7 @@
         </w:rPr>
         <w:t xml:space="preserve">  |  </w:t>
       </w:r>
-      <w:hyperlink w:history="1" r:id="rIdajnl1too5gdweij0ugmis">
+      <w:hyperlink w:history="1" r:id="rIda-rim3ehwgjxchwgtxygg">
         <w:r>
           <w:rPr>
             <w:rFonts w:ascii="Arial" w:cs="Arial" w:eastAsia="Arial" w:hAnsi="Arial"/>
@@ -141,7 +141,7 @@
           <w:sz w:val="20"/>
           <w:szCs w:val="20"/>
         </w:rPr>
-        <w:t xml:space="preserve">Senior Marine Environmental Specialist and Climate Mitigation Technical Lead with over 13 years of multidisciplinary experience pioneering integrated 'source-to-sink' (ridge-to-reef) environmental governance and high-integrity carbon mitigation across Indonesia. Uniquely bridges terrestrial forest concession areas, peatland hydrology, coastal blue carbon wetlands, and offshore marine ecosystems into unified landscape-seascape management frameworks. Formally trained in marine science and acoustics (IPB University), directing technical strategy, greenhouse gas (GHG) accounting, and project validation delivering high-quality, high-integrity carbon credits under the carbon unit registry system of Indonesia and premier international standards (Verra Verified Carbon Standard / VCS, Climate, Community &amp; Biodiversity / CCB Standards, Sustainable Development Verified Impact Standard / SD VISta, and Nature Framework). Technical portfolio encompasses &gt;200,000 hectares of peatland and wetland concessions in Papua, industrial waste decarbonization (Palm Oil Mill Effluent / POME methane capture &amp; biogas-to-energy), and national marine spatial planning. Proven track record managing multi-year programs with International Financial Institutions (IFIs) and United Nations (UN) agencies (World Bank, Asian Development Bank / ADB, Agence Française de Développement / AFD, Food and Agriculture Organization / FAO, and United Nations Development Programme / UNDP), as well as leading philanthropic foundations (Walton Family Foundation). Recognized with a National Innovation Award from the Business Innovation Center (BIC). Expertise spans Nature-based Solutions (NbS), robust Monitoring, Reporting, and Verification (MRV), Environmental and Social Impact Assessment (ESIA), and Free, Prior, and Informed Consent (FPIC) with indigenous customary communities.</w:t>
+        <w:t xml:space="preserve">Senior Marine Environmental Specialist and Climate Mitigation Technical Lead with over 13 years of multidisciplinary experience pioneering integrated 'source-to-sink' (ridge-to-reef) environmental governance and high-integrity carbon mitigation across Indonesia. Uniquely bridges terrestrial forest concession areas, peatland hydrology, coastal blue carbon wetlands, and offshore marine ecosystems into unified landscape-seascape management frameworks. Formally trained in marine science and technology (IPB University), directing technical strategy, greenhouse gas (GHG) accounting, and project validation delivering high-quality, high-integrity carbon credits under the carbon unit registry system of Indonesia and premier international standards (Verra Verified Carbon Standard / VCS, Climate, Community &amp; Biodiversity / CCB Standards, Sustainable Development Verified Impact Standard / SD VISta, and Nature Framework). Technical portfolio encompasses &gt;200,000 hectares of peatland and wetland concessions in Papua, industrial waste decarbonization (Palm Oil Mill Effluent / POME methane capture &amp; biogas-to-energy), and national marine spatial planning. Proven track record managing multi-year programs with International Financial Institutions (IFIs) and United Nations (UN) agencies (World Bank, Asian Development Bank / ADB, Agence Française de Développement / AFD, Food and Agriculture Organization / FAO, and United Nations Development Programme / UNDP), as well as leading philanthropic foundations (Walton Family Foundation). Recognized with a National Innovation Award from the Business Innovation Center (BIC). Expertise spans Nature-based Solutions (NbS), robust Monitoring, Reporting, and Verification (MRV), Environmental and Social Impact Assessment (ESIA), and Free, Prior, and Informed Consent (FPIC) with indigenous customary communities.</w:t>
       </w:r>
     </w:p>
     <w:p>

</xml_diff>

<commit_message>
feat(awards): add IPB Rector's Award: Tribute to Innovators and Authors 2015 to honors and master CV
</commit_message>
<xml_diff>
--- a/I Gede Mahendra Wijaya_Master CV.docx
+++ b/I Gede Mahendra Wijaya_Master CV.docx
@@ -41,7 +41,7 @@
         <w:spacing w:after="40" w:before="0"/>
         <w:jc w:val="center"/>
       </w:pPr>
-      <w:hyperlink w:history="1" r:id="rIdanp1mjyx1aulhkvzquvtz">
+      <w:hyperlink w:history="1" r:id="rIdk2fhrm2ayt2scxoc-wixb">
         <w:r>
           <w:rPr>
             <w:rFonts w:ascii="Arial" w:cs="Arial" w:eastAsia="Arial" w:hAnsi="Arial"/>
@@ -62,7 +62,7 @@
         </w:rPr>
         <w:t xml:space="preserve">  |  </w:t>
       </w:r>
-      <w:hyperlink w:history="1" r:id="rId7ltqlys5y19bwoolgotis">
+      <w:hyperlink w:history="1" r:id="rIdrzys17iwv7g83v7olbw-a">
         <w:r>
           <w:rPr>
             <w:rFonts w:ascii="Arial" w:cs="Arial" w:eastAsia="Arial" w:hAnsi="Arial"/>
@@ -83,7 +83,7 @@
         </w:rPr>
         <w:t xml:space="preserve">  |  </w:t>
       </w:r>
-      <w:hyperlink w:history="1" r:id="rIda-rim3ehwgjxchwgtxygg">
+      <w:hyperlink w:history="1" r:id="rId_yehhfhcw_upah32xnzsb">
         <w:r>
           <w:rPr>
             <w:rFonts w:ascii="Arial" w:cs="Arial" w:eastAsia="Arial" w:hAnsi="Arial"/>
@@ -6962,7 +6962,7 @@
           <w:sz w:val="24"/>
           <w:szCs w:val="24"/>
         </w:rPr>
-        <w:t xml:space="preserve">HONORS &amp; NATIONAL INNOVATION AWARDS (10 HONORS)</w:t>
+        <w:t xml:space="preserve">HONORS &amp; NATIONAL INNOVATION AWARDS (11 HONORS)</w:t>
       </w:r>
     </w:p>
     <w:p>
@@ -7212,16 +7212,16 @@
           <w:sz w:val="20"/>
           <w:szCs w:val="20"/>
         </w:rPr>
-        <w:t xml:space="preserve">7. Indonesian Young Innovator Award</w:t>
-      </w:r>
-      <w:r>
-        <w:rPr>
-          <w:rFonts w:ascii="Arial" w:cs="Arial" w:eastAsia="Arial" w:hAnsi="Arial"/>
-          <w:color w:val="0D9488"/>
-          <w:sz w:val="18"/>
-          <w:szCs w:val="18"/>
-        </w:rPr>
-        <w:t xml:space="preserve"> | Inovasia Indonesia &amp; Kemenpora RI (2014)</w:t>
+        <w:t xml:space="preserve">7. IPB Rector's Award: Tribute to Innovators and Authors 2015</w:t>
+      </w:r>
+      <w:r>
+        <w:rPr>
+          <w:rFonts w:ascii="Arial" w:cs="Arial" w:eastAsia="Arial" w:hAnsi="Arial"/>
+          <w:color w:val="0D9488"/>
+          <w:sz w:val="18"/>
+          <w:szCs w:val="18"/>
+        </w:rPr>
+        <w:t xml:space="preserve"> | Rector of IPB University (Institut Pertanian Bogor) (2015)</w:t>
       </w:r>
     </w:p>
     <w:p>
@@ -7235,7 +7235,7 @@
           <w:sz w:val="18"/>
           <w:szCs w:val="18"/>
         </w:rPr>
-        <w:t xml:space="preserve">Recognized among top national youth innovators for applied environmental and acoustic research.</w:t>
+        <w:t xml:space="preserve">Conferred by the Rector of IPB University during the 52nd Dies Natalis commemoration in recognition of outstanding dedication and scientific contributions in delivering impactful innovations.</w:t>
       </w:r>
     </w:p>
     <w:p>
@@ -7251,16 +7251,16 @@
           <w:sz w:val="20"/>
           <w:szCs w:val="20"/>
         </w:rPr>
-        <w:t xml:space="preserve">8. Indonesian Youth Parliament Delegate for North Maluku</w:t>
-      </w:r>
-      <w:r>
-        <w:rPr>
-          <w:rFonts w:ascii="Arial" w:cs="Arial" w:eastAsia="Arial" w:hAnsi="Arial"/>
-          <w:color w:val="0D9488"/>
-          <w:sz w:val="18"/>
-          <w:szCs w:val="18"/>
-        </w:rPr>
-        <w:t xml:space="preserve"> | Indonesian Youth Parliament (2013)</w:t>
+        <w:t xml:space="preserve">8. Indonesian Young Innovator Award</w:t>
+      </w:r>
+      <w:r>
+        <w:rPr>
+          <w:rFonts w:ascii="Arial" w:cs="Arial" w:eastAsia="Arial" w:hAnsi="Arial"/>
+          <w:color w:val="0D9488"/>
+          <w:sz w:val="18"/>
+          <w:szCs w:val="18"/>
+        </w:rPr>
+        <w:t xml:space="preserve"> | Inovasia Indonesia &amp; Kemenpora RI (2014)</w:t>
       </w:r>
     </w:p>
     <w:p>
@@ -7274,7 +7274,7 @@
           <w:sz w:val="18"/>
           <w:szCs w:val="18"/>
         </w:rPr>
-        <w:t xml:space="preserve">Selected youth parliamentary representative advocating coastal governance, archipelagic policy, and marine conservation.</w:t>
+        <w:t xml:space="preserve">Recognized among top national youth innovators for applied environmental and acoustic research.</w:t>
       </w:r>
     </w:p>
     <w:p>
@@ -7290,16 +7290,16 @@
           <w:sz w:val="20"/>
           <w:szCs w:val="20"/>
         </w:rPr>
-        <w:t xml:space="preserve">9. The 104th Prospective Innovation Award of Indonesia - 2012 Indonesia Scientist Award</w:t>
-      </w:r>
-      <w:r>
-        <w:rPr>
-          <w:rFonts w:ascii="Arial" w:cs="Arial" w:eastAsia="Arial" w:hAnsi="Arial"/>
-          <w:color w:val="0D9488"/>
-          <w:sz w:val="18"/>
-          <w:szCs w:val="18"/>
-        </w:rPr>
-        <w:t xml:space="preserve"> | Business Innovation Center (BIC) (2012)</w:t>
+        <w:t xml:space="preserve">9. Indonesian Youth Parliament Delegate for North Maluku</w:t>
+      </w:r>
+      <w:r>
+        <w:rPr>
+          <w:rFonts w:ascii="Arial" w:cs="Arial" w:eastAsia="Arial" w:hAnsi="Arial"/>
+          <w:color w:val="0D9488"/>
+          <w:sz w:val="18"/>
+          <w:szCs w:val="18"/>
+        </w:rPr>
+        <w:t xml:space="preserve"> | Indonesian Youth Parliament (2013)</w:t>
       </w:r>
     </w:p>
     <w:p>
@@ -7313,7 +7313,7 @@
           <w:sz w:val="18"/>
           <w:szCs w:val="18"/>
         </w:rPr>
-        <w:t xml:space="preserve">Awarded for pioneering undergraduate research on bioacoustics and acoustic fish behavior.</w:t>
+        <w:t xml:space="preserve">Selected youth parliamentary representative advocating coastal governance, archipelagic policy, and marine conservation.</w:t>
       </w:r>
     </w:p>
     <w:p>
@@ -7329,7 +7329,46 @@
           <w:sz w:val="20"/>
           <w:szCs w:val="20"/>
         </w:rPr>
-        <w:t xml:space="preserve">10. Candidate in Indonesian Leadership Camp</w:t>
+        <w:t xml:space="preserve">10. The 104th Prospective Innovation Award of Indonesia - 2012 Indonesia Scientist Award</w:t>
+      </w:r>
+      <w:r>
+        <w:rPr>
+          <w:rFonts w:ascii="Arial" w:cs="Arial" w:eastAsia="Arial" w:hAnsi="Arial"/>
+          <w:color w:val="0D9488"/>
+          <w:sz w:val="18"/>
+          <w:szCs w:val="18"/>
+        </w:rPr>
+        <w:t xml:space="preserve"> | Business Innovation Center (BIC) (2012)</w:t>
+      </w:r>
+    </w:p>
+    <w:p>
+      <w:pPr>
+        <w:spacing w:after="50" w:before="10"/>
+      </w:pPr>
+      <w:r>
+        <w:rPr>
+          <w:rFonts w:ascii="Arial" w:cs="Arial" w:eastAsia="Arial" w:hAnsi="Arial"/>
+          <w:color w:val="1E293B"/>
+          <w:sz w:val="18"/>
+          <w:szCs w:val="18"/>
+        </w:rPr>
+        <w:t xml:space="preserve">Awarded for pioneering undergraduate research on bioacoustics and acoustic fish behavior.</w:t>
+      </w:r>
+    </w:p>
+    <w:p>
+      <w:pPr>
+        <w:spacing w:after="20" w:before="60"/>
+      </w:pPr>
+      <w:r>
+        <w:rPr>
+          <w:rFonts w:ascii="Arial" w:cs="Arial" w:eastAsia="Arial" w:hAnsi="Arial"/>
+          <w:b/>
+          <w:bCs/>
+          <w:color w:val="0F3A5D"/>
+          <w:sz w:val="20"/>
+          <w:szCs w:val="20"/>
+        </w:rPr>
+        <w:t xml:space="preserve">11. Candidate in Indonesian Leadership Camp</w:t>
       </w:r>
       <w:r>
         <w:rPr>

</xml_diff>

<commit_message>
fix(docx): sync master docx with updated ministries
</commit_message>
<xml_diff>
--- a/I Gede Mahendra Wijaya_Master CV.docx
+++ b/I Gede Mahendra Wijaya_Master CV.docx
@@ -41,7 +41,7 @@
         <w:spacing w:after="40" w:before="0"/>
         <w:jc w:val="center"/>
       </w:pPr>
-      <w:hyperlink w:history="1" r:id="rIdk2fhrm2ayt2scxoc-wixb">
+      <w:hyperlink w:history="1" r:id="rId1rxghymx2ggc8myy2djy-">
         <w:r>
           <w:rPr>
             <w:rFonts w:ascii="Arial" w:cs="Arial" w:eastAsia="Arial" w:hAnsi="Arial"/>
@@ -62,7 +62,7 @@
         </w:rPr>
         <w:t xml:space="preserve">  |  </w:t>
       </w:r>
-      <w:hyperlink w:history="1" r:id="rIdrzys17iwv7g83v7olbw-a">
+      <w:hyperlink w:history="1" r:id="rIdztrwlvasdkrplskk5sslz">
         <w:r>
           <w:rPr>
             <w:rFonts w:ascii="Arial" w:cs="Arial" w:eastAsia="Arial" w:hAnsi="Arial"/>
@@ -83,7 +83,7 @@
         </w:rPr>
         <w:t xml:space="preserve">  |  </w:t>
       </w:r>
-      <w:hyperlink w:history="1" r:id="rId_yehhfhcw_upah32xnzsb">
+      <w:hyperlink w:history="1" r:id="rIdlfdpb2reyk63v1ik5trxy">
         <w:r>
           <w:rPr>
             <w:rFonts w:ascii="Arial" w:cs="Arial" w:eastAsia="Arial" w:hAnsi="Arial"/>
@@ -704,7 +704,7 @@
           <w:sz w:val="19"/>
           <w:szCs w:val="19"/>
         </w:rPr>
-        <w:t xml:space="preserve">Contributed to and managed terrestrial, peatland, and coastal wetland carbon project operations (&gt;200,000 ha) in West Papua and Southwest Papua. Led multidisciplinary field teams executing ecological baselines, High Carbon Stock Approach (HCSA), High Conservation Value (HCV), and ground-based carbon stock accounting (SNI 7724). Designed and facilitated Free, Prior, and Informed Consent (FPIC) with local customary communities to establish inclusive benefit-sharing frameworks. Directed regulatory licensing with the Ministry of Environment and Forestry (MoEF) and Ministry of Marine Affairs and Fisheries (MMAF), formulating Environmental and Social Management Plans (ESMP) and establishing rigorous Monitoring, Reporting, and Verification (MRV) systems.</w:t>
+        <w:t xml:space="preserve">Contributed to and managed terrestrial, peatland, and coastal wetland carbon project operations (&gt;200,000 ha) in West Papua and Southwest Papua. Led multidisciplinary field teams executing ecological baselines, High Carbon Stock Approach (HCSA), High Conservation Value (HCV), and ground-based carbon stock accounting (SNI 7724). Designed and facilitated Free, Prior, and Informed Consent (FPIC) with local customary communities to establish inclusive benefit-sharing frameworks. Directed regulatory licensing with the Ministry of Forestry and Ministry of Environment, formulating Environmental and Social Management Plans (ESMP) and establishing rigorous Monitoring, Reporting, and Verification (MRV) systems.</w:t>
       </w:r>
     </w:p>
     <w:p>

</xml_diff>

<commit_message>
fix(standards): unify SD VISta and Nature Framework to SD VISta Nature Framework
</commit_message>
<xml_diff>
--- a/I Gede Mahendra Wijaya_Master CV.docx
+++ b/I Gede Mahendra Wijaya_Master CV.docx
@@ -41,7 +41,7 @@
         <w:spacing w:after="40" w:before="0"/>
         <w:jc w:val="center"/>
       </w:pPr>
-      <w:hyperlink w:history="1" r:id="rId1rxghymx2ggc8myy2djy-">
+      <w:hyperlink w:history="1" r:id="rIdb8rbpnrts4wqrx-gdw0sp">
         <w:r>
           <w:rPr>
             <w:rFonts w:ascii="Arial" w:cs="Arial" w:eastAsia="Arial" w:hAnsi="Arial"/>
@@ -62,7 +62,7 @@
         </w:rPr>
         <w:t xml:space="preserve">  |  </w:t>
       </w:r>
-      <w:hyperlink w:history="1" r:id="rIdztrwlvasdkrplskk5sslz">
+      <w:hyperlink w:history="1" r:id="rIdu9pq7strpzzoqi7rxtlrx">
         <w:r>
           <w:rPr>
             <w:rFonts w:ascii="Arial" w:cs="Arial" w:eastAsia="Arial" w:hAnsi="Arial"/>
@@ -83,7 +83,7 @@
         </w:rPr>
         <w:t xml:space="preserve">  |  </w:t>
       </w:r>
-      <w:hyperlink w:history="1" r:id="rIdlfdpb2reyk63v1ik5trxy">
+      <w:hyperlink w:history="1" r:id="rIdeicuabevsw2llb-c_5d5s">
         <w:r>
           <w:rPr>
             <w:rFonts w:ascii="Arial" w:cs="Arial" w:eastAsia="Arial" w:hAnsi="Arial"/>
@@ -141,7 +141,7 @@
           <w:sz w:val="20"/>
           <w:szCs w:val="20"/>
         </w:rPr>
-        <w:t xml:space="preserve">Senior Marine Environmental Specialist and Climate Mitigation Technical Lead with over 13 years of multidisciplinary experience pioneering integrated 'source-to-sink' (ridge-to-reef) environmental governance and high-integrity carbon mitigation across Indonesia. Uniquely bridges terrestrial forest concession areas, peatland hydrology, coastal blue carbon wetlands, and offshore marine ecosystems into unified landscape-seascape management frameworks. Formally trained in marine science and technology (IPB University), directing technical strategy, greenhouse gas (GHG) accounting, and project validation delivering high-quality, high-integrity carbon credits under the carbon unit registry system of Indonesia and premier international standards (Verra Verified Carbon Standard / VCS, Climate, Community &amp; Biodiversity / CCB Standards, Sustainable Development Verified Impact Standard / SD VISta, and Nature Framework). Technical portfolio encompasses &gt;200,000 hectares of peatland and wetland concessions in Papua, industrial waste decarbonization (Palm Oil Mill Effluent / POME methane capture &amp; biogas-to-energy), and national marine spatial planning. Proven track record managing multi-year programs with International Financial Institutions (IFIs) and United Nations (UN) agencies (World Bank, Asian Development Bank / ADB, Agence Française de Développement / AFD, Food and Agriculture Organization / FAO, and United Nations Development Programme / UNDP), as well as leading philanthropic foundations (Walton Family Foundation). Recognized with a National Innovation Award from the Business Innovation Center (BIC). Expertise spans Nature-based Solutions (NbS), robust Monitoring, Reporting, and Verification (MRV), Environmental and Social Impact Assessment (ESIA), and Free, Prior, and Informed Consent (FPIC) with indigenous customary communities.</w:t>
+        <w:t xml:space="preserve">Senior Marine Environmental Specialist and Climate Mitigation Technical Lead with over 13 years of multidisciplinary experience pioneering integrated 'source-to-sink' (ridge-to-reef) environmental governance and high-integrity carbon mitigation across Indonesia. Uniquely bridges terrestrial forest concession areas, peatland hydrology, coastal blue carbon wetlands, and offshore marine ecosystems into unified landscape-seascape management frameworks. Formally trained in marine science and technology (IPB University), directing technical strategy, greenhouse gas (GHG) accounting, and project validation delivering high-quality, high-integrity carbon credits under the carbon unit registry system of Indonesia and premier international standards (Verra Verified Carbon Standard / VCS, Climate, Community &amp; Biodiversity / CCB Standards, and SD VISta Nature Framework). Technical portfolio encompasses &gt;200,000 hectares of peatland and wetland concessions in Papua, industrial waste decarbonization (Palm Oil Mill Effluent / POME methane capture &amp; biogas-to-energy), and national marine spatial planning. Proven track record managing multi-year programs with International Financial Institutions (IFIs) and United Nations (UN) agencies (World Bank, Asian Development Bank / ADB, Agence Française de Développement / AFD, Food and Agriculture Organization / FAO, and United Nations Development Programme / UNDP), as well as leading philanthropic foundations (Walton Family Foundation). Recognized with a National Innovation Award from the Business Innovation Center (BIC). Expertise spans Nature-based Solutions (NbS), robust Monitoring, Reporting, and Verification (MRV), Environmental and Social Impact Assessment (ESIA), and Free, Prior, and Informed Consent (FPIC) with indigenous customary communities.</w:t>
       </w:r>
     </w:p>
     <w:p>
@@ -647,7 +647,7 @@
           <w:sz w:val="19"/>
           <w:szCs w:val="19"/>
         </w:rPr>
-        <w:t xml:space="preserve">Dedicated to delivering and contributing to high-quality and high-integrity carbon credits and nature-based climate solutions based on Nature-based Solutions (NbS), the Agriculture, Forestry, and Other Land Use (AFOLU) ecosystem restoration, and robust Monitoring, Reporting, and Verification (MRV) frameworks. Directing technical strategy, greenhouse gas (GHG) accounting, and project validation aligned with Core Carbon Principles (CCPs) of the Integrity Council for the Voluntary Carbon Market (ICVCM) and Paris Agreement Article 6 mechanisms (Articles 6.2 and 6.4 for Internationally Transferred Mitigation Outcomes / ITMOs and authorized carbon crediting). Managing technical compliance across peatland, wetland, and forest concession areas (&gt;200,000 ha) in Papua under the carbon unit registry system of Indonesia, Verra Verified Carbon Standard (VCS), Climate, Community &amp; Biodiversity (CCB) Standards, Sustainable Development Verified Impact Standard (SD VISta), and Nature Framework to ensure additionality, permanence, and verifiable ecological integrity.</w:t>
+        <w:t xml:space="preserve">Dedicated to delivering and contributing to high-quality and high-integrity carbon credits and nature-based climate solutions based on Nature-based Solutions (NbS), the Agriculture, Forestry, and Other Land Use (AFOLU) ecosystem restoration, and robust Monitoring, Reporting, and Verification (MRV) frameworks. Directing technical strategy, greenhouse gas (GHG) accounting, and project validation aligned with Core Carbon Principles (CCPs) of the Integrity Council for the Voluntary Carbon Market (ICVCM) and Paris Agreement Article 6 mechanisms (Articles 6.2 and 6.4 for Internationally Transferred Mitigation Outcomes / ITMOs and authorized carbon crediting). Managing technical compliance across peatland, wetland, and forest concession areas (&gt;200,000 ha) in Papua under the carbon unit registry system of Indonesia, Verra Verified Carbon Standard (VCS), Climate, Community &amp; Biodiversity (CCB) Standards, and SD VISta Nature Framework.</w:t>
       </w:r>
     </w:p>
     <w:p>
@@ -1212,7 +1212,7 @@
           <w:sz w:val="19"/>
           <w:szCs w:val="19"/>
         </w:rPr>
-        <w:t xml:space="preserve">Delivered a high-level feasibility study and carbon scoping assessment across &gt;200,000 hectares of wetland and peatland forest concessions in Southwest Papua and West Papua Provinces. Synthesized remote sensing GIS analysis, forest carbon stock estimates, baseline deforestation drivers, regulatory compliance pathways (carbon unit registry system of Indonesia, Verra VCS + CCB, SD VISta, and Nature Framework), and socio-economic risk evaluations to establish project viability for carbon credit generation and biodiversity conservation.</w:t>
+        <w:t xml:space="preserve">Delivered a high-level feasibility study and carbon scoping assessment across &gt;200,000 hectares of wetland and peatland forest concessions in Southwest Papua and West Papua Provinces. Synthesized remote sensing GIS analysis, forest carbon stock estimates, baseline deforestation drivers, regulatory compliance pathways (carbon unit registry system of Indonesia, Verra VCS + CCB, and SD VISta Nature Framework), and socio-economic risk evaluations to establish project viability for carbon credit generation and biodiversity conservation.</w:t>
       </w:r>
     </w:p>
     <w:p>

</xml_diff>

<commit_message>
refactor(experience): broaden Hatfield marine environmental specialist scope to marine and coastal development related programs across Indonesia
</commit_message>
<xml_diff>
--- a/I Gede Mahendra Wijaya_Master CV.docx
+++ b/I Gede Mahendra Wijaya_Master CV.docx
@@ -41,7 +41,7 @@
         <w:spacing w:after="40" w:before="0"/>
         <w:jc w:val="center"/>
       </w:pPr>
-      <w:hyperlink w:history="1" r:id="rIdb8rbpnrts4wqrx-gdw0sp">
+      <w:hyperlink w:history="1" r:id="rIdb1eruu7zhce8oruwhdsdv">
         <w:r>
           <w:rPr>
             <w:rFonts w:ascii="Arial" w:cs="Arial" w:eastAsia="Arial" w:hAnsi="Arial"/>
@@ -62,7 +62,7 @@
         </w:rPr>
         <w:t xml:space="preserve">  |  </w:t>
       </w:r>
-      <w:hyperlink w:history="1" r:id="rIdu9pq7strpzzoqi7rxtlrx">
+      <w:hyperlink w:history="1" r:id="rIdthir_o2poqwe8k_b711xt">
         <w:r>
           <w:rPr>
             <w:rFonts w:ascii="Arial" w:cs="Arial" w:eastAsia="Arial" w:hAnsi="Arial"/>
@@ -83,7 +83,7 @@
         </w:rPr>
         <w:t xml:space="preserve">  |  </w:t>
       </w:r>
-      <w:hyperlink w:history="1" r:id="rIdeicuabevsw2llb-c_5d5s">
+      <w:hyperlink w:history="1" r:id="rIda5x1wim1idj3zb9i5l5ql">
         <w:r>
           <w:rPr>
             <w:rFonts w:ascii="Arial" w:cs="Arial" w:eastAsia="Arial" w:hAnsi="Arial"/>
@@ -818,7 +818,7 @@
           <w:sz w:val="19"/>
           <w:szCs w:val="19"/>
         </w:rPr>
-        <w:t xml:space="preserve">Served as technical specialist contributing to marine ecology, oceanographic baseline assessments, fisheries resource management, and environmental and social compliance (ESIA). Contributed to multi-year initiatives including fisheries and aquaculture programs supported by the Walton Family Foundation. Designed and executed comprehensive marine surveys (water quality, benthic communities, coral reef health, pelagic fish acoustics), formulated Environmental and Social Management Plans (ESMP), and advanced digital fisheries monitoring (satellite Vessel Monitoring Systems / VMS with Inmarsat and UK Space Agency). Delivered high-impact technical reports and policy recommendations for the World Bank, Asian Development Bank (ADB), Agence Française de Développement (AFD), Food and Agriculture Organization (FAO), and Ministry of Marine Affairs and Fisheries (MMAF).</w:t>
+        <w:t xml:space="preserve">Served as technical specialist contributing to diverse marine and coastal development related programs across Indonesia. Spearheaded ecological baseline assessments, oceanographic characterization, fisheries resource management, and environmental and social compliance (ESIA). Designed and executed comprehensive marine and coastal field surveys, formulated Environmental and Social Management Plans (ESMP), and advanced digital and technology-driven fisheries monitoring systems. Delivered high-impact technical reports, environmental safeguards, and policy recommendations for International Financial Institutions (IFIs), United Nations (UN) agencies (World Bank, ADB, AFD, FAO), and the Ministry of Marine Affairs and Fisheries (MMAF).</w:t>
       </w:r>
     </w:p>
     <w:p>

</xml_diff>

<commit_message>
refactor(experience): translate customary villages, streamline MMO scope to marine biotas, and adopt AAM/PAM for research assistant
</commit_message>
<xml_diff>
--- a/I Gede Mahendra Wijaya_Master CV.docx
+++ b/I Gede Mahendra Wijaya_Master CV.docx
@@ -41,7 +41,7 @@
         <w:spacing w:after="40" w:before="0"/>
         <w:jc w:val="center"/>
       </w:pPr>
-      <w:hyperlink w:history="1" r:id="rIdb1eruu7zhce8oruwhdsdv">
+      <w:hyperlink w:history="1" r:id="rIdgsics50wath7unkissjxe">
         <w:r>
           <w:rPr>
             <w:rFonts w:ascii="Arial" w:cs="Arial" w:eastAsia="Arial" w:hAnsi="Arial"/>
@@ -62,7 +62,7 @@
         </w:rPr>
         <w:t xml:space="preserve">  |  </w:t>
       </w:r>
-      <w:hyperlink w:history="1" r:id="rIdthir_o2poqwe8k_b711xt">
+      <w:hyperlink w:history="1" r:id="rId6bkhv8qw06aksvbg7peli">
         <w:r>
           <w:rPr>
             <w:rFonts w:ascii="Arial" w:cs="Arial" w:eastAsia="Arial" w:hAnsi="Arial"/>
@@ -83,7 +83,7 @@
         </w:rPr>
         <w:t xml:space="preserve">  |  </w:t>
       </w:r>
-      <w:hyperlink w:history="1" r:id="rIda5x1wim1idj3zb9i5l5ql">
+      <w:hyperlink w:history="1" r:id="rIdqz1zia4xpy8ptrbtamwq4">
         <w:r>
           <w:rPr>
             <w:rFonts w:ascii="Arial" w:cs="Arial" w:eastAsia="Arial" w:hAnsi="Arial"/>
@@ -875,7 +875,7 @@
           <w:sz w:val="19"/>
           <w:szCs w:val="19"/>
         </w:rPr>
-        <w:t xml:space="preserve">Assisted executive directors in coordinating coastal conservation, artificial reef deployment, coral reef restoration, and community-based marine ecotourism in Nusa Dua, Bali. Facilitated multi-stakeholder partnerships between government bodies (Ministry of Marine Affairs and Fisheries / MMAF, Bali Marine Affairs Agency), tourism operators (Indonesia Tourism Development Corporation / ITDC), local customary villages (Desa Adat), and dive operators. Managed educational outreach, conservation awareness campaigns, and community stewardship programs for coastal sustainability.</w:t>
+        <w:t xml:space="preserve">Assisted executive directors in coordinating coastal conservation, artificial reef deployment, coral reef restoration, and community-based marine ecotourism in Nusa Dua, Bali. Facilitated multi-stakeholder partnerships between government bodies (Ministry of Marine Affairs and Fisheries / MMAF, Bali Marine Affairs Agency), tourism operators (Indonesia Tourism Development Corporation / ITDC), local customary villages, and dive operators. Managed educational outreach, conservation awareness campaigns, and community stewardship programs for coastal sustainability.</w:t>
       </w:r>
     </w:p>
     <w:p>
@@ -932,7 +932,7 @@
           <w:sz w:val="19"/>
           <w:szCs w:val="19"/>
         </w:rPr>
-        <w:t xml:space="preserve">Led Health, Safety, and Environment (HSE) protocols and Joint Nature Conservation Committee (JNCC)-compliant Marine Mammal Observation (MMO) with dedicated visual observation during 2D and Transition Zone (TZ) marine seismic surveys for KrisEnergy (Udan Emas) BV in Arguni Bay, West Papua. Enforced pre-shooting visual scans, exclusion zone protocols, and soft-start ramp-up procedures to safeguard cetaceans, dugongs, and coastal fish stocks. Conducted socio-fisheries impact assessments, underwater acoustic propagation analyses, and community consultation with indigenous artisanal fishers.</w:t>
+        <w:t xml:space="preserve">Led Health, Safety, and Environment (HSE) protocols and Joint Nature Conservation Committee (JNCC)-compliant Marine Mammal Observation (MMO) with dedicated visual observation during 2D and Transition Zone (TZ) marine seismic surveys for KrisEnergy (Udan Emas) BV in Arguni Bay, West Papua. Enforced pre-shooting visual scans, exclusion zone protocols, and soft-start ramp-up procedures to safeguard marine biotas.</w:t>
       </w:r>
     </w:p>
     <w:p>
@@ -989,7 +989,7 @@
           <w:sz w:val="19"/>
           <w:szCs w:val="19"/>
         </w:rPr>
-        <w:t xml:space="preserve">Conducted academic and applied research in underwater bioacoustics, marine acoustic telemetry, satellite remote sensing, Geographic Information Systems (GIS) spatial modeling, and physical oceanography. Operated scientific echo sounders, hydrophones, and Conductivity, Temperature, and Depth (CTD) oceanographic probes. Supported national research grants funded by the Ministry of Education and Culture (Kemendikbud), co-authoring peer-reviewed scientific publications on marine bioacoustics, oil spill detection using Advanced Land Observing Satellite Phased Array type L-band Synthetic Aperture Radar (ALOS PALSAR) imagery, and autonomous surface vessels for maritime surveillance.</w:t>
+        <w:t xml:space="preserve">Conducted academic and applied research in underwater bioacoustics, marine acoustic telemetry, satellite remote sensing, Geographic Information Systems (GIS) spatial modeling, and physical oceanography. Applied Active Acoustic Monitoring (AAM) and Passive Acoustic Monitoring (PAM), as well as Conductivity, Temperature, and Depth (CTD) oceanographic probes. Supported national research grants funded by the Ministry of Education and Culture (Kemendikbud), co-authoring peer-reviewed scientific publications on marine bioacoustics, oil spill detection using Advanced Land Observing Satellite Phased Array type L-band Synthetic Aperture Radar (ALOS PALSAR) imagery, and autonomous surface vessels for maritime surveillance.</w:t>
       </w:r>
     </w:p>
     <w:p>

</xml_diff>

<commit_message>
Pembaruan otomatis CV dari Word & Sertifikat pada 21/10/2026 14:31:42,31
</commit_message>
<xml_diff>
--- a/I Gede Mahendra Wijaya_Master CV.docx
+++ b/I Gede Mahendra Wijaya_Master CV.docx
@@ -41,7 +41,7 @@
         <w:spacing w:after="40" w:before="0"/>
         <w:jc w:val="center"/>
       </w:pPr>
-      <w:hyperlink w:history="1" r:id="rIdgsics50wath7unkissjxe">
+      <w:hyperlink w:history="1" r:id="rIdkd5o6j6z945_8ow_ehng2">
         <w:r>
           <w:rPr>
             <w:rFonts w:ascii="Arial" w:cs="Arial" w:eastAsia="Arial" w:hAnsi="Arial"/>
@@ -62,7 +62,7 @@
         </w:rPr>
         <w:t xml:space="preserve">  |  </w:t>
       </w:r>
-      <w:hyperlink w:history="1" r:id="rId6bkhv8qw06aksvbg7peli">
+      <w:hyperlink w:history="1" r:id="rIdfzxlawul25whdgwcm-qzx">
         <w:r>
           <w:rPr>
             <w:rFonts w:ascii="Arial" w:cs="Arial" w:eastAsia="Arial" w:hAnsi="Arial"/>
@@ -83,7 +83,7 @@
         </w:rPr>
         <w:t xml:space="preserve">  |  </w:t>
       </w:r>
-      <w:hyperlink w:history="1" r:id="rIdqz1zia4xpy8ptrbtamwq4">
+      <w:hyperlink w:history="1" r:id="rIdvqoitta3sapohuyi-smz3">
         <w:r>
           <w:rPr>
             <w:rFonts w:ascii="Arial" w:cs="Arial" w:eastAsia="Arial" w:hAnsi="Arial"/>

</xml_diff>

<commit_message>
feat(projects): integrate WWF Malaysia and Packard Foundation supporting projects to expand portfolio to 31 key projects
</commit_message>
<xml_diff>
--- a/I Gede Mahendra Wijaya_Master CV.docx
+++ b/I Gede Mahendra Wijaya_Master CV.docx
@@ -41,7 +41,7 @@
         <w:spacing w:after="40" w:before="0"/>
         <w:jc w:val="center"/>
       </w:pPr>
-      <w:hyperlink w:history="1" r:id="rIdkd5o6j6z945_8ow_ehng2">
+      <w:hyperlink w:history="1" r:id="rIdu2rcbhqvya72k1r3pllvk">
         <w:r>
           <w:rPr>
             <w:rFonts w:ascii="Arial" w:cs="Arial" w:eastAsia="Arial" w:hAnsi="Arial"/>
@@ -62,7 +62,7 @@
         </w:rPr>
         <w:t xml:space="preserve">  |  </w:t>
       </w:r>
-      <w:hyperlink w:history="1" r:id="rIdfzxlawul25whdgwcm-qzx">
+      <w:hyperlink w:history="1" r:id="rIdhxsioj7hlualf9g165ax5">
         <w:r>
           <w:rPr>
             <w:rFonts w:ascii="Arial" w:cs="Arial" w:eastAsia="Arial" w:hAnsi="Arial"/>
@@ -83,7 +83,7 @@
         </w:rPr>
         <w:t xml:space="preserve">  |  </w:t>
       </w:r>
-      <w:hyperlink w:history="1" r:id="rIdvqoitta3sapohuyi-smz3">
+      <w:hyperlink w:history="1" r:id="rIdweiqyh_mqhh62quje4ydc">
         <w:r>
           <w:rPr>
             <w:rFonts w:ascii="Arial" w:cs="Arial" w:eastAsia="Arial" w:hAnsi="Arial"/>
@@ -211,7 +211,7 @@
           <w:sz w:val="20"/>
           <w:szCs w:val="20"/>
         </w:rPr>
-        <w:t xml:space="preserve">29: </w:t>
+        <w:t xml:space="preserve">31: </w:t>
       </w:r>
       <w:r>
         <w:rPr>
@@ -1008,7 +1008,7 @@
           <w:sz w:val="24"/>
           <w:szCs w:val="24"/>
         </w:rPr>
-        <w:t xml:space="preserve">KEY PROJECTS &amp; TECHNICAL DELIVERABLES (29 PROJECTS)</w:t>
+        <w:t xml:space="preserve">KEY PROJECTS &amp; TECHNICAL DELIVERABLES (31 PROJECTS)</w:t>
       </w:r>
     </w:p>
     <w:p>
@@ -1022,7 +1022,7 @@
           <w:sz w:val="19"/>
           <w:szCs w:val="19"/>
         </w:rPr>
-        <w:t xml:space="preserve">Over the past 13+ years, I Gede Mahendra Wijaya has directed, managed, and contributed to 29 high-impact multidisciplinary projects spanning marine environmental assessments, nature-based climate solutions, sustainable fisheries governance, and environmental and social compliance across the Indonesian archipelago. His technical involvement encompasses leading international financial institution (IFI) and UN-backed programs (World Bank, ADB, AFD, FAO, UNDP), directing large-scale AFOLU carbon feasibility and ecosystem restoration concessions (&gt;200,000 ha), conducting ecological baselines, formulating ESMP/ESIA safeguards, and deploying digital marine monitoring technologies. Below is the detailed catalog of key project assignments, technical scopes, and deliverables.</w:t>
+        <w:t xml:space="preserve">Over the past 13+ years, I Gede Mahendra Wijaya has directed, managed, and contributed to 31 high-impact multidisciplinary projects spanning marine environmental assessments, nature-based climate solutions, sustainable fisheries governance, and environmental and social compliance across the Indonesian archipelago. His technical involvement encompasses leading international financial institution (IFI) and UN-backed programs (World Bank, ADB, AFD, FAO, UNDP), directing large-scale AFOLU carbon feasibility and ecosystem restoration concessions (&gt;200,000 ha), conducting ecological baselines, formulating ESMP/ESIA safeguards, and deploying digital marine monitoring technologies. Below is the detailed catalog of key project assignments, technical scopes, and deliverables.</w:t>
       </w:r>
     </w:p>
     <w:p>
@@ -3603,7 +3603,7 @@
           <w:sz w:val="20"/>
           <w:szCs w:val="20"/>
         </w:rPr>
-        <w:t xml:space="preserve">28. Sustainable Tuna Fisheries Management Based on Acoustic Measurement, Length-Based Assessment, and FAD Management</w:t>
+        <w:t xml:space="preserve">28. Independent Evaluation of WWF Malaysia Marine Conservation Programme</w:t>
       </w:r>
     </w:p>
     <w:p>
@@ -3628,7 +3628,7 @@
           <w:sz w:val="18"/>
           <w:szCs w:val="18"/>
         </w:rPr>
-        <w:t xml:space="preserve">The Nature Conservancy (TNC) | </w:t>
+        <w:t xml:space="preserve">World Wildlife Fund for Nature (WWF) Malaysia / PT Hatfield Indonesia | </w:t>
       </w:r>
       <w:r>
         <w:rPr>
@@ -3648,7 +3648,7 @@
           <w:sz w:val="18"/>
           <w:szCs w:val="18"/>
         </w:rPr>
-        <w:t xml:space="preserve">January - December 2017 | </w:t>
+        <w:t xml:space="preserve">2020 - 2021 | </w:t>
       </w:r>
       <w:r>
         <w:rPr>
@@ -3668,7 +3668,7 @@
           <w:sz w:val="18"/>
           <w:szCs w:val="18"/>
         </w:rPr>
-        <w:t xml:space="preserve">Marine &amp; Fisheries Governance</w:t>
+        <w:t xml:space="preserve">marine</w:t>
       </w:r>
     </w:p>
     <w:p>
@@ -3682,7 +3682,7 @@
           <w:sz w:val="19"/>
           <w:szCs w:val="19"/>
         </w:rPr>
-        <w:t xml:space="preserve">Led the technical implementation of low-cost marine bioacoustic surveys and hydroacoustic telemetry beneath Fish Aggregating Devices (FADs / Rumpon) to quantify juvenile tuna biomass and deep-water pelagic schooling behavior. Integrated hydroacoustic data with on-board Captain-Operated Data Recording Systems (CODRS) and length-based spawning potential ratio (SPR) assessments to formulate policy briefs on voluntary FAD management guidelines and harvest strategy compliance in Indonesian tuna fisheries.</w:t>
+        <w:t xml:space="preserve">Provided evaluative research and analytical support for the independent evaluation of WWF Malaysia's Marine Conservation Programme. Supported criteria-based assessments evaluating conservation effectiveness, strategic relevance, stakeholder engagement, and marine protected area governance across priority seascapes in Peninsular Malaysia and Sabah.</w:t>
       </w:r>
     </w:p>
     <w:p>
@@ -3698,7 +3698,197 @@
           <w:sz w:val="20"/>
           <w:szCs w:val="20"/>
         </w:rPr>
-        <w:t xml:space="preserve">29. Marine Mammal Monitoring and Mitigation Plan for 3D Marine Seismic Acquisition in Mentawai Block</w:t>
+        <w:t xml:space="preserve">29. Institutional Advisory &amp; Multi-Stakeholder Facilitation for the Indonesian National Tuna Management Commission</w:t>
+      </w:r>
+    </w:p>
+    <w:p>
+      <w:pPr>
+        <w:spacing w:after="30" w:before="10"/>
+      </w:pPr>
+      <w:r>
+        <w:rPr>
+          <w:rFonts w:ascii="Arial" w:cs="Arial" w:eastAsia="Arial" w:hAnsi="Arial"/>
+          <w:b/>
+          <w:bCs/>
+          <w:color w:val="64748B"/>
+          <w:sz w:val="18"/>
+          <w:szCs w:val="18"/>
+        </w:rPr>
+        <w:t xml:space="preserve">Client: </w:t>
+      </w:r>
+      <w:r>
+        <w:rPr>
+          <w:rFonts w:ascii="Arial" w:cs="Arial" w:eastAsia="Arial" w:hAnsi="Arial"/>
+          <w:color w:val="1E293B"/>
+          <w:sz w:val="18"/>
+          <w:szCs w:val="18"/>
+        </w:rPr>
+        <w:t xml:space="preserve">The David and Lucile Packard Foundation / PT Hatfield Indonesia | </w:t>
+      </w:r>
+      <w:r>
+        <w:rPr>
+          <w:rFonts w:ascii="Arial" w:cs="Arial" w:eastAsia="Arial" w:hAnsi="Arial"/>
+          <w:b/>
+          <w:bCs/>
+          <w:color w:val="64748B"/>
+          <w:sz w:val="18"/>
+          <w:szCs w:val="18"/>
+        </w:rPr>
+        <w:t xml:space="preserve">Period: </w:t>
+      </w:r>
+      <w:r>
+        <w:rPr>
+          <w:rFonts w:ascii="Arial" w:cs="Arial" w:eastAsia="Arial" w:hAnsi="Arial"/>
+          <w:color w:val="1E293B"/>
+          <w:sz w:val="18"/>
+          <w:szCs w:val="18"/>
+        </w:rPr>
+        <w:t xml:space="preserve">2019 - 2020 | </w:t>
+      </w:r>
+      <w:r>
+        <w:rPr>
+          <w:rFonts w:ascii="Arial" w:cs="Arial" w:eastAsia="Arial" w:hAnsi="Arial"/>
+          <w:b/>
+          <w:bCs/>
+          <w:color w:val="64748B"/>
+          <w:sz w:val="18"/>
+          <w:szCs w:val="18"/>
+        </w:rPr>
+        <w:t xml:space="preserve">Focus: </w:t>
+      </w:r>
+      <w:r>
+        <w:rPr>
+          <w:rFonts w:ascii="Arial" w:cs="Arial" w:eastAsia="Arial" w:hAnsi="Arial"/>
+          <w:color w:val="0D9488"/>
+          <w:sz w:val="18"/>
+          <w:szCs w:val="18"/>
+        </w:rPr>
+        <w:t xml:space="preserve">Marine &amp; Fisheries Governance</w:t>
+      </w:r>
+    </w:p>
+    <w:p>
+      <w:pPr>
+        <w:spacing w:after="70" w:before="20"/>
+      </w:pPr>
+      <w:r>
+        <w:rPr>
+          <w:rFonts w:ascii="Arial" w:cs="Arial" w:eastAsia="Arial" w:hAnsi="Arial"/>
+          <w:color w:val="1E293B"/>
+          <w:sz w:val="19"/>
+          <w:szCs w:val="19"/>
+        </w:rPr>
+        <w:t xml:space="preserve">Provided technical and coordination support in facilitating the foundational dialogue and operational setup for the Indonesian National Tuna Management Commission (Komisi Nasional Pengelolaan Perikanan Tuna). Contributed to institutional stakeholder mapping, synthesis of fisheries policy inputs, and preparation of procedural materials to advance multi-stakeholder governance across Indonesia's tuna sector.</w:t>
+      </w:r>
+    </w:p>
+    <w:p>
+      <w:pPr>
+        <w:spacing w:after="20" w:before="80"/>
+      </w:pPr>
+      <w:r>
+        <w:rPr>
+          <w:rFonts w:ascii="Arial" w:cs="Arial" w:eastAsia="Arial" w:hAnsi="Arial"/>
+          <w:b/>
+          <w:bCs/>
+          <w:color w:val="0F3A5D"/>
+          <w:sz w:val="20"/>
+          <w:szCs w:val="20"/>
+        </w:rPr>
+        <w:t xml:space="preserve">30. Sustainable Tuna Fisheries Management Based on Acoustic Measurement, Length-Based Assessment, and FAD Management</w:t>
+      </w:r>
+    </w:p>
+    <w:p>
+      <w:pPr>
+        <w:spacing w:after="30" w:before="10"/>
+      </w:pPr>
+      <w:r>
+        <w:rPr>
+          <w:rFonts w:ascii="Arial" w:cs="Arial" w:eastAsia="Arial" w:hAnsi="Arial"/>
+          <w:b/>
+          <w:bCs/>
+          <w:color w:val="64748B"/>
+          <w:sz w:val="18"/>
+          <w:szCs w:val="18"/>
+        </w:rPr>
+        <w:t xml:space="preserve">Client: </w:t>
+      </w:r>
+      <w:r>
+        <w:rPr>
+          <w:rFonts w:ascii="Arial" w:cs="Arial" w:eastAsia="Arial" w:hAnsi="Arial"/>
+          <w:color w:val="1E293B"/>
+          <w:sz w:val="18"/>
+          <w:szCs w:val="18"/>
+        </w:rPr>
+        <w:t xml:space="preserve">The Nature Conservancy (TNC) | </w:t>
+      </w:r>
+      <w:r>
+        <w:rPr>
+          <w:rFonts w:ascii="Arial" w:cs="Arial" w:eastAsia="Arial" w:hAnsi="Arial"/>
+          <w:b/>
+          <w:bCs/>
+          <w:color w:val="64748B"/>
+          <w:sz w:val="18"/>
+          <w:szCs w:val="18"/>
+        </w:rPr>
+        <w:t xml:space="preserve">Period: </w:t>
+      </w:r>
+      <w:r>
+        <w:rPr>
+          <w:rFonts w:ascii="Arial" w:cs="Arial" w:eastAsia="Arial" w:hAnsi="Arial"/>
+          <w:color w:val="1E293B"/>
+          <w:sz w:val="18"/>
+          <w:szCs w:val="18"/>
+        </w:rPr>
+        <w:t xml:space="preserve">January - December 2017 | </w:t>
+      </w:r>
+      <w:r>
+        <w:rPr>
+          <w:rFonts w:ascii="Arial" w:cs="Arial" w:eastAsia="Arial" w:hAnsi="Arial"/>
+          <w:b/>
+          <w:bCs/>
+          <w:color w:val="64748B"/>
+          <w:sz w:val="18"/>
+          <w:szCs w:val="18"/>
+        </w:rPr>
+        <w:t xml:space="preserve">Focus: </w:t>
+      </w:r>
+      <w:r>
+        <w:rPr>
+          <w:rFonts w:ascii="Arial" w:cs="Arial" w:eastAsia="Arial" w:hAnsi="Arial"/>
+          <w:color w:val="0D9488"/>
+          <w:sz w:val="18"/>
+          <w:szCs w:val="18"/>
+        </w:rPr>
+        <w:t xml:space="preserve">Marine &amp; Fisheries Governance</w:t>
+      </w:r>
+    </w:p>
+    <w:p>
+      <w:pPr>
+        <w:spacing w:after="70" w:before="20"/>
+      </w:pPr>
+      <w:r>
+        <w:rPr>
+          <w:rFonts w:ascii="Arial" w:cs="Arial" w:eastAsia="Arial" w:hAnsi="Arial"/>
+          <w:color w:val="1E293B"/>
+          <w:sz w:val="19"/>
+          <w:szCs w:val="19"/>
+        </w:rPr>
+        <w:t xml:space="preserve">Led the technical implementation of low-cost marine bioacoustic surveys and hydroacoustic telemetry beneath Fish Aggregating Devices (FADs / Rumpon) to quantify juvenile tuna biomass and deep-water pelagic schooling behavior. Integrated hydroacoustic data with on-board Captain-Operated Data Recording Systems (CODRS) and length-based spawning potential ratio (SPR) assessments to formulate policy briefs on voluntary FAD management guidelines and harvest strategy compliance in Indonesian tuna fisheries.</w:t>
+      </w:r>
+    </w:p>
+    <w:p>
+      <w:pPr>
+        <w:spacing w:after="20" w:before="80"/>
+      </w:pPr>
+      <w:r>
+        <w:rPr>
+          <w:rFonts w:ascii="Arial" w:cs="Arial" w:eastAsia="Arial" w:hAnsi="Arial"/>
+          <w:b/>
+          <w:bCs/>
+          <w:color w:val="0F3A5D"/>
+          <w:sz w:val="20"/>
+          <w:szCs w:val="20"/>
+        </w:rPr>
+        <w:t xml:space="preserve">31. Marine Mammal Monitoring and Mitigation Plan for 3D Marine Seismic Acquisition in Mentawai Block</w:t>
       </w:r>
     </w:p>
     <w:p>

</xml_diff>

<commit_message>
Pembaruan otomatis CV dari Word & Sertifikat pada 21/10/2026 15:10:28,54
</commit_message>
<xml_diff>
--- a/I Gede Mahendra Wijaya_Master CV.docx
+++ b/I Gede Mahendra Wijaya_Master CV.docx
@@ -41,7 +41,7 @@
         <w:spacing w:after="40" w:before="0"/>
         <w:jc w:val="center"/>
       </w:pPr>
-      <w:hyperlink w:history="1" r:id="rIdu2rcbhqvya72k1r3pllvk">
+      <w:hyperlink w:history="1" r:id="rId6fm3fpveajd7m-bnpcgfu">
         <w:r>
           <w:rPr>
             <w:rFonts w:ascii="Arial" w:cs="Arial" w:eastAsia="Arial" w:hAnsi="Arial"/>
@@ -62,7 +62,7 @@
         </w:rPr>
         <w:t xml:space="preserve">  |  </w:t>
       </w:r>
-      <w:hyperlink w:history="1" r:id="rIdhxsioj7hlualf9g165ax5">
+      <w:hyperlink w:history="1" r:id="rIdq02xbgufrvhjwl5pdja9r">
         <w:r>
           <w:rPr>
             <w:rFonts w:ascii="Arial" w:cs="Arial" w:eastAsia="Arial" w:hAnsi="Arial"/>
@@ -83,7 +83,7 @@
         </w:rPr>
         <w:t xml:space="preserve">  |  </w:t>
       </w:r>
-      <w:hyperlink w:history="1" r:id="rIdweiqyh_mqhh62quje4ydc">
+      <w:hyperlink w:history="1" r:id="rIdela34zf7e_qt11sv9niyx">
         <w:r>
           <w:rPr>
             <w:rFonts w:ascii="Arial" w:cs="Arial" w:eastAsia="Arial" w:hAnsi="Arial"/>
@@ -133,6 +133,7 @@
     <w:p>
       <w:pPr>
         <w:spacing w:after="120" w:before="60"/>
+        <w:jc w:val="both"/>
       </w:pPr>
       <w:r>
         <w:rPr>
@@ -190,7 +191,7 @@
           <w:sz w:val="20"/>
           <w:szCs w:val="20"/>
         </w:rPr>
-        <w:t xml:space="preserve">Years Experience - </w:t>
+        <w:t xml:space="preserve">Years Experience</w:t>
       </w:r>
     </w:p>
     <w:p>
@@ -220,7 +221,7 @@
           <w:sz w:val="20"/>
           <w:szCs w:val="20"/>
         </w:rPr>
-        <w:t xml:space="preserve">Projects Completed - </w:t>
+        <w:t xml:space="preserve">Projects Completed</w:t>
       </w:r>
     </w:p>
     <w:p>
@@ -250,7 +251,7 @@
           <w:sz w:val="20"/>
           <w:szCs w:val="20"/>
         </w:rPr>
-        <w:t xml:space="preserve">Certifications - </w:t>
+        <w:t xml:space="preserve">Certifications</w:t>
       </w:r>
     </w:p>
     <w:p>
@@ -280,7 +281,7 @@
           <w:sz w:val="20"/>
           <w:szCs w:val="20"/>
         </w:rPr>
-        <w:t xml:space="preserve">Publications - </w:t>
+        <w:t xml:space="preserve">Publications</w:t>
       </w:r>
     </w:p>
     <w:p>
@@ -348,6 +349,7 @@
       <w:pPr>
         <w:spacing w:after="60" w:before="20"/>
         <w:ind w:left="360"/>
+        <w:jc w:val="both"/>
       </w:pPr>
       <w:r>
         <w:rPr>
@@ -416,6 +418,7 @@
       <w:pPr>
         <w:spacing w:after="60" w:before="20"/>
         <w:ind w:left="360"/>
+        <w:jc w:val="both"/>
       </w:pPr>
       <w:r>
         <w:rPr>
@@ -484,6 +487,7 @@
       <w:pPr>
         <w:spacing w:after="60" w:before="20"/>
         <w:ind w:left="360"/>
+        <w:jc w:val="both"/>
       </w:pPr>
       <w:r>
         <w:rPr>
@@ -552,6 +556,7 @@
       <w:pPr>
         <w:spacing w:after="60" w:before="20"/>
         <w:ind w:left="360"/>
+        <w:jc w:val="both"/>
       </w:pPr>
       <w:r>
         <w:rPr>
@@ -639,6 +644,7 @@
     <w:p>
       <w:pPr>
         <w:spacing w:after="80" w:before="20"/>
+        <w:jc w:val="both"/>
       </w:pPr>
       <w:r>
         <w:rPr>
@@ -696,6 +702,7 @@
     <w:p>
       <w:pPr>
         <w:spacing w:after="80" w:before="20"/>
+        <w:jc w:val="both"/>
       </w:pPr>
       <w:r>
         <w:rPr>
@@ -753,6 +760,7 @@
     <w:p>
       <w:pPr>
         <w:spacing w:after="80" w:before="20"/>
+        <w:jc w:val="both"/>
       </w:pPr>
       <w:r>
         <w:rPr>
@@ -810,6 +818,7 @@
     <w:p>
       <w:pPr>
         <w:spacing w:after="80" w:before="20"/>
+        <w:jc w:val="both"/>
       </w:pPr>
       <w:r>
         <w:rPr>
@@ -867,6 +876,7 @@
     <w:p>
       <w:pPr>
         <w:spacing w:after="80" w:before="20"/>
+        <w:jc w:val="both"/>
       </w:pPr>
       <w:r>
         <w:rPr>
@@ -924,6 +934,7 @@
     <w:p>
       <w:pPr>
         <w:spacing w:after="80" w:before="20"/>
+        <w:jc w:val="both"/>
       </w:pPr>
       <w:r>
         <w:rPr>
@@ -981,6 +992,7 @@
     <w:p>
       <w:pPr>
         <w:spacing w:after="80" w:before="20"/>
+        <w:jc w:val="both"/>
       </w:pPr>
       <w:r>
         <w:rPr>
@@ -1014,6 +1026,7 @@
     <w:p>
       <w:pPr>
         <w:spacing w:after="120" w:before="60"/>
+        <w:jc w:val="both"/>
       </w:pPr>
       <w:r>
         <w:rPr>
@@ -1109,6 +1122,7 @@
     <w:p>
       <w:pPr>
         <w:spacing w:after="70" w:before="20"/>
+        <w:jc w:val="both"/>
       </w:pPr>
       <w:r>
         <w:rPr>
@@ -1204,6 +1218,7 @@
     <w:p>
       <w:pPr>
         <w:spacing w:after="70" w:before="20"/>
+        <w:jc w:val="both"/>
       </w:pPr>
       <w:r>
         <w:rPr>
@@ -1299,6 +1314,7 @@
     <w:p>
       <w:pPr>
         <w:spacing w:after="70" w:before="20"/>
+        <w:jc w:val="both"/>
       </w:pPr>
       <w:r>
         <w:rPr>
@@ -1394,6 +1410,7 @@
     <w:p>
       <w:pPr>
         <w:spacing w:after="70" w:before="20"/>
+        <w:jc w:val="both"/>
       </w:pPr>
       <w:r>
         <w:rPr>
@@ -1489,6 +1506,7 @@
     <w:p>
       <w:pPr>
         <w:spacing w:after="70" w:before="20"/>
+        <w:jc w:val="both"/>
       </w:pPr>
       <w:r>
         <w:rPr>
@@ -1584,6 +1602,7 @@
     <w:p>
       <w:pPr>
         <w:spacing w:after="70" w:before="20"/>
+        <w:jc w:val="both"/>
       </w:pPr>
       <w:r>
         <w:rPr>
@@ -1679,6 +1698,7 @@
     <w:p>
       <w:pPr>
         <w:spacing w:after="70" w:before="20"/>
+        <w:jc w:val="both"/>
       </w:pPr>
       <w:r>
         <w:rPr>
@@ -1774,6 +1794,7 @@
     <w:p>
       <w:pPr>
         <w:spacing w:after="70" w:before="20"/>
+        <w:jc w:val="both"/>
       </w:pPr>
       <w:r>
         <w:rPr>
@@ -1869,6 +1890,7 @@
     <w:p>
       <w:pPr>
         <w:spacing w:after="70" w:before="20"/>
+        <w:jc w:val="both"/>
       </w:pPr>
       <w:r>
         <w:rPr>
@@ -1964,6 +1986,7 @@
     <w:p>
       <w:pPr>
         <w:spacing w:after="70" w:before="20"/>
+        <w:jc w:val="both"/>
       </w:pPr>
       <w:r>
         <w:rPr>
@@ -2059,6 +2082,7 @@
     <w:p>
       <w:pPr>
         <w:spacing w:after="70" w:before="20"/>
+        <w:jc w:val="both"/>
       </w:pPr>
       <w:r>
         <w:rPr>
@@ -2154,6 +2178,7 @@
     <w:p>
       <w:pPr>
         <w:spacing w:after="70" w:before="20"/>
+        <w:jc w:val="both"/>
       </w:pPr>
       <w:r>
         <w:rPr>
@@ -2249,6 +2274,7 @@
     <w:p>
       <w:pPr>
         <w:spacing w:after="70" w:before="20"/>
+        <w:jc w:val="both"/>
       </w:pPr>
       <w:r>
         <w:rPr>
@@ -2344,6 +2370,7 @@
     <w:p>
       <w:pPr>
         <w:spacing w:after="70" w:before="20"/>
+        <w:jc w:val="both"/>
       </w:pPr>
       <w:r>
         <w:rPr>
@@ -2439,6 +2466,7 @@
     <w:p>
       <w:pPr>
         <w:spacing w:after="70" w:before="20"/>
+        <w:jc w:val="both"/>
       </w:pPr>
       <w:r>
         <w:rPr>
@@ -2534,6 +2562,7 @@
     <w:p>
       <w:pPr>
         <w:spacing w:after="70" w:before="20"/>
+        <w:jc w:val="both"/>
       </w:pPr>
       <w:r>
         <w:rPr>
@@ -2629,6 +2658,7 @@
     <w:p>
       <w:pPr>
         <w:spacing w:after="70" w:before="20"/>
+        <w:jc w:val="both"/>
       </w:pPr>
       <w:r>
         <w:rPr>
@@ -2724,6 +2754,7 @@
     <w:p>
       <w:pPr>
         <w:spacing w:after="70" w:before="20"/>
+        <w:jc w:val="both"/>
       </w:pPr>
       <w:r>
         <w:rPr>
@@ -2819,6 +2850,7 @@
     <w:p>
       <w:pPr>
         <w:spacing w:after="70" w:before="20"/>
+        <w:jc w:val="both"/>
       </w:pPr>
       <w:r>
         <w:rPr>
@@ -2914,6 +2946,7 @@
     <w:p>
       <w:pPr>
         <w:spacing w:after="70" w:before="20"/>
+        <w:jc w:val="both"/>
       </w:pPr>
       <w:r>
         <w:rPr>
@@ -3009,6 +3042,7 @@
     <w:p>
       <w:pPr>
         <w:spacing w:after="70" w:before="20"/>
+        <w:jc w:val="both"/>
       </w:pPr>
       <w:r>
         <w:rPr>
@@ -3104,6 +3138,7 @@
     <w:p>
       <w:pPr>
         <w:spacing w:after="70" w:before="20"/>
+        <w:jc w:val="both"/>
       </w:pPr>
       <w:r>
         <w:rPr>
@@ -3199,6 +3234,7 @@
     <w:p>
       <w:pPr>
         <w:spacing w:after="70" w:before="20"/>
+        <w:jc w:val="both"/>
       </w:pPr>
       <w:r>
         <w:rPr>
@@ -3294,6 +3330,7 @@
     <w:p>
       <w:pPr>
         <w:spacing w:after="70" w:before="20"/>
+        <w:jc w:val="both"/>
       </w:pPr>
       <w:r>
         <w:rPr>
@@ -3389,6 +3426,7 @@
     <w:p>
       <w:pPr>
         <w:spacing w:after="70" w:before="20"/>
+        <w:jc w:val="both"/>
       </w:pPr>
       <w:r>
         <w:rPr>
@@ -3484,6 +3522,7 @@
     <w:p>
       <w:pPr>
         <w:spacing w:after="70" w:before="20"/>
+        <w:jc w:val="both"/>
       </w:pPr>
       <w:r>
         <w:rPr>
@@ -3579,6 +3618,7 @@
     <w:p>
       <w:pPr>
         <w:spacing w:after="70" w:before="20"/>
+        <w:jc w:val="both"/>
       </w:pPr>
       <w:r>
         <w:rPr>
@@ -3674,6 +3714,7 @@
     <w:p>
       <w:pPr>
         <w:spacing w:after="70" w:before="20"/>
+        <w:jc w:val="both"/>
       </w:pPr>
       <w:r>
         <w:rPr>
@@ -3769,6 +3810,7 @@
     <w:p>
       <w:pPr>
         <w:spacing w:after="70" w:before="20"/>
+        <w:jc w:val="both"/>
       </w:pPr>
       <w:r>
         <w:rPr>
@@ -3864,6 +3906,7 @@
     <w:p>
       <w:pPr>
         <w:spacing w:after="70" w:before="20"/>
+        <w:jc w:val="both"/>
       </w:pPr>
       <w:r>
         <w:rPr>
@@ -3959,6 +4002,7 @@
     <w:p>
       <w:pPr>
         <w:spacing w:after="70" w:before="20"/>
+        <w:jc w:val="both"/>
       </w:pPr>
       <w:r>
         <w:rPr>
@@ -4042,6 +4086,7 @@
     <w:p>
       <w:pPr>
         <w:spacing w:after="60" w:before="10"/>
+        <w:jc w:val="both"/>
       </w:pPr>
       <w:r>
         <w:rPr>
@@ -4106,6 +4151,7 @@
     <w:p>
       <w:pPr>
         <w:spacing w:after="60" w:before="10"/>
+        <w:jc w:val="both"/>
       </w:pPr>
       <w:r>
         <w:rPr>
@@ -4170,6 +4216,7 @@
     <w:p>
       <w:pPr>
         <w:spacing w:after="60" w:before="10"/>
+        <w:jc w:val="both"/>
       </w:pPr>
       <w:r>
         <w:rPr>
@@ -4234,6 +4281,7 @@
     <w:p>
       <w:pPr>
         <w:spacing w:after="60" w:before="10"/>
+        <w:jc w:val="both"/>
       </w:pPr>
       <w:r>
         <w:rPr>
@@ -4298,6 +4346,7 @@
     <w:p>
       <w:pPr>
         <w:spacing w:after="60" w:before="10"/>
+        <w:jc w:val="both"/>
       </w:pPr>
       <w:r>
         <w:rPr>
@@ -7183,6 +7232,7 @@
     <w:p>
       <w:pPr>
         <w:spacing w:after="50" w:before="10"/>
+        <w:jc w:val="both"/>
       </w:pPr>
       <w:r>
         <w:rPr>
@@ -7222,6 +7272,7 @@
     <w:p>
       <w:pPr>
         <w:spacing w:after="50" w:before="10"/>
+        <w:jc w:val="both"/>
       </w:pPr>
       <w:r>
         <w:rPr>
@@ -7261,6 +7312,7 @@
     <w:p>
       <w:pPr>
         <w:spacing w:after="50" w:before="10"/>
+        <w:jc w:val="both"/>
       </w:pPr>
       <w:r>
         <w:rPr>
@@ -7300,6 +7352,7 @@
     <w:p>
       <w:pPr>
         <w:spacing w:after="50" w:before="10"/>
+        <w:jc w:val="both"/>
       </w:pPr>
       <w:r>
         <w:rPr>
@@ -7339,6 +7392,7 @@
     <w:p>
       <w:pPr>
         <w:spacing w:after="50" w:before="10"/>
+        <w:jc w:val="both"/>
       </w:pPr>
       <w:r>
         <w:rPr>
@@ -7378,6 +7432,7 @@
     <w:p>
       <w:pPr>
         <w:spacing w:after="50" w:before="10"/>
+        <w:jc w:val="both"/>
       </w:pPr>
       <w:r>
         <w:rPr>
@@ -7417,6 +7472,7 @@
     <w:p>
       <w:pPr>
         <w:spacing w:after="50" w:before="10"/>
+        <w:jc w:val="both"/>
       </w:pPr>
       <w:r>
         <w:rPr>
@@ -7456,6 +7512,7 @@
     <w:p>
       <w:pPr>
         <w:spacing w:after="50" w:before="10"/>
+        <w:jc w:val="both"/>
       </w:pPr>
       <w:r>
         <w:rPr>
@@ -7495,6 +7552,7 @@
     <w:p>
       <w:pPr>
         <w:spacing w:after="50" w:before="10"/>
+        <w:jc w:val="both"/>
       </w:pPr>
       <w:r>
         <w:rPr>
@@ -7534,6 +7592,7 @@
     <w:p>
       <w:pPr>
         <w:spacing w:after="50" w:before="10"/>
+        <w:jc w:val="both"/>
       </w:pPr>
       <w:r>
         <w:rPr>
@@ -7573,6 +7632,7 @@
     <w:p>
       <w:pPr>
         <w:spacing w:after="50" w:before="10"/>
+        <w:jc w:val="both"/>
       </w:pPr>
       <w:r>
         <w:rPr>
@@ -7631,6 +7691,7 @@
     <w:p>
       <w:pPr>
         <w:spacing w:after="50" w:before="10"/>
+        <w:jc w:val="both"/>
       </w:pPr>
       <w:r>
         <w:rPr>

</xml_diff>

<commit_message>
Pembaruan otomatis CV dari Word & Sertifikat pada 21/10/2026 15:24:56,11
</commit_message>
<xml_diff>
--- a/I Gede Mahendra Wijaya_Master CV.docx
+++ b/I Gede Mahendra Wijaya_Master CV.docx
@@ -41,7 +41,7 @@
         <w:spacing w:after="40" w:before="0"/>
         <w:jc w:val="center"/>
       </w:pPr>
-      <w:hyperlink w:history="1" r:id="rId6fm3fpveajd7m-bnpcgfu">
+      <w:hyperlink w:history="1" r:id="rIdx3bi7aa85w7bo4tmk6eqa">
         <w:r>
           <w:rPr>
             <w:rFonts w:ascii="Arial" w:cs="Arial" w:eastAsia="Arial" w:hAnsi="Arial"/>
@@ -62,7 +62,7 @@
         </w:rPr>
         <w:t xml:space="preserve">  |  </w:t>
       </w:r>
-      <w:hyperlink w:history="1" r:id="rIdq02xbgufrvhjwl5pdja9r">
+      <w:hyperlink w:history="1" r:id="rIdlpqtk0b7t_guc8cvwyxot">
         <w:r>
           <w:rPr>
             <w:rFonts w:ascii="Arial" w:cs="Arial" w:eastAsia="Arial" w:hAnsi="Arial"/>
@@ -83,7 +83,7 @@
         </w:rPr>
         <w:t xml:space="preserve">  |  </w:t>
       </w:r>
-      <w:hyperlink w:history="1" r:id="rIdela34zf7e_qt11sv9niyx">
+      <w:hyperlink w:history="1" r:id="rId0pgp32s0uc4fj0vg0f3h1">
         <w:r>
           <w:rPr>
             <w:rFonts w:ascii="Arial" w:cs="Arial" w:eastAsia="Arial" w:hAnsi="Arial"/>
@@ -272,7 +272,7 @@
           <w:sz w:val="20"/>
           <w:szCs w:val="20"/>
         </w:rPr>
-        <w:t xml:space="preserve">5: </w:t>
+        <w:t xml:space="preserve">6: </w:t>
       </w:r>
       <w:r>
         <w:rPr>
@@ -4030,7 +4030,7 @@
           <w:sz w:val="24"/>
           <w:szCs w:val="24"/>
         </w:rPr>
-        <w:t xml:space="preserve">PEER-REVIEWED PUBLICATIONS &amp; PAPERS (5 PUBLICATIONS)</w:t>
+        <w:t xml:space="preserve">PEER-REVIEWED PUBLICATIONS &amp; PAPERS (6 PUBLICATIONS)</w:t>
       </w:r>
     </w:p>
     <w:p>
@@ -4046,7 +4046,7 @@
           <w:sz w:val="20"/>
           <w:szCs w:val="20"/>
         </w:rPr>
-        <w:t xml:space="preserve">1. Marine Mammals Interactions with Tuna Fishing Activities in Indonesian Seas</w:t>
+        <w:t xml:space="preserve">1. Digital Shrimp Cultivation: SMARTSHRIMPS.ID - Smart Mobile &amp; Web Application for Indonesian Shrimp Farmers (Budidaya Udang Cara Digital)</w:t>
       </w:r>
     </w:p>
     <w:p>
@@ -4060,7 +4060,7 @@
           <w:sz w:val="18"/>
           <w:szCs w:val="18"/>
         </w:rPr>
-        <w:t xml:space="preserve">(2019). </w:t>
+        <w:t xml:space="preserve">(2022). </w:t>
       </w:r>
       <w:r>
         <w:rPr>
@@ -4071,16 +4071,16 @@
           <w:sz w:val="18"/>
           <w:szCs w:val="18"/>
         </w:rPr>
-        <w:t xml:space="preserve">International Seminar on Natural Resources and Environmental Management. </w:t>
-      </w:r>
-      <w:r>
-        <w:rPr>
-          <w:rFonts w:ascii="Arial" w:cs="Arial" w:eastAsia="Arial" w:hAnsi="Arial"/>
-          <w:color w:val="0D9488"/>
-          <w:sz w:val="18"/>
-          <w:szCs w:val="18"/>
-        </w:rPr>
-        <w:t xml:space="preserve">DOI/Link: https://doi.org/10.1088/1755-1315/399/1/012128</w:t>
+        <w:t xml:space="preserve">114 Inovasi Indonesia 2022 - Business Innovation Center (BIC) &amp; Ministry of Research and Technology (Kemenristek/BRIN). </w:t>
+      </w:r>
+      <w:r>
+        <w:rPr>
+          <w:rFonts w:ascii="Arial" w:cs="Arial" w:eastAsia="Arial" w:hAnsi="Arial"/>
+          <w:color w:val="0D9488"/>
+          <w:sz w:val="18"/>
+          <w:szCs w:val="18"/>
+        </w:rPr>
+        <w:t xml:space="preserve">DOI/Link: https://bic.web.id/general/view/Budidaya+Udang+Cara+Digital+</w:t>
       </w:r>
     </w:p>
     <w:p>
@@ -4095,7 +4095,7 @@
           <w:sz w:val="18"/>
           <w:szCs w:val="18"/>
         </w:rPr>
-        <w:t xml:space="preserve">Research paper assessing spatial interactions and mitigation strategies between marine mammal populations and industrial tuna longline fisheries across Indonesian fishing zones.</w:t>
+        <w:t xml:space="preserve">National award-winning digital innovation developing a smart mobile and web application for optimizing daily shrimp farming data, real-time water quality monitoring, and traceability to elevate smallholder aquaculture productivity to international export standards.</w:t>
       </w:r>
     </w:p>
     <w:p>
@@ -4111,7 +4111,7 @@
           <w:sz w:val="20"/>
           <w:szCs w:val="20"/>
         </w:rPr>
-        <w:t xml:space="preserve">2. Observations on Australian Humpback Dolphins (Sousa sahulensis) in Waters of the Pacific Islands and New Guinea</w:t>
+        <w:t xml:space="preserve">2. Marine Mammals Interactions with Tuna Fishing Activities in Indonesian Seas</w:t>
       </w:r>
     </w:p>
     <w:p>
@@ -4125,7 +4125,7 @@
           <w:sz w:val="18"/>
           <w:szCs w:val="18"/>
         </w:rPr>
-        <w:t xml:space="preserve">(2016). </w:t>
+        <w:t xml:space="preserve">(2019). </w:t>
       </w:r>
       <w:r>
         <w:rPr>
@@ -4136,16 +4136,16 @@
           <w:sz w:val="18"/>
           <w:szCs w:val="18"/>
         </w:rPr>
-        <w:t xml:space="preserve">Current Status and Conservation, Part 2, Vol 73, AMB, UK: Academic Press, pp. 219-271. </w:t>
-      </w:r>
-      <w:r>
-        <w:rPr>
-          <w:rFonts w:ascii="Arial" w:cs="Arial" w:eastAsia="Arial" w:hAnsi="Arial"/>
-          <w:color w:val="0D9488"/>
-          <w:sz w:val="18"/>
-          <w:szCs w:val="18"/>
-        </w:rPr>
-        <w:t xml:space="preserve">DOI/Link: https://doi.org/10.1016/bs.amb.2015.08.003</w:t>
+        <w:t xml:space="preserve">International Seminar on Natural Resources and Environmental Management. </w:t>
+      </w:r>
+      <w:r>
+        <w:rPr>
+          <w:rFonts w:ascii="Arial" w:cs="Arial" w:eastAsia="Arial" w:hAnsi="Arial"/>
+          <w:color w:val="0D9488"/>
+          <w:sz w:val="18"/>
+          <w:szCs w:val="18"/>
+        </w:rPr>
+        <w:t xml:space="preserve">DOI/Link: https://doi.org/10.1088/1755-1315/399/1/012128</w:t>
       </w:r>
     </w:p>
     <w:p>
@@ -4160,7 +4160,7 @@
           <w:sz w:val="18"/>
           <w:szCs w:val="18"/>
         </w:rPr>
-        <w:t xml:space="preserve">Comprehensive peer-reviewed book chapter and field study documenting the distribution, ecology, and conservation status of Australian humpback dolphins in the Pacific and New Guinea.</w:t>
+        <w:t xml:space="preserve">Research paper assessing spatial interactions and mitigation strategies between marine mammal populations and industrial tuna longline fisheries across Indonesian fishing zones.</w:t>
       </w:r>
     </w:p>
     <w:p>
@@ -4176,7 +4176,7 @@
           <w:sz w:val="20"/>
           <w:szCs w:val="20"/>
         </w:rPr>
-        <w:t xml:space="preserve">3. Application of Radon Transform Method for 2D Seismic Multiple Wave Reduction in West Sumatra Waters</w:t>
+        <w:t xml:space="preserve">3. Observations on Australian Humpback Dolphins (Sousa sahulensis) in Waters of the Pacific Islands and New Guinea</w:t>
       </w:r>
     </w:p>
     <w:p>
@@ -4190,7 +4190,7 @@
           <w:sz w:val="18"/>
           <w:szCs w:val="18"/>
         </w:rPr>
-        <w:t xml:space="preserve">(2013). </w:t>
+        <w:t xml:space="preserve">(2016). </w:t>
       </w:r>
       <w:r>
         <w:rPr>
@@ -4201,16 +4201,16 @@
           <w:sz w:val="18"/>
           <w:szCs w:val="18"/>
         </w:rPr>
-        <w:t xml:space="preserve">IPB University Scientific Repository - Undergraduate Thesis (Advisor: Prof. Dr. Henry M. Manik). </w:t>
-      </w:r>
-      <w:r>
-        <w:rPr>
-          <w:rFonts w:ascii="Arial" w:cs="Arial" w:eastAsia="Arial" w:hAnsi="Arial"/>
-          <w:color w:val="0D9488"/>
-          <w:sz w:val="18"/>
-          <w:szCs w:val="18"/>
-        </w:rPr>
-        <w:t xml:space="preserve">DOI/Link: https://repository.ipb.ac.id/handle/123456789/63281</w:t>
+        <w:t xml:space="preserve">Current Status and Conservation, Part 2, Vol 73, AMB, UK: Academic Press, pp. 219-271. </w:t>
+      </w:r>
+      <w:r>
+        <w:rPr>
+          <w:rFonts w:ascii="Arial" w:cs="Arial" w:eastAsia="Arial" w:hAnsi="Arial"/>
+          <w:color w:val="0D9488"/>
+          <w:sz w:val="18"/>
+          <w:szCs w:val="18"/>
+        </w:rPr>
+        <w:t xml:space="preserve">DOI/Link: https://doi.org/10.1016/bs.amb.2015.08.003</w:t>
       </w:r>
     </w:p>
     <w:p>
@@ -4225,7 +4225,7 @@
           <w:sz w:val="18"/>
           <w:szCs w:val="18"/>
         </w:rPr>
-        <w:t xml:space="preserve">Undergraduate research in marine geophysics and seismic data processing applying Radon Transform (Tau-P Analysis) to attenuate surface multiples on 2D marine seismic line SUME23.31 in West Sumatra waters.</w:t>
+        <w:t xml:space="preserve">Comprehensive peer-reviewed book chapter and field study documenting the distribution, ecology, and conservation status of Australian humpback dolphins in the Pacific and New Guinea.</w:t>
       </w:r>
     </w:p>
     <w:p>
@@ -4241,7 +4241,7 @@
           <w:sz w:val="20"/>
           <w:szCs w:val="20"/>
         </w:rPr>
-        <w:t xml:space="preserve">4. Sound of Fish Affects Fish Productivity</w:t>
+        <w:t xml:space="preserve">4. Application of Radon Transform Method for 2D Seismic Multiple Wave Reduction in West Sumatra Waters</w:t>
       </w:r>
     </w:p>
     <w:p>
@@ -4255,7 +4255,7 @@
           <w:sz w:val="18"/>
           <w:szCs w:val="18"/>
         </w:rPr>
-        <w:t xml:space="preserve">(2012). </w:t>
+        <w:t xml:space="preserve">(2013). </w:t>
       </w:r>
       <w:r>
         <w:rPr>
@@ -4266,16 +4266,16 @@
           <w:sz w:val="18"/>
           <w:szCs w:val="18"/>
         </w:rPr>
-        <w:t xml:space="preserve">Research Innovation Award - Business Innovation Center (BIC), Indonesia. </w:t>
-      </w:r>
-      <w:r>
-        <w:rPr>
-          <w:rFonts w:ascii="Arial" w:cs="Arial" w:eastAsia="Arial" w:hAnsi="Arial"/>
-          <w:color w:val="0D9488"/>
-          <w:sz w:val="18"/>
-          <w:szCs w:val="18"/>
-        </w:rPr>
-        <w:t xml:space="preserve">DOI/Link: https://www.antaranews.com/berita/342159/mahasiswa-ipb-temukan-cara-deteksi-produktivitas-ikan</w:t>
+        <w:t xml:space="preserve">IPB University Scientific Repository - Undergraduate Thesis (Advisor: Prof. Dr. Henry M. Manik). </w:t>
+      </w:r>
+      <w:r>
+        <w:rPr>
+          <w:rFonts w:ascii="Arial" w:cs="Arial" w:eastAsia="Arial" w:hAnsi="Arial"/>
+          <w:color w:val="0D9488"/>
+          <w:sz w:val="18"/>
+          <w:szCs w:val="18"/>
+        </w:rPr>
+        <w:t xml:space="preserve">DOI/Link: https://repository.ipb.ac.id/handle/123456789/63281</w:t>
       </w:r>
     </w:p>
     <w:p>
@@ -4290,7 +4290,7 @@
           <w:sz w:val="18"/>
           <w:szCs w:val="18"/>
         </w:rPr>
-        <w:t xml:space="preserve">National award-winning research innovation on passive acoustic detection and bioacoustic monitoring for fish productivity.</w:t>
+        <w:t xml:space="preserve">Undergraduate research in marine geophysics and seismic data processing applying Radon Transform (Tau-P Analysis) to attenuate surface multiples on 2D marine seismic line SUME23.31 in West Sumatra waters.</w:t>
       </w:r>
     </w:p>
     <w:p>
@@ -4306,7 +4306,72 @@
           <w:sz w:val="20"/>
           <w:szCs w:val="20"/>
         </w:rPr>
-        <w:t xml:space="preserve">5. Investigation on Salinity, Turbidity, and Total Suspended Solid (TSS) in Cimandiri River and Its Impact on Marine Environment</w:t>
+        <w:t xml:space="preserve">5. Spionase Bawah Air: Sound of Fish Affects Fish Productivity</w:t>
+      </w:r>
+    </w:p>
+    <w:p>
+      <w:pPr>
+        <w:spacing w:after="30" w:before="10"/>
+      </w:pPr>
+      <w:r>
+        <w:rPr>
+          <w:rFonts w:ascii="Arial" w:cs="Arial" w:eastAsia="Arial" w:hAnsi="Arial"/>
+          <w:color w:val="1E293B"/>
+          <w:sz w:val="18"/>
+          <w:szCs w:val="18"/>
+        </w:rPr>
+        <w:t xml:space="preserve">(2012). </w:t>
+      </w:r>
+      <w:r>
+        <w:rPr>
+          <w:rFonts w:ascii="Arial" w:cs="Arial" w:eastAsia="Arial" w:hAnsi="Arial"/>
+          <w:i/>
+          <w:iCs/>
+          <w:color w:val="64748B"/>
+          <w:sz w:val="18"/>
+          <w:szCs w:val="18"/>
+        </w:rPr>
+        <w:t xml:space="preserve">104 Inovasi Indonesia 2012 - Business Innovation Center (BIC) &amp; Ministry of Research and Technology. </w:t>
+      </w:r>
+      <w:r>
+        <w:rPr>
+          <w:rFonts w:ascii="Arial" w:cs="Arial" w:eastAsia="Arial" w:hAnsi="Arial"/>
+          <w:color w:val="0D9488"/>
+          <w:sz w:val="18"/>
+          <w:szCs w:val="18"/>
+        </w:rPr>
+        <w:t xml:space="preserve">DOI/Link: https://bic.web.id/general/view/Spionase+Bawah+Air</w:t>
+      </w:r>
+    </w:p>
+    <w:p>
+      <w:pPr>
+        <w:spacing w:after="60" w:before="10"/>
+        <w:jc w:val="both"/>
+      </w:pPr>
+      <w:r>
+        <w:rPr>
+          <w:rFonts w:ascii="Arial" w:cs="Arial" w:eastAsia="Arial" w:hAnsi="Arial"/>
+          <w:color w:val="1E293B"/>
+          <w:sz w:val="18"/>
+          <w:szCs w:val="18"/>
+        </w:rPr>
+        <w:t xml:space="preserve">National award-winning research innovation on passive acoustic detection, bioacoustic monitoring, and fish behavior analysis to assess aquaculture fish productivity.</w:t>
+      </w:r>
+    </w:p>
+    <w:p>
+      <w:pPr>
+        <w:spacing w:after="20" w:before="70"/>
+      </w:pPr>
+      <w:r>
+        <w:rPr>
+          <w:rFonts w:ascii="Arial" w:cs="Arial" w:eastAsia="Arial" w:hAnsi="Arial"/>
+          <w:b/>
+          <w:bCs/>
+          <w:color w:val="0F3A5D"/>
+          <w:sz w:val="20"/>
+          <w:szCs w:val="20"/>
+        </w:rPr>
+        <w:t xml:space="preserve">6. Investigation on Salinity, Turbidity, and Total Suspended Solid (TSS) in Cimandiri River and Its Impact on Marine Environment</w:t>
       </w:r>
     </w:p>
     <w:p>
@@ -7361,7 +7426,7 @@
           <w:sz w:val="18"/>
           <w:szCs w:val="18"/>
         </w:rPr>
-        <w:t xml:space="preserve">National innovation recognition awarded for applied marine technology and sustainable fisheries innovation.</w:t>
+        <w:t xml:space="preserve">National innovation recognition awarded for "Budidaya Udang Cara Digital (SMARTSHRIMPS.ID)" - a pioneering smart digital application optimizing real-time monitoring and traceability for Indonesian shrimp farmers.</w:t>
       </w:r>
     </w:p>
     <w:p>
@@ -7601,7 +7666,7 @@
           <w:sz w:val="18"/>
           <w:szCs w:val="18"/>
         </w:rPr>
-        <w:t xml:space="preserve">Awarded for pioneering undergraduate research on bioacoustics and acoustic fish behavior.</w:t>
+        <w:t xml:space="preserve">Awarded for pioneering undergraduate research on "Spionase Bawah Air (Sound of Fish Affects Fish Productivity)" utilizing passive bioacoustic detection to determine fish behavior and productivity.</w:t>
       </w:r>
     </w:p>
     <w:p>

</xml_diff>

<commit_message>
feat(publications): add 3 SEMNAS SOSEK KP 2012 conference papers to expand publications portfolio to 9 works
</commit_message>
<xml_diff>
--- a/I Gede Mahendra Wijaya_Master CV.docx
+++ b/I Gede Mahendra Wijaya_Master CV.docx
@@ -41,7 +41,7 @@
         <w:spacing w:after="40" w:before="0"/>
         <w:jc w:val="center"/>
       </w:pPr>
-      <w:hyperlink w:history="1" r:id="rIdx3bi7aa85w7bo4tmk6eqa">
+      <w:hyperlink w:history="1" r:id="rIdvnaslm76krmhhtdaay6ii">
         <w:r>
           <w:rPr>
             <w:rFonts w:ascii="Arial" w:cs="Arial" w:eastAsia="Arial" w:hAnsi="Arial"/>
@@ -62,7 +62,7 @@
         </w:rPr>
         <w:t xml:space="preserve">  |  </w:t>
       </w:r>
-      <w:hyperlink w:history="1" r:id="rIdlpqtk0b7t_guc8cvwyxot">
+      <w:hyperlink w:history="1" r:id="rId2ykcccdp2be5kjghhfs9n">
         <w:r>
           <w:rPr>
             <w:rFonts w:ascii="Arial" w:cs="Arial" w:eastAsia="Arial" w:hAnsi="Arial"/>
@@ -83,7 +83,7 @@
         </w:rPr>
         <w:t xml:space="preserve">  |  </w:t>
       </w:r>
-      <w:hyperlink w:history="1" r:id="rId0pgp32s0uc4fj0vg0f3h1">
+      <w:hyperlink w:history="1" r:id="rIdjahlcrafgwgqyfap-ovfg">
         <w:r>
           <w:rPr>
             <w:rFonts w:ascii="Arial" w:cs="Arial" w:eastAsia="Arial" w:hAnsi="Arial"/>
@@ -272,7 +272,7 @@
           <w:sz w:val="20"/>
           <w:szCs w:val="20"/>
         </w:rPr>
-        <w:t xml:space="preserve">6: </w:t>
+        <w:t xml:space="preserve">9: </w:t>
       </w:r>
       <w:r>
         <w:rPr>
@@ -711,7 +711,7 @@
           <w:sz w:val="19"/>
           <w:szCs w:val="19"/>
         </w:rPr>
-        <w:t xml:space="preserve">Contributed to and managed terrestrial, peatland, and coastal wetland carbon project operations (&gt;200,000 ha) in West Papua and Southwest Papua. Led multidisciplinary field teams executing ecological baselines, High Carbon Stock Approach (HCSA), High Conservation Value (HCV), and ground-based carbon stock accounting (SNI 7724). Designed and facilitated Free, Prior, and Informed Consent (FPIC) with local customary communities to establish inclusive benefit-sharing frameworks. Directed regulatory licensing with the Ministry of Forestry and Ministry of Environment, formulating Environmental and Social Management Plans (ESMP) and establishing rigorous Monitoring, Reporting, and Verification (MRV) systems.</w:t>
+        <w:t xml:space="preserve">Managed multidisciplinary carbon project operations across terrestrial, peatland, and coastal wetland concession areas (&gt;200,000 ha) in West Papua and Southwest Papua. Directed cross-functional field teams across forestry, biodiversity, and social workstreams to execute rigorous primary data collection, ecological baselines, High Carbon Stock Approach (HCSA), High Conservation Value (HCV), and ground-based carbon stock accounting (SNI 7724). Spearheaded multi-level stakeholder management and Free, Prior, and Informed Consent (FPIC) consultations with local customary communities to secure social license to operate (SLO) and establish equitable benefit-sharing frameworks. Coordinated regulatory compliance and statutory licensing pathways with the Ministry of Forestry and the Ministry of Environment, formulating Environmental and Social Management Plans (ESMP) and robust Monitoring, Reporting, and Verification (MRV) systems.</w:t>
       </w:r>
     </w:p>
     <w:p>
@@ -4030,7 +4030,7 @@
           <w:sz w:val="24"/>
           <w:szCs w:val="24"/>
         </w:rPr>
-        <w:t xml:space="preserve">PEER-REVIEWED PUBLICATIONS &amp; PAPERS (6 PUBLICATIONS)</w:t>
+        <w:t xml:space="preserve">PEER-REVIEWED PUBLICATIONS &amp; PAPERS (9 PUBLICATIONS)</w:t>
       </w:r>
     </w:p>
     <w:p>
@@ -4421,6 +4421,201 @@
           <w:szCs w:val="18"/>
         </w:rPr>
         <w:t xml:space="preserve">Estuarine and coastal water quality assessment analyzing terrestrial sediment runoff, salinity gradients, and environmental impacts on coastal ecosystems.</w:t>
+      </w:r>
+    </w:p>
+    <w:p>
+      <w:pPr>
+        <w:spacing w:after="20" w:before="70"/>
+      </w:pPr>
+      <w:r>
+        <w:rPr>
+          <w:rFonts w:ascii="Arial" w:cs="Arial" w:eastAsia="Arial" w:hAnsi="Arial"/>
+          <w:b/>
+          <w:bCs/>
+          <w:color w:val="0F3A5D"/>
+          <w:sz w:val="20"/>
+          <w:szCs w:val="20"/>
+        </w:rPr>
+        <w:t xml:space="preserve">7. Prototype Radio Wave-Based Autonomous Patrol Vessel: Design for Maritime Border Security in Outer Islands of Indonesia (Prototipe Kapal Patroli Perairan Tanpa Awak)</w:t>
+      </w:r>
+    </w:p>
+    <w:p>
+      <w:pPr>
+        <w:spacing w:after="30" w:before="10"/>
+      </w:pPr>
+      <w:r>
+        <w:rPr>
+          <w:rFonts w:ascii="Arial" w:cs="Arial" w:eastAsia="Arial" w:hAnsi="Arial"/>
+          <w:color w:val="1E293B"/>
+          <w:sz w:val="18"/>
+          <w:szCs w:val="18"/>
+        </w:rPr>
+        <w:t xml:space="preserve">(2012). </w:t>
+      </w:r>
+      <w:r>
+        <w:rPr>
+          <w:rFonts w:ascii="Arial" w:cs="Arial" w:eastAsia="Arial" w:hAnsi="Arial"/>
+          <w:i/>
+          <w:iCs/>
+          <w:color w:val="64748B"/>
+          <w:sz w:val="18"/>
+          <w:szCs w:val="18"/>
+        </w:rPr>
+        <w:t xml:space="preserve">National Seminar on Marine &amp; Fisheries Socio-Economic Policy (SEMNAS SOSEK KP 2012) - Ministry of Marine Affairs and Fisheries (MMAF) &amp; Indonesian Institute of Sciences (LIPI). </w:t>
+      </w:r>
+      <w:r>
+        <w:rPr>
+          <w:rFonts w:ascii="Arial" w:cs="Arial" w:eastAsia="Arial" w:hAnsi="Arial"/>
+          <w:color w:val="0D9488"/>
+          <w:sz w:val="18"/>
+          <w:szCs w:val="18"/>
+        </w:rPr>
+        <w:t xml:space="preserve">DOI/Link: https://www.bbrse.kkp.go.id/semnas/</w:t>
+      </w:r>
+    </w:p>
+    <w:p>
+      <w:pPr>
+        <w:spacing w:after="60" w:before="10"/>
+        <w:jc w:val="both"/>
+      </w:pPr>
+      <w:r>
+        <w:rPr>
+          <w:rFonts w:ascii="Arial" w:cs="Arial" w:eastAsia="Arial" w:hAnsi="Arial"/>
+          <w:color w:val="1E293B"/>
+          <w:sz w:val="18"/>
+          <w:szCs w:val="18"/>
+        </w:rPr>
+        <w:t xml:space="preserve">Technical conference paper on the conceptual design of an autonomous surface/underwater vehicle (AUV/ASV) utilizing radio navigation and Differential GPS (DGPS) for automated maritime surveillance and border deterrence against illegal, unreported, and unregulated (IUU) fishing.</w:t>
+      </w:r>
+    </w:p>
+    <w:p>
+      <w:pPr>
+        <w:spacing w:after="20" w:before="70"/>
+      </w:pPr>
+      <w:r>
+        <w:rPr>
+          <w:rFonts w:ascii="Arial" w:cs="Arial" w:eastAsia="Arial" w:hAnsi="Arial"/>
+          <w:b/>
+          <w:bCs/>
+          <w:color w:val="0F3A5D"/>
+          <w:sz w:val="20"/>
+          <w:szCs w:val="20"/>
+        </w:rPr>
+        <w:t xml:space="preserve">8. Development of a Hydrokinetic Water Turbine Propeller for Small-Scale Fishing Vessels to Reduce Fossil Fuel Dependence</w:t>
+      </w:r>
+    </w:p>
+    <w:p>
+      <w:pPr>
+        <w:spacing w:after="30" w:before="10"/>
+      </w:pPr>
+      <w:r>
+        <w:rPr>
+          <w:rFonts w:ascii="Arial" w:cs="Arial" w:eastAsia="Arial" w:hAnsi="Arial"/>
+          <w:color w:val="1E293B"/>
+          <w:sz w:val="18"/>
+          <w:szCs w:val="18"/>
+        </w:rPr>
+        <w:t xml:space="preserve">(2012). </w:t>
+      </w:r>
+      <w:r>
+        <w:rPr>
+          <w:rFonts w:ascii="Arial" w:cs="Arial" w:eastAsia="Arial" w:hAnsi="Arial"/>
+          <w:i/>
+          <w:iCs/>
+          <w:color w:val="64748B"/>
+          <w:sz w:val="18"/>
+          <w:szCs w:val="18"/>
+        </w:rPr>
+        <w:t xml:space="preserve">National Seminar on Marine &amp; Fisheries Socio-Economic Policy (SEMNAS SOSEK KP 2012) - Ministry of Marine Affairs and Fisheries (MMAF) &amp; Indonesian Institute of Sciences (LIPI). </w:t>
+      </w:r>
+      <w:r>
+        <w:rPr>
+          <w:rFonts w:ascii="Arial" w:cs="Arial" w:eastAsia="Arial" w:hAnsi="Arial"/>
+          <w:color w:val="0D9488"/>
+          <w:sz w:val="18"/>
+          <w:szCs w:val="18"/>
+        </w:rPr>
+        <w:t xml:space="preserve">DOI/Link: https://www.bbrse.kkp.go.id/semnas/</w:t>
+      </w:r>
+    </w:p>
+    <w:p>
+      <w:pPr>
+        <w:spacing w:after="60" w:before="10"/>
+        <w:jc w:val="both"/>
+      </w:pPr>
+      <w:r>
+        <w:rPr>
+          <w:rFonts w:ascii="Arial" w:cs="Arial" w:eastAsia="Arial" w:hAnsi="Arial"/>
+          <w:color w:val="1E293B"/>
+          <w:sz w:val="18"/>
+          <w:szCs w:val="18"/>
+        </w:rPr>
+        <w:t xml:space="preserve">Applied engineering paper proposing a hydrokinetic Voith Schneider Propeller design to harness water flow kinetic energy during navigation on small-scale vessels (&lt;5 GT), generating renewable electricity to reduce diesel fuel dependency and operational costs.</w:t>
+      </w:r>
+    </w:p>
+    <w:p>
+      <w:pPr>
+        <w:spacing w:after="20" w:before="70"/>
+      </w:pPr>
+      <w:r>
+        <w:rPr>
+          <w:rFonts w:ascii="Arial" w:cs="Arial" w:eastAsia="Arial" w:hAnsi="Arial"/>
+          <w:b/>
+          <w:bCs/>
+          <w:color w:val="0F3A5D"/>
+          <w:sz w:val="20"/>
+          <w:szCs w:val="20"/>
+        </w:rPr>
+        <w:t xml:space="preserve">9. Analysis of Vessel Gross Tonnage Impact on Fishermen Catch Yield at Tegal Coastal Fishing Port, Central Java</w:t>
+      </w:r>
+    </w:p>
+    <w:p>
+      <w:pPr>
+        <w:spacing w:after="30" w:before="10"/>
+      </w:pPr>
+      <w:r>
+        <w:rPr>
+          <w:rFonts w:ascii="Arial" w:cs="Arial" w:eastAsia="Arial" w:hAnsi="Arial"/>
+          <w:color w:val="1E293B"/>
+          <w:sz w:val="18"/>
+          <w:szCs w:val="18"/>
+        </w:rPr>
+        <w:t xml:space="preserve">(2012). </w:t>
+      </w:r>
+      <w:r>
+        <w:rPr>
+          <w:rFonts w:ascii="Arial" w:cs="Arial" w:eastAsia="Arial" w:hAnsi="Arial"/>
+          <w:i/>
+          <w:iCs/>
+          <w:color w:val="64748B"/>
+          <w:sz w:val="18"/>
+          <w:szCs w:val="18"/>
+        </w:rPr>
+        <w:t xml:space="preserve">National Seminar on Marine &amp; Fisheries Socio-Economic Policy (SEMNAS SOSEK KP 2012) - Ministry of Marine Affairs and Fisheries (MMAF) &amp; Indonesian Institute of Sciences (LIPI). </w:t>
+      </w:r>
+      <w:r>
+        <w:rPr>
+          <w:rFonts w:ascii="Arial" w:cs="Arial" w:eastAsia="Arial" w:hAnsi="Arial"/>
+          <w:color w:val="0D9488"/>
+          <w:sz w:val="18"/>
+          <w:szCs w:val="18"/>
+        </w:rPr>
+        <w:t xml:space="preserve">DOI/Link: https://www.bbrse.kkp.go.id/semnas/</w:t>
+      </w:r>
+    </w:p>
+    <w:p>
+      <w:pPr>
+        <w:spacing w:after="60" w:before="10"/>
+        <w:jc w:val="both"/>
+      </w:pPr>
+      <w:r>
+        <w:rPr>
+          <w:rFonts w:ascii="Arial" w:cs="Arial" w:eastAsia="Arial" w:hAnsi="Arial"/>
+          <w:color w:val="1E293B"/>
+          <w:sz w:val="18"/>
+          <w:szCs w:val="18"/>
+        </w:rPr>
+        <w:t xml:space="preserve">Quantitative empirical study evaluating the correlation between fishing vessel gross tonnage (GT), trip duration, and total catch yield efficiency across fishing fleets operating out of Tegal Coastal Fishing Port.</w:t>
       </w:r>
     </w:p>
     <w:p>

</xml_diff>

<commit_message>
fix(publications): remove unverified Cimandiri report and update total verified publications to 8
</commit_message>
<xml_diff>
--- a/I Gede Mahendra Wijaya_Master CV.docx
+++ b/I Gede Mahendra Wijaya_Master CV.docx
@@ -41,7 +41,7 @@
         <w:spacing w:after="40" w:before="0"/>
         <w:jc w:val="center"/>
       </w:pPr>
-      <w:hyperlink w:history="1" r:id="rIdvnaslm76krmhhtdaay6ii">
+      <w:hyperlink w:history="1" r:id="rIdib3uwkxokd8xe_it3bs1f">
         <w:r>
           <w:rPr>
             <w:rFonts w:ascii="Arial" w:cs="Arial" w:eastAsia="Arial" w:hAnsi="Arial"/>
@@ -62,7 +62,7 @@
         </w:rPr>
         <w:t xml:space="preserve">  |  </w:t>
       </w:r>
-      <w:hyperlink w:history="1" r:id="rId2ykcccdp2be5kjghhfs9n">
+      <w:hyperlink w:history="1" r:id="rIdkvs2cqtbkghfyc_blmcwu">
         <w:r>
           <w:rPr>
             <w:rFonts w:ascii="Arial" w:cs="Arial" w:eastAsia="Arial" w:hAnsi="Arial"/>
@@ -83,7 +83,7 @@
         </w:rPr>
         <w:t xml:space="preserve">  |  </w:t>
       </w:r>
-      <w:hyperlink w:history="1" r:id="rIdjahlcrafgwgqyfap-ovfg">
+      <w:hyperlink w:history="1" r:id="rIdihzv-tizfzdtmxp1sm69w">
         <w:r>
           <w:rPr>
             <w:rFonts w:ascii="Arial" w:cs="Arial" w:eastAsia="Arial" w:hAnsi="Arial"/>
@@ -272,7 +272,7 @@
           <w:sz w:val="20"/>
           <w:szCs w:val="20"/>
         </w:rPr>
-        <w:t xml:space="preserve">9: </w:t>
+        <w:t xml:space="preserve">8: </w:t>
       </w:r>
       <w:r>
         <w:rPr>
@@ -4030,7 +4030,7 @@
           <w:sz w:val="24"/>
           <w:szCs w:val="24"/>
         </w:rPr>
-        <w:t xml:space="preserve">PEER-REVIEWED PUBLICATIONS &amp; PAPERS (9 PUBLICATIONS)</w:t>
+        <w:t xml:space="preserve">PEER-REVIEWED PUBLICATIONS &amp; PAPERS (8 PUBLICATIONS)</w:t>
       </w:r>
     </w:p>
     <w:p>
@@ -4371,7 +4371,7 @@
           <w:sz w:val="20"/>
           <w:szCs w:val="20"/>
         </w:rPr>
-        <w:t xml:space="preserve">6. Investigation on Salinity, Turbidity, and Total Suspended Solid (TSS) in Cimandiri River and Its Impact on Marine Environment</w:t>
+        <w:t xml:space="preserve">6. Prototype Radio Wave-Based Autonomous Patrol Vessel: Design for Maritime Border Security in Outer Islands of Indonesia (Prototipe Kapal Patroli Perairan Tanpa Awak)</w:t>
       </w:r>
     </w:p>
     <w:p>
@@ -4396,16 +4396,16 @@
           <w:sz w:val="18"/>
           <w:szCs w:val="18"/>
         </w:rPr>
-        <w:t xml:space="preserve">Marine Science and Technology Dept., Bogor Agriculture University Journal. </w:t>
-      </w:r>
-      <w:r>
-        <w:rPr>
-          <w:rFonts w:ascii="Arial" w:cs="Arial" w:eastAsia="Arial" w:hAnsi="Arial"/>
-          <w:color w:val="0D9488"/>
-          <w:sz w:val="18"/>
-          <w:szCs w:val="18"/>
-        </w:rPr>
-        <w:t xml:space="preserve">DOI/Link: https://repository.ipb.ac.id</w:t>
+        <w:t xml:space="preserve">National Seminar on Marine &amp; Fisheries Socio-Economic Policy (SEMNAS SOSEK KP 2012) - Ministry of Marine Affairs and Fisheries (MMAF) &amp; Indonesian Institute of Sciences (LIPI). </w:t>
+      </w:r>
+      <w:r>
+        <w:rPr>
+          <w:rFonts w:ascii="Arial" w:cs="Arial" w:eastAsia="Arial" w:hAnsi="Arial"/>
+          <w:color w:val="0D9488"/>
+          <w:sz w:val="18"/>
+          <w:szCs w:val="18"/>
+        </w:rPr>
+        <w:t xml:space="preserve">DOI/Link: https://www.bbrse.kkp.go.id/semnas/</w:t>
       </w:r>
     </w:p>
     <w:p>
@@ -4420,7 +4420,7 @@
           <w:sz w:val="18"/>
           <w:szCs w:val="18"/>
         </w:rPr>
-        <w:t xml:space="preserve">Estuarine and coastal water quality assessment analyzing terrestrial sediment runoff, salinity gradients, and environmental impacts on coastal ecosystems.</w:t>
+        <w:t xml:space="preserve">Technical conference paper on the conceptual design of an autonomous surface/underwater vehicle (AUV/ASV) utilizing radio navigation and Differential GPS (DGPS) for automated maritime surveillance and border deterrence against illegal, unreported, and unregulated (IUU) fishing.</w:t>
       </w:r>
     </w:p>
     <w:p>
@@ -4436,7 +4436,7 @@
           <w:sz w:val="20"/>
           <w:szCs w:val="20"/>
         </w:rPr>
-        <w:t xml:space="preserve">7. Prototype Radio Wave-Based Autonomous Patrol Vessel: Design for Maritime Border Security in Outer Islands of Indonesia (Prototipe Kapal Patroli Perairan Tanpa Awak)</w:t>
+        <w:t xml:space="preserve">7. Development of a Hydrokinetic Water Turbine Propeller for Small-Scale Fishing Vessels to Reduce Fossil Fuel Dependence</w:t>
       </w:r>
     </w:p>
     <w:p>
@@ -4485,7 +4485,7 @@
           <w:sz w:val="18"/>
           <w:szCs w:val="18"/>
         </w:rPr>
-        <w:t xml:space="preserve">Technical conference paper on the conceptual design of an autonomous surface/underwater vehicle (AUV/ASV) utilizing radio navigation and Differential GPS (DGPS) for automated maritime surveillance and border deterrence against illegal, unreported, and unregulated (IUU) fishing.</w:t>
+        <w:t xml:space="preserve">Applied engineering paper proposing a hydrokinetic Voith Schneider Propeller design to harness water flow kinetic energy during navigation on small-scale vessels (&lt;5 GT), generating renewable electricity to reduce diesel fuel dependency and operational costs.</w:t>
       </w:r>
     </w:p>
     <w:p>
@@ -4501,72 +4501,7 @@
           <w:sz w:val="20"/>
           <w:szCs w:val="20"/>
         </w:rPr>
-        <w:t xml:space="preserve">8. Development of a Hydrokinetic Water Turbine Propeller for Small-Scale Fishing Vessels to Reduce Fossil Fuel Dependence</w:t>
-      </w:r>
-    </w:p>
-    <w:p>
-      <w:pPr>
-        <w:spacing w:after="30" w:before="10"/>
-      </w:pPr>
-      <w:r>
-        <w:rPr>
-          <w:rFonts w:ascii="Arial" w:cs="Arial" w:eastAsia="Arial" w:hAnsi="Arial"/>
-          <w:color w:val="1E293B"/>
-          <w:sz w:val="18"/>
-          <w:szCs w:val="18"/>
-        </w:rPr>
-        <w:t xml:space="preserve">(2012). </w:t>
-      </w:r>
-      <w:r>
-        <w:rPr>
-          <w:rFonts w:ascii="Arial" w:cs="Arial" w:eastAsia="Arial" w:hAnsi="Arial"/>
-          <w:i/>
-          <w:iCs/>
-          <w:color w:val="64748B"/>
-          <w:sz w:val="18"/>
-          <w:szCs w:val="18"/>
-        </w:rPr>
-        <w:t xml:space="preserve">National Seminar on Marine &amp; Fisheries Socio-Economic Policy (SEMNAS SOSEK KP 2012) - Ministry of Marine Affairs and Fisheries (MMAF) &amp; Indonesian Institute of Sciences (LIPI). </w:t>
-      </w:r>
-      <w:r>
-        <w:rPr>
-          <w:rFonts w:ascii="Arial" w:cs="Arial" w:eastAsia="Arial" w:hAnsi="Arial"/>
-          <w:color w:val="0D9488"/>
-          <w:sz w:val="18"/>
-          <w:szCs w:val="18"/>
-        </w:rPr>
-        <w:t xml:space="preserve">DOI/Link: https://www.bbrse.kkp.go.id/semnas/</w:t>
-      </w:r>
-    </w:p>
-    <w:p>
-      <w:pPr>
-        <w:spacing w:after="60" w:before="10"/>
-        <w:jc w:val="both"/>
-      </w:pPr>
-      <w:r>
-        <w:rPr>
-          <w:rFonts w:ascii="Arial" w:cs="Arial" w:eastAsia="Arial" w:hAnsi="Arial"/>
-          <w:color w:val="1E293B"/>
-          <w:sz w:val="18"/>
-          <w:szCs w:val="18"/>
-        </w:rPr>
-        <w:t xml:space="preserve">Applied engineering paper proposing a hydrokinetic Voith Schneider Propeller design to harness water flow kinetic energy during navigation on small-scale vessels (&lt;5 GT), generating renewable electricity to reduce diesel fuel dependency and operational costs.</w:t>
-      </w:r>
-    </w:p>
-    <w:p>
-      <w:pPr>
-        <w:spacing w:after="20" w:before="70"/>
-      </w:pPr>
-      <w:r>
-        <w:rPr>
-          <w:rFonts w:ascii="Arial" w:cs="Arial" w:eastAsia="Arial" w:hAnsi="Arial"/>
-          <w:b/>
-          <w:bCs/>
-          <w:color w:val="0F3A5D"/>
-          <w:sz w:val="20"/>
-          <w:szCs w:val="20"/>
-        </w:rPr>
-        <w:t xml:space="preserve">9. Analysis of Vessel Gross Tonnage Impact on Fishermen Catch Yield at Tegal Coastal Fishing Port, Central Java</w:t>
+        <w:t xml:space="preserve">8. Analysis of Vessel Gross Tonnage Impact on Fishermen Catch Yield at Tegal Coastal Fishing Port, Central Java</w:t>
       </w:r>
     </w:p>
     <w:p>

</xml_diff>

<commit_message>
Add A Society of Greenhouse Gas Professionals (GHGMI) membership
</commit_message>
<xml_diff>
--- a/I Gede Mahendra Wijaya_Master CV.docx
+++ b/I Gede Mahendra Wijaya_Master CV.docx
@@ -41,7 +41,7 @@
         <w:spacing w:after="40" w:before="0"/>
         <w:jc w:val="center"/>
       </w:pPr>
-      <w:hyperlink w:history="1" r:id="rIdib3uwkxokd8xe_it3bs1f">
+      <w:hyperlink w:history="1" r:id="rId3vwsdxpnqsvs27tu7y_i5">
         <w:r>
           <w:rPr>
             <w:rFonts w:ascii="Arial" w:cs="Arial" w:eastAsia="Arial" w:hAnsi="Arial"/>
@@ -62,7 +62,7 @@
         </w:rPr>
         <w:t xml:space="preserve">  |  </w:t>
       </w:r>
-      <w:hyperlink w:history="1" r:id="rIdkvs2cqtbkghfyc_blmcwu">
+      <w:hyperlink w:history="1" r:id="rIdcm8dirmtwdcp8zp3apmwv">
         <w:r>
           <w:rPr>
             <w:rFonts w:ascii="Arial" w:cs="Arial" w:eastAsia="Arial" w:hAnsi="Arial"/>
@@ -83,7 +83,7 @@
         </w:rPr>
         <w:t xml:space="preserve">  |  </w:t>
       </w:r>
-      <w:hyperlink w:history="1" r:id="rIdihzv-tizfzdtmxp1sm69w">
+      <w:hyperlink w:history="1" r:id="rIdw-l47irrndobeadzefnut">
         <w:r>
           <w:rPr>
             <w:rFonts w:ascii="Arial" w:cs="Arial" w:eastAsia="Arial" w:hAnsi="Arial"/>
@@ -7871,7 +7871,47 @@
           <w:sz w:val="20"/>
           <w:szCs w:val="20"/>
         </w:rPr>
-        <w:t xml:space="preserve">1. Asian Fisheries Acoustics Society (AFAS)</w:t>
+        <w:t xml:space="preserve">1. A Society of Greenhouse Gas Professionals (GHGMI)</w:t>
+      </w:r>
+      <w:r>
+        <w:rPr>
+          <w:rFonts w:ascii="Arial" w:cs="Arial" w:eastAsia="Arial" w:hAnsi="Arial"/>
+          <w:color w:val="0D9488"/>
+          <w:sz w:val="18"/>
+          <w:szCs w:val="18"/>
+        </w:rPr>
+        <w:t xml:space="preserve"> | Professional Member (2024 - Present)</w:t>
+      </w:r>
+    </w:p>
+    <w:p>
+      <w:pPr>
+        <w:spacing w:after="50" w:before="10"/>
+        <w:jc w:val="both"/>
+      </w:pPr>
+      <w:r>
+        <w:rPr>
+          <w:rFonts w:ascii="Arial" w:cs="Arial" w:eastAsia="Arial" w:hAnsi="Arial"/>
+          <w:color w:val="1E293B"/>
+          <w:sz w:val="18"/>
+          <w:szCs w:val="18"/>
+        </w:rPr>
+        <w:t xml:space="preserve">Global professional community under the Greenhouse Gas Management Institute (GHGMI), upholding rigorous carbon accounting standards, ethical code of conduct, and robust MRV practices for climate change mitigation.</w:t>
+      </w:r>
+    </w:p>
+    <w:p>
+      <w:pPr>
+        <w:spacing w:after="20" w:before="60"/>
+      </w:pPr>
+      <w:r>
+        <w:rPr>
+          <w:rFonts w:ascii="Arial" w:cs="Arial" w:eastAsia="Arial" w:hAnsi="Arial"/>
+          <w:b/>
+          <w:bCs/>
+          <w:color w:val="0F3A5D"/>
+          <w:sz w:val="20"/>
+          <w:szCs w:val="20"/>
+        </w:rPr>
+        <w:t xml:space="preserve">2. Asian Fisheries Acoustics Society (AFAS)</w:t>
       </w:r>
       <w:r>
         <w:rPr>

</xml_diff>

<commit_message>
Update membership naming to Greenhouse Gas Management Institute (GHGMI) - Member
</commit_message>
<xml_diff>
--- a/I Gede Mahendra Wijaya_Master CV.docx
+++ b/I Gede Mahendra Wijaya_Master CV.docx
@@ -41,7 +41,7 @@
         <w:spacing w:after="40" w:before="0"/>
         <w:jc w:val="center"/>
       </w:pPr>
-      <w:hyperlink w:history="1" r:id="rId3vwsdxpnqsvs27tu7y_i5">
+      <w:hyperlink w:history="1" r:id="rId1bjxgfpx48k7f-5yyu5op">
         <w:r>
           <w:rPr>
             <w:rFonts w:ascii="Arial" w:cs="Arial" w:eastAsia="Arial" w:hAnsi="Arial"/>
@@ -62,7 +62,7 @@
         </w:rPr>
         <w:t xml:space="preserve">  |  </w:t>
       </w:r>
-      <w:hyperlink w:history="1" r:id="rIdcm8dirmtwdcp8zp3apmwv">
+      <w:hyperlink w:history="1" r:id="rId6ovh1bwrkxnrsfhh7xs2u">
         <w:r>
           <w:rPr>
             <w:rFonts w:ascii="Arial" w:cs="Arial" w:eastAsia="Arial" w:hAnsi="Arial"/>
@@ -83,7 +83,7 @@
         </w:rPr>
         <w:t xml:space="preserve">  |  </w:t>
       </w:r>
-      <w:hyperlink w:history="1" r:id="rIdw-l47irrndobeadzefnut">
+      <w:hyperlink w:history="1" r:id="rIdnfkhkezcgh2elneqf73ho">
         <w:r>
           <w:rPr>
             <w:rFonts w:ascii="Arial" w:cs="Arial" w:eastAsia="Arial" w:hAnsi="Arial"/>
@@ -7871,16 +7871,16 @@
           <w:sz w:val="20"/>
           <w:szCs w:val="20"/>
         </w:rPr>
-        <w:t xml:space="preserve">1. A Society of Greenhouse Gas Professionals (GHGMI)</w:t>
-      </w:r>
-      <w:r>
-        <w:rPr>
-          <w:rFonts w:ascii="Arial" w:cs="Arial" w:eastAsia="Arial" w:hAnsi="Arial"/>
-          <w:color w:val="0D9488"/>
-          <w:sz w:val="18"/>
-          <w:szCs w:val="18"/>
-        </w:rPr>
-        <w:t xml:space="preserve"> | Professional Member (2024 - Present)</w:t>
+        <w:t xml:space="preserve">1. Greenhouse Gas Management Institute (GHGMI)</w:t>
+      </w:r>
+      <w:r>
+        <w:rPr>
+          <w:rFonts w:ascii="Arial" w:cs="Arial" w:eastAsia="Arial" w:hAnsi="Arial"/>
+          <w:color w:val="0D9488"/>
+          <w:sz w:val="18"/>
+          <w:szCs w:val="18"/>
+        </w:rPr>
+        <w:t xml:space="preserve"> | Member (2024 - Present)</w:t>
       </w:r>
     </w:p>
     <w:p>
@@ -7895,7 +7895,7 @@
           <w:sz w:val="18"/>
           <w:szCs w:val="18"/>
         </w:rPr>
-        <w:t xml:space="preserve">Global professional community under the Greenhouse Gas Management Institute (GHGMI), upholding rigorous carbon accounting standards, ethical code of conduct, and robust MRV practices for climate change mitigation.</w:t>
+        <w:t xml:space="preserve">Professional member of A Society of Greenhouse Gas Professionals under the Greenhouse Gas Management Institute (GHGMI), upholding rigorous carbon accounting standards, ethical code of conduct, and robust MRV practices for climate change mitigation.</w:t>
       </w:r>
     </w:p>
     <w:p>

</xml_diff>

<commit_message>
Add 202 Basics of Project-Level GHG Accounting (GHGMI) certificate and badge
</commit_message>
<xml_diff>
--- a/I Gede Mahendra Wijaya_Master CV.docx
+++ b/I Gede Mahendra Wijaya_Master CV.docx
@@ -41,7 +41,7 @@
         <w:spacing w:after="40" w:before="0"/>
         <w:jc w:val="center"/>
       </w:pPr>
-      <w:hyperlink w:history="1" r:id="rId1bjxgfpx48k7f-5yyu5op">
+      <w:hyperlink w:history="1" r:id="rId1zz_fhvbdyjx_uxfgwzo1">
         <w:r>
           <w:rPr>
             <w:rFonts w:ascii="Arial" w:cs="Arial" w:eastAsia="Arial" w:hAnsi="Arial"/>
@@ -62,7 +62,7 @@
         </w:rPr>
         <w:t xml:space="preserve">  |  </w:t>
       </w:r>
-      <w:hyperlink w:history="1" r:id="rId6ovh1bwrkxnrsfhh7xs2u">
+      <w:hyperlink w:history="1" r:id="rIdu16ifseltx51hpy3bjafp">
         <w:r>
           <w:rPr>
             <w:rFonts w:ascii="Arial" w:cs="Arial" w:eastAsia="Arial" w:hAnsi="Arial"/>
@@ -83,7 +83,7 @@
         </w:rPr>
         <w:t xml:space="preserve">  |  </w:t>
       </w:r>
-      <w:hyperlink w:history="1" r:id="rIdnfkhkezcgh2elneqf73ho">
+      <w:hyperlink w:history="1" r:id="rIdojr34wqfafwt2acahup1f">
         <w:r>
           <w:rPr>
             <w:rFonts w:ascii="Arial" w:cs="Arial" w:eastAsia="Arial" w:hAnsi="Arial"/>
@@ -242,7 +242,7 @@
           <w:sz w:val="20"/>
           <w:szCs w:val="20"/>
         </w:rPr>
-        <w:t xml:space="preserve">72: </w:t>
+        <w:t xml:space="preserve">73: </w:t>
       </w:r>
       <w:r>
         <w:rPr>
@@ -4569,7 +4569,46 @@
           <w:sz w:val="24"/>
           <w:szCs w:val="24"/>
         </w:rPr>
-        <w:t xml:space="preserve">PROFESSIONAL CERTIFICATIONS &amp; SPECIALIZED TRAINING (72 CREDENTIALS)</w:t>
+        <w:t xml:space="preserve">PROFESSIONAL CERTIFICATIONS &amp; SPECIALIZED TRAINING (73 CREDENTIALS)</w:t>
+      </w:r>
+    </w:p>
+    <w:p>
+      <w:pPr>
+        <w:pStyle w:val="ListParagraph"/>
+        <w:numPr>
+          <w:ilvl w:val="0"/>
+          <w:numId w:val="1"/>
+        </w:numPr>
+        <w:spacing w:after="20" w:before="40"/>
+      </w:pPr>
+      <w:r>
+        <w:rPr>
+          <w:rFonts w:ascii="Arial" w:cs="Arial" w:eastAsia="Arial" w:hAnsi="Arial"/>
+          <w:b/>
+          <w:bCs/>
+          <w:color w:val="0F3A5D"/>
+          <w:sz w:val="19"/>
+          <w:szCs w:val="19"/>
+        </w:rPr>
+        <w:t xml:space="preserve">202 Basics of Project-Level GHG Accounting (Certificate of Proficiency) </w:t>
+      </w:r>
+      <w:r>
+        <w:rPr>
+          <w:rFonts w:ascii="Arial" w:cs="Arial" w:eastAsia="Arial" w:hAnsi="Arial"/>
+          <w:color w:val="64748B"/>
+          <w:sz w:val="18"/>
+          <w:szCs w:val="18"/>
+        </w:rPr>
+        <w:t xml:space="preserve"> | The Greenhouse Gas Management Institute (GHGMI) (Oct 2026)</w:t>
+      </w:r>
+      <w:r>
+        <w:rPr>
+          <w:rFonts w:ascii="Arial" w:cs="Arial" w:eastAsia="Arial" w:hAnsi="Arial"/>
+          <w:color w:val="0D9488"/>
+          <w:sz w:val="17"/>
+          <w:szCs w:val="17"/>
+        </w:rPr>
+        <w:t xml:space="preserve"/>
       </w:r>
     </w:p>
     <w:p>

</xml_diff>

<commit_message>
Highlight IUCN Kaimana IMMA designation impact across publications, experience, and map locations
</commit_message>
<xml_diff>
--- a/I Gede Mahendra Wijaya_Master CV.docx
+++ b/I Gede Mahendra Wijaya_Master CV.docx
@@ -41,7 +41,7 @@
         <w:spacing w:after="40" w:before="0"/>
         <w:jc w:val="center"/>
       </w:pPr>
-      <w:hyperlink w:history="1" r:id="rId1zz_fhvbdyjx_uxfgwzo1">
+      <w:hyperlink w:history="1" r:id="rIdgkuywgwkgiqf5dvi9dzmf">
         <w:r>
           <w:rPr>
             <w:rFonts w:ascii="Arial" w:cs="Arial" w:eastAsia="Arial" w:hAnsi="Arial"/>
@@ -62,7 +62,7 @@
         </w:rPr>
         <w:t xml:space="preserve">  |  </w:t>
       </w:r>
-      <w:hyperlink w:history="1" r:id="rIdu16ifseltx51hpy3bjafp">
+      <w:hyperlink w:history="1" r:id="rIdpxlw9qjrbkeeozsmyfcqr">
         <w:r>
           <w:rPr>
             <w:rFonts w:ascii="Arial" w:cs="Arial" w:eastAsia="Arial" w:hAnsi="Arial"/>
@@ -83,7 +83,7 @@
         </w:rPr>
         <w:t xml:space="preserve">  |  </w:t>
       </w:r>
-      <w:hyperlink w:history="1" r:id="rIdojr34wqfafwt2acahup1f">
+      <w:hyperlink w:history="1" r:id="rIdhbi6fpvwpvnsdds6voyoj">
         <w:r>
           <w:rPr>
             <w:rFonts w:ascii="Arial" w:cs="Arial" w:eastAsia="Arial" w:hAnsi="Arial"/>
@@ -943,7 +943,7 @@
           <w:sz w:val="19"/>
           <w:szCs w:val="19"/>
         </w:rPr>
-        <w:t xml:space="preserve">Led Health, Safety, and Environment (HSE) protocols and Joint Nature Conservation Committee (JNCC)-compliant Marine Mammal Observation (MMO) with dedicated visual observation during 2D and Transition Zone (TZ) marine seismic surveys for KrisEnergy (Udan Emas) BV in Arguni Bay, West Papua. Enforced pre-shooting visual scans, exclusion zone protocols, and soft-start ramp-up procedures to safeguard marine biotas.</w:t>
+        <w:t xml:space="preserve">Led Health, Safety, and Environment (HSE) protocols and Joint Nature Conservation Committee (JNCC)-compliant Marine Mammal Observation (MMO) with dedicated visual observation during 2D and Transition Zone (TZ) marine seismic surveys for KrisEnergy (Udan Emas) BV in Arguni Bay, West Papua. Enforced pre-shooting visual scans, exclusion zone protocols, and soft-start ramp-up procedures to safeguard marine biotas. Field observations and technical reporting directly provided the primary scientific evidence officially adopted by the IUCN Joint SSC/WCPA Task Force for the designation of the Kaimana, West Papua Important Marine Mammal Area (IMMA).</w:t>
       </w:r>
     </w:p>
     <w:p>
@@ -4225,7 +4225,7 @@
           <w:sz w:val="18"/>
           <w:szCs w:val="18"/>
         </w:rPr>
-        <w:t xml:space="preserve">Comprehensive peer-reviewed book chapter and field study documenting the distribution, ecology, and conservation status of Australian humpback dolphins in the Pacific and New Guinea.</w:t>
+        <w:t xml:space="preserve">Comprehensive peer-reviewed book chapter and field study documenting the distribution, ecology, and conservation status of Australian humpback dolphins in the Pacific and New Guinea. Findings from field surveys in Arguni Bay directly served as the primary scientific justification for the IUCN Joint SSC/WCPA Task Force in formally designating the Kaimana, West Papua Important Marine Mammal Area (IMMA).</w:t>
       </w:r>
     </w:p>
     <w:p>

</xml_diff>

<commit_message>
Pembaruan otomatis CV dari Word & Sertifikat pada 26/10/2026 16:58:45,60
</commit_message>
<xml_diff>
--- a/I Gede Mahendra Wijaya_Master CV.docx
+++ b/I Gede Mahendra Wijaya_Master CV.docx
@@ -41,7 +41,7 @@
         <w:spacing w:after="40" w:before="0"/>
         <w:jc w:val="center"/>
       </w:pPr>
-      <w:hyperlink w:history="1" r:id="rIdgkuywgwkgiqf5dvi9dzmf">
+      <w:hyperlink w:history="1" r:id="rId0ncepmbzyghm9jqhnguu3">
         <w:r>
           <w:rPr>
             <w:rFonts w:ascii="Arial" w:cs="Arial" w:eastAsia="Arial" w:hAnsi="Arial"/>
@@ -62,7 +62,7 @@
         </w:rPr>
         <w:t xml:space="preserve">  |  </w:t>
       </w:r>
-      <w:hyperlink w:history="1" r:id="rIdpxlw9qjrbkeeozsmyfcqr">
+      <w:hyperlink w:history="1" r:id="rIdzlkeksc-mxzjhe-dcvpdw">
         <w:r>
           <w:rPr>
             <w:rFonts w:ascii="Arial" w:cs="Arial" w:eastAsia="Arial" w:hAnsi="Arial"/>
@@ -83,7 +83,7 @@
         </w:rPr>
         <w:t xml:space="preserve">  |  </w:t>
       </w:r>
-      <w:hyperlink w:history="1" r:id="rIdhbi6fpvwpvnsdds6voyoj">
+      <w:hyperlink w:history="1" r:id="rIdiypovdznq32oq9ltvrfse">
         <w:r>
           <w:rPr>
             <w:rFonts w:ascii="Arial" w:cs="Arial" w:eastAsia="Arial" w:hAnsi="Arial"/>
@@ -242,7 +242,7 @@
           <w:sz w:val="20"/>
           <w:szCs w:val="20"/>
         </w:rPr>
-        <w:t xml:space="preserve">73: </w:t>
+        <w:t xml:space="preserve">72: </w:t>
       </w:r>
       <w:r>
         <w:rPr>
@@ -4569,46 +4569,7 @@
           <w:sz w:val="24"/>
           <w:szCs w:val="24"/>
         </w:rPr>
-        <w:t xml:space="preserve">PROFESSIONAL CERTIFICATIONS &amp; SPECIALIZED TRAINING (73 CREDENTIALS)</w:t>
-      </w:r>
-    </w:p>
-    <w:p>
-      <w:pPr>
-        <w:pStyle w:val="ListParagraph"/>
-        <w:numPr>
-          <w:ilvl w:val="0"/>
-          <w:numId w:val="1"/>
-        </w:numPr>
-        <w:spacing w:after="20" w:before="40"/>
-      </w:pPr>
-      <w:r>
-        <w:rPr>
-          <w:rFonts w:ascii="Arial" w:cs="Arial" w:eastAsia="Arial" w:hAnsi="Arial"/>
-          <w:b/>
-          <w:bCs/>
-          <w:color w:val="0F3A5D"/>
-          <w:sz w:val="19"/>
-          <w:szCs w:val="19"/>
-        </w:rPr>
-        <w:t xml:space="preserve">202 Basics of Project-Level GHG Accounting (Certificate of Proficiency) </w:t>
-      </w:r>
-      <w:r>
-        <w:rPr>
-          <w:rFonts w:ascii="Arial" w:cs="Arial" w:eastAsia="Arial" w:hAnsi="Arial"/>
-          <w:color w:val="64748B"/>
-          <w:sz w:val="18"/>
-          <w:szCs w:val="18"/>
-        </w:rPr>
-        <w:t xml:space="preserve"> | The Greenhouse Gas Management Institute (GHGMI) (Oct 2026)</w:t>
-      </w:r>
-      <w:r>
-        <w:rPr>
-          <w:rFonts w:ascii="Arial" w:cs="Arial" w:eastAsia="Arial" w:hAnsi="Arial"/>
-          <w:color w:val="0D9488"/>
-          <w:sz w:val="17"/>
-          <w:szCs w:val="17"/>
-        </w:rPr>
-        <w:t xml:space="preserve"/>
+        <w:t xml:space="preserve">PROFESSIONAL CERTIFICATIONS &amp; SPECIALIZED TRAINING (72 CREDENTIALS)</w:t>
       </w:r>
     </w:p>
     <w:p>

</xml_diff>

<commit_message>
Pembaruan otomatis CV dari Word & Sertifikat pada 26/10/2026 17:03:35,68
</commit_message>
<xml_diff>
--- a/I Gede Mahendra Wijaya_Master CV.docx
+++ b/I Gede Mahendra Wijaya_Master CV.docx
@@ -41,7 +41,7 @@
         <w:spacing w:after="40" w:before="0"/>
         <w:jc w:val="center"/>
       </w:pPr>
-      <w:hyperlink w:history="1" r:id="rId0ncepmbzyghm9jqhnguu3">
+      <w:hyperlink w:history="1" r:id="rId7xmddspk48iuit02nd8iw">
         <w:r>
           <w:rPr>
             <w:rFonts w:ascii="Arial" w:cs="Arial" w:eastAsia="Arial" w:hAnsi="Arial"/>
@@ -62,7 +62,7 @@
         </w:rPr>
         <w:t xml:space="preserve">  |  </w:t>
       </w:r>
-      <w:hyperlink w:history="1" r:id="rIdzlkeksc-mxzjhe-dcvpdw">
+      <w:hyperlink w:history="1" r:id="rIddkcpexexz4foxfi9ne1uj">
         <w:r>
           <w:rPr>
             <w:rFonts w:ascii="Arial" w:cs="Arial" w:eastAsia="Arial" w:hAnsi="Arial"/>
@@ -83,7 +83,7 @@
         </w:rPr>
         <w:t xml:space="preserve">  |  </w:t>
       </w:r>
-      <w:hyperlink w:history="1" r:id="rIdiypovdznq32oq9ltvrfse">
+      <w:hyperlink w:history="1" r:id="rIdmxli460hephpqjabnat8_">
         <w:r>
           <w:rPr>
             <w:rFonts w:ascii="Arial" w:cs="Arial" w:eastAsia="Arial" w:hAnsi="Arial"/>

</xml_diff>

<commit_message>
Incorporate specific quantitative survey evidence (64 Sousa sahulensis & 40 Tursiops aduncus groups) cited by IUCN IMMA (2022)
</commit_message>
<xml_diff>
--- a/I Gede Mahendra Wijaya_Master CV.docx
+++ b/I Gede Mahendra Wijaya_Master CV.docx
@@ -41,7 +41,7 @@
         <w:spacing w:after="40" w:before="0"/>
         <w:jc w:val="center"/>
       </w:pPr>
-      <w:hyperlink w:history="1" r:id="rId7xmddspk48iuit02nd8iw">
+      <w:hyperlink w:history="1" r:id="rIdmdvecu7qxz1ou1htx_ccy">
         <w:r>
           <w:rPr>
             <w:rFonts w:ascii="Arial" w:cs="Arial" w:eastAsia="Arial" w:hAnsi="Arial"/>
@@ -62,7 +62,7 @@
         </w:rPr>
         <w:t xml:space="preserve">  |  </w:t>
       </w:r>
-      <w:hyperlink w:history="1" r:id="rIddkcpexexz4foxfi9ne1uj">
+      <w:hyperlink w:history="1" r:id="rIdrymlxdscb9mosq6cnbwn8">
         <w:r>
           <w:rPr>
             <w:rFonts w:ascii="Arial" w:cs="Arial" w:eastAsia="Arial" w:hAnsi="Arial"/>
@@ -83,7 +83,7 @@
         </w:rPr>
         <w:t xml:space="preserve">  |  </w:t>
       </w:r>
-      <w:hyperlink w:history="1" r:id="rIdmxli460hephpqjabnat8_">
+      <w:hyperlink w:history="1" r:id="rIdwdnuyoodf0yl60tehvfr0">
         <w:r>
           <w:rPr>
             <w:rFonts w:ascii="Arial" w:cs="Arial" w:eastAsia="Arial" w:hAnsi="Arial"/>
@@ -943,7 +943,7 @@
           <w:sz w:val="19"/>
           <w:szCs w:val="19"/>
         </w:rPr>
-        <w:t xml:space="preserve">Led Health, Safety, and Environment (HSE) protocols and Joint Nature Conservation Committee (JNCC)-compliant Marine Mammal Observation (MMO) with dedicated visual observation during 2D and Transition Zone (TZ) marine seismic surveys for KrisEnergy (Udan Emas) BV in Arguni Bay, West Papua. Enforced pre-shooting visual scans, exclusion zone protocols, and soft-start ramp-up procedures to safeguard marine biotas. Field observations and technical reporting directly provided the primary scientific evidence officially adopted by the IUCN Joint SSC/WCPA Task Force for the designation of the Kaimana, West Papua Important Marine Mammal Area (IMMA).</w:t>
+        <w:t xml:space="preserve">Led Health, Safety, and Environment (HSE) protocols and Joint Nature Conservation Committee (JNCC)-compliant Marine Mammal Observation (MMO) with dedicated land-based and vessel visual observation during 2D and Transition Zone (TZ) marine seismic surveys for KrisEnergy (Udan Emas) BV in Arguni Bay, West Papua. Enforced pre-shooting visual scans, exclusion zone protocols, and soft-start ramp-up procedures to safeguard marine biotas. Field observations confirmed 64 Australian humpback dolphin groups (Sousa sahulensis) and 40 Indo-Pacific bottlenose dolphin groups (Tursiops aduncus), directly cited by the IUCN Joint SSC/WCPA Marine Mammal Protected Areas Task Force (Wijaya, 2015; Beasley et al., 2016) as foundational empirical evidence designating Arguni Bay as a global marine mammal biodiversity hotspot (Kaimana IMMA).</w:t>
       </w:r>
     </w:p>
     <w:p>
@@ -4225,7 +4225,7 @@
           <w:sz w:val="18"/>
           <w:szCs w:val="18"/>
         </w:rPr>
-        <w:t xml:space="preserve">Comprehensive peer-reviewed book chapter and field study documenting the distribution, ecology, and conservation status of Australian humpback dolphins in the Pacific and New Guinea. Findings from field surveys in Arguni Bay directly served as the primary scientific justification for the IUCN Joint SSC/WCPA Task Force in formally designating the Kaimana, West Papua Important Marine Mammal Area (IMMA).</w:t>
+        <w:t xml:space="preserve">Comprehensive peer-reviewed book chapter and field study documenting the distribution, ecology, and conservation status of Australian humpback dolphins in the Pacific and New Guinea. Incorporates primary survey observations in Arguni Bay confirming 64 Sousa sahulensis groups and 40 Tursiops aduncus groups, formally cited as key empirical evidence by the IUCN Joint SSC/WCPA Task Force (2022) in designating the Kaimana, West Papua Important Marine Mammal Area (IMMA).</w:t>
       </w:r>
     </w:p>
     <w:p>

</xml_diff>

<commit_message>
Pembaruan otomatis CV dari Word & Sertifikat pada 26/10/2026 17:06:40,71
</commit_message>
<xml_diff>
--- a/I Gede Mahendra Wijaya_Master CV.docx
+++ b/I Gede Mahendra Wijaya_Master CV.docx
@@ -41,7 +41,7 @@
         <w:spacing w:after="40" w:before="0"/>
         <w:jc w:val="center"/>
       </w:pPr>
-      <w:hyperlink w:history="1" r:id="rIdmdvecu7qxz1ou1htx_ccy">
+      <w:hyperlink w:history="1" r:id="rIdlmgichdfdne6opf-q_xe6">
         <w:r>
           <w:rPr>
             <w:rFonts w:ascii="Arial" w:cs="Arial" w:eastAsia="Arial" w:hAnsi="Arial"/>
@@ -62,7 +62,7 @@
         </w:rPr>
         <w:t xml:space="preserve">  |  </w:t>
       </w:r>
-      <w:hyperlink w:history="1" r:id="rIdrymlxdscb9mosq6cnbwn8">
+      <w:hyperlink w:history="1" r:id="rId9fbokpvztlrdzm_poosp1">
         <w:r>
           <w:rPr>
             <w:rFonts w:ascii="Arial" w:cs="Arial" w:eastAsia="Arial" w:hAnsi="Arial"/>
@@ -83,7 +83,7 @@
         </w:rPr>
         <w:t xml:space="preserve">  |  </w:t>
       </w:r>
-      <w:hyperlink w:history="1" r:id="rIdwdnuyoodf0yl60tehvfr0">
+      <w:hyperlink w:history="1" r:id="rId41sohbzk6asmfbzxyznpe">
         <w:r>
           <w:rPr>
             <w:rFonts w:ascii="Arial" w:cs="Arial" w:eastAsia="Arial" w:hAnsi="Arial"/>

</xml_diff>

<commit_message>
Pembaruan otomatis CV dari Word & Sertifikat pada 27/10/2026 17:03:42,29
</commit_message>
<xml_diff>
--- a/I Gede Mahendra Wijaya_Master CV.docx
+++ b/I Gede Mahendra Wijaya_Master CV.docx
@@ -41,7 +41,7 @@
         <w:spacing w:after="40" w:before="0"/>
         <w:jc w:val="center"/>
       </w:pPr>
-      <w:hyperlink w:history="1" r:id="rIdlmgichdfdne6opf-q_xe6">
+      <w:hyperlink w:history="1" r:id="rIdzzubudv94axjh9t3ncber">
         <w:r>
           <w:rPr>
             <w:rFonts w:ascii="Arial" w:cs="Arial" w:eastAsia="Arial" w:hAnsi="Arial"/>
@@ -62,7 +62,7 @@
         </w:rPr>
         <w:t xml:space="preserve">  |  </w:t>
       </w:r>
-      <w:hyperlink w:history="1" r:id="rId9fbokpvztlrdzm_poosp1">
+      <w:hyperlink w:history="1" r:id="rIdatilb2wqcu90e1j64ukuc">
         <w:r>
           <w:rPr>
             <w:rFonts w:ascii="Arial" w:cs="Arial" w:eastAsia="Arial" w:hAnsi="Arial"/>
@@ -83,7 +83,7 @@
         </w:rPr>
         <w:t xml:space="preserve">  |  </w:t>
       </w:r>
-      <w:hyperlink w:history="1" r:id="rId41sohbzk6asmfbzxyznpe">
+      <w:hyperlink w:history="1" r:id="rId6vhm-zup3hqifbnpg77a8">
         <w:r>
           <w:rPr>
             <w:rFonts w:ascii="Arial" w:cs="Arial" w:eastAsia="Arial" w:hAnsi="Arial"/>

</xml_diff>

<commit_message>
Incorporate customary clan mapping database (350+ clans, 240+ dusun) and environmental permit support for PT SHL & PT SHE
</commit_message>
<xml_diff>
--- a/I Gede Mahendra Wijaya_Master CV.docx
+++ b/I Gede Mahendra Wijaya_Master CV.docx
@@ -41,7 +41,7 @@
         <w:spacing w:after="40" w:before="0"/>
         <w:jc w:val="center"/>
       </w:pPr>
-      <w:hyperlink w:history="1" r:id="rIdzzubudv94axjh9t3ncber">
+      <w:hyperlink w:history="1" r:id="rIdnbs0t5m_g4azhiomwqy7f">
         <w:r>
           <w:rPr>
             <w:rFonts w:ascii="Arial" w:cs="Arial" w:eastAsia="Arial" w:hAnsi="Arial"/>
@@ -62,7 +62,7 @@
         </w:rPr>
         <w:t xml:space="preserve">  |  </w:t>
       </w:r>
-      <w:hyperlink w:history="1" r:id="rIdatilb2wqcu90e1j64ukuc">
+      <w:hyperlink w:history="1" r:id="rIdxgijtiw1sqxsdknxsoxzn">
         <w:r>
           <w:rPr>
             <w:rFonts w:ascii="Arial" w:cs="Arial" w:eastAsia="Arial" w:hAnsi="Arial"/>
@@ -83,7 +83,7 @@
         </w:rPr>
         <w:t xml:space="preserve">  |  </w:t>
       </w:r>
-      <w:hyperlink w:history="1" r:id="rId6vhm-zup3hqifbnpg77a8">
+      <w:hyperlink w:history="1" r:id="rIduneacghh3977f489mi3hk">
         <w:r>
           <w:rPr>
             <w:rFonts w:ascii="Arial" w:cs="Arial" w:eastAsia="Arial" w:hAnsi="Arial"/>
@@ -711,7 +711,7 @@
           <w:sz w:val="19"/>
           <w:szCs w:val="19"/>
         </w:rPr>
-        <w:t xml:space="preserve">Managed multidisciplinary carbon project operations across terrestrial, peatland, and coastal wetland concession areas (&gt;200,000 ha) in West Papua and Southwest Papua. Directed cross-functional field teams across forestry, biodiversity, and social workstreams to execute rigorous primary data collection, ecological baselines, High Carbon Stock Approach (HCSA), High Conservation Value (HCV), and ground-based carbon stock accounting (SNI 7724). Spearheaded multi-level stakeholder management and Free, Prior, and Informed Consent (FPIC) consultations with local customary communities to secure social license to operate (SLO) and establish equitable benefit-sharing frameworks. Coordinated regulatory compliance and statutory licensing pathways with the Ministry of Forestry and the Ministry of Environment, formulating Environmental and Social Management Plans (ESMP) and robust Monitoring, Reporting, and Verification (MRV) systems.</w:t>
+        <w:t xml:space="preserve">Managed multidisciplinary carbon project operations across terrestrial, peatland, and coastal wetland concession areas (&gt;200,000 ha) in West Papua and Southwest Papua. Directed cross-functional field teams across forestry, biodiversity, and socio-tenurial workstreams executing rigorous ecological baselines, HCSA, HCV, and ground-based carbon stock accounting (SNI 7724). Spearheaded customary clan and kinship mapping, establishing an integrated tenurial database encompassing 350+ customary clans (marga), 240+ customary dusun boundaries, 11 sub-tribes, and 36 villages across 4 districts for PT SHL and PT SHE. Orchestrated multi-tier stakeholder management, Free, Prior, and Informed Consent (FPIC) consultations, and clan-level equitable benefit-sharing frameworks to secure social license to operate (SLO). Coordinated regulatory licensing and environmental permit pathways with the Ministry of Forestry and the Ministry of Environment, formulating Environmental and Social Management Plans (ESMP) and robust Monitoring, Reporting, and Verification (MRV) systems.</w:t>
       </w:r>
     </w:p>
     <w:p>
@@ -1131,7 +1131,7 @@
           <w:sz w:val="19"/>
           <w:szCs w:val="19"/>
         </w:rPr>
-        <w:t xml:space="preserve">Conducted comprehensive pre-socialization assessments, institutional mapping, and multi-tier stakeholder analysis across district and provincial levels in Southwest Papua. Designed the initial stakeholder engagement strategy and Free, Prior, and Informed Consent (FPIC) framework required for forest concession ecosystem restoration and carbon project licensing, ensuring full alignment with local customary land rights.</w:t>
+        <w:t xml:space="preserve">Conducted comprehensive pre-socialization assessments, institutional mapping, and customary clan identification across district and provincial levels in Southwest Papua. Established an integrated tenurial database documenting 350+ customary clans (marga) and 240+ customary dusun boundaries, formulating the initial stakeholder engagement strategy, clan-level FPIC protocols, and statutory licensing pathways to secure social license to operate (SLO) and support environmental permit acquisition for forest carbon ecosystem restoration.</w:t>
       </w:r>
     </w:p>
     <w:p>

</xml_diff>

<commit_message>
Pembaruan otomatis CV dari Word & Sertifikat pada 27/10/2026 17:13:51,43
</commit_message>
<xml_diff>
--- a/I Gede Mahendra Wijaya_Master CV.docx
+++ b/I Gede Mahendra Wijaya_Master CV.docx
@@ -41,7 +41,7 @@
         <w:spacing w:after="40" w:before="0"/>
         <w:jc w:val="center"/>
       </w:pPr>
-      <w:hyperlink w:history="1" r:id="rIdnbs0t5m_g4azhiomwqy7f">
+      <w:hyperlink w:history="1" r:id="rIdcfwoby8eqag_nv-qh7h-y">
         <w:r>
           <w:rPr>
             <w:rFonts w:ascii="Arial" w:cs="Arial" w:eastAsia="Arial" w:hAnsi="Arial"/>
@@ -62,7 +62,7 @@
         </w:rPr>
         <w:t xml:space="preserve">  |  </w:t>
       </w:r>
-      <w:hyperlink w:history="1" r:id="rIdxgijtiw1sqxsdknxsoxzn">
+      <w:hyperlink w:history="1" r:id="rIddbwffskypnp6qpk5vicn7">
         <w:r>
           <w:rPr>
             <w:rFonts w:ascii="Arial" w:cs="Arial" w:eastAsia="Arial" w:hAnsi="Arial"/>
@@ -83,7 +83,7 @@
         </w:rPr>
         <w:t xml:space="preserve">  |  </w:t>
       </w:r>
-      <w:hyperlink w:history="1" r:id="rIduneacghh3977f489mi3hk">
+      <w:hyperlink w:history="1" r:id="rId6j4xrsvhwyjdlgrobacvi">
         <w:r>
           <w:rPr>
             <w:rFonts w:ascii="Arial" w:cs="Arial" w:eastAsia="Arial" w:hAnsi="Arial"/>

</xml_diff>